<commit_message>
Actualiza fuentes de datos
</commit_message>
<xml_diff>
--- a/Documentacion/Fuentes de Datos.docx
+++ b/Documentacion/Fuentes de Datos.docx
@@ -100,7 +100,21 @@
           <w:rFonts w:ascii="Arial" w:hAnsi="Arial" w:cs="Arial"/>
           <w:lang w:val="es-CO"/>
         </w:rPr>
-        <w:t>24 de febrero de 2025</w:t>
+        <w:t>2</w:t>
+      </w:r>
+      <w:r>
+        <w:rPr>
+          <w:rFonts w:ascii="Arial" w:hAnsi="Arial" w:cs="Arial"/>
+          <w:lang w:val="es-CO"/>
+        </w:rPr>
+        <w:t>5</w:t>
+      </w:r>
+      <w:r>
+        <w:rPr>
+          <w:rFonts w:ascii="Arial" w:hAnsi="Arial" w:cs="Arial"/>
+          <w:lang w:val="es-CO"/>
+        </w:rPr>
+        <w:t xml:space="preserve"> de febrero de 2025</w:t>
       </w:r>
     </w:p>
     <w:p>
@@ -158,23 +172,7 @@
             <w:rFonts w:ascii="Arial" w:hAnsi="Arial" w:cs="Arial"/>
             <w:lang w:val="es-CO"/>
           </w:rPr>
-          <w:t xml:space="preserve">página </w:t>
-        </w:r>
-        <w:r>
-          <w:rPr>
-            <w:rStyle w:val="Hipervnculo"/>
-            <w:rFonts w:ascii="Arial" w:hAnsi="Arial" w:cs="Arial"/>
-            <w:lang w:val="es-CO"/>
-          </w:rPr>
-          <w:t>o</w:t>
-        </w:r>
-        <w:r>
-          <w:rPr>
-            <w:rStyle w:val="Hipervnculo"/>
-            <w:rFonts w:ascii="Arial" w:hAnsi="Arial" w:cs="Arial"/>
-            <w:lang w:val="es-CO"/>
-          </w:rPr>
-          <w:t>ficial del Departamento Nacional de Estadística</w:t>
+          <w:t>página oficial del Departamento Nacional de Estadística</w:t>
         </w:r>
       </w:hyperlink>
       <w:r>
@@ -361,30 +359,7 @@
           <w:rFonts w:ascii="Arial" w:hAnsi="Arial" w:cs="Arial"/>
           <w:lang w:val="es-CO"/>
         </w:rPr>
-        <w:t>Los datos proporcionados son datos públicos</w:t>
-      </w:r>
-      <w:r>
-        <w:rPr>
-          <w:rFonts w:ascii="Arial" w:hAnsi="Arial" w:cs="Arial"/>
-          <w:lang w:val="es-CO"/>
-        </w:rPr>
-        <w:t xml:space="preserve"> recolectados por </w:t>
-      </w:r>
-      <w:proofErr w:type="spellStart"/>
-      <w:r>
-        <w:rPr>
-          <w:rFonts w:ascii="Arial" w:hAnsi="Arial" w:cs="Arial"/>
-          <w:lang w:val="es-CO"/>
-        </w:rPr>
-        <w:t>el</w:t>
-      </w:r>
-      <w:proofErr w:type="spellEnd"/>
-      <w:r>
-        <w:rPr>
-          <w:rFonts w:ascii="Arial" w:hAnsi="Arial" w:cs="Arial"/>
-          <w:lang w:val="es-CO"/>
-        </w:rPr>
-        <w:t xml:space="preserve"> DANE, no es posible la individualización de ningún ciudadano que haya proporcionado datos para el censo.</w:t>
+        <w:t>Los datos proporcionados son datos públicos recolectados por el DANE, no es posible la individualización de ningún ciudadano que haya proporcionado datos para el censo.</w:t>
       </w:r>
     </w:p>
     <w:p>
@@ -777,36 +752,7 @@
           <w:iCs/>
           <w:lang w:val="es-CO"/>
         </w:rPr>
-        <w:t>Censo Viterbo Caldas 2018/Data</w:t>
-      </w:r>
-      <w:r>
-        <w:rPr>
-          <w:rFonts w:ascii="Arial" w:hAnsi="Arial" w:cs="Arial"/>
-          <w:i/>
-          <w:iCs/>
-          <w:lang w:val="es-CO"/>
-        </w:rPr>
-        <w:t>/</w:t>
-      </w:r>
-      <w:proofErr w:type="spellStart"/>
-      <w:r>
-        <w:rPr>
-          <w:rFonts w:ascii="Arial" w:hAnsi="Arial" w:cs="Arial"/>
-          <w:i/>
-          <w:iCs/>
-          <w:lang w:val="es-CO"/>
-        </w:rPr>
-        <w:t>Datasets</w:t>
-      </w:r>
-      <w:proofErr w:type="spellEnd"/>
-      <w:r>
-        <w:rPr>
-          <w:rFonts w:ascii="Arial" w:hAnsi="Arial" w:cs="Arial"/>
-          <w:i/>
-          <w:iCs/>
-          <w:lang w:val="es-CO"/>
-        </w:rPr>
-        <w:t>/</w:t>
+        <w:t>Censo Viterbo Caldas 2018/Data/Datasets/</w:t>
       </w:r>
     </w:p>
     <w:p>
@@ -1046,6 +992,1399 @@
         <w:t>Personas Total Nacional</w:t>
       </w:r>
     </w:p>
+    <w:p>
+      <w:pPr>
+        <w:pStyle w:val="Prrafodelista"/>
+        <w:numPr>
+          <w:ilvl w:val="0"/>
+          <w:numId w:val="1"/>
+        </w:numPr>
+        <w:rPr>
+          <w:rFonts w:ascii="Arial" w:hAnsi="Arial" w:cs="Arial"/>
+          <w:lang w:val="es-CO"/>
+        </w:rPr>
+      </w:pPr>
+      <w:r>
+        <w:rPr>
+          <w:rFonts w:ascii="Arial" w:hAnsi="Arial" w:cs="Arial"/>
+          <w:b/>
+          <w:bCs/>
+          <w:lang w:val="es-CO"/>
+        </w:rPr>
+        <w:t>PP:</w:t>
+      </w:r>
+      <w:r>
+        <w:rPr>
+          <w:rFonts w:ascii="Arial" w:hAnsi="Arial" w:cs="Arial"/>
+          <w:lang w:val="es-CO"/>
+        </w:rPr>
+        <w:t xml:space="preserve"> Principales países</w:t>
+      </w:r>
+    </w:p>
+    <w:p>
+      <w:pPr>
+        <w:rPr>
+          <w:rFonts w:ascii="Arial" w:hAnsi="Arial" w:cs="Arial"/>
+          <w:lang w:val="es-CO"/>
+        </w:rPr>
+      </w:pPr>
+      <w:r>
+        <w:rPr>
+          <w:rFonts w:ascii="Arial" w:hAnsi="Arial" w:cs="Arial"/>
+          <w:lang w:val="es-CO"/>
+        </w:rPr>
+        <w:t>Por el alcance de este proyecto, se utilizarán solo las hojas relacionadas con datos municipales.</w:t>
+      </w:r>
+    </w:p>
+    <w:p>
+      <w:pPr>
+        <w:rPr>
+          <w:rFonts w:ascii="Arial" w:hAnsi="Arial" w:cs="Arial"/>
+          <w:lang w:val="es-CO"/>
+        </w:rPr>
+      </w:pPr>
+      <w:r>
+        <w:rPr>
+          <w:rFonts w:ascii="Arial" w:hAnsi="Arial" w:cs="Arial"/>
+          <w:lang w:val="es-CO"/>
+        </w:rPr>
+        <w:t>Lista de hojas</w:t>
+      </w:r>
+    </w:p>
+    <w:tbl>
+      <w:tblPr>
+        <w:tblStyle w:val="Tablaconcuadrcula"/>
+        <w:tblW w:w="9651" w:type="dxa"/>
+        <w:tblLayout w:type="fixed"/>
+        <w:tblLook w:val="04A0" w:firstRow="1" w:lastRow="0" w:firstColumn="1" w:lastColumn="0" w:noHBand="0" w:noVBand="1"/>
+      </w:tblPr>
+      <w:tblGrid>
+        <w:gridCol w:w="1165"/>
+        <w:gridCol w:w="6570"/>
+        <w:gridCol w:w="1093"/>
+        <w:gridCol w:w="823"/>
+      </w:tblGrid>
+      <w:tr>
+        <w:tc>
+          <w:tcPr>
+            <w:tcW w:w="1165" w:type="dxa"/>
+          </w:tcPr>
+          <w:p>
+            <w:pPr>
+              <w:rPr>
+                <w:rFonts w:ascii="Arial" w:hAnsi="Arial" w:cs="Arial"/>
+                <w:lang w:val="es-CO"/>
+              </w:rPr>
+            </w:pPr>
+            <w:r>
+              <w:rPr>
+                <w:rFonts w:ascii="Arial" w:hAnsi="Arial" w:cs="Arial"/>
+                <w:lang w:val="es-CO"/>
+              </w:rPr>
+              <w:t>Nombre</w:t>
+            </w:r>
+          </w:p>
+        </w:tc>
+        <w:tc>
+          <w:tcPr>
+            <w:tcW w:w="6570" w:type="dxa"/>
+          </w:tcPr>
+          <w:p>
+            <w:pPr>
+              <w:rPr>
+                <w:rFonts w:ascii="Arial" w:hAnsi="Arial" w:cs="Arial"/>
+                <w:lang w:val="es-CO"/>
+              </w:rPr>
+            </w:pPr>
+            <w:r>
+              <w:rPr>
+                <w:rFonts w:ascii="Arial" w:hAnsi="Arial" w:cs="Arial"/>
+                <w:lang w:val="es-CO"/>
+              </w:rPr>
+              <w:t>Descripción</w:t>
+            </w:r>
+          </w:p>
+        </w:tc>
+        <w:tc>
+          <w:tcPr>
+            <w:tcW w:w="1093" w:type="dxa"/>
+          </w:tcPr>
+          <w:p>
+            <w:pPr>
+              <w:rPr>
+                <w:rFonts w:ascii="Arial" w:hAnsi="Arial" w:cs="Arial"/>
+                <w:lang w:val="es-CO"/>
+              </w:rPr>
+            </w:pPr>
+            <w:r>
+              <w:rPr>
+                <w:rFonts w:ascii="Arial" w:hAnsi="Arial" w:cs="Arial"/>
+                <w:lang w:val="es-CO"/>
+              </w:rPr>
+              <w:t>Rango</w:t>
+            </w:r>
+          </w:p>
+        </w:tc>
+        <w:tc>
+          <w:tcPr>
+            <w:tcW w:w="823" w:type="dxa"/>
+          </w:tcPr>
+          <w:p>
+            <w:pPr>
+              <w:rPr>
+                <w:rFonts w:ascii="Arial" w:hAnsi="Arial" w:cs="Arial"/>
+                <w:lang w:val="es-CO"/>
+              </w:rPr>
+            </w:pPr>
+            <w:r>
+              <w:rPr>
+                <w:rFonts w:ascii="Arial" w:hAnsi="Arial" w:cs="Arial"/>
+                <w:lang w:val="es-CO"/>
+              </w:rPr>
+              <w:t>Filas</w:t>
+            </w:r>
+          </w:p>
+        </w:tc>
+      </w:tr>
+      <w:tr>
+        <w:tc>
+          <w:tcPr>
+            <w:tcW w:w="1165" w:type="dxa"/>
+          </w:tcPr>
+          <w:p>
+            <w:pPr>
+              <w:rPr>
+                <w:rFonts w:ascii="Arial" w:hAnsi="Arial" w:cs="Arial"/>
+                <w:lang w:val="es-CO"/>
+              </w:rPr>
+            </w:pPr>
+            <w:r>
+              <w:rPr>
+                <w:rFonts w:ascii="Arial" w:hAnsi="Arial" w:cs="Arial"/>
+                <w:lang w:val="es-CO"/>
+              </w:rPr>
+              <w:t>1PM</w:t>
+            </w:r>
+          </w:p>
+        </w:tc>
+        <w:tc>
+          <w:tcPr>
+            <w:tcW w:w="6570" w:type="dxa"/>
+          </w:tcPr>
+          <w:p>
+            <w:pPr>
+              <w:rPr>
+                <w:rFonts w:ascii="Arial" w:hAnsi="Arial" w:cs="Arial"/>
+                <w:lang w:val="es-CO"/>
+              </w:rPr>
+            </w:pPr>
+            <w:r>
+              <w:rPr>
+                <w:rFonts w:ascii="Arial" w:hAnsi="Arial" w:cs="Arial"/>
+                <w:lang w:val="es-CO"/>
+              </w:rPr>
+              <w:t>Población total censada, por sexo e índices de masculinidad y feminidad, según municipio, áreas (Total, Cabecera y Centros poblados y Rural disperso) y grupos de edad</w:t>
+            </w:r>
+          </w:p>
+        </w:tc>
+        <w:tc>
+          <w:tcPr>
+            <w:tcW w:w="1093" w:type="dxa"/>
+          </w:tcPr>
+          <w:p>
+            <w:pPr>
+              <w:rPr>
+                <w:rFonts w:ascii="Arial" w:hAnsi="Arial" w:cs="Arial"/>
+                <w:lang w:val="es-CO"/>
+              </w:rPr>
+            </w:pPr>
+            <w:r>
+              <w:rPr>
+                <w:rFonts w:ascii="Arial" w:hAnsi="Arial" w:cs="Arial"/>
+                <w:lang w:val="es-CO"/>
+              </w:rPr>
+              <w:t>B24196-B24252</w:t>
+            </w:r>
+          </w:p>
+        </w:tc>
+        <w:tc>
+          <w:tcPr>
+            <w:tcW w:w="823" w:type="dxa"/>
+          </w:tcPr>
+          <w:p>
+            <w:pPr>
+              <w:rPr>
+                <w:rFonts w:ascii="Arial" w:hAnsi="Arial" w:cs="Arial"/>
+                <w:lang w:val="es-CO"/>
+              </w:rPr>
+            </w:pPr>
+            <w:r>
+              <w:rPr>
+                <w:rFonts w:ascii="Arial" w:hAnsi="Arial" w:cs="Arial"/>
+                <w:lang w:val="es-CO"/>
+              </w:rPr>
+              <w:t>57</w:t>
+            </w:r>
+          </w:p>
+          <w:p>
+            <w:pPr>
+              <w:rPr>
+                <w:rFonts w:ascii="Arial" w:hAnsi="Arial" w:cs="Arial"/>
+                <w:lang w:val="es-CO"/>
+              </w:rPr>
+            </w:pPr>
+          </w:p>
+        </w:tc>
+      </w:tr>
+      <w:tr>
+        <w:tc>
+          <w:tcPr>
+            <w:tcW w:w="1165" w:type="dxa"/>
+          </w:tcPr>
+          <w:p>
+            <w:pPr>
+              <w:rPr>
+                <w:rFonts w:ascii="Arial" w:hAnsi="Arial" w:cs="Arial"/>
+                <w:lang w:val="es-CO"/>
+              </w:rPr>
+            </w:pPr>
+            <w:r>
+              <w:rPr>
+                <w:rFonts w:ascii="Arial" w:hAnsi="Arial" w:cs="Arial"/>
+                <w:lang w:val="es-CO"/>
+              </w:rPr>
+              <w:t>3PM</w:t>
+            </w:r>
+          </w:p>
+        </w:tc>
+        <w:tc>
+          <w:tcPr>
+            <w:tcW w:w="6570" w:type="dxa"/>
+          </w:tcPr>
+          <w:p>
+            <w:pPr>
+              <w:rPr>
+                <w:rFonts w:ascii="Arial" w:hAnsi="Arial" w:cs="Arial"/>
+                <w:lang w:val="es-CO"/>
+              </w:rPr>
+            </w:pPr>
+            <w:r>
+              <w:rPr>
+                <w:rFonts w:ascii="Arial" w:hAnsi="Arial" w:cs="Arial"/>
+                <w:lang w:val="es-CO"/>
+              </w:rPr>
+              <w:t>Población censada, por sexo y áreas (Total, Cabecera y Centros poblados y Rural disperso), según municipios y edades simples</w:t>
+            </w:r>
+          </w:p>
+        </w:tc>
+        <w:tc>
+          <w:tcPr>
+            <w:tcW w:w="1093" w:type="dxa"/>
+          </w:tcPr>
+          <w:p>
+            <w:pPr>
+              <w:rPr>
+                <w:rFonts w:ascii="Arial" w:hAnsi="Arial" w:cs="Arial"/>
+                <w:lang w:val="es-CO"/>
+              </w:rPr>
+            </w:pPr>
+            <w:r>
+              <w:rPr>
+                <w:rFonts w:ascii="Arial" w:hAnsi="Arial" w:cs="Arial"/>
+                <w:lang w:val="es-CO"/>
+              </w:rPr>
+              <w:t>B42485-42607</w:t>
+            </w:r>
+          </w:p>
+        </w:tc>
+        <w:tc>
+          <w:tcPr>
+            <w:tcW w:w="823" w:type="dxa"/>
+          </w:tcPr>
+          <w:p>
+            <w:pPr>
+              <w:rPr>
+                <w:rFonts w:ascii="Arial" w:hAnsi="Arial" w:cs="Arial"/>
+                <w:lang w:val="es-CO"/>
+              </w:rPr>
+            </w:pPr>
+            <w:r>
+              <w:rPr>
+                <w:rFonts w:ascii="Arial" w:hAnsi="Arial" w:cs="Arial"/>
+                <w:lang w:val="es-CO"/>
+              </w:rPr>
+              <w:t>123</w:t>
+            </w:r>
+          </w:p>
+        </w:tc>
+      </w:tr>
+      <w:tr>
+        <w:tc>
+          <w:tcPr>
+            <w:tcW w:w="1165" w:type="dxa"/>
+          </w:tcPr>
+          <w:p>
+            <w:pPr>
+              <w:rPr>
+                <w:rFonts w:ascii="Arial" w:hAnsi="Arial" w:cs="Arial"/>
+                <w:lang w:val="es-CO"/>
+              </w:rPr>
+            </w:pPr>
+            <w:r>
+              <w:rPr>
+                <w:rFonts w:ascii="Arial" w:hAnsi="Arial" w:cs="Arial"/>
+                <w:lang w:val="es-CO"/>
+              </w:rPr>
+              <w:t>4PM</w:t>
+            </w:r>
+          </w:p>
+        </w:tc>
+        <w:tc>
+          <w:tcPr>
+            <w:tcW w:w="6570" w:type="dxa"/>
+          </w:tcPr>
+          <w:p>
+            <w:pPr>
+              <w:rPr>
+                <w:rFonts w:ascii="Arial" w:hAnsi="Arial" w:cs="Arial"/>
+                <w:lang w:val="es-CO"/>
+              </w:rPr>
+            </w:pPr>
+            <w:r>
+              <w:rPr>
+                <w:rFonts w:ascii="Arial" w:hAnsi="Arial" w:cs="Arial"/>
+                <w:lang w:val="es-CO"/>
+              </w:rPr>
+              <w:t>Población censada en hogares particulares, por relación o parentesco con el jefe(a) del hogar, según sexo, municipio y áreas (Total, Cabecera y Centros poblados y Rural disperso) </w:t>
+            </w:r>
+          </w:p>
+        </w:tc>
+        <w:tc>
+          <w:tcPr>
+            <w:tcW w:w="1093" w:type="dxa"/>
+          </w:tcPr>
+          <w:p>
+            <w:pPr>
+              <w:rPr>
+                <w:rFonts w:ascii="Arial" w:hAnsi="Arial" w:cs="Arial"/>
+                <w:lang w:val="es-CO"/>
+              </w:rPr>
+            </w:pPr>
+            <w:r>
+              <w:rPr>
+                <w:rFonts w:ascii="Arial" w:hAnsi="Arial" w:cs="Arial"/>
+                <w:lang w:val="es-CO"/>
+              </w:rPr>
+              <w:t>B3846-</w:t>
+            </w:r>
+          </w:p>
+          <w:p>
+            <w:pPr>
+              <w:rPr>
+                <w:rFonts w:ascii="Arial" w:hAnsi="Arial" w:cs="Arial"/>
+                <w:lang w:val="es-CO"/>
+              </w:rPr>
+            </w:pPr>
+            <w:r>
+              <w:rPr>
+                <w:rFonts w:ascii="Arial" w:hAnsi="Arial" w:cs="Arial"/>
+                <w:lang w:val="es-CO"/>
+              </w:rPr>
+              <w:t>B3854</w:t>
+            </w:r>
+          </w:p>
+        </w:tc>
+        <w:tc>
+          <w:tcPr>
+            <w:tcW w:w="823" w:type="dxa"/>
+          </w:tcPr>
+          <w:p>
+            <w:pPr>
+              <w:rPr>
+                <w:rFonts w:ascii="Arial" w:hAnsi="Arial" w:cs="Arial"/>
+                <w:lang w:val="es-CO"/>
+              </w:rPr>
+            </w:pPr>
+            <w:r>
+              <w:rPr>
+                <w:rFonts w:ascii="Arial" w:hAnsi="Arial" w:cs="Arial"/>
+                <w:lang w:val="es-CO"/>
+              </w:rPr>
+              <w:t>9</w:t>
+            </w:r>
+          </w:p>
+        </w:tc>
+      </w:tr>
+      <w:tr>
+        <w:tc>
+          <w:tcPr>
+            <w:tcW w:w="1165" w:type="dxa"/>
+          </w:tcPr>
+          <w:p>
+            <w:pPr>
+              <w:rPr>
+                <w:rFonts w:ascii="Arial" w:hAnsi="Arial" w:cs="Arial"/>
+                <w:lang w:val="es-CO"/>
+              </w:rPr>
+            </w:pPr>
+            <w:r>
+              <w:rPr>
+                <w:rFonts w:ascii="Arial" w:hAnsi="Arial" w:cs="Arial"/>
+                <w:lang w:val="es-CO"/>
+              </w:rPr>
+              <w:t>5.1PM</w:t>
+            </w:r>
+          </w:p>
+        </w:tc>
+        <w:tc>
+          <w:tcPr>
+            <w:tcW w:w="6570" w:type="dxa"/>
+          </w:tcPr>
+          <w:p>
+            <w:pPr>
+              <w:rPr>
+                <w:rFonts w:ascii="Arial" w:hAnsi="Arial" w:cs="Arial"/>
+                <w:lang w:val="es-CO"/>
+              </w:rPr>
+            </w:pPr>
+            <w:r>
+              <w:rPr>
+                <w:rFonts w:ascii="Arial" w:hAnsi="Arial" w:cs="Arial"/>
+                <w:lang w:val="es-CO"/>
+              </w:rPr>
+              <w:t>Población censada en hogares particulares, por relación o parentesco con el jefe(a) de hogar, según municipio, área (Total, Cabecera y Centros poblados y Rural disperso) y grupo de edad</w:t>
+            </w:r>
+          </w:p>
+        </w:tc>
+        <w:tc>
+          <w:tcPr>
+            <w:tcW w:w="1093" w:type="dxa"/>
+          </w:tcPr>
+          <w:p>
+            <w:pPr>
+              <w:rPr>
+                <w:rFonts w:ascii="Arial" w:hAnsi="Arial" w:cs="Arial"/>
+                <w:lang w:val="es-CO"/>
+              </w:rPr>
+            </w:pPr>
+            <w:r>
+              <w:rPr>
+                <w:rFonts w:ascii="Arial" w:hAnsi="Arial" w:cs="Arial"/>
+                <w:lang w:val="es-CO"/>
+              </w:rPr>
+              <w:t>B24196-</w:t>
+            </w:r>
+          </w:p>
+          <w:p>
+            <w:pPr>
+              <w:rPr>
+                <w:rFonts w:ascii="Arial" w:hAnsi="Arial" w:cs="Arial"/>
+                <w:lang w:val="es-CO"/>
+              </w:rPr>
+            </w:pPr>
+            <w:r>
+              <w:rPr>
+                <w:rFonts w:ascii="Arial" w:hAnsi="Arial" w:cs="Arial"/>
+                <w:lang w:val="es-CO"/>
+              </w:rPr>
+              <w:t>B24252</w:t>
+            </w:r>
+          </w:p>
+        </w:tc>
+        <w:tc>
+          <w:tcPr>
+            <w:tcW w:w="823" w:type="dxa"/>
+          </w:tcPr>
+          <w:p>
+            <w:pPr>
+              <w:rPr>
+                <w:rFonts w:ascii="Arial" w:hAnsi="Arial" w:cs="Arial"/>
+                <w:lang w:val="es-CO"/>
+              </w:rPr>
+            </w:pPr>
+            <w:r>
+              <w:rPr>
+                <w:rFonts w:ascii="Arial" w:hAnsi="Arial" w:cs="Arial"/>
+                <w:lang w:val="es-CO"/>
+              </w:rPr>
+              <w:t>57</w:t>
+            </w:r>
+          </w:p>
+        </w:tc>
+      </w:tr>
+      <w:tr>
+        <w:tc>
+          <w:tcPr>
+            <w:tcW w:w="1165" w:type="dxa"/>
+          </w:tcPr>
+          <w:p>
+            <w:pPr>
+              <w:rPr>
+                <w:rFonts w:ascii="Arial" w:hAnsi="Arial" w:cs="Arial"/>
+                <w:lang w:val="es-CO"/>
+              </w:rPr>
+            </w:pPr>
+            <w:r>
+              <w:rPr>
+                <w:rFonts w:ascii="Arial" w:hAnsi="Arial" w:cs="Arial"/>
+                <w:lang w:val="es-CO"/>
+              </w:rPr>
+              <w:t>5.2PM</w:t>
+            </w:r>
+          </w:p>
+        </w:tc>
+        <w:tc>
+          <w:tcPr>
+            <w:tcW w:w="6570" w:type="dxa"/>
+          </w:tcPr>
+          <w:p>
+            <w:pPr>
+              <w:rPr>
+                <w:rFonts w:ascii="Arial" w:hAnsi="Arial" w:cs="Arial"/>
+                <w:lang w:val="es-CO"/>
+              </w:rPr>
+            </w:pPr>
+            <w:r>
+              <w:rPr>
+                <w:rFonts w:ascii="Arial" w:hAnsi="Arial" w:cs="Arial"/>
+                <w:lang w:val="es-CO"/>
+              </w:rPr>
+              <w:t>Población censada en hogares particulares, por relación o parentesco con el jefe(a) de hogar, según municipio, área (Total, Cabecera y Centros poblados y Rural disperso),</w:t>
+            </w:r>
+            <w:r>
+              <w:rPr>
+                <w:rFonts w:ascii="Arial" w:hAnsi="Arial" w:cs="Arial"/>
+                <w:lang w:val="es-CO"/>
+              </w:rPr>
+              <w:t xml:space="preserve"> </w:t>
+            </w:r>
+            <w:r>
+              <w:rPr>
+                <w:rFonts w:ascii="Arial" w:hAnsi="Arial" w:cs="Arial"/>
+                <w:lang w:val="es-CO"/>
+              </w:rPr>
+              <w:t>sexo y grupo de edad</w:t>
+            </w:r>
+          </w:p>
+        </w:tc>
+        <w:tc>
+          <w:tcPr>
+            <w:tcW w:w="1093" w:type="dxa"/>
+          </w:tcPr>
+          <w:p>
+            <w:pPr>
+              <w:rPr>
+                <w:rFonts w:ascii="Arial" w:hAnsi="Arial" w:cs="Arial"/>
+                <w:lang w:val="es-CO"/>
+              </w:rPr>
+            </w:pPr>
+            <w:r>
+              <w:rPr>
+                <w:rFonts w:ascii="Arial" w:hAnsi="Arial" w:cs="Arial"/>
+                <w:lang w:val="es-CO"/>
+              </w:rPr>
+              <w:t>B48170-</w:t>
+            </w:r>
+          </w:p>
+          <w:p>
+            <w:pPr>
+              <w:rPr>
+                <w:rFonts w:ascii="Arial" w:hAnsi="Arial" w:cs="Arial"/>
+                <w:lang w:val="es-CO"/>
+              </w:rPr>
+            </w:pPr>
+            <w:r>
+              <w:rPr>
+                <w:rFonts w:ascii="Arial" w:hAnsi="Arial" w:cs="Arial"/>
+                <w:lang w:val="es-CO"/>
+              </w:rPr>
+              <w:t>B48283</w:t>
+            </w:r>
+          </w:p>
+        </w:tc>
+        <w:tc>
+          <w:tcPr>
+            <w:tcW w:w="823" w:type="dxa"/>
+          </w:tcPr>
+          <w:p>
+            <w:pPr>
+              <w:rPr>
+                <w:rFonts w:ascii="Arial" w:hAnsi="Arial" w:cs="Arial"/>
+                <w:lang w:val="es-CO"/>
+              </w:rPr>
+            </w:pPr>
+            <w:r>
+              <w:rPr>
+                <w:rFonts w:ascii="Arial" w:hAnsi="Arial" w:cs="Arial"/>
+                <w:lang w:val="es-CO"/>
+              </w:rPr>
+              <w:t>114</w:t>
+            </w:r>
+          </w:p>
+        </w:tc>
+      </w:tr>
+      <w:tr>
+        <w:tc>
+          <w:tcPr>
+            <w:tcW w:w="1165" w:type="dxa"/>
+          </w:tcPr>
+          <w:p>
+            <w:pPr>
+              <w:rPr>
+                <w:rFonts w:ascii="Arial" w:hAnsi="Arial" w:cs="Arial"/>
+                <w:lang w:val="es-CO"/>
+              </w:rPr>
+            </w:pPr>
+            <w:r>
+              <w:rPr>
+                <w:rFonts w:ascii="Arial" w:hAnsi="Arial" w:cs="Arial"/>
+                <w:lang w:val="es-CO"/>
+              </w:rPr>
+              <w:t>12PM</w:t>
+            </w:r>
+          </w:p>
+        </w:tc>
+        <w:tc>
+          <w:tcPr>
+            <w:tcW w:w="6570" w:type="dxa"/>
+          </w:tcPr>
+          <w:p>
+            <w:pPr>
+              <w:rPr>
+                <w:rFonts w:ascii="Arial" w:hAnsi="Arial" w:cs="Arial"/>
+                <w:lang w:val="es-CO"/>
+              </w:rPr>
+            </w:pPr>
+            <w:r>
+              <w:rPr>
+                <w:rFonts w:ascii="Arial" w:hAnsi="Arial" w:cs="Arial"/>
+                <w:lang w:val="es-CO"/>
+              </w:rPr>
+              <w:t>Población censada en hogares particulares, por auto reconocimiento étnico y área (Total, Cabecera y Centros poblados y Rural disperso), según municipio y grupos de edad</w:t>
+            </w:r>
+          </w:p>
+        </w:tc>
+        <w:tc>
+          <w:tcPr>
+            <w:tcW w:w="1093" w:type="dxa"/>
+          </w:tcPr>
+          <w:p>
+            <w:pPr>
+              <w:rPr>
+                <w:rFonts w:ascii="Arial" w:hAnsi="Arial" w:cs="Arial"/>
+                <w:lang w:val="es-CO"/>
+              </w:rPr>
+            </w:pPr>
+            <w:r>
+              <w:rPr>
+                <w:rFonts w:ascii="Arial" w:hAnsi="Arial" w:cs="Arial"/>
+                <w:lang w:val="es-CO"/>
+              </w:rPr>
+              <w:t>B6568-</w:t>
+            </w:r>
+          </w:p>
+          <w:p>
+            <w:pPr>
+              <w:rPr>
+                <w:rFonts w:ascii="Arial" w:hAnsi="Arial" w:cs="Arial"/>
+                <w:lang w:val="es-CO"/>
+              </w:rPr>
+            </w:pPr>
+            <w:r>
+              <w:rPr>
+                <w:rFonts w:ascii="Arial" w:hAnsi="Arial" w:cs="Arial"/>
+                <w:lang w:val="es-CO"/>
+              </w:rPr>
+              <w:t>B6586</w:t>
+            </w:r>
+          </w:p>
+        </w:tc>
+        <w:tc>
+          <w:tcPr>
+            <w:tcW w:w="823" w:type="dxa"/>
+          </w:tcPr>
+          <w:p>
+            <w:pPr>
+              <w:rPr>
+                <w:rFonts w:ascii="Arial" w:hAnsi="Arial" w:cs="Arial"/>
+                <w:lang w:val="es-CO"/>
+              </w:rPr>
+            </w:pPr>
+            <w:r>
+              <w:rPr>
+                <w:rFonts w:ascii="Arial" w:hAnsi="Arial" w:cs="Arial"/>
+                <w:lang w:val="es-CO"/>
+              </w:rPr>
+              <w:t>19</w:t>
+            </w:r>
+          </w:p>
+        </w:tc>
+      </w:tr>
+      <w:tr>
+        <w:tc>
+          <w:tcPr>
+            <w:tcW w:w="1165" w:type="dxa"/>
+          </w:tcPr>
+          <w:p>
+            <w:pPr>
+              <w:rPr>
+                <w:rFonts w:ascii="Arial" w:hAnsi="Arial" w:cs="Arial"/>
+                <w:lang w:val="es-CO"/>
+              </w:rPr>
+            </w:pPr>
+            <w:r>
+              <w:rPr>
+                <w:rFonts w:ascii="Arial" w:hAnsi="Arial" w:cs="Arial"/>
+                <w:lang w:val="es-CO"/>
+              </w:rPr>
+              <w:t>13PM</w:t>
+            </w:r>
+          </w:p>
+        </w:tc>
+        <w:tc>
+          <w:tcPr>
+            <w:tcW w:w="6570" w:type="dxa"/>
+          </w:tcPr>
+          <w:p>
+            <w:pPr>
+              <w:rPr>
+                <w:rFonts w:ascii="Arial" w:hAnsi="Arial" w:cs="Arial"/>
+                <w:lang w:val="es-CO"/>
+              </w:rPr>
+            </w:pPr>
+            <w:r>
+              <w:rPr>
+                <w:rFonts w:ascii="Arial" w:hAnsi="Arial" w:cs="Arial"/>
+                <w:lang w:val="es-CO"/>
+              </w:rPr>
+              <w:t>Población censada en hogares particulares, por auto reconocimiento étnico y áreas (Total, Cabecera y Centros poblados y Rural disperso), según Municipio y territorialidad étnica</w:t>
+            </w:r>
+          </w:p>
+        </w:tc>
+        <w:tc>
+          <w:tcPr>
+            <w:tcW w:w="1093" w:type="dxa"/>
+          </w:tcPr>
+          <w:p>
+            <w:pPr>
+              <w:rPr>
+                <w:rFonts w:ascii="Arial" w:hAnsi="Arial" w:cs="Arial"/>
+                <w:lang w:val="es-CO"/>
+              </w:rPr>
+            </w:pPr>
+            <w:r>
+              <w:rPr>
+                <w:rFonts w:ascii="Arial" w:hAnsi="Arial" w:cs="Arial"/>
+                <w:lang w:val="es-CO"/>
+              </w:rPr>
+              <w:t>B749-B751</w:t>
+            </w:r>
+          </w:p>
+        </w:tc>
+        <w:tc>
+          <w:tcPr>
+            <w:tcW w:w="823" w:type="dxa"/>
+          </w:tcPr>
+          <w:p>
+            <w:pPr>
+              <w:rPr>
+                <w:rFonts w:ascii="Arial" w:hAnsi="Arial" w:cs="Arial"/>
+                <w:lang w:val="es-CO"/>
+              </w:rPr>
+            </w:pPr>
+            <w:r>
+              <w:rPr>
+                <w:rFonts w:ascii="Arial" w:hAnsi="Arial" w:cs="Arial"/>
+                <w:lang w:val="es-CO"/>
+              </w:rPr>
+              <w:t>3</w:t>
+            </w:r>
+          </w:p>
+        </w:tc>
+      </w:tr>
+      <w:tr>
+        <w:tc>
+          <w:tcPr>
+            <w:tcW w:w="1165" w:type="dxa"/>
+          </w:tcPr>
+          <w:p>
+            <w:pPr>
+              <w:rPr>
+                <w:rFonts w:ascii="Arial" w:hAnsi="Arial" w:cs="Arial"/>
+                <w:lang w:val="es-CO"/>
+              </w:rPr>
+            </w:pPr>
+            <w:r>
+              <w:rPr>
+                <w:rFonts w:ascii="Arial" w:hAnsi="Arial" w:cs="Arial"/>
+                <w:lang w:val="es-CO"/>
+              </w:rPr>
+              <w:t>14PM</w:t>
+            </w:r>
+          </w:p>
+        </w:tc>
+        <w:tc>
+          <w:tcPr>
+            <w:tcW w:w="6570" w:type="dxa"/>
+          </w:tcPr>
+          <w:p>
+            <w:pPr>
+              <w:rPr>
+                <w:rFonts w:ascii="Arial" w:hAnsi="Arial" w:cs="Arial"/>
+                <w:lang w:val="es-CO"/>
+              </w:rPr>
+            </w:pPr>
+            <w:r>
+              <w:rPr>
+                <w:rFonts w:ascii="Arial" w:hAnsi="Arial" w:cs="Arial"/>
+                <w:lang w:val="es-CO"/>
+              </w:rPr>
+              <w:t xml:space="preserve">Población censada en hogares que en los últimos treinta días tuvieron alguna enfermedad, accidente, problema odontológico u otro problema de salud, por áreas (Total, </w:t>
+            </w:r>
+            <w:r>
+              <w:rPr>
+                <w:rFonts w:ascii="Arial" w:hAnsi="Arial" w:cs="Arial"/>
+                <w:lang w:val="es-CO"/>
+              </w:rPr>
+              <w:lastRenderedPageBreak/>
+              <w:t>Cabecera y Centros poblados y Rural disperso), servicio de salud al que hayan acudido por</w:t>
+            </w:r>
+          </w:p>
+        </w:tc>
+        <w:tc>
+          <w:tcPr>
+            <w:tcW w:w="1093" w:type="dxa"/>
+          </w:tcPr>
+          <w:p>
+            <w:pPr>
+              <w:rPr>
+                <w:rFonts w:ascii="Arial" w:hAnsi="Arial" w:cs="Arial"/>
+                <w:lang w:val="es-CO"/>
+              </w:rPr>
+            </w:pPr>
+            <w:r>
+              <w:rPr>
+                <w:rFonts w:ascii="Arial" w:hAnsi="Arial" w:cs="Arial"/>
+                <w:lang w:val="es-CO"/>
+              </w:rPr>
+              <w:lastRenderedPageBreak/>
+              <w:t>B19678-</w:t>
+            </w:r>
+          </w:p>
+          <w:p>
+            <w:pPr>
+              <w:rPr>
+                <w:rFonts w:ascii="Arial" w:hAnsi="Arial" w:cs="Arial"/>
+                <w:lang w:val="es-CO"/>
+              </w:rPr>
+            </w:pPr>
+            <w:r>
+              <w:rPr>
+                <w:rFonts w:ascii="Arial" w:hAnsi="Arial" w:cs="Arial"/>
+                <w:lang w:val="es-CO"/>
+              </w:rPr>
+              <w:t>B19734</w:t>
+            </w:r>
+          </w:p>
+        </w:tc>
+        <w:tc>
+          <w:tcPr>
+            <w:tcW w:w="823" w:type="dxa"/>
+          </w:tcPr>
+          <w:p>
+            <w:pPr>
+              <w:rPr>
+                <w:rFonts w:ascii="Arial" w:hAnsi="Arial" w:cs="Arial"/>
+                <w:lang w:val="es-CO"/>
+              </w:rPr>
+            </w:pPr>
+            <w:r>
+              <w:rPr>
+                <w:rFonts w:ascii="Arial" w:hAnsi="Arial" w:cs="Arial"/>
+                <w:lang w:val="es-CO"/>
+              </w:rPr>
+              <w:t>57</w:t>
+            </w:r>
+          </w:p>
+        </w:tc>
+      </w:tr>
+      <w:tr>
+        <w:tc>
+          <w:tcPr>
+            <w:tcW w:w="1165" w:type="dxa"/>
+          </w:tcPr>
+          <w:p>
+            <w:pPr>
+              <w:rPr>
+                <w:rFonts w:ascii="Arial" w:hAnsi="Arial" w:cs="Arial"/>
+                <w:lang w:val="es-CO"/>
+              </w:rPr>
+            </w:pPr>
+            <w:r>
+              <w:rPr>
+                <w:rFonts w:ascii="Arial" w:hAnsi="Arial" w:cs="Arial"/>
+                <w:lang w:val="es-CO"/>
+              </w:rPr>
+              <w:t>15PM</w:t>
+            </w:r>
+          </w:p>
+        </w:tc>
+        <w:tc>
+          <w:tcPr>
+            <w:tcW w:w="6570" w:type="dxa"/>
+          </w:tcPr>
+          <w:p>
+            <w:pPr>
+              <w:rPr>
+                <w:rFonts w:ascii="Arial" w:hAnsi="Arial" w:cs="Arial"/>
+                <w:lang w:val="es-CO"/>
+              </w:rPr>
+            </w:pPr>
+            <w:r>
+              <w:rPr>
+                <w:rFonts w:ascii="Arial" w:hAnsi="Arial" w:cs="Arial"/>
+                <w:lang w:val="es-CO"/>
+              </w:rPr>
+              <w:t xml:space="preserve">Población menor de 5 </w:t>
+            </w:r>
+            <w:r>
+              <w:rPr>
+                <w:rFonts w:ascii="Arial" w:hAnsi="Arial" w:cs="Arial"/>
+                <w:lang w:val="es-CO"/>
+              </w:rPr>
+              <w:t>años</w:t>
+            </w:r>
+            <w:r>
+              <w:rPr>
+                <w:rFonts w:ascii="Arial" w:hAnsi="Arial" w:cs="Arial"/>
+                <w:lang w:val="es-CO"/>
+              </w:rPr>
+              <w:t>, censada en hogares particulares, por dónde o con quién permanece durante la mayor parte del tiempo entre semana el menor, según municipios, áreas (Total, Cabecera y Centros poblados y Rural disperso), sexo y edades simpl</w:t>
+            </w:r>
+            <w:r>
+              <w:rPr>
+                <w:rFonts w:ascii="Arial" w:hAnsi="Arial" w:cs="Arial"/>
+                <w:lang w:val="es-CO"/>
+              </w:rPr>
+              <w:t>e</w:t>
+            </w:r>
+          </w:p>
+        </w:tc>
+        <w:tc>
+          <w:tcPr>
+            <w:tcW w:w="1093" w:type="dxa"/>
+          </w:tcPr>
+          <w:p>
+            <w:pPr>
+              <w:rPr>
+                <w:rFonts w:ascii="Arial" w:hAnsi="Arial" w:cs="Arial"/>
+                <w:lang w:val="es-CO"/>
+              </w:rPr>
+            </w:pPr>
+            <w:r>
+              <w:rPr>
+                <w:rFonts w:ascii="Arial" w:hAnsi="Arial" w:cs="Arial"/>
+                <w:lang w:val="es-CO"/>
+              </w:rPr>
+              <w:t>B22610-B22663</w:t>
+            </w:r>
+          </w:p>
+        </w:tc>
+        <w:tc>
+          <w:tcPr>
+            <w:tcW w:w="823" w:type="dxa"/>
+          </w:tcPr>
+          <w:p>
+            <w:pPr>
+              <w:rPr>
+                <w:rFonts w:ascii="Arial" w:hAnsi="Arial" w:cs="Arial"/>
+                <w:lang w:val="es-CO"/>
+              </w:rPr>
+            </w:pPr>
+            <w:r>
+              <w:rPr>
+                <w:rFonts w:ascii="Arial" w:hAnsi="Arial" w:cs="Arial"/>
+                <w:lang w:val="es-CO"/>
+              </w:rPr>
+              <w:t>54</w:t>
+            </w:r>
+          </w:p>
+        </w:tc>
+      </w:tr>
+      <w:tr>
+        <w:tc>
+          <w:tcPr>
+            <w:tcW w:w="1165" w:type="dxa"/>
+          </w:tcPr>
+          <w:p>
+            <w:pPr>
+              <w:rPr>
+                <w:rFonts w:ascii="Arial" w:hAnsi="Arial" w:cs="Arial"/>
+                <w:lang w:val="es-CO"/>
+              </w:rPr>
+            </w:pPr>
+            <w:r>
+              <w:rPr>
+                <w:rFonts w:ascii="Arial" w:hAnsi="Arial" w:cs="Arial"/>
+                <w:lang w:val="es-CO"/>
+              </w:rPr>
+              <w:t>16PM</w:t>
+            </w:r>
+          </w:p>
+        </w:tc>
+        <w:tc>
+          <w:tcPr>
+            <w:tcW w:w="6570" w:type="dxa"/>
+          </w:tcPr>
+          <w:p>
+            <w:pPr>
+              <w:rPr>
+                <w:rFonts w:ascii="Arial" w:hAnsi="Arial" w:cs="Arial"/>
+                <w:lang w:val="es-CO"/>
+              </w:rPr>
+            </w:pPr>
+            <w:r>
+              <w:rPr>
+                <w:rFonts w:ascii="Arial" w:hAnsi="Arial" w:cs="Arial"/>
+                <w:lang w:val="es-CO"/>
+              </w:rPr>
+              <w:t>Población censada en hogares particulares, por sexo y alfabetismo, según municipio, áreas (Total, Cabecera y Centros poblados y Rural disperso) y grandes grupos de edad</w:t>
+            </w:r>
+          </w:p>
+        </w:tc>
+        <w:tc>
+          <w:tcPr>
+            <w:tcW w:w="1093" w:type="dxa"/>
+          </w:tcPr>
+          <w:p>
+            <w:pPr>
+              <w:rPr>
+                <w:rFonts w:ascii="Arial" w:hAnsi="Arial" w:cs="Arial"/>
+                <w:lang w:val="es-CO"/>
+              </w:rPr>
+            </w:pPr>
+            <w:r>
+              <w:rPr>
+                <w:rFonts w:ascii="Arial" w:hAnsi="Arial" w:cs="Arial"/>
+                <w:lang w:val="es-CO"/>
+              </w:rPr>
+              <w:t>B3847-B3855</w:t>
+            </w:r>
+          </w:p>
+        </w:tc>
+        <w:tc>
+          <w:tcPr>
+            <w:tcW w:w="823" w:type="dxa"/>
+          </w:tcPr>
+          <w:p>
+            <w:pPr>
+              <w:rPr>
+                <w:rFonts w:ascii="Arial" w:hAnsi="Arial" w:cs="Arial"/>
+                <w:lang w:val="es-CO"/>
+              </w:rPr>
+            </w:pPr>
+            <w:r>
+              <w:rPr>
+                <w:rFonts w:ascii="Arial" w:hAnsi="Arial" w:cs="Arial"/>
+                <w:lang w:val="es-CO"/>
+              </w:rPr>
+              <w:t>9</w:t>
+            </w:r>
+          </w:p>
+        </w:tc>
+      </w:tr>
+      <w:tr>
+        <w:tc>
+          <w:tcPr>
+            <w:tcW w:w="1165" w:type="dxa"/>
+          </w:tcPr>
+          <w:p>
+            <w:pPr>
+              <w:rPr>
+                <w:rFonts w:ascii="Arial" w:hAnsi="Arial" w:cs="Arial"/>
+                <w:lang w:val="es-CO"/>
+              </w:rPr>
+            </w:pPr>
+            <w:r>
+              <w:rPr>
+                <w:rFonts w:ascii="Arial" w:hAnsi="Arial" w:cs="Arial"/>
+                <w:lang w:val="es-CO"/>
+              </w:rPr>
+              <w:t>17PM</w:t>
+            </w:r>
+          </w:p>
+        </w:tc>
+        <w:tc>
+          <w:tcPr>
+            <w:tcW w:w="6570" w:type="dxa"/>
+          </w:tcPr>
+          <w:p>
+            <w:pPr>
+              <w:rPr>
+                <w:rFonts w:ascii="Arial" w:hAnsi="Arial" w:cs="Arial"/>
+                <w:lang w:val="es-CO"/>
+              </w:rPr>
+            </w:pPr>
+            <w:r>
+              <w:rPr>
+                <w:rFonts w:ascii="Arial" w:hAnsi="Arial" w:cs="Arial"/>
+                <w:lang w:val="es-CO"/>
+              </w:rPr>
+              <w:t>Población censa da en hogares, de 5 años y más de edad, por asistencia escolar y sexo, según municipio y áreas y (Total, Cabecera y Centros poblados y Rural disperso) y grupos de edad escolar</w:t>
+            </w:r>
+          </w:p>
+        </w:tc>
+        <w:tc>
+          <w:tcPr>
+            <w:tcW w:w="1093" w:type="dxa"/>
+          </w:tcPr>
+          <w:p>
+            <w:pPr>
+              <w:rPr>
+                <w:rFonts w:ascii="Arial" w:hAnsi="Arial" w:cs="Arial"/>
+                <w:lang w:val="es-CO"/>
+              </w:rPr>
+            </w:pPr>
+            <w:r>
+              <w:rPr>
+                <w:rFonts w:ascii="Arial" w:hAnsi="Arial" w:cs="Arial"/>
+                <w:lang w:val="es-CO"/>
+              </w:rPr>
+              <w:t>B3846-</w:t>
+            </w:r>
+          </w:p>
+          <w:p>
+            <w:pPr>
+              <w:rPr>
+                <w:rFonts w:ascii="Arial" w:hAnsi="Arial" w:cs="Arial"/>
+                <w:lang w:val="es-CO"/>
+              </w:rPr>
+            </w:pPr>
+            <w:r>
+              <w:rPr>
+                <w:rFonts w:ascii="Arial" w:hAnsi="Arial" w:cs="Arial"/>
+                <w:lang w:val="es-CO"/>
+              </w:rPr>
+              <w:t>B3854</w:t>
+            </w:r>
+          </w:p>
+        </w:tc>
+        <w:tc>
+          <w:tcPr>
+            <w:tcW w:w="823" w:type="dxa"/>
+          </w:tcPr>
+          <w:p>
+            <w:pPr>
+              <w:rPr>
+                <w:rFonts w:ascii="Arial" w:hAnsi="Arial" w:cs="Arial"/>
+                <w:lang w:val="es-CO"/>
+              </w:rPr>
+            </w:pPr>
+            <w:r>
+              <w:rPr>
+                <w:rFonts w:ascii="Arial" w:hAnsi="Arial" w:cs="Arial"/>
+                <w:lang w:val="es-CO"/>
+              </w:rPr>
+              <w:t>9</w:t>
+            </w:r>
+          </w:p>
+        </w:tc>
+      </w:tr>
+      <w:tr>
+        <w:tc>
+          <w:tcPr>
+            <w:tcW w:w="1165" w:type="dxa"/>
+          </w:tcPr>
+          <w:p>
+            <w:pPr>
+              <w:rPr>
+                <w:rFonts w:ascii="Arial" w:hAnsi="Arial" w:cs="Arial"/>
+                <w:lang w:val="es-CO"/>
+              </w:rPr>
+            </w:pPr>
+            <w:r>
+              <w:rPr>
+                <w:rFonts w:ascii="Arial" w:hAnsi="Arial" w:cs="Arial"/>
+                <w:lang w:val="es-CO"/>
+              </w:rPr>
+              <w:t>18PM</w:t>
+            </w:r>
+          </w:p>
+        </w:tc>
+        <w:tc>
+          <w:tcPr>
+            <w:tcW w:w="6570" w:type="dxa"/>
+          </w:tcPr>
+          <w:p>
+            <w:pPr>
+              <w:rPr>
+                <w:rFonts w:ascii="Arial" w:hAnsi="Arial" w:cs="Arial"/>
+                <w:lang w:val="es-CO"/>
+              </w:rPr>
+            </w:pPr>
+            <w:r>
+              <w:rPr>
+                <w:rFonts w:ascii="Arial" w:hAnsi="Arial" w:cs="Arial"/>
+                <w:lang w:val="es-CO"/>
+              </w:rPr>
+              <w:t>Población censada en hogares particulares, de 5 años y más de edad, por asistencia escolar y sexo, según municipio y áreas y (Total, Cabecera y Centros poblados y Rural disperso) y grupos de edad escolar</w:t>
+            </w:r>
+          </w:p>
+        </w:tc>
+        <w:tc>
+          <w:tcPr>
+            <w:tcW w:w="1093" w:type="dxa"/>
+          </w:tcPr>
+          <w:p>
+            <w:pPr>
+              <w:rPr>
+                <w:rFonts w:ascii="Arial" w:hAnsi="Arial" w:cs="Arial"/>
+                <w:lang w:val="es-CO"/>
+              </w:rPr>
+            </w:pPr>
+            <w:r>
+              <w:rPr>
+                <w:rFonts w:ascii="Arial" w:hAnsi="Arial" w:cs="Arial"/>
+                <w:lang w:val="es-CO"/>
+              </w:rPr>
+              <w:t>B8959-</w:t>
+            </w:r>
+          </w:p>
+          <w:p>
+            <w:pPr>
+              <w:rPr>
+                <w:rFonts w:ascii="Arial" w:hAnsi="Arial" w:cs="Arial"/>
+                <w:lang w:val="es-CO"/>
+              </w:rPr>
+            </w:pPr>
+            <w:r>
+              <w:rPr>
+                <w:rFonts w:ascii="Arial" w:hAnsi="Arial" w:cs="Arial"/>
+                <w:lang w:val="es-CO"/>
+              </w:rPr>
+              <w:t>B8979</w:t>
+            </w:r>
+          </w:p>
+        </w:tc>
+        <w:tc>
+          <w:tcPr>
+            <w:tcW w:w="823" w:type="dxa"/>
+          </w:tcPr>
+          <w:p>
+            <w:pPr>
+              <w:rPr>
+                <w:rFonts w:ascii="Arial" w:hAnsi="Arial" w:cs="Arial"/>
+                <w:lang w:val="es-CO"/>
+              </w:rPr>
+            </w:pPr>
+            <w:r>
+              <w:rPr>
+                <w:rFonts w:ascii="Arial" w:hAnsi="Arial" w:cs="Arial"/>
+                <w:lang w:val="es-CO"/>
+              </w:rPr>
+              <w:t>21</w:t>
+            </w:r>
+          </w:p>
+        </w:tc>
+      </w:tr>
+      <w:tr>
+        <w:tc>
+          <w:tcPr>
+            <w:tcW w:w="1165" w:type="dxa"/>
+          </w:tcPr>
+          <w:p>
+            <w:pPr>
+              <w:rPr>
+                <w:rFonts w:ascii="Arial" w:hAnsi="Arial" w:cs="Arial"/>
+                <w:lang w:val="es-CO"/>
+              </w:rPr>
+            </w:pPr>
+            <w:r>
+              <w:rPr>
+                <w:rFonts w:ascii="Arial" w:hAnsi="Arial" w:cs="Arial"/>
+                <w:lang w:val="es-CO"/>
+              </w:rPr>
+              <w:t>19PM</w:t>
+            </w:r>
+          </w:p>
+        </w:tc>
+        <w:tc>
+          <w:tcPr>
+            <w:tcW w:w="6570" w:type="dxa"/>
+          </w:tcPr>
+          <w:p>
+            <w:pPr>
+              <w:rPr>
+                <w:rFonts w:ascii="Arial" w:hAnsi="Arial" w:cs="Arial"/>
+                <w:lang w:val="es-CO"/>
+              </w:rPr>
+            </w:pPr>
+            <w:r>
+              <w:rPr>
+                <w:rFonts w:ascii="Arial" w:hAnsi="Arial" w:cs="Arial"/>
+                <w:lang w:val="es-CO"/>
+              </w:rPr>
+              <w:t>Población censada en hogares particulares, de 5 años y más de edad, por asistencia escolar y sexo, según municipio, áreas (Total, Cabecera y Centros poblados y Rural disperso) y grupos de edad escolar</w:t>
+            </w:r>
+          </w:p>
+        </w:tc>
+        <w:tc>
+          <w:tcPr>
+            <w:tcW w:w="1093" w:type="dxa"/>
+          </w:tcPr>
+          <w:p>
+            <w:pPr>
+              <w:rPr>
+                <w:rFonts w:ascii="Arial" w:hAnsi="Arial" w:cs="Arial"/>
+                <w:lang w:val="es-CO"/>
+              </w:rPr>
+            </w:pPr>
+            <w:r>
+              <w:rPr>
+                <w:rFonts w:ascii="Arial" w:hAnsi="Arial" w:cs="Arial"/>
+                <w:lang w:val="es-CO"/>
+              </w:rPr>
+              <w:t>B18211-</w:t>
+            </w:r>
+          </w:p>
+          <w:p>
+            <w:pPr>
+              <w:rPr>
+                <w:rFonts w:ascii="Arial" w:hAnsi="Arial" w:cs="Arial"/>
+                <w:lang w:val="es-CO"/>
+              </w:rPr>
+            </w:pPr>
+            <w:r>
+              <w:rPr>
+                <w:rFonts w:ascii="Arial" w:hAnsi="Arial" w:cs="Arial"/>
+                <w:lang w:val="es-CO"/>
+              </w:rPr>
+              <w:t>B18263</w:t>
+            </w:r>
+          </w:p>
+        </w:tc>
+        <w:tc>
+          <w:tcPr>
+            <w:tcW w:w="823" w:type="dxa"/>
+          </w:tcPr>
+          <w:p>
+            <w:pPr>
+              <w:rPr>
+                <w:rFonts w:ascii="Arial" w:hAnsi="Arial" w:cs="Arial"/>
+                <w:lang w:val="es-CO"/>
+              </w:rPr>
+            </w:pPr>
+            <w:r>
+              <w:rPr>
+                <w:rFonts w:ascii="Arial" w:hAnsi="Arial" w:cs="Arial"/>
+                <w:lang w:val="es-CO"/>
+              </w:rPr>
+              <w:t>53</w:t>
+            </w:r>
+          </w:p>
+        </w:tc>
+      </w:tr>
+    </w:tbl>
     <w:p>
       <w:pPr>
         <w:rPr>

</xml_diff>

<commit_message>
Actualiza fuentes de datos con estructura de hoja 1PM
</commit_message>
<xml_diff>
--- a/Documentacion/Fuentes de Datos.docx
+++ b/Documentacion/Fuentes de Datos.docx
@@ -752,7 +752,27 @@
           <w:iCs/>
           <w:lang w:val="es-CO"/>
         </w:rPr>
-        <w:t>Censo Viterbo Caldas 2018/Data/Datasets/</w:t>
+        <w:t>Censo Viterbo Caldas 2018/Data/</w:t>
+      </w:r>
+      <w:proofErr w:type="spellStart"/>
+      <w:r>
+        <w:rPr>
+          <w:rFonts w:ascii="Arial" w:hAnsi="Arial" w:cs="Arial"/>
+          <w:i/>
+          <w:iCs/>
+          <w:lang w:val="es-CO"/>
+        </w:rPr>
+        <w:t>Datasets</w:t>
+      </w:r>
+      <w:proofErr w:type="spellEnd"/>
+      <w:r>
+        <w:rPr>
+          <w:rFonts w:ascii="Arial" w:hAnsi="Arial" w:cs="Arial"/>
+          <w:i/>
+          <w:iCs/>
+          <w:lang w:val="es-CO"/>
+        </w:rPr>
+        <w:t>/</w:t>
       </w:r>
     </w:p>
     <w:p>
@@ -1945,21 +1965,7 @@
                 <w:rFonts w:ascii="Arial" w:hAnsi="Arial" w:cs="Arial"/>
                 <w:lang w:val="es-CO"/>
               </w:rPr>
-              <w:t xml:space="preserve">Población menor de 5 </w:t>
-            </w:r>
-            <w:r>
-              <w:rPr>
-                <w:rFonts w:ascii="Arial" w:hAnsi="Arial" w:cs="Arial"/>
-                <w:lang w:val="es-CO"/>
-              </w:rPr>
-              <w:t>años</w:t>
-            </w:r>
-            <w:r>
-              <w:rPr>
-                <w:rFonts w:ascii="Arial" w:hAnsi="Arial" w:cs="Arial"/>
-                <w:lang w:val="es-CO"/>
-              </w:rPr>
-              <w:t>, censada en hogares particulares, por dónde o con quién permanece durante la mayor parte del tiempo entre semana el menor, según municipios, áreas (Total, Cabecera y Centros poblados y Rural disperso), sexo y edades simpl</w:t>
+              <w:t>Población menor de 5 años, censada en hogares particulares, por dónde o con quién permanece durante la mayor parte del tiempo entre semana el menor, según municipios, áreas (Total, Cabecera y Centros poblados y Rural disperso), sexo y edades simpl</w:t>
             </w:r>
             <w:r>
               <w:rPr>
@@ -2400,6 +2406,360 @@
           <w:lang w:val="es-CO"/>
         </w:rPr>
       </w:pPr>
+    </w:p>
+    <w:p>
+      <w:pPr>
+        <w:rPr>
+          <w:rFonts w:ascii="Arial" w:hAnsi="Arial" w:cs="Arial"/>
+          <w:b/>
+          <w:bCs/>
+          <w:lang w:val="es-CO"/>
+        </w:rPr>
+      </w:pPr>
+      <w:r>
+        <w:rPr>
+          <w:rFonts w:ascii="Arial" w:hAnsi="Arial" w:cs="Arial"/>
+          <w:b/>
+          <w:bCs/>
+          <w:lang w:val="es-CO"/>
+        </w:rPr>
+        <w:t>Estructura de hojas</w:t>
+      </w:r>
+    </w:p>
+    <w:p>
+      <w:pPr>
+        <w:rPr>
+          <w:rFonts w:ascii="Arial" w:hAnsi="Arial" w:cs="Arial"/>
+          <w:b/>
+          <w:bCs/>
+          <w:lang w:val="es-CO"/>
+        </w:rPr>
+      </w:pPr>
+      <w:r>
+        <w:rPr>
+          <w:rFonts w:ascii="Arial" w:hAnsi="Arial" w:cs="Arial"/>
+          <w:b/>
+          <w:bCs/>
+          <w:lang w:val="es-CO"/>
+        </w:rPr>
+        <w:t>1PM</w:t>
+      </w:r>
+    </w:p>
+    <w:p>
+      <w:pPr>
+        <w:rPr>
+          <w:rFonts w:ascii="Arial" w:hAnsi="Arial" w:cs="Arial"/>
+          <w:lang w:val="es-CO"/>
+        </w:rPr>
+      </w:pPr>
+      <w:r>
+        <w:rPr>
+          <w:rFonts w:ascii="Arial" w:hAnsi="Arial" w:cs="Arial"/>
+          <w:lang w:val="es-CO"/>
+        </w:rPr>
+        <w:t>Contiene 6 columnas y 4 agrupaciones.</w:t>
+      </w:r>
+    </w:p>
+    <w:p>
+      <w:pPr>
+        <w:rPr>
+          <w:rFonts w:ascii="Arial" w:hAnsi="Arial" w:cs="Arial"/>
+          <w:lang w:val="es-CO"/>
+        </w:rPr>
+      </w:pPr>
+      <w:r>
+        <w:rPr>
+          <w:rFonts w:ascii="Arial" w:hAnsi="Arial" w:cs="Arial"/>
+          <w:lang w:val="es-CO"/>
+        </w:rPr>
+        <w:t>Columnas:</w:t>
+      </w:r>
+    </w:p>
+    <w:p>
+      <w:pPr>
+        <w:pStyle w:val="Prrafodelista"/>
+        <w:numPr>
+          <w:ilvl w:val="0"/>
+          <w:numId w:val="2"/>
+        </w:numPr>
+        <w:rPr>
+          <w:rFonts w:ascii="Arial" w:hAnsi="Arial" w:cs="Arial"/>
+          <w:lang w:val="es-CO"/>
+        </w:rPr>
+      </w:pPr>
+      <w:r>
+        <w:rPr>
+          <w:rFonts w:ascii="Arial" w:hAnsi="Arial" w:cs="Arial"/>
+          <w:lang w:val="es-CO"/>
+        </w:rPr>
+        <w:t>Grupos de edad</w:t>
+      </w:r>
+      <w:r>
+        <w:rPr>
+          <w:rFonts w:ascii="Arial" w:hAnsi="Arial" w:cs="Arial"/>
+          <w:lang w:val="es-CO"/>
+        </w:rPr>
+        <w:t xml:space="preserve"> (texto): Rango de edad.</w:t>
+      </w:r>
+    </w:p>
+    <w:p>
+      <w:pPr>
+        <w:pStyle w:val="Prrafodelista"/>
+        <w:numPr>
+          <w:ilvl w:val="0"/>
+          <w:numId w:val="2"/>
+        </w:numPr>
+        <w:rPr>
+          <w:rFonts w:ascii="Arial" w:hAnsi="Arial" w:cs="Arial"/>
+          <w:lang w:val="es-CO"/>
+        </w:rPr>
+      </w:pPr>
+      <w:r>
+        <w:rPr>
+          <w:rFonts w:ascii="Arial" w:hAnsi="Arial" w:cs="Arial"/>
+          <w:lang w:val="es-CO"/>
+        </w:rPr>
+        <w:t>Total</w:t>
+      </w:r>
+      <w:r>
+        <w:rPr>
+          <w:rFonts w:ascii="Arial" w:hAnsi="Arial" w:cs="Arial"/>
+          <w:lang w:val="es-CO"/>
+        </w:rPr>
+        <w:t xml:space="preserve"> (entero): Cantidad total.</w:t>
+      </w:r>
+    </w:p>
+    <w:p>
+      <w:pPr>
+        <w:pStyle w:val="Prrafodelista"/>
+        <w:numPr>
+          <w:ilvl w:val="0"/>
+          <w:numId w:val="2"/>
+        </w:numPr>
+        <w:rPr>
+          <w:rFonts w:ascii="Arial" w:hAnsi="Arial" w:cs="Arial"/>
+          <w:lang w:val="es-CO"/>
+        </w:rPr>
+      </w:pPr>
+      <w:r>
+        <w:rPr>
+          <w:rFonts w:ascii="Arial" w:hAnsi="Arial" w:cs="Arial"/>
+          <w:lang w:val="es-CO"/>
+        </w:rPr>
+        <w:t>Hombre</w:t>
+      </w:r>
+      <w:r>
+        <w:rPr>
+          <w:rFonts w:ascii="Arial" w:hAnsi="Arial" w:cs="Arial"/>
+          <w:lang w:val="es-CO"/>
+        </w:rPr>
+        <w:t xml:space="preserve"> (entero): Cantidad de hombres.</w:t>
+      </w:r>
+    </w:p>
+    <w:p>
+      <w:pPr>
+        <w:pStyle w:val="Prrafodelista"/>
+        <w:numPr>
+          <w:ilvl w:val="0"/>
+          <w:numId w:val="2"/>
+        </w:numPr>
+        <w:rPr>
+          <w:rFonts w:ascii="Arial" w:hAnsi="Arial" w:cs="Arial"/>
+          <w:lang w:val="es-CO"/>
+        </w:rPr>
+      </w:pPr>
+      <w:r>
+        <w:rPr>
+          <w:rFonts w:ascii="Arial" w:hAnsi="Arial" w:cs="Arial"/>
+          <w:lang w:val="es-CO"/>
+        </w:rPr>
+        <w:t>Sexo Mujer</w:t>
+      </w:r>
+      <w:r>
+        <w:rPr>
+          <w:rFonts w:ascii="Arial" w:hAnsi="Arial" w:cs="Arial"/>
+          <w:lang w:val="es-CO"/>
+        </w:rPr>
+        <w:t xml:space="preserve"> (entero): Cantidad de mujeres.</w:t>
+      </w:r>
+    </w:p>
+    <w:p>
+      <w:pPr>
+        <w:pStyle w:val="Prrafodelista"/>
+        <w:numPr>
+          <w:ilvl w:val="0"/>
+          <w:numId w:val="2"/>
+        </w:numPr>
+        <w:rPr>
+          <w:rFonts w:ascii="Arial" w:hAnsi="Arial" w:cs="Arial"/>
+          <w:lang w:val="es-CO"/>
+        </w:rPr>
+      </w:pPr>
+      <w:r>
+        <w:rPr>
+          <w:rFonts w:ascii="Arial" w:hAnsi="Arial" w:cs="Arial"/>
+          <w:lang w:val="es-CO"/>
+        </w:rPr>
+        <w:t>Índice de masculinidad</w:t>
+      </w:r>
+      <w:r>
+        <w:rPr>
+          <w:rFonts w:ascii="Arial" w:hAnsi="Arial" w:cs="Arial"/>
+          <w:lang w:val="es-CO"/>
+        </w:rPr>
+        <w:t xml:space="preserve"> (decimal): índice de masculinidad.</w:t>
+      </w:r>
+    </w:p>
+    <w:p>
+      <w:pPr>
+        <w:pStyle w:val="Prrafodelista"/>
+        <w:numPr>
+          <w:ilvl w:val="0"/>
+          <w:numId w:val="2"/>
+        </w:numPr>
+        <w:rPr>
+          <w:rFonts w:ascii="Arial" w:hAnsi="Arial" w:cs="Arial"/>
+          <w:lang w:val="es-CO"/>
+        </w:rPr>
+      </w:pPr>
+      <w:r>
+        <w:rPr>
+          <w:rFonts w:ascii="Arial" w:hAnsi="Arial" w:cs="Arial"/>
+          <w:lang w:val="es-CO"/>
+        </w:rPr>
+        <w:t>Índice de feminidad</w:t>
+      </w:r>
+      <w:r>
+        <w:rPr>
+          <w:rFonts w:ascii="Arial" w:hAnsi="Arial" w:cs="Arial"/>
+          <w:lang w:val="es-CO"/>
+        </w:rPr>
+        <w:t xml:space="preserve"> (decimal): índice de feminidad.</w:t>
+      </w:r>
+    </w:p>
+    <w:p>
+      <w:pPr>
+        <w:rPr>
+          <w:rFonts w:ascii="Arial" w:hAnsi="Arial" w:cs="Arial"/>
+          <w:lang w:val="es-CO"/>
+        </w:rPr>
+      </w:pPr>
+      <w:r>
+        <w:rPr>
+          <w:rFonts w:ascii="Arial" w:hAnsi="Arial" w:cs="Arial"/>
+          <w:lang w:val="es-CO"/>
+        </w:rPr>
+        <w:t>Agrupaciones:</w:t>
+      </w:r>
+    </w:p>
+    <w:p>
+      <w:pPr>
+        <w:pStyle w:val="Prrafodelista"/>
+        <w:numPr>
+          <w:ilvl w:val="0"/>
+          <w:numId w:val="3"/>
+        </w:numPr>
+        <w:rPr>
+          <w:rFonts w:ascii="Arial" w:hAnsi="Arial" w:cs="Arial"/>
+          <w:lang w:val="es-CO"/>
+        </w:rPr>
+      </w:pPr>
+      <w:r>
+        <w:rPr>
+          <w:rFonts w:ascii="Arial" w:hAnsi="Arial" w:cs="Arial"/>
+          <w:lang w:val="es-CO"/>
+        </w:rPr>
+        <w:t>Total</w:t>
+      </w:r>
+      <w:r>
+        <w:rPr>
+          <w:rFonts w:ascii="Arial" w:hAnsi="Arial" w:cs="Arial"/>
+          <w:lang w:val="es-CO"/>
+        </w:rPr>
+        <w:t>: Grupo con resumen de datos totales.</w:t>
+      </w:r>
+    </w:p>
+    <w:p>
+      <w:pPr>
+        <w:pStyle w:val="Prrafodelista"/>
+        <w:numPr>
+          <w:ilvl w:val="0"/>
+          <w:numId w:val="3"/>
+        </w:numPr>
+        <w:rPr>
+          <w:rFonts w:ascii="Arial" w:hAnsi="Arial" w:cs="Arial"/>
+          <w:lang w:val="es-CO"/>
+        </w:rPr>
+      </w:pPr>
+      <w:r>
+        <w:rPr>
+          <w:rFonts w:ascii="Arial" w:hAnsi="Arial" w:cs="Arial"/>
+          <w:lang w:val="es-CO"/>
+        </w:rPr>
+        <w:t>Cabecera</w:t>
+      </w:r>
+      <w:r>
+        <w:rPr>
+          <w:rFonts w:ascii="Arial" w:hAnsi="Arial" w:cs="Arial"/>
+          <w:lang w:val="es-CO"/>
+        </w:rPr>
+        <w:t>: Grupo con resumen de datos correspondientes a las cabeceras municipales</w:t>
+      </w:r>
+    </w:p>
+    <w:p>
+      <w:pPr>
+        <w:pStyle w:val="Prrafodelista"/>
+        <w:numPr>
+          <w:ilvl w:val="0"/>
+          <w:numId w:val="3"/>
+        </w:numPr>
+        <w:rPr>
+          <w:rFonts w:ascii="Arial" w:hAnsi="Arial" w:cs="Arial"/>
+          <w:lang w:val="es-CO"/>
+        </w:rPr>
+      </w:pPr>
+      <w:r>
+        <w:rPr>
+          <w:rFonts w:ascii="Arial" w:hAnsi="Arial" w:cs="Arial"/>
+          <w:lang w:val="es-CO"/>
+        </w:rPr>
+        <w:lastRenderedPageBreak/>
+        <w:t>Centro Poblado</w:t>
+      </w:r>
+      <w:r>
+        <w:rPr>
+          <w:rFonts w:ascii="Arial" w:hAnsi="Arial" w:cs="Arial"/>
+          <w:lang w:val="es-CO"/>
+        </w:rPr>
+        <w:t>: Grupo con resumen de datos correspondientes a centros poblados.</w:t>
+      </w:r>
+    </w:p>
+    <w:p>
+      <w:pPr>
+        <w:pStyle w:val="Prrafodelista"/>
+        <w:numPr>
+          <w:ilvl w:val="0"/>
+          <w:numId w:val="3"/>
+        </w:numPr>
+        <w:rPr>
+          <w:rFonts w:ascii="Arial" w:hAnsi="Arial" w:cs="Arial"/>
+          <w:lang w:val="es-CO"/>
+        </w:rPr>
+      </w:pPr>
+      <w:r>
+        <w:rPr>
+          <w:rFonts w:ascii="Arial" w:hAnsi="Arial" w:cs="Arial"/>
+          <w:lang w:val="es-CO"/>
+        </w:rPr>
+        <w:t>Rural disperso</w:t>
+      </w:r>
+      <w:r>
+        <w:rPr>
+          <w:rFonts w:ascii="Arial" w:hAnsi="Arial" w:cs="Arial"/>
+          <w:lang w:val="es-CO"/>
+        </w:rPr>
+        <w:t>: Grupo con resumen de datos correspondientes a ciudadanos que habitan en las zonas rurales, pero no en centros poblados.</w:t>
+      </w:r>
     </w:p>
     <w:sectPr>
       <w:pgSz w:w="12240" w:h="15840"/>
@@ -2414,9 +2774,9 @@
 <file path=word/numbering.xml><?xml version="1.0" encoding="utf-8"?>
 <w:numbering xmlns:wpc="http://schemas.microsoft.com/office/word/2010/wordprocessingCanvas" xmlns:cx="http://schemas.microsoft.com/office/drawing/2014/chartex" xmlns:cx1="http://schemas.microsoft.com/office/drawing/2015/9/8/chartex" xmlns:cx2="http://schemas.microsoft.com/office/drawing/2015/10/21/chartex" xmlns:cx3="http://schemas.microsoft.com/office/drawing/2016/5/9/chartex" xmlns:cx4="http://schemas.microsoft.com/office/drawing/2016/5/10/chartex" xmlns:cx5="http://schemas.microsoft.com/office/drawing/2016/5/11/chartex" xmlns:cx6="http://schemas.microsoft.com/office/drawing/2016/5/12/chartex" xmlns:cx7="http://schemas.microsoft.com/office/drawing/2016/5/13/chartex" xmlns:cx8="http://schemas.microsoft.com/office/drawing/2016/5/14/chartex" xmlns:mc="http://schemas.openxmlformats.org/markup-compatibility/2006" xmlns:aink="http://schemas.microsoft.com/office/drawing/2016/ink" xmlns:am3d="http://schemas.microsoft.com/office/drawing/2017/model3d" xmlns:o="urn:schemas-microsoft-com:office:office" xmlns:oel="http://schemas.microsoft.com/office/2019/extlst" xmlns:r="http://schemas.openxmlformats.org/officeDocument/2006/relationships" xmlns:m="http://schemas.openxmlformats.org/officeDocument/2006/math" xmlns:v="urn:schemas-microsoft-com:vml" xmlns:wp14="http://schemas.microsoft.com/office/word/2010/wordprocessingDrawing" xmlns:wp="http://schemas.openxmlformats.org/drawingml/2006/wordprocessingDrawing" xmlns:w10="urn:schemas-microsoft-com:office:word" xmlns:w="http://schemas.openxmlformats.org/wordprocessingml/2006/main" xmlns:w14="http://schemas.microsoft.com/office/word/2010/wordml" xmlns:w15="http://schemas.microsoft.com/office/word/2012/wordml" xmlns:w16cex="http://schemas.microsoft.com/office/word/2018/wordml/cex" xmlns:w16cid="http://schemas.microsoft.com/office/word/2016/wordml/cid" xmlns:w16="http://schemas.microsoft.com/office/word/2018/wordml" xmlns:w16du="http://schemas.microsoft.com/office/word/2023/wordml/word16du" xmlns:w16sdtdh="http://schemas.microsoft.com/office/word/2020/wordml/sdtdatahash" xmlns:w16sdtfl="http://schemas.microsoft.com/office/word/2024/wordml/sdtformatlock" xmlns:w16se="http://schemas.microsoft.com/office/word/2015/wordml/symex" xmlns:wpg="http://schemas.microsoft.com/office/word/2010/wordprocessingGroup" xmlns:wpi="http://schemas.microsoft.com/office/word/2010/wordprocessingInk" xmlns:wne="http://schemas.microsoft.com/office/word/2006/wordml" xmlns:wps="http://schemas.microsoft.com/office/word/2010/wordprocessingShape" mc:Ignorable="w14 w15 w16se w16cid w16 w16cex w16sdtdh w16sdtfl w16du wp14">
   <w:abstractNum w:abstractNumId="0" w15:restartNumberingAfterBreak="0">
-    <w:nsid w:val="608B0027"/>
+    <w:nsid w:val="52D63117"/>
     <w:multiLevelType w:val="hybridMultilevel"/>
-    <w:tmpl w:val="1A2A0CCE"/>
+    <w:tmpl w:val="036E0984"/>
     <w:lvl w:ilvl="0" w:tplc="04090001">
       <w:start w:val="1"/>
       <w:numFmt w:val="bullet"/>
@@ -2526,7 +2886,239 @@
       </w:rPr>
     </w:lvl>
   </w:abstractNum>
+  <w:abstractNum w:abstractNumId="1" w15:restartNumberingAfterBreak="0">
+    <w:nsid w:val="608B0027"/>
+    <w:multiLevelType w:val="hybridMultilevel"/>
+    <w:tmpl w:val="1A2A0CCE"/>
+    <w:lvl w:ilvl="0" w:tplc="04090001">
+      <w:start w:val="1"/>
+      <w:numFmt w:val="bullet"/>
+      <w:lvlText w:val=""/>
+      <w:lvlJc w:val="left"/>
+      <w:pPr>
+        <w:ind w:left="720" w:hanging="360"/>
+      </w:pPr>
+      <w:rPr>
+        <w:rFonts w:ascii="Symbol" w:hAnsi="Symbol" w:hint="default"/>
+      </w:rPr>
+    </w:lvl>
+    <w:lvl w:ilvl="1" w:tplc="04090003" w:tentative="1">
+      <w:start w:val="1"/>
+      <w:numFmt w:val="bullet"/>
+      <w:lvlText w:val="o"/>
+      <w:lvlJc w:val="left"/>
+      <w:pPr>
+        <w:ind w:left="1440" w:hanging="360"/>
+      </w:pPr>
+      <w:rPr>
+        <w:rFonts w:ascii="Courier New" w:hAnsi="Courier New" w:cs="Courier New" w:hint="default"/>
+      </w:rPr>
+    </w:lvl>
+    <w:lvl w:ilvl="2" w:tplc="04090005" w:tentative="1">
+      <w:start w:val="1"/>
+      <w:numFmt w:val="bullet"/>
+      <w:lvlText w:val=""/>
+      <w:lvlJc w:val="left"/>
+      <w:pPr>
+        <w:ind w:left="2160" w:hanging="360"/>
+      </w:pPr>
+      <w:rPr>
+        <w:rFonts w:ascii="Wingdings" w:hAnsi="Wingdings" w:hint="default"/>
+      </w:rPr>
+    </w:lvl>
+    <w:lvl w:ilvl="3" w:tplc="04090001" w:tentative="1">
+      <w:start w:val="1"/>
+      <w:numFmt w:val="bullet"/>
+      <w:lvlText w:val=""/>
+      <w:lvlJc w:val="left"/>
+      <w:pPr>
+        <w:ind w:left="2880" w:hanging="360"/>
+      </w:pPr>
+      <w:rPr>
+        <w:rFonts w:ascii="Symbol" w:hAnsi="Symbol" w:hint="default"/>
+      </w:rPr>
+    </w:lvl>
+    <w:lvl w:ilvl="4" w:tplc="04090003" w:tentative="1">
+      <w:start w:val="1"/>
+      <w:numFmt w:val="bullet"/>
+      <w:lvlText w:val="o"/>
+      <w:lvlJc w:val="left"/>
+      <w:pPr>
+        <w:ind w:left="3600" w:hanging="360"/>
+      </w:pPr>
+      <w:rPr>
+        <w:rFonts w:ascii="Courier New" w:hAnsi="Courier New" w:cs="Courier New" w:hint="default"/>
+      </w:rPr>
+    </w:lvl>
+    <w:lvl w:ilvl="5" w:tplc="04090005" w:tentative="1">
+      <w:start w:val="1"/>
+      <w:numFmt w:val="bullet"/>
+      <w:lvlText w:val=""/>
+      <w:lvlJc w:val="left"/>
+      <w:pPr>
+        <w:ind w:left="4320" w:hanging="360"/>
+      </w:pPr>
+      <w:rPr>
+        <w:rFonts w:ascii="Wingdings" w:hAnsi="Wingdings" w:hint="default"/>
+      </w:rPr>
+    </w:lvl>
+    <w:lvl w:ilvl="6" w:tplc="04090001" w:tentative="1">
+      <w:start w:val="1"/>
+      <w:numFmt w:val="bullet"/>
+      <w:lvlText w:val=""/>
+      <w:lvlJc w:val="left"/>
+      <w:pPr>
+        <w:ind w:left="5040" w:hanging="360"/>
+      </w:pPr>
+      <w:rPr>
+        <w:rFonts w:ascii="Symbol" w:hAnsi="Symbol" w:hint="default"/>
+      </w:rPr>
+    </w:lvl>
+    <w:lvl w:ilvl="7" w:tplc="04090003" w:tentative="1">
+      <w:start w:val="1"/>
+      <w:numFmt w:val="bullet"/>
+      <w:lvlText w:val="o"/>
+      <w:lvlJc w:val="left"/>
+      <w:pPr>
+        <w:ind w:left="5760" w:hanging="360"/>
+      </w:pPr>
+      <w:rPr>
+        <w:rFonts w:ascii="Courier New" w:hAnsi="Courier New" w:cs="Courier New" w:hint="default"/>
+      </w:rPr>
+    </w:lvl>
+    <w:lvl w:ilvl="8" w:tplc="04090005" w:tentative="1">
+      <w:start w:val="1"/>
+      <w:numFmt w:val="bullet"/>
+      <w:lvlText w:val=""/>
+      <w:lvlJc w:val="left"/>
+      <w:pPr>
+        <w:ind w:left="6480" w:hanging="360"/>
+      </w:pPr>
+      <w:rPr>
+        <w:rFonts w:ascii="Wingdings" w:hAnsi="Wingdings" w:hint="default"/>
+      </w:rPr>
+    </w:lvl>
+  </w:abstractNum>
+  <w:abstractNum w:abstractNumId="2" w15:restartNumberingAfterBreak="0">
+    <w:nsid w:val="6EF91E29"/>
+    <w:multiLevelType w:val="hybridMultilevel"/>
+    <w:tmpl w:val="90A0CFD2"/>
+    <w:lvl w:ilvl="0" w:tplc="04090001">
+      <w:start w:val="1"/>
+      <w:numFmt w:val="bullet"/>
+      <w:lvlText w:val=""/>
+      <w:lvlJc w:val="left"/>
+      <w:pPr>
+        <w:ind w:left="720" w:hanging="360"/>
+      </w:pPr>
+      <w:rPr>
+        <w:rFonts w:ascii="Symbol" w:hAnsi="Symbol" w:hint="default"/>
+      </w:rPr>
+    </w:lvl>
+    <w:lvl w:ilvl="1" w:tplc="04090003" w:tentative="1">
+      <w:start w:val="1"/>
+      <w:numFmt w:val="bullet"/>
+      <w:lvlText w:val="o"/>
+      <w:lvlJc w:val="left"/>
+      <w:pPr>
+        <w:ind w:left="1440" w:hanging="360"/>
+      </w:pPr>
+      <w:rPr>
+        <w:rFonts w:ascii="Courier New" w:hAnsi="Courier New" w:cs="Courier New" w:hint="default"/>
+      </w:rPr>
+    </w:lvl>
+    <w:lvl w:ilvl="2" w:tplc="04090005" w:tentative="1">
+      <w:start w:val="1"/>
+      <w:numFmt w:val="bullet"/>
+      <w:lvlText w:val=""/>
+      <w:lvlJc w:val="left"/>
+      <w:pPr>
+        <w:ind w:left="2160" w:hanging="360"/>
+      </w:pPr>
+      <w:rPr>
+        <w:rFonts w:ascii="Wingdings" w:hAnsi="Wingdings" w:hint="default"/>
+      </w:rPr>
+    </w:lvl>
+    <w:lvl w:ilvl="3" w:tplc="04090001" w:tentative="1">
+      <w:start w:val="1"/>
+      <w:numFmt w:val="bullet"/>
+      <w:lvlText w:val=""/>
+      <w:lvlJc w:val="left"/>
+      <w:pPr>
+        <w:ind w:left="2880" w:hanging="360"/>
+      </w:pPr>
+      <w:rPr>
+        <w:rFonts w:ascii="Symbol" w:hAnsi="Symbol" w:hint="default"/>
+      </w:rPr>
+    </w:lvl>
+    <w:lvl w:ilvl="4" w:tplc="04090003" w:tentative="1">
+      <w:start w:val="1"/>
+      <w:numFmt w:val="bullet"/>
+      <w:lvlText w:val="o"/>
+      <w:lvlJc w:val="left"/>
+      <w:pPr>
+        <w:ind w:left="3600" w:hanging="360"/>
+      </w:pPr>
+      <w:rPr>
+        <w:rFonts w:ascii="Courier New" w:hAnsi="Courier New" w:cs="Courier New" w:hint="default"/>
+      </w:rPr>
+    </w:lvl>
+    <w:lvl w:ilvl="5" w:tplc="04090005" w:tentative="1">
+      <w:start w:val="1"/>
+      <w:numFmt w:val="bullet"/>
+      <w:lvlText w:val=""/>
+      <w:lvlJc w:val="left"/>
+      <w:pPr>
+        <w:ind w:left="4320" w:hanging="360"/>
+      </w:pPr>
+      <w:rPr>
+        <w:rFonts w:ascii="Wingdings" w:hAnsi="Wingdings" w:hint="default"/>
+      </w:rPr>
+    </w:lvl>
+    <w:lvl w:ilvl="6" w:tplc="04090001" w:tentative="1">
+      <w:start w:val="1"/>
+      <w:numFmt w:val="bullet"/>
+      <w:lvlText w:val=""/>
+      <w:lvlJc w:val="left"/>
+      <w:pPr>
+        <w:ind w:left="5040" w:hanging="360"/>
+      </w:pPr>
+      <w:rPr>
+        <w:rFonts w:ascii="Symbol" w:hAnsi="Symbol" w:hint="default"/>
+      </w:rPr>
+    </w:lvl>
+    <w:lvl w:ilvl="7" w:tplc="04090003" w:tentative="1">
+      <w:start w:val="1"/>
+      <w:numFmt w:val="bullet"/>
+      <w:lvlText w:val="o"/>
+      <w:lvlJc w:val="left"/>
+      <w:pPr>
+        <w:ind w:left="5760" w:hanging="360"/>
+      </w:pPr>
+      <w:rPr>
+        <w:rFonts w:ascii="Courier New" w:hAnsi="Courier New" w:cs="Courier New" w:hint="default"/>
+      </w:rPr>
+    </w:lvl>
+    <w:lvl w:ilvl="8" w:tplc="04090005" w:tentative="1">
+      <w:start w:val="1"/>
+      <w:numFmt w:val="bullet"/>
+      <w:lvlText w:val=""/>
+      <w:lvlJc w:val="left"/>
+      <w:pPr>
+        <w:ind w:left="6480" w:hanging="360"/>
+      </w:pPr>
+      <w:rPr>
+        <w:rFonts w:ascii="Wingdings" w:hAnsi="Wingdings" w:hint="default"/>
+      </w:rPr>
+    </w:lvl>
+  </w:abstractNum>
   <w:num w:numId="1" w16cid:durableId="824902107">
+    <w:abstractNumId w:val="1"/>
+  </w:num>
+  <w:num w:numId="2" w16cid:durableId="617299781">
+    <w:abstractNumId w:val="2"/>
+  </w:num>
+  <w:num w:numId="3" w16cid:durableId="1048263498">
     <w:abstractNumId w:val="0"/>
   </w:num>
 </w:numbering>

</xml_diff>

<commit_message>
Actualiza fuentes de datos con hoja 3PM
</commit_message>
<xml_diff>
--- a/Documentacion/Fuentes de Datos.docx
+++ b/Documentacion/Fuentes de Datos.docx
@@ -107,7 +107,7 @@
           <w:rFonts w:ascii="Arial" w:hAnsi="Arial" w:cs="Arial"/>
           <w:lang w:val="es-CO"/>
         </w:rPr>
-        <w:t>5</w:t>
+        <w:t>8</w:t>
       </w:r>
       <w:r>
         <w:rPr>
@@ -752,27 +752,7 @@
           <w:iCs/>
           <w:lang w:val="es-CO"/>
         </w:rPr>
-        <w:t>Censo Viterbo Caldas 2018/Data/</w:t>
-      </w:r>
-      <w:proofErr w:type="spellStart"/>
-      <w:r>
-        <w:rPr>
-          <w:rFonts w:ascii="Arial" w:hAnsi="Arial" w:cs="Arial"/>
-          <w:i/>
-          <w:iCs/>
-          <w:lang w:val="es-CO"/>
-        </w:rPr>
-        <w:t>Datasets</w:t>
-      </w:r>
-      <w:proofErr w:type="spellEnd"/>
-      <w:r>
-        <w:rPr>
-          <w:rFonts w:ascii="Arial" w:hAnsi="Arial" w:cs="Arial"/>
-          <w:i/>
-          <w:iCs/>
-          <w:lang w:val="es-CO"/>
-        </w:rPr>
-        <w:t>/</w:t>
+        <w:t>Censo Viterbo Caldas 2018/Data/Datasets/</w:t>
       </w:r>
     </w:p>
     <w:p>
@@ -2546,6 +2526,13 @@
           <w:rFonts w:ascii="Arial" w:hAnsi="Arial" w:cs="Arial"/>
           <w:lang w:val="es-CO"/>
         </w:rPr>
+        <w:t xml:space="preserve">Sexo </w:t>
+      </w:r>
+      <w:r>
+        <w:rPr>
+          <w:rFonts w:ascii="Arial" w:hAnsi="Arial" w:cs="Arial"/>
+          <w:lang w:val="es-CO"/>
+        </w:rPr>
         <w:t>Hombre</w:t>
       </w:r>
       <w:r>
@@ -2759,6 +2746,420 @@
           <w:lang w:val="es-CO"/>
         </w:rPr>
         <w:t>: Grupo con resumen de datos correspondientes a ciudadanos que habitan en las zonas rurales, pero no en centros poblados.</w:t>
+      </w:r>
+    </w:p>
+    <w:p>
+      <w:pPr>
+        <w:rPr>
+          <w:rFonts w:ascii="Arial" w:hAnsi="Arial" w:cs="Arial"/>
+          <w:lang w:val="es-CO"/>
+        </w:rPr>
+      </w:pPr>
+    </w:p>
+    <w:p>
+      <w:pPr>
+        <w:rPr>
+          <w:rFonts w:ascii="Arial" w:hAnsi="Arial" w:cs="Arial"/>
+          <w:b/>
+          <w:bCs/>
+          <w:lang w:val="es-CO"/>
+        </w:rPr>
+      </w:pPr>
+      <w:r>
+        <w:rPr>
+          <w:rFonts w:ascii="Arial" w:hAnsi="Arial" w:cs="Arial"/>
+          <w:b/>
+          <w:bCs/>
+          <w:lang w:val="es-CO"/>
+        </w:rPr>
+        <w:t>3PM</w:t>
+      </w:r>
+    </w:p>
+    <w:p>
+      <w:pPr>
+        <w:rPr>
+          <w:rFonts w:ascii="Arial" w:hAnsi="Arial" w:cs="Arial"/>
+          <w:i/>
+          <w:iCs/>
+          <w:lang w:val="es-CO"/>
+        </w:rPr>
+      </w:pPr>
+      <w:r>
+        <w:rPr>
+          <w:rFonts w:ascii="Arial" w:hAnsi="Arial" w:cs="Arial"/>
+          <w:lang w:val="es-CO"/>
+        </w:rPr>
+        <w:t xml:space="preserve">Contiene 12 columnas fuertemente agrupadas por </w:t>
+      </w:r>
+      <w:r>
+        <w:rPr>
+          <w:rFonts w:ascii="Arial" w:hAnsi="Arial" w:cs="Arial"/>
+          <w:i/>
+          <w:iCs/>
+          <w:lang w:val="es-CO"/>
+        </w:rPr>
+        <w:t xml:space="preserve">Sexo, Cabecera </w:t>
+      </w:r>
+      <w:r>
+        <w:rPr>
+          <w:rFonts w:ascii="Arial" w:hAnsi="Arial" w:cs="Arial"/>
+          <w:lang w:val="es-CO"/>
+        </w:rPr>
+        <w:t xml:space="preserve">(Grupo </w:t>
+      </w:r>
+      <w:r>
+        <w:rPr>
+          <w:rFonts w:ascii="Arial" w:hAnsi="Arial" w:cs="Arial"/>
+          <w:lang w:val="es-CO"/>
+        </w:rPr>
+        <w:t>con datos correspondientes a las cabeceras municipales)</w:t>
+      </w:r>
+      <w:r>
+        <w:rPr>
+          <w:rFonts w:ascii="Arial" w:hAnsi="Arial" w:cs="Arial"/>
+          <w:i/>
+          <w:iCs/>
+          <w:lang w:val="es-CO"/>
+        </w:rPr>
+        <w:t>, Centro Poblado</w:t>
+      </w:r>
+      <w:r>
+        <w:rPr>
+          <w:rFonts w:ascii="Arial" w:hAnsi="Arial" w:cs="Arial"/>
+          <w:i/>
+          <w:iCs/>
+          <w:lang w:val="es-CO"/>
+        </w:rPr>
+        <w:t xml:space="preserve"> </w:t>
+      </w:r>
+      <w:r>
+        <w:rPr>
+          <w:rFonts w:ascii="Arial" w:hAnsi="Arial" w:cs="Arial"/>
+          <w:lang w:val="es-CO"/>
+        </w:rPr>
+        <w:t>(Grupo con datos correspondientes a centros poblados)</w:t>
+      </w:r>
+      <w:r>
+        <w:rPr>
+          <w:rFonts w:ascii="Arial" w:hAnsi="Arial" w:cs="Arial"/>
+          <w:i/>
+          <w:iCs/>
+          <w:lang w:val="es-CO"/>
+        </w:rPr>
+        <w:t>, Rural Disperso</w:t>
+      </w:r>
+      <w:r>
+        <w:rPr>
+          <w:rFonts w:ascii="Arial" w:hAnsi="Arial" w:cs="Arial"/>
+          <w:i/>
+          <w:iCs/>
+          <w:lang w:val="es-CO"/>
+        </w:rPr>
+        <w:t xml:space="preserve"> </w:t>
+      </w:r>
+      <w:r>
+        <w:rPr>
+          <w:rFonts w:ascii="Arial" w:hAnsi="Arial" w:cs="Arial"/>
+          <w:lang w:val="es-CO"/>
+        </w:rPr>
+        <w:t>(Grupo con datos correspondientes a ciudadanos que habitan en las zonas rurales, pero no en centros poblados</w:t>
+      </w:r>
+      <w:r>
+        <w:rPr>
+          <w:rFonts w:ascii="Arial" w:hAnsi="Arial" w:cs="Arial"/>
+          <w:lang w:val="es-CO"/>
+        </w:rPr>
+        <w:t>).</w:t>
+      </w:r>
+    </w:p>
+    <w:p>
+      <w:pPr>
+        <w:rPr>
+          <w:rFonts w:ascii="Arial" w:hAnsi="Arial" w:cs="Arial"/>
+          <w:lang w:val="es-CO"/>
+        </w:rPr>
+      </w:pPr>
+      <w:r>
+        <w:rPr>
+          <w:rFonts w:ascii="Arial" w:hAnsi="Arial" w:cs="Arial"/>
+          <w:lang w:val="es-CO"/>
+        </w:rPr>
+        <w:t>Contiene filas correspondientes a grupos de edad.</w:t>
+      </w:r>
+    </w:p>
+    <w:p>
+      <w:pPr>
+        <w:rPr>
+          <w:rFonts w:ascii="Arial" w:hAnsi="Arial" w:cs="Arial"/>
+          <w:lang w:val="es-CO"/>
+        </w:rPr>
+      </w:pPr>
+      <w:r>
+        <w:rPr>
+          <w:rFonts w:ascii="Arial" w:hAnsi="Arial" w:cs="Arial"/>
+          <w:lang w:val="es-CO"/>
+        </w:rPr>
+        <w:t>Columnas:</w:t>
+      </w:r>
+    </w:p>
+    <w:p>
+      <w:pPr>
+        <w:pStyle w:val="Prrafodelista"/>
+        <w:numPr>
+          <w:ilvl w:val="0"/>
+          <w:numId w:val="4"/>
+        </w:numPr>
+        <w:rPr>
+          <w:rFonts w:ascii="Arial" w:hAnsi="Arial" w:cs="Arial"/>
+          <w:lang w:val="es-CO"/>
+        </w:rPr>
+      </w:pPr>
+      <w:r>
+        <w:rPr>
+          <w:rFonts w:ascii="Arial" w:hAnsi="Arial" w:cs="Arial"/>
+          <w:lang w:val="es-CO"/>
+        </w:rPr>
+        <w:t>(blank) (texto): Título en blanco, contiene las edades.</w:t>
+      </w:r>
+    </w:p>
+    <w:p>
+      <w:pPr>
+        <w:pStyle w:val="Prrafodelista"/>
+        <w:numPr>
+          <w:ilvl w:val="0"/>
+          <w:numId w:val="4"/>
+        </w:numPr>
+        <w:rPr>
+          <w:rFonts w:ascii="Arial" w:hAnsi="Arial" w:cs="Arial"/>
+          <w:lang w:val="es-CO"/>
+        </w:rPr>
+      </w:pPr>
+      <w:r>
+        <w:rPr>
+          <w:rFonts w:ascii="Arial" w:hAnsi="Arial" w:cs="Arial"/>
+          <w:lang w:val="es-CO"/>
+        </w:rPr>
+        <w:t>Sexo Total (entero): Cantidad total.</w:t>
+      </w:r>
+    </w:p>
+    <w:p>
+      <w:pPr>
+        <w:pStyle w:val="Prrafodelista"/>
+        <w:numPr>
+          <w:ilvl w:val="0"/>
+          <w:numId w:val="4"/>
+        </w:numPr>
+        <w:rPr>
+          <w:rFonts w:ascii="Arial" w:hAnsi="Arial" w:cs="Arial"/>
+          <w:lang w:val="es-CO"/>
+        </w:rPr>
+      </w:pPr>
+      <w:r>
+        <w:rPr>
+          <w:rFonts w:ascii="Arial" w:hAnsi="Arial" w:cs="Arial"/>
+          <w:lang w:val="es-CO"/>
+        </w:rPr>
+        <w:t>Sexo Hombre (entero): Cantidad de hombres.</w:t>
+      </w:r>
+    </w:p>
+    <w:p>
+      <w:pPr>
+        <w:pStyle w:val="Prrafodelista"/>
+        <w:numPr>
+          <w:ilvl w:val="0"/>
+          <w:numId w:val="4"/>
+        </w:numPr>
+        <w:rPr>
+          <w:rFonts w:ascii="Arial" w:hAnsi="Arial" w:cs="Arial"/>
+          <w:lang w:val="es-CO"/>
+        </w:rPr>
+      </w:pPr>
+      <w:r>
+        <w:rPr>
+          <w:rFonts w:ascii="Arial" w:hAnsi="Arial" w:cs="Arial"/>
+          <w:lang w:val="es-CO"/>
+        </w:rPr>
+        <w:t>Sexo Mujer (entero): Cantidad de mujeres.</w:t>
+      </w:r>
+    </w:p>
+    <w:p>
+      <w:pPr>
+        <w:pStyle w:val="Prrafodelista"/>
+        <w:numPr>
+          <w:ilvl w:val="0"/>
+          <w:numId w:val="4"/>
+        </w:numPr>
+        <w:rPr>
+          <w:rFonts w:ascii="Arial" w:hAnsi="Arial" w:cs="Arial"/>
+          <w:lang w:val="es-CO"/>
+        </w:rPr>
+      </w:pPr>
+      <w:r>
+        <w:rPr>
+          <w:rFonts w:ascii="Arial" w:hAnsi="Arial" w:cs="Arial"/>
+          <w:lang w:val="es-CO"/>
+        </w:rPr>
+        <w:t>Cabecera Total (entero): Cantidad total en cabeceras municipales.</w:t>
+      </w:r>
+    </w:p>
+    <w:p>
+      <w:pPr>
+        <w:pStyle w:val="Prrafodelista"/>
+        <w:numPr>
+          <w:ilvl w:val="0"/>
+          <w:numId w:val="4"/>
+        </w:numPr>
+        <w:rPr>
+          <w:rFonts w:ascii="Arial" w:hAnsi="Arial" w:cs="Arial"/>
+          <w:lang w:val="es-CO"/>
+        </w:rPr>
+      </w:pPr>
+      <w:r>
+        <w:rPr>
+          <w:rFonts w:ascii="Arial" w:hAnsi="Arial" w:cs="Arial"/>
+          <w:lang w:val="es-CO"/>
+        </w:rPr>
+        <w:t>Cabecera Hombre (entero): Cantidad de hombres en cabeceras municipales.</w:t>
+      </w:r>
+    </w:p>
+    <w:p>
+      <w:pPr>
+        <w:pStyle w:val="Prrafodelista"/>
+        <w:numPr>
+          <w:ilvl w:val="0"/>
+          <w:numId w:val="4"/>
+        </w:numPr>
+        <w:rPr>
+          <w:rFonts w:ascii="Arial" w:hAnsi="Arial" w:cs="Arial"/>
+          <w:lang w:val="es-CO"/>
+        </w:rPr>
+      </w:pPr>
+      <w:r>
+        <w:rPr>
+          <w:rFonts w:ascii="Arial" w:hAnsi="Arial" w:cs="Arial"/>
+          <w:lang w:val="es-CO"/>
+        </w:rPr>
+        <w:t>Cabecera Mujer (entero): Cantidad de mujeres en cabeceras municipales.</w:t>
+      </w:r>
+    </w:p>
+    <w:p>
+      <w:pPr>
+        <w:pStyle w:val="Prrafodelista"/>
+        <w:numPr>
+          <w:ilvl w:val="0"/>
+          <w:numId w:val="4"/>
+        </w:numPr>
+        <w:rPr>
+          <w:rFonts w:ascii="Arial" w:hAnsi="Arial" w:cs="Arial"/>
+          <w:lang w:val="es-CO"/>
+        </w:rPr>
+      </w:pPr>
+      <w:r>
+        <w:rPr>
+          <w:rFonts w:ascii="Arial" w:hAnsi="Arial" w:cs="Arial"/>
+          <w:lang w:val="es-CO"/>
+        </w:rPr>
+        <w:t>Centro Poblado Total (entero): Cantidad total en centros poblados.</w:t>
+      </w:r>
+    </w:p>
+    <w:p>
+      <w:pPr>
+        <w:pStyle w:val="Prrafodelista"/>
+        <w:numPr>
+          <w:ilvl w:val="0"/>
+          <w:numId w:val="4"/>
+        </w:numPr>
+        <w:rPr>
+          <w:rFonts w:ascii="Arial" w:hAnsi="Arial" w:cs="Arial"/>
+          <w:lang w:val="es-CO"/>
+        </w:rPr>
+      </w:pPr>
+      <w:r>
+        <w:rPr>
+          <w:rFonts w:ascii="Arial" w:hAnsi="Arial" w:cs="Arial"/>
+          <w:lang w:val="es-CO"/>
+        </w:rPr>
+        <w:t>Centro Poblado Hombre (entero): Cantidad de hombres en centros poblados.</w:t>
+      </w:r>
+    </w:p>
+    <w:p>
+      <w:pPr>
+        <w:pStyle w:val="Prrafodelista"/>
+        <w:numPr>
+          <w:ilvl w:val="0"/>
+          <w:numId w:val="4"/>
+        </w:numPr>
+        <w:rPr>
+          <w:rFonts w:ascii="Arial" w:hAnsi="Arial" w:cs="Arial"/>
+          <w:lang w:val="es-CO"/>
+        </w:rPr>
+      </w:pPr>
+      <w:r>
+        <w:rPr>
+          <w:rFonts w:ascii="Arial" w:hAnsi="Arial" w:cs="Arial"/>
+          <w:lang w:val="es-CO"/>
+        </w:rPr>
+        <w:t>Centro Poblado Mujer (entero): Cantidad de mujeres en centros poblados.</w:t>
+      </w:r>
+    </w:p>
+    <w:p>
+      <w:pPr>
+        <w:pStyle w:val="Prrafodelista"/>
+        <w:numPr>
+          <w:ilvl w:val="0"/>
+          <w:numId w:val="4"/>
+        </w:numPr>
+        <w:rPr>
+          <w:rFonts w:ascii="Arial" w:hAnsi="Arial" w:cs="Arial"/>
+          <w:lang w:val="es-CO"/>
+        </w:rPr>
+      </w:pPr>
+      <w:r>
+        <w:rPr>
+          <w:rFonts w:ascii="Arial" w:hAnsi="Arial" w:cs="Arial"/>
+          <w:lang w:val="es-CO"/>
+        </w:rPr>
+        <w:t>Rural disperso Total (entero): Cantidad total en zona rural que no hace parte de centros poblados.</w:t>
+      </w:r>
+    </w:p>
+    <w:p>
+      <w:pPr>
+        <w:pStyle w:val="Prrafodelista"/>
+        <w:numPr>
+          <w:ilvl w:val="0"/>
+          <w:numId w:val="4"/>
+        </w:numPr>
+        <w:rPr>
+          <w:rFonts w:ascii="Arial" w:hAnsi="Arial" w:cs="Arial"/>
+          <w:lang w:val="es-CO"/>
+        </w:rPr>
+      </w:pPr>
+      <w:r>
+        <w:rPr>
+          <w:rFonts w:ascii="Arial" w:hAnsi="Arial" w:cs="Arial"/>
+          <w:lang w:val="es-CO"/>
+        </w:rPr>
+        <w:t>Rural disperso Hombre (entero): Cantidad de hombres en zona rural.</w:t>
+      </w:r>
+    </w:p>
+    <w:p>
+      <w:pPr>
+        <w:pStyle w:val="Prrafodelista"/>
+        <w:numPr>
+          <w:ilvl w:val="0"/>
+          <w:numId w:val="4"/>
+        </w:numPr>
+        <w:rPr>
+          <w:rFonts w:ascii="Arial" w:hAnsi="Arial" w:cs="Arial"/>
+          <w:lang w:val="es-CO"/>
+        </w:rPr>
+      </w:pPr>
+      <w:r>
+        <w:rPr>
+          <w:rFonts w:ascii="Arial" w:hAnsi="Arial" w:cs="Arial"/>
+          <w:lang w:val="es-CO"/>
+        </w:rPr>
+        <w:t>Rural disperso Mujer (entero): Cantidad de mujeres en zona rural.</w:t>
       </w:r>
     </w:p>
     <w:sectPr>
@@ -2774,9 +3175,9 @@
 <file path=word/numbering.xml><?xml version="1.0" encoding="utf-8"?>
 <w:numbering xmlns:wpc="http://schemas.microsoft.com/office/word/2010/wordprocessingCanvas" xmlns:cx="http://schemas.microsoft.com/office/drawing/2014/chartex" xmlns:cx1="http://schemas.microsoft.com/office/drawing/2015/9/8/chartex" xmlns:cx2="http://schemas.microsoft.com/office/drawing/2015/10/21/chartex" xmlns:cx3="http://schemas.microsoft.com/office/drawing/2016/5/9/chartex" xmlns:cx4="http://schemas.microsoft.com/office/drawing/2016/5/10/chartex" xmlns:cx5="http://schemas.microsoft.com/office/drawing/2016/5/11/chartex" xmlns:cx6="http://schemas.microsoft.com/office/drawing/2016/5/12/chartex" xmlns:cx7="http://schemas.microsoft.com/office/drawing/2016/5/13/chartex" xmlns:cx8="http://schemas.microsoft.com/office/drawing/2016/5/14/chartex" xmlns:mc="http://schemas.openxmlformats.org/markup-compatibility/2006" xmlns:aink="http://schemas.microsoft.com/office/drawing/2016/ink" xmlns:am3d="http://schemas.microsoft.com/office/drawing/2017/model3d" xmlns:o="urn:schemas-microsoft-com:office:office" xmlns:oel="http://schemas.microsoft.com/office/2019/extlst" xmlns:r="http://schemas.openxmlformats.org/officeDocument/2006/relationships" xmlns:m="http://schemas.openxmlformats.org/officeDocument/2006/math" xmlns:v="urn:schemas-microsoft-com:vml" xmlns:wp14="http://schemas.microsoft.com/office/word/2010/wordprocessingDrawing" xmlns:wp="http://schemas.openxmlformats.org/drawingml/2006/wordprocessingDrawing" xmlns:w10="urn:schemas-microsoft-com:office:word" xmlns:w="http://schemas.openxmlformats.org/wordprocessingml/2006/main" xmlns:w14="http://schemas.microsoft.com/office/word/2010/wordml" xmlns:w15="http://schemas.microsoft.com/office/word/2012/wordml" xmlns:w16cex="http://schemas.microsoft.com/office/word/2018/wordml/cex" xmlns:w16cid="http://schemas.microsoft.com/office/word/2016/wordml/cid" xmlns:w16="http://schemas.microsoft.com/office/word/2018/wordml" xmlns:w16du="http://schemas.microsoft.com/office/word/2023/wordml/word16du" xmlns:w16sdtdh="http://schemas.microsoft.com/office/word/2020/wordml/sdtdatahash" xmlns:w16sdtfl="http://schemas.microsoft.com/office/word/2024/wordml/sdtformatlock" xmlns:w16se="http://schemas.microsoft.com/office/word/2015/wordml/symex" xmlns:wpg="http://schemas.microsoft.com/office/word/2010/wordprocessingGroup" xmlns:wpi="http://schemas.microsoft.com/office/word/2010/wordprocessingInk" xmlns:wne="http://schemas.microsoft.com/office/word/2006/wordml" xmlns:wps="http://schemas.microsoft.com/office/word/2010/wordprocessingShape" mc:Ignorable="w14 w15 w16se w16cid w16 w16cex w16sdtdh w16sdtfl w16du wp14">
   <w:abstractNum w:abstractNumId="0" w15:restartNumberingAfterBreak="0">
-    <w:nsid w:val="52D63117"/>
+    <w:nsid w:val="521C4194"/>
     <w:multiLevelType w:val="hybridMultilevel"/>
-    <w:tmpl w:val="036E0984"/>
+    <w:tmpl w:val="0542FC48"/>
     <w:lvl w:ilvl="0" w:tplc="04090001">
       <w:start w:val="1"/>
       <w:numFmt w:val="bullet"/>
@@ -2887,9 +3288,9 @@
     </w:lvl>
   </w:abstractNum>
   <w:abstractNum w:abstractNumId="1" w15:restartNumberingAfterBreak="0">
-    <w:nsid w:val="608B0027"/>
+    <w:nsid w:val="52D63117"/>
     <w:multiLevelType w:val="hybridMultilevel"/>
-    <w:tmpl w:val="1A2A0CCE"/>
+    <w:tmpl w:val="036E0984"/>
     <w:lvl w:ilvl="0" w:tplc="04090001">
       <w:start w:val="1"/>
       <w:numFmt w:val="bullet"/>
@@ -3000,9 +3401,9 @@
     </w:lvl>
   </w:abstractNum>
   <w:abstractNum w:abstractNumId="2" w15:restartNumberingAfterBreak="0">
-    <w:nsid w:val="6EF91E29"/>
+    <w:nsid w:val="608B0027"/>
     <w:multiLevelType w:val="hybridMultilevel"/>
-    <w:tmpl w:val="90A0CFD2"/>
+    <w:tmpl w:val="1A2A0CCE"/>
     <w:lvl w:ilvl="0" w:tplc="04090001">
       <w:start w:val="1"/>
       <w:numFmt w:val="bullet"/>
@@ -3112,13 +3513,129 @@
       </w:rPr>
     </w:lvl>
   </w:abstractNum>
+  <w:abstractNum w:abstractNumId="3" w15:restartNumberingAfterBreak="0">
+    <w:nsid w:val="6EF91E29"/>
+    <w:multiLevelType w:val="hybridMultilevel"/>
+    <w:tmpl w:val="90A0CFD2"/>
+    <w:lvl w:ilvl="0" w:tplc="04090001">
+      <w:start w:val="1"/>
+      <w:numFmt w:val="bullet"/>
+      <w:lvlText w:val=""/>
+      <w:lvlJc w:val="left"/>
+      <w:pPr>
+        <w:ind w:left="720" w:hanging="360"/>
+      </w:pPr>
+      <w:rPr>
+        <w:rFonts w:ascii="Symbol" w:hAnsi="Symbol" w:hint="default"/>
+      </w:rPr>
+    </w:lvl>
+    <w:lvl w:ilvl="1" w:tplc="04090003" w:tentative="1">
+      <w:start w:val="1"/>
+      <w:numFmt w:val="bullet"/>
+      <w:lvlText w:val="o"/>
+      <w:lvlJc w:val="left"/>
+      <w:pPr>
+        <w:ind w:left="1440" w:hanging="360"/>
+      </w:pPr>
+      <w:rPr>
+        <w:rFonts w:ascii="Courier New" w:hAnsi="Courier New" w:cs="Courier New" w:hint="default"/>
+      </w:rPr>
+    </w:lvl>
+    <w:lvl w:ilvl="2" w:tplc="04090005" w:tentative="1">
+      <w:start w:val="1"/>
+      <w:numFmt w:val="bullet"/>
+      <w:lvlText w:val=""/>
+      <w:lvlJc w:val="left"/>
+      <w:pPr>
+        <w:ind w:left="2160" w:hanging="360"/>
+      </w:pPr>
+      <w:rPr>
+        <w:rFonts w:ascii="Wingdings" w:hAnsi="Wingdings" w:hint="default"/>
+      </w:rPr>
+    </w:lvl>
+    <w:lvl w:ilvl="3" w:tplc="04090001" w:tentative="1">
+      <w:start w:val="1"/>
+      <w:numFmt w:val="bullet"/>
+      <w:lvlText w:val=""/>
+      <w:lvlJc w:val="left"/>
+      <w:pPr>
+        <w:ind w:left="2880" w:hanging="360"/>
+      </w:pPr>
+      <w:rPr>
+        <w:rFonts w:ascii="Symbol" w:hAnsi="Symbol" w:hint="default"/>
+      </w:rPr>
+    </w:lvl>
+    <w:lvl w:ilvl="4" w:tplc="04090003" w:tentative="1">
+      <w:start w:val="1"/>
+      <w:numFmt w:val="bullet"/>
+      <w:lvlText w:val="o"/>
+      <w:lvlJc w:val="left"/>
+      <w:pPr>
+        <w:ind w:left="3600" w:hanging="360"/>
+      </w:pPr>
+      <w:rPr>
+        <w:rFonts w:ascii="Courier New" w:hAnsi="Courier New" w:cs="Courier New" w:hint="default"/>
+      </w:rPr>
+    </w:lvl>
+    <w:lvl w:ilvl="5" w:tplc="04090005" w:tentative="1">
+      <w:start w:val="1"/>
+      <w:numFmt w:val="bullet"/>
+      <w:lvlText w:val=""/>
+      <w:lvlJc w:val="left"/>
+      <w:pPr>
+        <w:ind w:left="4320" w:hanging="360"/>
+      </w:pPr>
+      <w:rPr>
+        <w:rFonts w:ascii="Wingdings" w:hAnsi="Wingdings" w:hint="default"/>
+      </w:rPr>
+    </w:lvl>
+    <w:lvl w:ilvl="6" w:tplc="04090001" w:tentative="1">
+      <w:start w:val="1"/>
+      <w:numFmt w:val="bullet"/>
+      <w:lvlText w:val=""/>
+      <w:lvlJc w:val="left"/>
+      <w:pPr>
+        <w:ind w:left="5040" w:hanging="360"/>
+      </w:pPr>
+      <w:rPr>
+        <w:rFonts w:ascii="Symbol" w:hAnsi="Symbol" w:hint="default"/>
+      </w:rPr>
+    </w:lvl>
+    <w:lvl w:ilvl="7" w:tplc="04090003" w:tentative="1">
+      <w:start w:val="1"/>
+      <w:numFmt w:val="bullet"/>
+      <w:lvlText w:val="o"/>
+      <w:lvlJc w:val="left"/>
+      <w:pPr>
+        <w:ind w:left="5760" w:hanging="360"/>
+      </w:pPr>
+      <w:rPr>
+        <w:rFonts w:ascii="Courier New" w:hAnsi="Courier New" w:cs="Courier New" w:hint="default"/>
+      </w:rPr>
+    </w:lvl>
+    <w:lvl w:ilvl="8" w:tplc="04090005" w:tentative="1">
+      <w:start w:val="1"/>
+      <w:numFmt w:val="bullet"/>
+      <w:lvlText w:val=""/>
+      <w:lvlJc w:val="left"/>
+      <w:pPr>
+        <w:ind w:left="6480" w:hanging="360"/>
+      </w:pPr>
+      <w:rPr>
+        <w:rFonts w:ascii="Wingdings" w:hAnsi="Wingdings" w:hint="default"/>
+      </w:rPr>
+    </w:lvl>
+  </w:abstractNum>
   <w:num w:numId="1" w16cid:durableId="824902107">
+    <w:abstractNumId w:val="2"/>
+  </w:num>
+  <w:num w:numId="2" w16cid:durableId="617299781">
+    <w:abstractNumId w:val="3"/>
+  </w:num>
+  <w:num w:numId="3" w16cid:durableId="1048263498">
     <w:abstractNumId w:val="1"/>
   </w:num>
-  <w:num w:numId="2" w16cid:durableId="617299781">
-    <w:abstractNumId w:val="2"/>
-  </w:num>
-  <w:num w:numId="3" w16cid:durableId="1048263498">
+  <w:num w:numId="4" w16cid:durableId="237983024">
     <w:abstractNumId w:val="0"/>
   </w:num>
 </w:numbering>

</xml_diff>

<commit_message>
Actualiza fuentes de datos con hoja 4PM
</commit_message>
<xml_diff>
--- a/Documentacion/Fuentes de Datos.docx
+++ b/Documentacion/Fuentes de Datos.docx
@@ -100,21 +100,28 @@
           <w:rFonts w:ascii="Arial" w:hAnsi="Arial" w:cs="Arial"/>
           <w:lang w:val="es-CO"/>
         </w:rPr>
-        <w:t>2</w:t>
-      </w:r>
-      <w:r>
-        <w:rPr>
-          <w:rFonts w:ascii="Arial" w:hAnsi="Arial" w:cs="Arial"/>
-          <w:lang w:val="es-CO"/>
-        </w:rPr>
-        <w:t>8</w:t>
-      </w:r>
-      <w:r>
-        <w:rPr>
-          <w:rFonts w:ascii="Arial" w:hAnsi="Arial" w:cs="Arial"/>
-          <w:lang w:val="es-CO"/>
-        </w:rPr>
-        <w:t xml:space="preserve"> de febrero de 2025</w:t>
+        <w:t>4</w:t>
+      </w:r>
+      <w:r>
+        <w:rPr>
+          <w:rFonts w:ascii="Arial" w:hAnsi="Arial" w:cs="Arial"/>
+          <w:lang w:val="es-CO"/>
+        </w:rPr>
+        <w:t xml:space="preserve"> de </w:t>
+      </w:r>
+      <w:r>
+        <w:rPr>
+          <w:rFonts w:ascii="Arial" w:hAnsi="Arial" w:cs="Arial"/>
+          <w:lang w:val="es-CO"/>
+        </w:rPr>
+        <w:t>marzo</w:t>
+      </w:r>
+      <w:r>
+        <w:rPr>
+          <w:rFonts w:ascii="Arial" w:hAnsi="Arial" w:cs="Arial"/>
+          <w:lang w:val="es-CO"/>
+        </w:rPr>
+        <w:t xml:space="preserve"> de 2025</w:t>
       </w:r>
     </w:p>
     <w:p>
@@ -3162,6 +3169,629 @@
         <w:t>Rural disperso Mujer (entero): Cantidad de mujeres en zona rural.</w:t>
       </w:r>
     </w:p>
+    <w:p>
+      <w:pPr>
+        <w:rPr>
+          <w:rFonts w:ascii="Arial" w:hAnsi="Arial" w:cs="Arial"/>
+          <w:lang w:val="es-CO"/>
+        </w:rPr>
+      </w:pPr>
+    </w:p>
+    <w:p>
+      <w:pPr>
+        <w:rPr>
+          <w:rFonts w:ascii="Arial" w:hAnsi="Arial" w:cs="Arial"/>
+          <w:b/>
+          <w:bCs/>
+          <w:lang w:val="es-CO"/>
+        </w:rPr>
+      </w:pPr>
+      <w:r>
+        <w:rPr>
+          <w:rFonts w:ascii="Arial" w:hAnsi="Arial" w:cs="Arial"/>
+          <w:b/>
+          <w:bCs/>
+          <w:lang w:val="es-CO"/>
+        </w:rPr>
+        <w:t>4PM</w:t>
+      </w:r>
+    </w:p>
+    <w:p>
+      <w:pPr>
+        <w:rPr>
+          <w:rFonts w:ascii="Arial" w:hAnsi="Arial" w:cs="Arial"/>
+          <w:lang w:val="es-CO"/>
+        </w:rPr>
+      </w:pPr>
+      <w:r>
+        <w:rPr>
+          <w:rFonts w:ascii="Arial" w:hAnsi="Arial" w:cs="Arial"/>
+          <w:lang w:val="es-CO"/>
+        </w:rPr>
+        <w:t>Contiene 17 columnas y 3 agrupaciones, cada agrupación tiene 3 subagrupaciones.</w:t>
+      </w:r>
+    </w:p>
+    <w:p>
+      <w:pPr>
+        <w:rPr>
+          <w:rFonts w:ascii="Arial" w:hAnsi="Arial" w:cs="Arial"/>
+          <w:lang w:val="es-CO"/>
+        </w:rPr>
+      </w:pPr>
+    </w:p>
+    <w:p>
+      <w:pPr>
+        <w:rPr>
+          <w:rFonts w:ascii="Arial" w:hAnsi="Arial" w:cs="Arial"/>
+          <w:lang w:val="es-CO"/>
+        </w:rPr>
+      </w:pPr>
+      <w:r>
+        <w:rPr>
+          <w:rFonts w:ascii="Arial" w:hAnsi="Arial" w:cs="Arial"/>
+          <w:lang w:val="es-CO"/>
+        </w:rPr>
+        <w:lastRenderedPageBreak/>
+        <w:t>Columnas:</w:t>
+      </w:r>
+    </w:p>
+    <w:p>
+      <w:pPr>
+        <w:pStyle w:val="Prrafodelista"/>
+        <w:numPr>
+          <w:ilvl w:val="0"/>
+          <w:numId w:val="5"/>
+        </w:numPr>
+        <w:rPr>
+          <w:rFonts w:ascii="Arial" w:hAnsi="Arial" w:cs="Arial"/>
+          <w:lang w:val="es-CO"/>
+        </w:rPr>
+      </w:pPr>
+      <w:r>
+        <w:rPr>
+          <w:rFonts w:ascii="Arial" w:hAnsi="Arial" w:cs="Arial"/>
+          <w:lang w:val="es-CO"/>
+        </w:rPr>
+        <w:t>Total (entero): Cantidad total.</w:t>
+      </w:r>
+    </w:p>
+    <w:p>
+      <w:pPr>
+        <w:pStyle w:val="Prrafodelista"/>
+        <w:numPr>
+          <w:ilvl w:val="0"/>
+          <w:numId w:val="5"/>
+        </w:numPr>
+        <w:rPr>
+          <w:rFonts w:ascii="Arial" w:hAnsi="Arial" w:cs="Arial"/>
+          <w:lang w:val="es-CO"/>
+        </w:rPr>
+      </w:pPr>
+      <w:r>
+        <w:rPr>
+          <w:rFonts w:ascii="Arial" w:hAnsi="Arial" w:cs="Arial"/>
+          <w:lang w:val="es-CO"/>
+        </w:rPr>
+        <w:t>Jefe(a) del hogar (entero): Cantidad de censados que son jefes del hogar.</w:t>
+      </w:r>
+    </w:p>
+    <w:p>
+      <w:pPr>
+        <w:pStyle w:val="Prrafodelista"/>
+        <w:numPr>
+          <w:ilvl w:val="0"/>
+          <w:numId w:val="5"/>
+        </w:numPr>
+        <w:rPr>
+          <w:rFonts w:ascii="Arial" w:hAnsi="Arial" w:cs="Arial"/>
+          <w:lang w:val="es-CO"/>
+        </w:rPr>
+      </w:pPr>
+      <w:r>
+        <w:rPr>
+          <w:rFonts w:ascii="Arial" w:hAnsi="Arial" w:cs="Arial"/>
+          <w:lang w:val="es-CO"/>
+        </w:rPr>
+        <w:t xml:space="preserve">Pareja (Conyugue, Compañero(a), </w:t>
+      </w:r>
+      <w:r>
+        <w:rPr>
+          <w:rFonts w:ascii="Arial" w:hAnsi="Arial" w:cs="Arial"/>
+          <w:lang w:val="es-CO"/>
+        </w:rPr>
+        <w:t>esposo(a)) (entero): Cantidad de censados que son pareja del jefe del hogar.</w:t>
+      </w:r>
+    </w:p>
+    <w:p>
+      <w:pPr>
+        <w:pStyle w:val="Prrafodelista"/>
+        <w:numPr>
+          <w:ilvl w:val="0"/>
+          <w:numId w:val="5"/>
+        </w:numPr>
+        <w:rPr>
+          <w:rFonts w:ascii="Arial" w:hAnsi="Arial" w:cs="Arial"/>
+          <w:lang w:val="es-CO"/>
+        </w:rPr>
+      </w:pPr>
+      <w:r>
+        <w:rPr>
+          <w:rFonts w:ascii="Arial" w:hAnsi="Arial" w:cs="Arial"/>
+          <w:lang w:val="es-CO"/>
+        </w:rPr>
+        <w:t>Hijo(a) (entero): Cantidad de censados que son hijos del jefe del hogar.</w:t>
+      </w:r>
+    </w:p>
+    <w:p>
+      <w:pPr>
+        <w:pStyle w:val="Prrafodelista"/>
+        <w:numPr>
+          <w:ilvl w:val="0"/>
+          <w:numId w:val="5"/>
+        </w:numPr>
+        <w:rPr>
+          <w:rFonts w:ascii="Arial" w:hAnsi="Arial" w:cs="Arial"/>
+          <w:lang w:val="es-CO"/>
+        </w:rPr>
+      </w:pPr>
+      <w:r>
+        <w:rPr>
+          <w:rFonts w:ascii="Arial" w:hAnsi="Arial" w:cs="Arial"/>
+          <w:lang w:val="es-CO"/>
+        </w:rPr>
+        <w:t>Hijastro(a) (entero): Cantidad de censados que son hijastros del jefe de hogar.</w:t>
+      </w:r>
+    </w:p>
+    <w:p>
+      <w:pPr>
+        <w:pStyle w:val="Prrafodelista"/>
+        <w:numPr>
+          <w:ilvl w:val="0"/>
+          <w:numId w:val="5"/>
+        </w:numPr>
+        <w:rPr>
+          <w:rFonts w:ascii="Arial" w:hAnsi="Arial" w:cs="Arial"/>
+          <w:lang w:val="es-CO"/>
+        </w:rPr>
+      </w:pPr>
+      <w:r>
+        <w:rPr>
+          <w:rFonts w:ascii="Arial" w:hAnsi="Arial" w:cs="Arial"/>
+          <w:lang w:val="es-CO"/>
+        </w:rPr>
+        <w:t>Yerno/nuera (entero): Cantidad de censados que son yerno</w:t>
+      </w:r>
+      <w:r>
+        <w:rPr>
+          <w:rFonts w:ascii="Arial" w:hAnsi="Arial" w:cs="Arial"/>
+          <w:lang w:val="es-CO"/>
+        </w:rPr>
+        <w:t>s</w:t>
+      </w:r>
+      <w:r>
+        <w:rPr>
+          <w:rFonts w:ascii="Arial" w:hAnsi="Arial" w:cs="Arial"/>
+          <w:lang w:val="es-CO"/>
+        </w:rPr>
+        <w:t xml:space="preserve"> o nuera</w:t>
+      </w:r>
+      <w:r>
+        <w:rPr>
+          <w:rFonts w:ascii="Arial" w:hAnsi="Arial" w:cs="Arial"/>
+          <w:lang w:val="es-CO"/>
+        </w:rPr>
+        <w:t>s</w:t>
+      </w:r>
+      <w:r>
+        <w:rPr>
+          <w:rFonts w:ascii="Arial" w:hAnsi="Arial" w:cs="Arial"/>
+          <w:lang w:val="es-CO"/>
+        </w:rPr>
+        <w:t xml:space="preserve"> del jefe del hogar.</w:t>
+      </w:r>
+    </w:p>
+    <w:p>
+      <w:pPr>
+        <w:pStyle w:val="Prrafodelista"/>
+        <w:numPr>
+          <w:ilvl w:val="0"/>
+          <w:numId w:val="5"/>
+        </w:numPr>
+        <w:rPr>
+          <w:rFonts w:ascii="Arial" w:hAnsi="Arial" w:cs="Arial"/>
+          <w:lang w:val="es-CO"/>
+        </w:rPr>
+      </w:pPr>
+      <w:r>
+        <w:rPr>
+          <w:rFonts w:ascii="Arial" w:hAnsi="Arial" w:cs="Arial"/>
+          <w:lang w:val="es-CO"/>
+        </w:rPr>
+        <w:t xml:space="preserve">Padre/madre (entero): </w:t>
+      </w:r>
+      <w:r>
+        <w:rPr>
+          <w:rFonts w:ascii="Arial" w:hAnsi="Arial" w:cs="Arial"/>
+          <w:lang w:val="es-CO"/>
+        </w:rPr>
+        <w:t>Cantidad de censados que son padres o madres del jefe del hogar.</w:t>
+      </w:r>
+    </w:p>
+    <w:p>
+      <w:pPr>
+        <w:pStyle w:val="Prrafodelista"/>
+        <w:numPr>
+          <w:ilvl w:val="0"/>
+          <w:numId w:val="5"/>
+        </w:numPr>
+        <w:rPr>
+          <w:rFonts w:ascii="Arial" w:hAnsi="Arial" w:cs="Arial"/>
+          <w:lang w:val="es-CO"/>
+        </w:rPr>
+      </w:pPr>
+      <w:r>
+        <w:rPr>
+          <w:rFonts w:ascii="Arial" w:hAnsi="Arial" w:cs="Arial"/>
+          <w:lang w:val="es-CO"/>
+        </w:rPr>
+        <w:t>Padrastro, madrastra (entero): Cantidad de censados que son padrastros o madrastras del jefe del hogar.</w:t>
+      </w:r>
+    </w:p>
+    <w:p>
+      <w:pPr>
+        <w:pStyle w:val="Prrafodelista"/>
+        <w:numPr>
+          <w:ilvl w:val="0"/>
+          <w:numId w:val="5"/>
+        </w:numPr>
+        <w:rPr>
+          <w:rFonts w:ascii="Arial" w:hAnsi="Arial" w:cs="Arial"/>
+          <w:lang w:val="es-CO"/>
+        </w:rPr>
+      </w:pPr>
+      <w:r>
+        <w:rPr>
+          <w:rFonts w:ascii="Arial" w:hAnsi="Arial" w:cs="Arial"/>
+          <w:lang w:val="es-CO"/>
+        </w:rPr>
+        <w:t>Suegro(a) (entero): Cantidad de censados que son suegros del jefe del hogar.</w:t>
+      </w:r>
+    </w:p>
+    <w:p>
+      <w:pPr>
+        <w:pStyle w:val="Prrafodelista"/>
+        <w:numPr>
+          <w:ilvl w:val="0"/>
+          <w:numId w:val="5"/>
+        </w:numPr>
+        <w:rPr>
+          <w:rFonts w:ascii="Arial" w:hAnsi="Arial" w:cs="Arial"/>
+          <w:lang w:val="es-CO"/>
+        </w:rPr>
+      </w:pPr>
+      <w:r>
+        <w:rPr>
+          <w:rFonts w:ascii="Arial" w:hAnsi="Arial" w:cs="Arial"/>
+          <w:lang w:val="es-CO"/>
+        </w:rPr>
+        <w:t>Hermano(a) (entero): Cantidad de censados que son hermanos del jefe del hogar.</w:t>
+      </w:r>
+    </w:p>
+    <w:p>
+      <w:pPr>
+        <w:pStyle w:val="Prrafodelista"/>
+        <w:numPr>
+          <w:ilvl w:val="0"/>
+          <w:numId w:val="5"/>
+        </w:numPr>
+        <w:rPr>
+          <w:rFonts w:ascii="Arial" w:hAnsi="Arial" w:cs="Arial"/>
+          <w:lang w:val="es-CO"/>
+        </w:rPr>
+      </w:pPr>
+      <w:r>
+        <w:rPr>
+          <w:rFonts w:ascii="Arial" w:hAnsi="Arial" w:cs="Arial"/>
+          <w:lang w:val="es-CO"/>
+        </w:rPr>
+        <w:t>Hermanastro(a) (entero): Cantidad de censados que son hermanastros del jefe del hogar.</w:t>
+      </w:r>
+    </w:p>
+    <w:p>
+      <w:pPr>
+        <w:pStyle w:val="Prrafodelista"/>
+        <w:numPr>
+          <w:ilvl w:val="0"/>
+          <w:numId w:val="5"/>
+        </w:numPr>
+        <w:rPr>
+          <w:rFonts w:ascii="Arial" w:hAnsi="Arial" w:cs="Arial"/>
+          <w:lang w:val="es-CO"/>
+        </w:rPr>
+      </w:pPr>
+      <w:r>
+        <w:rPr>
+          <w:rFonts w:ascii="Arial" w:hAnsi="Arial" w:cs="Arial"/>
+          <w:lang w:val="es-CO"/>
+        </w:rPr>
+        <w:t>Cuñado(a) (entero): Cantidad de censados que son cuñados del jefe del hogar.</w:t>
+      </w:r>
+    </w:p>
+    <w:p>
+      <w:pPr>
+        <w:pStyle w:val="Prrafodelista"/>
+        <w:numPr>
+          <w:ilvl w:val="0"/>
+          <w:numId w:val="5"/>
+        </w:numPr>
+        <w:rPr>
+          <w:rFonts w:ascii="Arial" w:hAnsi="Arial" w:cs="Arial"/>
+          <w:lang w:val="es-CO"/>
+        </w:rPr>
+      </w:pPr>
+      <w:r>
+        <w:rPr>
+          <w:rFonts w:ascii="Arial" w:hAnsi="Arial" w:cs="Arial"/>
+          <w:lang w:val="es-CO"/>
+        </w:rPr>
+        <w:t>Nieto(a) (entero): Cantidad de censados que son nietos del jefe del hogar.</w:t>
+      </w:r>
+    </w:p>
+    <w:p>
+      <w:pPr>
+        <w:pStyle w:val="Prrafodelista"/>
+        <w:numPr>
+          <w:ilvl w:val="0"/>
+          <w:numId w:val="5"/>
+        </w:numPr>
+        <w:rPr>
+          <w:rFonts w:ascii="Arial" w:hAnsi="Arial" w:cs="Arial"/>
+          <w:lang w:val="es-CO"/>
+        </w:rPr>
+      </w:pPr>
+      <w:r>
+        <w:rPr>
+          <w:rFonts w:ascii="Arial" w:hAnsi="Arial" w:cs="Arial"/>
+          <w:lang w:val="es-CO"/>
+        </w:rPr>
+        <w:t>Abuelo(a) (entero): Cantidad de censados que son abuelos del jefe del hogar.</w:t>
+      </w:r>
+    </w:p>
+    <w:p>
+      <w:pPr>
+        <w:pStyle w:val="Prrafodelista"/>
+        <w:numPr>
+          <w:ilvl w:val="0"/>
+          <w:numId w:val="5"/>
+        </w:numPr>
+        <w:rPr>
+          <w:rFonts w:ascii="Arial" w:hAnsi="Arial" w:cs="Arial"/>
+          <w:lang w:val="es-CO"/>
+        </w:rPr>
+      </w:pPr>
+      <w:r>
+        <w:rPr>
+          <w:rFonts w:ascii="Arial" w:hAnsi="Arial" w:cs="Arial"/>
+          <w:lang w:val="es-CO"/>
+        </w:rPr>
+        <w:t>Otro pariente (entero): Cantidad de censados que son otro tipo de pariente del jefe del hogar.</w:t>
+      </w:r>
+    </w:p>
+    <w:p>
+      <w:pPr>
+        <w:pStyle w:val="Prrafodelista"/>
+        <w:numPr>
+          <w:ilvl w:val="0"/>
+          <w:numId w:val="5"/>
+        </w:numPr>
+        <w:rPr>
+          <w:rFonts w:ascii="Arial" w:hAnsi="Arial" w:cs="Arial"/>
+          <w:lang w:val="es-CO"/>
+        </w:rPr>
+      </w:pPr>
+      <w:r>
+        <w:rPr>
+          <w:rFonts w:ascii="Arial" w:hAnsi="Arial" w:cs="Arial"/>
+          <w:lang w:val="es-CO"/>
+        </w:rPr>
+        <w:t>Empleado(a) del servicio doméstico (entero): Cantidad de censados que son empleados domésticos del jefe del hogar.</w:t>
+      </w:r>
+    </w:p>
+    <w:p>
+      <w:pPr>
+        <w:pStyle w:val="Prrafodelista"/>
+        <w:numPr>
+          <w:ilvl w:val="0"/>
+          <w:numId w:val="5"/>
+        </w:numPr>
+        <w:rPr>
+          <w:rFonts w:ascii="Arial" w:hAnsi="Arial" w:cs="Arial"/>
+          <w:lang w:val="es-CO"/>
+        </w:rPr>
+      </w:pPr>
+      <w:r>
+        <w:rPr>
+          <w:rFonts w:ascii="Arial" w:hAnsi="Arial" w:cs="Arial"/>
+          <w:lang w:val="es-CO"/>
+        </w:rPr>
+        <w:t>No pariente (entero): Cantidad de censados que no son parientes del jefe del hogar.</w:t>
+      </w:r>
+    </w:p>
+    <w:p>
+      <w:pPr>
+        <w:rPr>
+          <w:rFonts w:ascii="Arial" w:hAnsi="Arial" w:cs="Arial"/>
+          <w:lang w:val="es-CO"/>
+        </w:rPr>
+      </w:pPr>
+    </w:p>
+    <w:p>
+      <w:pPr>
+        <w:rPr>
+          <w:rFonts w:ascii="Arial" w:hAnsi="Arial" w:cs="Arial"/>
+          <w:lang w:val="es-CO"/>
+        </w:rPr>
+      </w:pPr>
+      <w:r>
+        <w:rPr>
+          <w:rFonts w:ascii="Arial" w:hAnsi="Arial" w:cs="Arial"/>
+          <w:lang w:val="es-CO"/>
+        </w:rPr>
+        <w:t>Agrupaciones:</w:t>
+      </w:r>
+    </w:p>
+    <w:p>
+      <w:pPr>
+        <w:pStyle w:val="Prrafodelista"/>
+        <w:numPr>
+          <w:ilvl w:val="0"/>
+          <w:numId w:val="6"/>
+        </w:numPr>
+        <w:rPr>
+          <w:rFonts w:ascii="Arial" w:hAnsi="Arial" w:cs="Arial"/>
+          <w:lang w:val="es-CO"/>
+        </w:rPr>
+      </w:pPr>
+      <w:r>
+        <w:rPr>
+          <w:rFonts w:ascii="Arial" w:hAnsi="Arial" w:cs="Arial"/>
+          <w:lang w:val="es-CO"/>
+        </w:rPr>
+        <w:t>Total: Grupo con resumen cantidades totales.</w:t>
+      </w:r>
+    </w:p>
+    <w:p>
+      <w:pPr>
+        <w:pStyle w:val="Prrafodelista"/>
+        <w:numPr>
+          <w:ilvl w:val="0"/>
+          <w:numId w:val="6"/>
+        </w:numPr>
+        <w:rPr>
+          <w:rFonts w:ascii="Arial" w:hAnsi="Arial" w:cs="Arial"/>
+          <w:lang w:val="es-CO"/>
+        </w:rPr>
+      </w:pPr>
+      <w:r>
+        <w:rPr>
+          <w:rFonts w:ascii="Arial" w:hAnsi="Arial" w:cs="Arial"/>
+          <w:lang w:val="es-CO"/>
+        </w:rPr>
+        <w:t>Cabecera: Grupo con resumen de datos correspondientes a las cabeceras municipales.</w:t>
+      </w:r>
+    </w:p>
+    <w:p>
+      <w:pPr>
+        <w:pStyle w:val="Prrafodelista"/>
+        <w:numPr>
+          <w:ilvl w:val="0"/>
+          <w:numId w:val="6"/>
+        </w:numPr>
+        <w:rPr>
+          <w:rFonts w:ascii="Arial" w:hAnsi="Arial" w:cs="Arial"/>
+          <w:lang w:val="es-CO"/>
+        </w:rPr>
+      </w:pPr>
+      <w:r>
+        <w:rPr>
+          <w:rFonts w:ascii="Arial" w:hAnsi="Arial" w:cs="Arial"/>
+          <w:lang w:val="es-CO"/>
+        </w:rPr>
+        <w:lastRenderedPageBreak/>
+        <w:t>Rural disperso: Grupo con resumen de datos correspondiente a la zona rural.</w:t>
+      </w:r>
+    </w:p>
+    <w:p>
+      <w:pPr>
+        <w:rPr>
+          <w:rFonts w:ascii="Arial" w:hAnsi="Arial" w:cs="Arial"/>
+          <w:lang w:val="es-CO"/>
+        </w:rPr>
+      </w:pPr>
+    </w:p>
+    <w:p>
+      <w:pPr>
+        <w:rPr>
+          <w:rFonts w:ascii="Arial" w:hAnsi="Arial" w:cs="Arial"/>
+          <w:lang w:val="es-CO"/>
+        </w:rPr>
+      </w:pPr>
+      <w:r>
+        <w:rPr>
+          <w:rFonts w:ascii="Arial" w:hAnsi="Arial" w:cs="Arial"/>
+          <w:lang w:val="es-CO"/>
+        </w:rPr>
+        <w:t>Subgrupos:</w:t>
+      </w:r>
+    </w:p>
+    <w:p>
+      <w:pPr>
+        <w:pStyle w:val="Prrafodelista"/>
+        <w:numPr>
+          <w:ilvl w:val="0"/>
+          <w:numId w:val="7"/>
+        </w:numPr>
+        <w:rPr>
+          <w:rFonts w:ascii="Arial" w:hAnsi="Arial" w:cs="Arial"/>
+          <w:lang w:val="es-CO"/>
+        </w:rPr>
+      </w:pPr>
+      <w:r>
+        <w:rPr>
+          <w:rFonts w:ascii="Arial" w:hAnsi="Arial" w:cs="Arial"/>
+          <w:lang w:val="es-CO"/>
+        </w:rPr>
+        <w:t>Total: Subgrupo con resumen total del grupo.</w:t>
+      </w:r>
+    </w:p>
+    <w:p>
+      <w:pPr>
+        <w:pStyle w:val="Prrafodelista"/>
+        <w:numPr>
+          <w:ilvl w:val="0"/>
+          <w:numId w:val="7"/>
+        </w:numPr>
+        <w:rPr>
+          <w:rFonts w:ascii="Arial" w:hAnsi="Arial" w:cs="Arial"/>
+          <w:lang w:val="es-CO"/>
+        </w:rPr>
+      </w:pPr>
+      <w:r>
+        <w:rPr>
+          <w:rFonts w:ascii="Arial" w:hAnsi="Arial" w:cs="Arial"/>
+          <w:lang w:val="es-CO"/>
+        </w:rPr>
+        <w:t>Hombre: Subgrupo de datos correspondientes a los hombres.</w:t>
+      </w:r>
+    </w:p>
+    <w:p>
+      <w:pPr>
+        <w:pStyle w:val="Prrafodelista"/>
+        <w:numPr>
+          <w:ilvl w:val="0"/>
+          <w:numId w:val="7"/>
+        </w:numPr>
+        <w:rPr>
+          <w:rFonts w:ascii="Arial" w:hAnsi="Arial" w:cs="Arial"/>
+          <w:lang w:val="es-CO"/>
+        </w:rPr>
+      </w:pPr>
+      <w:r>
+        <w:rPr>
+          <w:rFonts w:ascii="Arial" w:hAnsi="Arial" w:cs="Arial"/>
+          <w:lang w:val="es-CO"/>
+        </w:rPr>
+        <w:t>Mujer: Subgrupo de datos correspondientes a las mujeres.</w:t>
+      </w:r>
+    </w:p>
+    <w:p>
+      <w:pPr>
+        <w:rPr>
+          <w:rFonts w:ascii="Arial" w:hAnsi="Arial" w:cs="Arial"/>
+          <w:lang w:val="es-CO"/>
+        </w:rPr>
+      </w:pPr>
+    </w:p>
     <w:sectPr>
       <w:pgSz w:w="12240" w:h="15840"/>
       <w:pgMar w:top="1417" w:right="1701" w:bottom="1417" w:left="1701" w:header="720" w:footer="720" w:gutter="0"/>
@@ -3175,6 +3805,119 @@
 <file path=word/numbering.xml><?xml version="1.0" encoding="utf-8"?>
 <w:numbering xmlns:wpc="http://schemas.microsoft.com/office/word/2010/wordprocessingCanvas" xmlns:cx="http://schemas.microsoft.com/office/drawing/2014/chartex" xmlns:cx1="http://schemas.microsoft.com/office/drawing/2015/9/8/chartex" xmlns:cx2="http://schemas.microsoft.com/office/drawing/2015/10/21/chartex" xmlns:cx3="http://schemas.microsoft.com/office/drawing/2016/5/9/chartex" xmlns:cx4="http://schemas.microsoft.com/office/drawing/2016/5/10/chartex" xmlns:cx5="http://schemas.microsoft.com/office/drawing/2016/5/11/chartex" xmlns:cx6="http://schemas.microsoft.com/office/drawing/2016/5/12/chartex" xmlns:cx7="http://schemas.microsoft.com/office/drawing/2016/5/13/chartex" xmlns:cx8="http://schemas.microsoft.com/office/drawing/2016/5/14/chartex" xmlns:mc="http://schemas.openxmlformats.org/markup-compatibility/2006" xmlns:aink="http://schemas.microsoft.com/office/drawing/2016/ink" xmlns:am3d="http://schemas.microsoft.com/office/drawing/2017/model3d" xmlns:o="urn:schemas-microsoft-com:office:office" xmlns:oel="http://schemas.microsoft.com/office/2019/extlst" xmlns:r="http://schemas.openxmlformats.org/officeDocument/2006/relationships" xmlns:m="http://schemas.openxmlformats.org/officeDocument/2006/math" xmlns:v="urn:schemas-microsoft-com:vml" xmlns:wp14="http://schemas.microsoft.com/office/word/2010/wordprocessingDrawing" xmlns:wp="http://schemas.openxmlformats.org/drawingml/2006/wordprocessingDrawing" xmlns:w10="urn:schemas-microsoft-com:office:word" xmlns:w="http://schemas.openxmlformats.org/wordprocessingml/2006/main" xmlns:w14="http://schemas.microsoft.com/office/word/2010/wordml" xmlns:w15="http://schemas.microsoft.com/office/word/2012/wordml" xmlns:w16cex="http://schemas.microsoft.com/office/word/2018/wordml/cex" xmlns:w16cid="http://schemas.microsoft.com/office/word/2016/wordml/cid" xmlns:w16="http://schemas.microsoft.com/office/word/2018/wordml" xmlns:w16du="http://schemas.microsoft.com/office/word/2023/wordml/word16du" xmlns:w16sdtdh="http://schemas.microsoft.com/office/word/2020/wordml/sdtdatahash" xmlns:w16sdtfl="http://schemas.microsoft.com/office/word/2024/wordml/sdtformatlock" xmlns:w16se="http://schemas.microsoft.com/office/word/2015/wordml/symex" xmlns:wpg="http://schemas.microsoft.com/office/word/2010/wordprocessingGroup" xmlns:wpi="http://schemas.microsoft.com/office/word/2010/wordprocessingInk" xmlns:wne="http://schemas.microsoft.com/office/word/2006/wordml" xmlns:wps="http://schemas.microsoft.com/office/word/2010/wordprocessingShape" mc:Ignorable="w14 w15 w16se w16cid w16 w16cex w16sdtdh w16sdtfl w16du wp14">
   <w:abstractNum w:abstractNumId="0" w15:restartNumberingAfterBreak="0">
+    <w:nsid w:val="1AE62D74"/>
+    <w:multiLevelType w:val="hybridMultilevel"/>
+    <w:tmpl w:val="CA0E2AF4"/>
+    <w:lvl w:ilvl="0" w:tplc="04090001">
+      <w:start w:val="1"/>
+      <w:numFmt w:val="bullet"/>
+      <w:lvlText w:val=""/>
+      <w:lvlJc w:val="left"/>
+      <w:pPr>
+        <w:ind w:left="720" w:hanging="360"/>
+      </w:pPr>
+      <w:rPr>
+        <w:rFonts w:ascii="Symbol" w:hAnsi="Symbol" w:hint="default"/>
+      </w:rPr>
+    </w:lvl>
+    <w:lvl w:ilvl="1" w:tplc="04090003" w:tentative="1">
+      <w:start w:val="1"/>
+      <w:numFmt w:val="bullet"/>
+      <w:lvlText w:val="o"/>
+      <w:lvlJc w:val="left"/>
+      <w:pPr>
+        <w:ind w:left="1440" w:hanging="360"/>
+      </w:pPr>
+      <w:rPr>
+        <w:rFonts w:ascii="Courier New" w:hAnsi="Courier New" w:cs="Courier New" w:hint="default"/>
+      </w:rPr>
+    </w:lvl>
+    <w:lvl w:ilvl="2" w:tplc="04090005" w:tentative="1">
+      <w:start w:val="1"/>
+      <w:numFmt w:val="bullet"/>
+      <w:lvlText w:val=""/>
+      <w:lvlJc w:val="left"/>
+      <w:pPr>
+        <w:ind w:left="2160" w:hanging="360"/>
+      </w:pPr>
+      <w:rPr>
+        <w:rFonts w:ascii="Wingdings" w:hAnsi="Wingdings" w:hint="default"/>
+      </w:rPr>
+    </w:lvl>
+    <w:lvl w:ilvl="3" w:tplc="04090001" w:tentative="1">
+      <w:start w:val="1"/>
+      <w:numFmt w:val="bullet"/>
+      <w:lvlText w:val=""/>
+      <w:lvlJc w:val="left"/>
+      <w:pPr>
+        <w:ind w:left="2880" w:hanging="360"/>
+      </w:pPr>
+      <w:rPr>
+        <w:rFonts w:ascii="Symbol" w:hAnsi="Symbol" w:hint="default"/>
+      </w:rPr>
+    </w:lvl>
+    <w:lvl w:ilvl="4" w:tplc="04090003" w:tentative="1">
+      <w:start w:val="1"/>
+      <w:numFmt w:val="bullet"/>
+      <w:lvlText w:val="o"/>
+      <w:lvlJc w:val="left"/>
+      <w:pPr>
+        <w:ind w:left="3600" w:hanging="360"/>
+      </w:pPr>
+      <w:rPr>
+        <w:rFonts w:ascii="Courier New" w:hAnsi="Courier New" w:cs="Courier New" w:hint="default"/>
+      </w:rPr>
+    </w:lvl>
+    <w:lvl w:ilvl="5" w:tplc="04090005" w:tentative="1">
+      <w:start w:val="1"/>
+      <w:numFmt w:val="bullet"/>
+      <w:lvlText w:val=""/>
+      <w:lvlJc w:val="left"/>
+      <w:pPr>
+        <w:ind w:left="4320" w:hanging="360"/>
+      </w:pPr>
+      <w:rPr>
+        <w:rFonts w:ascii="Wingdings" w:hAnsi="Wingdings" w:hint="default"/>
+      </w:rPr>
+    </w:lvl>
+    <w:lvl w:ilvl="6" w:tplc="04090001" w:tentative="1">
+      <w:start w:val="1"/>
+      <w:numFmt w:val="bullet"/>
+      <w:lvlText w:val=""/>
+      <w:lvlJc w:val="left"/>
+      <w:pPr>
+        <w:ind w:left="5040" w:hanging="360"/>
+      </w:pPr>
+      <w:rPr>
+        <w:rFonts w:ascii="Symbol" w:hAnsi="Symbol" w:hint="default"/>
+      </w:rPr>
+    </w:lvl>
+    <w:lvl w:ilvl="7" w:tplc="04090003" w:tentative="1">
+      <w:start w:val="1"/>
+      <w:numFmt w:val="bullet"/>
+      <w:lvlText w:val="o"/>
+      <w:lvlJc w:val="left"/>
+      <w:pPr>
+        <w:ind w:left="5760" w:hanging="360"/>
+      </w:pPr>
+      <w:rPr>
+        <w:rFonts w:ascii="Courier New" w:hAnsi="Courier New" w:cs="Courier New" w:hint="default"/>
+      </w:rPr>
+    </w:lvl>
+    <w:lvl w:ilvl="8" w:tplc="04090005" w:tentative="1">
+      <w:start w:val="1"/>
+      <w:numFmt w:val="bullet"/>
+      <w:lvlText w:val=""/>
+      <w:lvlJc w:val="left"/>
+      <w:pPr>
+        <w:ind w:left="6480" w:hanging="360"/>
+      </w:pPr>
+      <w:rPr>
+        <w:rFonts w:ascii="Wingdings" w:hAnsi="Wingdings" w:hint="default"/>
+      </w:rPr>
+    </w:lvl>
+  </w:abstractNum>
+  <w:abstractNum w:abstractNumId="1" w15:restartNumberingAfterBreak="0">
     <w:nsid w:val="521C4194"/>
     <w:multiLevelType w:val="hybridMultilevel"/>
     <w:tmpl w:val="0542FC48"/>
@@ -3287,7 +4030,7 @@
       </w:rPr>
     </w:lvl>
   </w:abstractNum>
-  <w:abstractNum w:abstractNumId="1" w15:restartNumberingAfterBreak="0">
+  <w:abstractNum w:abstractNumId="2" w15:restartNumberingAfterBreak="0">
     <w:nsid w:val="52D63117"/>
     <w:multiLevelType w:val="hybridMultilevel"/>
     <w:tmpl w:val="036E0984"/>
@@ -3400,7 +4143,7 @@
       </w:rPr>
     </w:lvl>
   </w:abstractNum>
-  <w:abstractNum w:abstractNumId="2" w15:restartNumberingAfterBreak="0">
+  <w:abstractNum w:abstractNumId="3" w15:restartNumberingAfterBreak="0">
     <w:nsid w:val="608B0027"/>
     <w:multiLevelType w:val="hybridMultilevel"/>
     <w:tmpl w:val="1A2A0CCE"/>
@@ -3513,7 +4256,120 @@
       </w:rPr>
     </w:lvl>
   </w:abstractNum>
-  <w:abstractNum w:abstractNumId="3" w15:restartNumberingAfterBreak="0">
+  <w:abstractNum w:abstractNumId="4" w15:restartNumberingAfterBreak="0">
+    <w:nsid w:val="6B39307D"/>
+    <w:multiLevelType w:val="hybridMultilevel"/>
+    <w:tmpl w:val="BE94EE76"/>
+    <w:lvl w:ilvl="0" w:tplc="04090001">
+      <w:start w:val="1"/>
+      <w:numFmt w:val="bullet"/>
+      <w:lvlText w:val=""/>
+      <w:lvlJc w:val="left"/>
+      <w:pPr>
+        <w:ind w:left="720" w:hanging="360"/>
+      </w:pPr>
+      <w:rPr>
+        <w:rFonts w:ascii="Symbol" w:hAnsi="Symbol" w:hint="default"/>
+      </w:rPr>
+    </w:lvl>
+    <w:lvl w:ilvl="1" w:tplc="04090003" w:tentative="1">
+      <w:start w:val="1"/>
+      <w:numFmt w:val="bullet"/>
+      <w:lvlText w:val="o"/>
+      <w:lvlJc w:val="left"/>
+      <w:pPr>
+        <w:ind w:left="1440" w:hanging="360"/>
+      </w:pPr>
+      <w:rPr>
+        <w:rFonts w:ascii="Courier New" w:hAnsi="Courier New" w:cs="Courier New" w:hint="default"/>
+      </w:rPr>
+    </w:lvl>
+    <w:lvl w:ilvl="2" w:tplc="04090005" w:tentative="1">
+      <w:start w:val="1"/>
+      <w:numFmt w:val="bullet"/>
+      <w:lvlText w:val=""/>
+      <w:lvlJc w:val="left"/>
+      <w:pPr>
+        <w:ind w:left="2160" w:hanging="360"/>
+      </w:pPr>
+      <w:rPr>
+        <w:rFonts w:ascii="Wingdings" w:hAnsi="Wingdings" w:hint="default"/>
+      </w:rPr>
+    </w:lvl>
+    <w:lvl w:ilvl="3" w:tplc="04090001" w:tentative="1">
+      <w:start w:val="1"/>
+      <w:numFmt w:val="bullet"/>
+      <w:lvlText w:val=""/>
+      <w:lvlJc w:val="left"/>
+      <w:pPr>
+        <w:ind w:left="2880" w:hanging="360"/>
+      </w:pPr>
+      <w:rPr>
+        <w:rFonts w:ascii="Symbol" w:hAnsi="Symbol" w:hint="default"/>
+      </w:rPr>
+    </w:lvl>
+    <w:lvl w:ilvl="4" w:tplc="04090003" w:tentative="1">
+      <w:start w:val="1"/>
+      <w:numFmt w:val="bullet"/>
+      <w:lvlText w:val="o"/>
+      <w:lvlJc w:val="left"/>
+      <w:pPr>
+        <w:ind w:left="3600" w:hanging="360"/>
+      </w:pPr>
+      <w:rPr>
+        <w:rFonts w:ascii="Courier New" w:hAnsi="Courier New" w:cs="Courier New" w:hint="default"/>
+      </w:rPr>
+    </w:lvl>
+    <w:lvl w:ilvl="5" w:tplc="04090005" w:tentative="1">
+      <w:start w:val="1"/>
+      <w:numFmt w:val="bullet"/>
+      <w:lvlText w:val=""/>
+      <w:lvlJc w:val="left"/>
+      <w:pPr>
+        <w:ind w:left="4320" w:hanging="360"/>
+      </w:pPr>
+      <w:rPr>
+        <w:rFonts w:ascii="Wingdings" w:hAnsi="Wingdings" w:hint="default"/>
+      </w:rPr>
+    </w:lvl>
+    <w:lvl w:ilvl="6" w:tplc="04090001" w:tentative="1">
+      <w:start w:val="1"/>
+      <w:numFmt w:val="bullet"/>
+      <w:lvlText w:val=""/>
+      <w:lvlJc w:val="left"/>
+      <w:pPr>
+        <w:ind w:left="5040" w:hanging="360"/>
+      </w:pPr>
+      <w:rPr>
+        <w:rFonts w:ascii="Symbol" w:hAnsi="Symbol" w:hint="default"/>
+      </w:rPr>
+    </w:lvl>
+    <w:lvl w:ilvl="7" w:tplc="04090003" w:tentative="1">
+      <w:start w:val="1"/>
+      <w:numFmt w:val="bullet"/>
+      <w:lvlText w:val="o"/>
+      <w:lvlJc w:val="left"/>
+      <w:pPr>
+        <w:ind w:left="5760" w:hanging="360"/>
+      </w:pPr>
+      <w:rPr>
+        <w:rFonts w:ascii="Courier New" w:hAnsi="Courier New" w:cs="Courier New" w:hint="default"/>
+      </w:rPr>
+    </w:lvl>
+    <w:lvl w:ilvl="8" w:tplc="04090005" w:tentative="1">
+      <w:start w:val="1"/>
+      <w:numFmt w:val="bullet"/>
+      <w:lvlText w:val=""/>
+      <w:lvlJc w:val="left"/>
+      <w:pPr>
+        <w:ind w:left="6480" w:hanging="360"/>
+      </w:pPr>
+      <w:rPr>
+        <w:rFonts w:ascii="Wingdings" w:hAnsi="Wingdings" w:hint="default"/>
+      </w:rPr>
+    </w:lvl>
+  </w:abstractNum>
+  <w:abstractNum w:abstractNumId="5" w15:restartNumberingAfterBreak="0">
     <w:nsid w:val="6EF91E29"/>
     <w:multiLevelType w:val="hybridMultilevel"/>
     <w:tmpl w:val="90A0CFD2"/>
@@ -3626,17 +4482,139 @@
       </w:rPr>
     </w:lvl>
   </w:abstractNum>
+  <w:abstractNum w:abstractNumId="6" w15:restartNumberingAfterBreak="0">
+    <w:nsid w:val="736117B3"/>
+    <w:multiLevelType w:val="hybridMultilevel"/>
+    <w:tmpl w:val="B902F320"/>
+    <w:lvl w:ilvl="0" w:tplc="04090001">
+      <w:start w:val="1"/>
+      <w:numFmt w:val="bullet"/>
+      <w:lvlText w:val=""/>
+      <w:lvlJc w:val="left"/>
+      <w:pPr>
+        <w:ind w:left="720" w:hanging="360"/>
+      </w:pPr>
+      <w:rPr>
+        <w:rFonts w:ascii="Symbol" w:hAnsi="Symbol" w:hint="default"/>
+      </w:rPr>
+    </w:lvl>
+    <w:lvl w:ilvl="1" w:tplc="04090003" w:tentative="1">
+      <w:start w:val="1"/>
+      <w:numFmt w:val="bullet"/>
+      <w:lvlText w:val="o"/>
+      <w:lvlJc w:val="left"/>
+      <w:pPr>
+        <w:ind w:left="1440" w:hanging="360"/>
+      </w:pPr>
+      <w:rPr>
+        <w:rFonts w:ascii="Courier New" w:hAnsi="Courier New" w:cs="Courier New" w:hint="default"/>
+      </w:rPr>
+    </w:lvl>
+    <w:lvl w:ilvl="2" w:tplc="04090005" w:tentative="1">
+      <w:start w:val="1"/>
+      <w:numFmt w:val="bullet"/>
+      <w:lvlText w:val=""/>
+      <w:lvlJc w:val="left"/>
+      <w:pPr>
+        <w:ind w:left="2160" w:hanging="360"/>
+      </w:pPr>
+      <w:rPr>
+        <w:rFonts w:ascii="Wingdings" w:hAnsi="Wingdings" w:hint="default"/>
+      </w:rPr>
+    </w:lvl>
+    <w:lvl w:ilvl="3" w:tplc="04090001" w:tentative="1">
+      <w:start w:val="1"/>
+      <w:numFmt w:val="bullet"/>
+      <w:lvlText w:val=""/>
+      <w:lvlJc w:val="left"/>
+      <w:pPr>
+        <w:ind w:left="2880" w:hanging="360"/>
+      </w:pPr>
+      <w:rPr>
+        <w:rFonts w:ascii="Symbol" w:hAnsi="Symbol" w:hint="default"/>
+      </w:rPr>
+    </w:lvl>
+    <w:lvl w:ilvl="4" w:tplc="04090003" w:tentative="1">
+      <w:start w:val="1"/>
+      <w:numFmt w:val="bullet"/>
+      <w:lvlText w:val="o"/>
+      <w:lvlJc w:val="left"/>
+      <w:pPr>
+        <w:ind w:left="3600" w:hanging="360"/>
+      </w:pPr>
+      <w:rPr>
+        <w:rFonts w:ascii="Courier New" w:hAnsi="Courier New" w:cs="Courier New" w:hint="default"/>
+      </w:rPr>
+    </w:lvl>
+    <w:lvl w:ilvl="5" w:tplc="04090005" w:tentative="1">
+      <w:start w:val="1"/>
+      <w:numFmt w:val="bullet"/>
+      <w:lvlText w:val=""/>
+      <w:lvlJc w:val="left"/>
+      <w:pPr>
+        <w:ind w:left="4320" w:hanging="360"/>
+      </w:pPr>
+      <w:rPr>
+        <w:rFonts w:ascii="Wingdings" w:hAnsi="Wingdings" w:hint="default"/>
+      </w:rPr>
+    </w:lvl>
+    <w:lvl w:ilvl="6" w:tplc="04090001" w:tentative="1">
+      <w:start w:val="1"/>
+      <w:numFmt w:val="bullet"/>
+      <w:lvlText w:val=""/>
+      <w:lvlJc w:val="left"/>
+      <w:pPr>
+        <w:ind w:left="5040" w:hanging="360"/>
+      </w:pPr>
+      <w:rPr>
+        <w:rFonts w:ascii="Symbol" w:hAnsi="Symbol" w:hint="default"/>
+      </w:rPr>
+    </w:lvl>
+    <w:lvl w:ilvl="7" w:tplc="04090003" w:tentative="1">
+      <w:start w:val="1"/>
+      <w:numFmt w:val="bullet"/>
+      <w:lvlText w:val="o"/>
+      <w:lvlJc w:val="left"/>
+      <w:pPr>
+        <w:ind w:left="5760" w:hanging="360"/>
+      </w:pPr>
+      <w:rPr>
+        <w:rFonts w:ascii="Courier New" w:hAnsi="Courier New" w:cs="Courier New" w:hint="default"/>
+      </w:rPr>
+    </w:lvl>
+    <w:lvl w:ilvl="8" w:tplc="04090005" w:tentative="1">
+      <w:start w:val="1"/>
+      <w:numFmt w:val="bullet"/>
+      <w:lvlText w:val=""/>
+      <w:lvlJc w:val="left"/>
+      <w:pPr>
+        <w:ind w:left="6480" w:hanging="360"/>
+      </w:pPr>
+      <w:rPr>
+        <w:rFonts w:ascii="Wingdings" w:hAnsi="Wingdings" w:hint="default"/>
+      </w:rPr>
+    </w:lvl>
+  </w:abstractNum>
   <w:num w:numId="1" w16cid:durableId="824902107">
+    <w:abstractNumId w:val="3"/>
+  </w:num>
+  <w:num w:numId="2" w16cid:durableId="617299781">
+    <w:abstractNumId w:val="5"/>
+  </w:num>
+  <w:num w:numId="3" w16cid:durableId="1048263498">
     <w:abstractNumId w:val="2"/>
   </w:num>
-  <w:num w:numId="2" w16cid:durableId="617299781">
-    <w:abstractNumId w:val="3"/>
-  </w:num>
-  <w:num w:numId="3" w16cid:durableId="1048263498">
+  <w:num w:numId="4" w16cid:durableId="237983024">
     <w:abstractNumId w:val="1"/>
   </w:num>
-  <w:num w:numId="4" w16cid:durableId="237983024">
+  <w:num w:numId="5" w16cid:durableId="325859572">
     <w:abstractNumId w:val="0"/>
+  </w:num>
+  <w:num w:numId="6" w16cid:durableId="398870548">
+    <w:abstractNumId w:val="4"/>
+  </w:num>
+  <w:num w:numId="7" w16cid:durableId="1317153043">
+    <w:abstractNumId w:val="6"/>
   </w:num>
 </w:numbering>
 </file>

</xml_diff>

<commit_message>
Actualiza fuentes de datos con hoja 5.1PM
</commit_message>
<xml_diff>
--- a/Documentacion/Fuentes de Datos.docx
+++ b/Documentacion/Fuentes de Datos.docx
@@ -759,7 +759,27 @@
           <w:iCs/>
           <w:lang w:val="es-CO"/>
         </w:rPr>
-        <w:t>Censo Viterbo Caldas 2018/Data/Datasets/</w:t>
+        <w:t>Censo Viterbo Caldas 2018/Data/</w:t>
+      </w:r>
+      <w:proofErr w:type="spellStart"/>
+      <w:r>
+        <w:rPr>
+          <w:rFonts w:ascii="Arial" w:hAnsi="Arial" w:cs="Arial"/>
+          <w:i/>
+          <w:iCs/>
+          <w:lang w:val="es-CO"/>
+        </w:rPr>
+        <w:t>Datasets</w:t>
+      </w:r>
+      <w:proofErr w:type="spellEnd"/>
+      <w:r>
+        <w:rPr>
+          <w:rFonts w:ascii="Arial" w:hAnsi="Arial" w:cs="Arial"/>
+          <w:i/>
+          <w:iCs/>
+          <w:lang w:val="es-CO"/>
+        </w:rPr>
+        <w:t>/</w:t>
       </w:r>
     </w:p>
     <w:p>
@@ -2926,7 +2946,23 @@
           <w:rFonts w:ascii="Arial" w:hAnsi="Arial" w:cs="Arial"/>
           <w:lang w:val="es-CO"/>
         </w:rPr>
-        <w:t>(blank) (texto): Título en blanco, contiene las edades.</w:t>
+        <w:t>(</w:t>
+      </w:r>
+      <w:proofErr w:type="spellStart"/>
+      <w:r>
+        <w:rPr>
+          <w:rFonts w:ascii="Arial" w:hAnsi="Arial" w:cs="Arial"/>
+          <w:lang w:val="es-CO"/>
+        </w:rPr>
+        <w:t>blank</w:t>
+      </w:r>
+      <w:proofErr w:type="spellEnd"/>
+      <w:r>
+        <w:rPr>
+          <w:rFonts w:ascii="Arial" w:hAnsi="Arial" w:cs="Arial"/>
+          <w:lang w:val="es-CO"/>
+        </w:rPr>
+        <w:t>) (texto): Título en blanco, contiene las edades.</w:t>
       </w:r>
     </w:p>
     <w:p>
@@ -3208,19 +3244,53 @@
           <w:rFonts w:ascii="Arial" w:hAnsi="Arial" w:cs="Arial"/>
           <w:lang w:val="es-CO"/>
         </w:rPr>
-        <w:t>Contiene 17 columnas y 3 agrupaciones, cada agrupación tiene 3 subagrupaciones.</w:t>
-      </w:r>
-    </w:p>
-    <w:p>
-      <w:pPr>
-        <w:rPr>
-          <w:rFonts w:ascii="Arial" w:hAnsi="Arial" w:cs="Arial"/>
-          <w:lang w:val="es-CO"/>
-        </w:rPr>
-      </w:pPr>
-    </w:p>
-    <w:p>
-      <w:pPr>
+        <w:t>Contiene 17 columnas y 3 agrupaciones, cada agrupación tiene 3 su</w:t>
+      </w:r>
+      <w:r>
+        <w:rPr>
+          <w:rFonts w:ascii="Arial" w:hAnsi="Arial" w:cs="Arial"/>
+          <w:lang w:val="es-CO"/>
+        </w:rPr>
+        <w:t>bgrupos</w:t>
+      </w:r>
+      <w:r>
+        <w:rPr>
+          <w:rFonts w:ascii="Arial" w:hAnsi="Arial" w:cs="Arial"/>
+          <w:lang w:val="es-CO"/>
+        </w:rPr>
+        <w:t>.</w:t>
+      </w:r>
+    </w:p>
+    <w:p>
+      <w:pPr>
+        <w:rPr>
+          <w:rFonts w:ascii="Arial" w:hAnsi="Arial" w:cs="Arial"/>
+          <w:lang w:val="es-CO"/>
+        </w:rPr>
+      </w:pPr>
+    </w:p>
+    <w:p>
+      <w:pPr>
+        <w:rPr>
+          <w:rFonts w:ascii="Arial" w:hAnsi="Arial" w:cs="Arial"/>
+          <w:lang w:val="es-CO"/>
+        </w:rPr>
+      </w:pPr>
+      <w:r>
+        <w:rPr>
+          <w:rFonts w:ascii="Arial" w:hAnsi="Arial" w:cs="Arial"/>
+          <w:lang w:val="es-CO"/>
+        </w:rPr>
+        <w:t>Columnas:</w:t>
+      </w:r>
+    </w:p>
+    <w:p>
+      <w:pPr>
+        <w:pStyle w:val="Prrafodelista"/>
+        <w:numPr>
+          <w:ilvl w:val="0"/>
+          <w:numId w:val="5"/>
+        </w:numPr>
         <w:rPr>
           <w:rFonts w:ascii="Arial" w:hAnsi="Arial" w:cs="Arial"/>
           <w:lang w:val="es-CO"/>
@@ -3232,6 +3302,599 @@
           <w:lang w:val="es-CO"/>
         </w:rPr>
         <w:lastRenderedPageBreak/>
+        <w:t>Total (entero): Cantidad total.</w:t>
+      </w:r>
+    </w:p>
+    <w:p>
+      <w:pPr>
+        <w:pStyle w:val="Prrafodelista"/>
+        <w:numPr>
+          <w:ilvl w:val="0"/>
+          <w:numId w:val="5"/>
+        </w:numPr>
+        <w:rPr>
+          <w:rFonts w:ascii="Arial" w:hAnsi="Arial" w:cs="Arial"/>
+          <w:lang w:val="es-CO"/>
+        </w:rPr>
+      </w:pPr>
+      <w:r>
+        <w:rPr>
+          <w:rFonts w:ascii="Arial" w:hAnsi="Arial" w:cs="Arial"/>
+          <w:lang w:val="es-CO"/>
+        </w:rPr>
+        <w:t>Jefe(a) del hogar (entero): Cantidad de censados que son jefes del hogar.</w:t>
+      </w:r>
+    </w:p>
+    <w:p>
+      <w:pPr>
+        <w:pStyle w:val="Prrafodelista"/>
+        <w:numPr>
+          <w:ilvl w:val="0"/>
+          <w:numId w:val="5"/>
+        </w:numPr>
+        <w:rPr>
+          <w:rFonts w:ascii="Arial" w:hAnsi="Arial" w:cs="Arial"/>
+          <w:lang w:val="es-CO"/>
+        </w:rPr>
+      </w:pPr>
+      <w:r>
+        <w:rPr>
+          <w:rFonts w:ascii="Arial" w:hAnsi="Arial" w:cs="Arial"/>
+          <w:lang w:val="es-CO"/>
+        </w:rPr>
+        <w:t xml:space="preserve">Pareja (Conyugue, Compañero(a), </w:t>
+      </w:r>
+      <w:r>
+        <w:rPr>
+          <w:rFonts w:ascii="Arial" w:hAnsi="Arial" w:cs="Arial"/>
+          <w:lang w:val="es-CO"/>
+        </w:rPr>
+        <w:t>esposo(a)) (entero): Cantidad de censados que son pareja del jefe del hogar.</w:t>
+      </w:r>
+    </w:p>
+    <w:p>
+      <w:pPr>
+        <w:pStyle w:val="Prrafodelista"/>
+        <w:numPr>
+          <w:ilvl w:val="0"/>
+          <w:numId w:val="5"/>
+        </w:numPr>
+        <w:rPr>
+          <w:rFonts w:ascii="Arial" w:hAnsi="Arial" w:cs="Arial"/>
+          <w:lang w:val="es-CO"/>
+        </w:rPr>
+      </w:pPr>
+      <w:r>
+        <w:rPr>
+          <w:rFonts w:ascii="Arial" w:hAnsi="Arial" w:cs="Arial"/>
+          <w:lang w:val="es-CO"/>
+        </w:rPr>
+        <w:t>Hijo(a) (entero): Cantidad de censados que son hijos del jefe del hogar.</w:t>
+      </w:r>
+    </w:p>
+    <w:p>
+      <w:pPr>
+        <w:pStyle w:val="Prrafodelista"/>
+        <w:numPr>
+          <w:ilvl w:val="0"/>
+          <w:numId w:val="5"/>
+        </w:numPr>
+        <w:rPr>
+          <w:rFonts w:ascii="Arial" w:hAnsi="Arial" w:cs="Arial"/>
+          <w:lang w:val="es-CO"/>
+        </w:rPr>
+      </w:pPr>
+      <w:r>
+        <w:rPr>
+          <w:rFonts w:ascii="Arial" w:hAnsi="Arial" w:cs="Arial"/>
+          <w:lang w:val="es-CO"/>
+        </w:rPr>
+        <w:t>Hijastro(a) (entero): Cantidad de censados que son hijastros del jefe de hogar.</w:t>
+      </w:r>
+    </w:p>
+    <w:p>
+      <w:pPr>
+        <w:pStyle w:val="Prrafodelista"/>
+        <w:numPr>
+          <w:ilvl w:val="0"/>
+          <w:numId w:val="5"/>
+        </w:numPr>
+        <w:rPr>
+          <w:rFonts w:ascii="Arial" w:hAnsi="Arial" w:cs="Arial"/>
+          <w:lang w:val="es-CO"/>
+        </w:rPr>
+      </w:pPr>
+      <w:r>
+        <w:rPr>
+          <w:rFonts w:ascii="Arial" w:hAnsi="Arial" w:cs="Arial"/>
+          <w:lang w:val="es-CO"/>
+        </w:rPr>
+        <w:t>Yerno/nuera (entero): Cantidad de censados que son yerno</w:t>
+      </w:r>
+      <w:r>
+        <w:rPr>
+          <w:rFonts w:ascii="Arial" w:hAnsi="Arial" w:cs="Arial"/>
+          <w:lang w:val="es-CO"/>
+        </w:rPr>
+        <w:t>s</w:t>
+      </w:r>
+      <w:r>
+        <w:rPr>
+          <w:rFonts w:ascii="Arial" w:hAnsi="Arial" w:cs="Arial"/>
+          <w:lang w:val="es-CO"/>
+        </w:rPr>
+        <w:t xml:space="preserve"> o nuera</w:t>
+      </w:r>
+      <w:r>
+        <w:rPr>
+          <w:rFonts w:ascii="Arial" w:hAnsi="Arial" w:cs="Arial"/>
+          <w:lang w:val="es-CO"/>
+        </w:rPr>
+        <w:t>s</w:t>
+      </w:r>
+      <w:r>
+        <w:rPr>
+          <w:rFonts w:ascii="Arial" w:hAnsi="Arial" w:cs="Arial"/>
+          <w:lang w:val="es-CO"/>
+        </w:rPr>
+        <w:t xml:space="preserve"> del jefe del hogar.</w:t>
+      </w:r>
+    </w:p>
+    <w:p>
+      <w:pPr>
+        <w:pStyle w:val="Prrafodelista"/>
+        <w:numPr>
+          <w:ilvl w:val="0"/>
+          <w:numId w:val="5"/>
+        </w:numPr>
+        <w:rPr>
+          <w:rFonts w:ascii="Arial" w:hAnsi="Arial" w:cs="Arial"/>
+          <w:lang w:val="es-CO"/>
+        </w:rPr>
+      </w:pPr>
+      <w:r>
+        <w:rPr>
+          <w:rFonts w:ascii="Arial" w:hAnsi="Arial" w:cs="Arial"/>
+          <w:lang w:val="es-CO"/>
+        </w:rPr>
+        <w:t xml:space="preserve">Padre/madre (entero): </w:t>
+      </w:r>
+      <w:r>
+        <w:rPr>
+          <w:rFonts w:ascii="Arial" w:hAnsi="Arial" w:cs="Arial"/>
+          <w:lang w:val="es-CO"/>
+        </w:rPr>
+        <w:t>Cantidad de censados que son padres o madres del jefe del hogar.</w:t>
+      </w:r>
+    </w:p>
+    <w:p>
+      <w:pPr>
+        <w:pStyle w:val="Prrafodelista"/>
+        <w:numPr>
+          <w:ilvl w:val="0"/>
+          <w:numId w:val="5"/>
+        </w:numPr>
+        <w:rPr>
+          <w:rFonts w:ascii="Arial" w:hAnsi="Arial" w:cs="Arial"/>
+          <w:lang w:val="es-CO"/>
+        </w:rPr>
+      </w:pPr>
+      <w:r>
+        <w:rPr>
+          <w:rFonts w:ascii="Arial" w:hAnsi="Arial" w:cs="Arial"/>
+          <w:lang w:val="es-CO"/>
+        </w:rPr>
+        <w:t>Padrastro, madrastra (entero): Cantidad de censados que son padrastros o madrastras del jefe del hogar.</w:t>
+      </w:r>
+    </w:p>
+    <w:p>
+      <w:pPr>
+        <w:pStyle w:val="Prrafodelista"/>
+        <w:numPr>
+          <w:ilvl w:val="0"/>
+          <w:numId w:val="5"/>
+        </w:numPr>
+        <w:rPr>
+          <w:rFonts w:ascii="Arial" w:hAnsi="Arial" w:cs="Arial"/>
+          <w:lang w:val="es-CO"/>
+        </w:rPr>
+      </w:pPr>
+      <w:r>
+        <w:rPr>
+          <w:rFonts w:ascii="Arial" w:hAnsi="Arial" w:cs="Arial"/>
+          <w:lang w:val="es-CO"/>
+        </w:rPr>
+        <w:t>Suegro(a) (entero): Cantidad de censados que son suegros del jefe del hogar.</w:t>
+      </w:r>
+    </w:p>
+    <w:p>
+      <w:pPr>
+        <w:pStyle w:val="Prrafodelista"/>
+        <w:numPr>
+          <w:ilvl w:val="0"/>
+          <w:numId w:val="5"/>
+        </w:numPr>
+        <w:rPr>
+          <w:rFonts w:ascii="Arial" w:hAnsi="Arial" w:cs="Arial"/>
+          <w:lang w:val="es-CO"/>
+        </w:rPr>
+      </w:pPr>
+      <w:r>
+        <w:rPr>
+          <w:rFonts w:ascii="Arial" w:hAnsi="Arial" w:cs="Arial"/>
+          <w:lang w:val="es-CO"/>
+        </w:rPr>
+        <w:t>Hermano(a) (entero): Cantidad de censados que son hermanos del jefe del hogar.</w:t>
+      </w:r>
+    </w:p>
+    <w:p>
+      <w:pPr>
+        <w:pStyle w:val="Prrafodelista"/>
+        <w:numPr>
+          <w:ilvl w:val="0"/>
+          <w:numId w:val="5"/>
+        </w:numPr>
+        <w:rPr>
+          <w:rFonts w:ascii="Arial" w:hAnsi="Arial" w:cs="Arial"/>
+          <w:lang w:val="es-CO"/>
+        </w:rPr>
+      </w:pPr>
+      <w:r>
+        <w:rPr>
+          <w:rFonts w:ascii="Arial" w:hAnsi="Arial" w:cs="Arial"/>
+          <w:lang w:val="es-CO"/>
+        </w:rPr>
+        <w:t>Hermanastro(a) (entero): Cantidad de censados que son hermanastros del jefe del hogar.</w:t>
+      </w:r>
+    </w:p>
+    <w:p>
+      <w:pPr>
+        <w:pStyle w:val="Prrafodelista"/>
+        <w:numPr>
+          <w:ilvl w:val="0"/>
+          <w:numId w:val="5"/>
+        </w:numPr>
+        <w:rPr>
+          <w:rFonts w:ascii="Arial" w:hAnsi="Arial" w:cs="Arial"/>
+          <w:lang w:val="es-CO"/>
+        </w:rPr>
+      </w:pPr>
+      <w:r>
+        <w:rPr>
+          <w:rFonts w:ascii="Arial" w:hAnsi="Arial" w:cs="Arial"/>
+          <w:lang w:val="es-CO"/>
+        </w:rPr>
+        <w:t>Cuñado(a) (entero): Cantidad de censados que son cuñados del jefe del hogar.</w:t>
+      </w:r>
+    </w:p>
+    <w:p>
+      <w:pPr>
+        <w:pStyle w:val="Prrafodelista"/>
+        <w:numPr>
+          <w:ilvl w:val="0"/>
+          <w:numId w:val="5"/>
+        </w:numPr>
+        <w:rPr>
+          <w:rFonts w:ascii="Arial" w:hAnsi="Arial" w:cs="Arial"/>
+          <w:lang w:val="es-CO"/>
+        </w:rPr>
+      </w:pPr>
+      <w:r>
+        <w:rPr>
+          <w:rFonts w:ascii="Arial" w:hAnsi="Arial" w:cs="Arial"/>
+          <w:lang w:val="es-CO"/>
+        </w:rPr>
+        <w:t>Nieto(a) (entero): Cantidad de censados que son nietos del jefe del hogar.</w:t>
+      </w:r>
+    </w:p>
+    <w:p>
+      <w:pPr>
+        <w:pStyle w:val="Prrafodelista"/>
+        <w:numPr>
+          <w:ilvl w:val="0"/>
+          <w:numId w:val="5"/>
+        </w:numPr>
+        <w:rPr>
+          <w:rFonts w:ascii="Arial" w:hAnsi="Arial" w:cs="Arial"/>
+          <w:lang w:val="es-CO"/>
+        </w:rPr>
+      </w:pPr>
+      <w:r>
+        <w:rPr>
+          <w:rFonts w:ascii="Arial" w:hAnsi="Arial" w:cs="Arial"/>
+          <w:lang w:val="es-CO"/>
+        </w:rPr>
+        <w:t>Abuelo(a) (entero): Cantidad de censados que son abuelos del jefe del hogar.</w:t>
+      </w:r>
+    </w:p>
+    <w:p>
+      <w:pPr>
+        <w:pStyle w:val="Prrafodelista"/>
+        <w:numPr>
+          <w:ilvl w:val="0"/>
+          <w:numId w:val="5"/>
+        </w:numPr>
+        <w:rPr>
+          <w:rFonts w:ascii="Arial" w:hAnsi="Arial" w:cs="Arial"/>
+          <w:lang w:val="es-CO"/>
+        </w:rPr>
+      </w:pPr>
+      <w:r>
+        <w:rPr>
+          <w:rFonts w:ascii="Arial" w:hAnsi="Arial" w:cs="Arial"/>
+          <w:lang w:val="es-CO"/>
+        </w:rPr>
+        <w:t>Otro pariente (entero): Cantidad de censados que son otro tipo de pariente del jefe del hogar.</w:t>
+      </w:r>
+    </w:p>
+    <w:p>
+      <w:pPr>
+        <w:pStyle w:val="Prrafodelista"/>
+        <w:numPr>
+          <w:ilvl w:val="0"/>
+          <w:numId w:val="5"/>
+        </w:numPr>
+        <w:rPr>
+          <w:rFonts w:ascii="Arial" w:hAnsi="Arial" w:cs="Arial"/>
+          <w:lang w:val="es-CO"/>
+        </w:rPr>
+      </w:pPr>
+      <w:r>
+        <w:rPr>
+          <w:rFonts w:ascii="Arial" w:hAnsi="Arial" w:cs="Arial"/>
+          <w:lang w:val="es-CO"/>
+        </w:rPr>
+        <w:t>Empleado(a) del servicio doméstico (entero): Cantidad de censados que son empleados domésticos del jefe del hogar.</w:t>
+      </w:r>
+    </w:p>
+    <w:p>
+      <w:pPr>
+        <w:pStyle w:val="Prrafodelista"/>
+        <w:numPr>
+          <w:ilvl w:val="0"/>
+          <w:numId w:val="5"/>
+        </w:numPr>
+        <w:rPr>
+          <w:rFonts w:ascii="Arial" w:hAnsi="Arial" w:cs="Arial"/>
+          <w:lang w:val="es-CO"/>
+        </w:rPr>
+      </w:pPr>
+      <w:r>
+        <w:rPr>
+          <w:rFonts w:ascii="Arial" w:hAnsi="Arial" w:cs="Arial"/>
+          <w:lang w:val="es-CO"/>
+        </w:rPr>
+        <w:t>No pariente (entero): Cantidad de censados que no son parientes del jefe del hogar.</w:t>
+      </w:r>
+    </w:p>
+    <w:p>
+      <w:pPr>
+        <w:rPr>
+          <w:rFonts w:ascii="Arial" w:hAnsi="Arial" w:cs="Arial"/>
+          <w:lang w:val="es-CO"/>
+        </w:rPr>
+      </w:pPr>
+    </w:p>
+    <w:p>
+      <w:pPr>
+        <w:rPr>
+          <w:rFonts w:ascii="Arial" w:hAnsi="Arial" w:cs="Arial"/>
+          <w:lang w:val="es-CO"/>
+        </w:rPr>
+      </w:pPr>
+      <w:r>
+        <w:rPr>
+          <w:rFonts w:ascii="Arial" w:hAnsi="Arial" w:cs="Arial"/>
+          <w:lang w:val="es-CO"/>
+        </w:rPr>
+        <w:t>Agrupaciones:</w:t>
+      </w:r>
+    </w:p>
+    <w:p>
+      <w:pPr>
+        <w:pStyle w:val="Prrafodelista"/>
+        <w:numPr>
+          <w:ilvl w:val="0"/>
+          <w:numId w:val="6"/>
+        </w:numPr>
+        <w:rPr>
+          <w:rFonts w:ascii="Arial" w:hAnsi="Arial" w:cs="Arial"/>
+          <w:lang w:val="es-CO"/>
+        </w:rPr>
+      </w:pPr>
+      <w:r>
+        <w:rPr>
+          <w:rFonts w:ascii="Arial" w:hAnsi="Arial" w:cs="Arial"/>
+          <w:lang w:val="es-CO"/>
+        </w:rPr>
+        <w:t>Total: Grupo con resumen cantidades totales.</w:t>
+      </w:r>
+    </w:p>
+    <w:p>
+      <w:pPr>
+        <w:pStyle w:val="Prrafodelista"/>
+        <w:numPr>
+          <w:ilvl w:val="0"/>
+          <w:numId w:val="6"/>
+        </w:numPr>
+        <w:rPr>
+          <w:rFonts w:ascii="Arial" w:hAnsi="Arial" w:cs="Arial"/>
+          <w:lang w:val="es-CO"/>
+        </w:rPr>
+      </w:pPr>
+      <w:r>
+        <w:rPr>
+          <w:rFonts w:ascii="Arial" w:hAnsi="Arial" w:cs="Arial"/>
+          <w:lang w:val="es-CO"/>
+        </w:rPr>
+        <w:t>Cabecera: Grupo con resumen de datos correspondientes a las cabeceras municipales.</w:t>
+      </w:r>
+    </w:p>
+    <w:p>
+      <w:pPr>
+        <w:pStyle w:val="Prrafodelista"/>
+        <w:numPr>
+          <w:ilvl w:val="0"/>
+          <w:numId w:val="6"/>
+        </w:numPr>
+        <w:rPr>
+          <w:rFonts w:ascii="Arial" w:hAnsi="Arial" w:cs="Arial"/>
+          <w:lang w:val="es-CO"/>
+        </w:rPr>
+      </w:pPr>
+      <w:r>
+        <w:rPr>
+          <w:rFonts w:ascii="Arial" w:hAnsi="Arial" w:cs="Arial"/>
+          <w:lang w:val="es-CO"/>
+        </w:rPr>
+        <w:t>Rural disperso: Grupo con resumen de datos correspondiente a la zona rural.</w:t>
+      </w:r>
+    </w:p>
+    <w:p>
+      <w:pPr>
+        <w:rPr>
+          <w:rFonts w:ascii="Arial" w:hAnsi="Arial" w:cs="Arial"/>
+          <w:lang w:val="es-CO"/>
+        </w:rPr>
+      </w:pPr>
+    </w:p>
+    <w:p>
+      <w:pPr>
+        <w:rPr>
+          <w:rFonts w:ascii="Arial" w:hAnsi="Arial" w:cs="Arial"/>
+          <w:lang w:val="es-CO"/>
+        </w:rPr>
+      </w:pPr>
+      <w:r>
+        <w:rPr>
+          <w:rFonts w:ascii="Arial" w:hAnsi="Arial" w:cs="Arial"/>
+          <w:lang w:val="es-CO"/>
+        </w:rPr>
+        <w:t>Subgrupos:</w:t>
+      </w:r>
+    </w:p>
+    <w:p>
+      <w:pPr>
+        <w:pStyle w:val="Prrafodelista"/>
+        <w:numPr>
+          <w:ilvl w:val="0"/>
+          <w:numId w:val="7"/>
+        </w:numPr>
+        <w:rPr>
+          <w:rFonts w:ascii="Arial" w:hAnsi="Arial" w:cs="Arial"/>
+          <w:lang w:val="es-CO"/>
+        </w:rPr>
+      </w:pPr>
+      <w:r>
+        <w:rPr>
+          <w:rFonts w:ascii="Arial" w:hAnsi="Arial" w:cs="Arial"/>
+          <w:lang w:val="es-CO"/>
+        </w:rPr>
+        <w:t>Total: Subgrupo con resumen total del grupo.</w:t>
+      </w:r>
+    </w:p>
+    <w:p>
+      <w:pPr>
+        <w:pStyle w:val="Prrafodelista"/>
+        <w:numPr>
+          <w:ilvl w:val="0"/>
+          <w:numId w:val="7"/>
+        </w:numPr>
+        <w:rPr>
+          <w:rFonts w:ascii="Arial" w:hAnsi="Arial" w:cs="Arial"/>
+          <w:lang w:val="es-CO"/>
+        </w:rPr>
+      </w:pPr>
+      <w:r>
+        <w:rPr>
+          <w:rFonts w:ascii="Arial" w:hAnsi="Arial" w:cs="Arial"/>
+          <w:lang w:val="es-CO"/>
+        </w:rPr>
+        <w:t>Hombre: Subgrupo de datos correspondientes a los hombres.</w:t>
+      </w:r>
+    </w:p>
+    <w:p>
+      <w:pPr>
+        <w:pStyle w:val="Prrafodelista"/>
+        <w:numPr>
+          <w:ilvl w:val="0"/>
+          <w:numId w:val="7"/>
+        </w:numPr>
+        <w:rPr>
+          <w:rFonts w:ascii="Arial" w:hAnsi="Arial" w:cs="Arial"/>
+          <w:lang w:val="es-CO"/>
+        </w:rPr>
+      </w:pPr>
+      <w:r>
+        <w:rPr>
+          <w:rFonts w:ascii="Arial" w:hAnsi="Arial" w:cs="Arial"/>
+          <w:lang w:val="es-CO"/>
+        </w:rPr>
+        <w:t>Mujer: Subgrupo de datos correspondientes a las mujeres.</w:t>
+      </w:r>
+    </w:p>
+    <w:p>
+      <w:pPr>
+        <w:rPr>
+          <w:rFonts w:ascii="Arial" w:hAnsi="Arial" w:cs="Arial"/>
+          <w:lang w:val="es-CO"/>
+        </w:rPr>
+      </w:pPr>
+    </w:p>
+    <w:p>
+      <w:pPr>
+        <w:rPr>
+          <w:rFonts w:ascii="Arial" w:hAnsi="Arial" w:cs="Arial"/>
+          <w:b/>
+          <w:bCs/>
+          <w:lang w:val="es-CO"/>
+        </w:rPr>
+      </w:pPr>
+      <w:r>
+        <w:rPr>
+          <w:rFonts w:ascii="Arial" w:hAnsi="Arial" w:cs="Arial"/>
+          <w:b/>
+          <w:bCs/>
+          <w:lang w:val="es-CO"/>
+        </w:rPr>
+        <w:t>5.1PM</w:t>
+      </w:r>
+    </w:p>
+    <w:p>
+      <w:pPr>
+        <w:rPr>
+          <w:rFonts w:ascii="Arial" w:hAnsi="Arial" w:cs="Arial"/>
+          <w:lang w:val="es-CO"/>
+        </w:rPr>
+      </w:pPr>
+      <w:r>
+        <w:rPr>
+          <w:rFonts w:ascii="Arial" w:hAnsi="Arial" w:cs="Arial"/>
+          <w:lang w:val="es-CO"/>
+        </w:rPr>
+        <w:t>Contiene 17 columnas y 3 agrupaciones, cada agrupación tiene 18 subgrupos que corresponden a rangos de edad.</w:t>
+      </w:r>
+    </w:p>
+    <w:p>
+      <w:pPr>
+        <w:rPr>
+          <w:rFonts w:ascii="Arial" w:hAnsi="Arial" w:cs="Arial"/>
+          <w:lang w:val="es-CO"/>
+        </w:rPr>
+      </w:pPr>
+    </w:p>
+    <w:p>
+      <w:pPr>
+        <w:rPr>
+          <w:rFonts w:ascii="Arial" w:hAnsi="Arial" w:cs="Arial"/>
+          <w:lang w:val="es-CO"/>
+        </w:rPr>
+      </w:pPr>
+      <w:r>
+        <w:rPr>
+          <w:rFonts w:ascii="Arial" w:hAnsi="Arial" w:cs="Arial"/>
+          <w:lang w:val="es-CO"/>
+        </w:rPr>
         <w:t>Columnas:</w:t>
       </w:r>
     </w:p>
@@ -3292,14 +3955,7 @@
           <w:rFonts w:ascii="Arial" w:hAnsi="Arial" w:cs="Arial"/>
           <w:lang w:val="es-CO"/>
         </w:rPr>
-        <w:t xml:space="preserve">Pareja (Conyugue, Compañero(a), </w:t>
-      </w:r>
-      <w:r>
-        <w:rPr>
-          <w:rFonts w:ascii="Arial" w:hAnsi="Arial" w:cs="Arial"/>
-          <w:lang w:val="es-CO"/>
-        </w:rPr>
-        <w:t>esposo(a)) (entero): Cantidad de censados que son pareja del jefe del hogar.</w:t>
+        <w:t>Pareja (Conyugue, Compañero(a), esposo(a)) (entero): Cantidad de censados que son pareja del jefe del hogar.</w:t>
       </w:r>
     </w:p>
     <w:p>
@@ -3359,35 +4015,7 @@
           <w:rFonts w:ascii="Arial" w:hAnsi="Arial" w:cs="Arial"/>
           <w:lang w:val="es-CO"/>
         </w:rPr>
-        <w:t>Yerno/nuera (entero): Cantidad de censados que son yerno</w:t>
-      </w:r>
-      <w:r>
-        <w:rPr>
-          <w:rFonts w:ascii="Arial" w:hAnsi="Arial" w:cs="Arial"/>
-          <w:lang w:val="es-CO"/>
-        </w:rPr>
-        <w:t>s</w:t>
-      </w:r>
-      <w:r>
-        <w:rPr>
-          <w:rFonts w:ascii="Arial" w:hAnsi="Arial" w:cs="Arial"/>
-          <w:lang w:val="es-CO"/>
-        </w:rPr>
-        <w:t xml:space="preserve"> o nuera</w:t>
-      </w:r>
-      <w:r>
-        <w:rPr>
-          <w:rFonts w:ascii="Arial" w:hAnsi="Arial" w:cs="Arial"/>
-          <w:lang w:val="es-CO"/>
-        </w:rPr>
-        <w:t>s</w:t>
-      </w:r>
-      <w:r>
-        <w:rPr>
-          <w:rFonts w:ascii="Arial" w:hAnsi="Arial" w:cs="Arial"/>
-          <w:lang w:val="es-CO"/>
-        </w:rPr>
-        <w:t xml:space="preserve"> del jefe del hogar.</w:t>
+        <w:t>Yerno/nuera (entero): Cantidad de censados que son yernos o nueras del jefe del hogar.</w:t>
       </w:r>
     </w:p>
     <w:p>
@@ -3407,14 +4035,7 @@
           <w:rFonts w:ascii="Arial" w:hAnsi="Arial" w:cs="Arial"/>
           <w:lang w:val="es-CO"/>
         </w:rPr>
-        <w:t xml:space="preserve">Padre/madre (entero): </w:t>
-      </w:r>
-      <w:r>
-        <w:rPr>
-          <w:rFonts w:ascii="Arial" w:hAnsi="Arial" w:cs="Arial"/>
-          <w:lang w:val="es-CO"/>
-        </w:rPr>
-        <w:t>Cantidad de censados que son padres o madres del jefe del hogar.</w:t>
+        <w:t>Padre/madre (entero): Cantidad de censados que son padres o madres del jefe del hogar.</w:t>
       </w:r>
     </w:p>
     <w:p>
@@ -3574,6 +4195,7 @@
           <w:rFonts w:ascii="Arial" w:hAnsi="Arial" w:cs="Arial"/>
           <w:lang w:val="es-CO"/>
         </w:rPr>
+        <w:lastRenderedPageBreak/>
         <w:t>Otro pariente (entero): Cantidad de censados que son otro tipo de pariente del jefe del hogar.</w:t>
       </w:r>
     </w:p>
@@ -3682,115 +4304,18 @@
     </w:p>
     <w:p>
       <w:pPr>
-        <w:pStyle w:val="Prrafodelista"/>
-        <w:numPr>
-          <w:ilvl w:val="0"/>
-          <w:numId w:val="6"/>
-        </w:numPr>
-        <w:rPr>
-          <w:rFonts w:ascii="Arial" w:hAnsi="Arial" w:cs="Arial"/>
-          <w:lang w:val="es-CO"/>
-        </w:rPr>
-      </w:pPr>
-      <w:r>
-        <w:rPr>
-          <w:rFonts w:ascii="Arial" w:hAnsi="Arial" w:cs="Arial"/>
-          <w:lang w:val="es-CO"/>
-        </w:rPr>
-        <w:lastRenderedPageBreak/>
+        <w:rPr>
+          <w:rFonts w:ascii="Arial" w:hAnsi="Arial" w:cs="Arial"/>
+          <w:lang w:val="es-CO"/>
+        </w:rPr>
+      </w:pPr>
+      <w:r>
+        <w:rPr>
+          <w:rFonts w:ascii="Arial" w:hAnsi="Arial" w:cs="Arial"/>
+          <w:lang w:val="es-CO"/>
+        </w:rPr>
         <w:t>Rural disperso: Grupo con resumen de datos correspondiente a la zona rural.</w:t>
       </w:r>
-    </w:p>
-    <w:p>
-      <w:pPr>
-        <w:rPr>
-          <w:rFonts w:ascii="Arial" w:hAnsi="Arial" w:cs="Arial"/>
-          <w:lang w:val="es-CO"/>
-        </w:rPr>
-      </w:pPr>
-    </w:p>
-    <w:p>
-      <w:pPr>
-        <w:rPr>
-          <w:rFonts w:ascii="Arial" w:hAnsi="Arial" w:cs="Arial"/>
-          <w:lang w:val="es-CO"/>
-        </w:rPr>
-      </w:pPr>
-      <w:r>
-        <w:rPr>
-          <w:rFonts w:ascii="Arial" w:hAnsi="Arial" w:cs="Arial"/>
-          <w:lang w:val="es-CO"/>
-        </w:rPr>
-        <w:t>Subgrupos:</w:t>
-      </w:r>
-    </w:p>
-    <w:p>
-      <w:pPr>
-        <w:pStyle w:val="Prrafodelista"/>
-        <w:numPr>
-          <w:ilvl w:val="0"/>
-          <w:numId w:val="7"/>
-        </w:numPr>
-        <w:rPr>
-          <w:rFonts w:ascii="Arial" w:hAnsi="Arial" w:cs="Arial"/>
-          <w:lang w:val="es-CO"/>
-        </w:rPr>
-      </w:pPr>
-      <w:r>
-        <w:rPr>
-          <w:rFonts w:ascii="Arial" w:hAnsi="Arial" w:cs="Arial"/>
-          <w:lang w:val="es-CO"/>
-        </w:rPr>
-        <w:t>Total: Subgrupo con resumen total del grupo.</w:t>
-      </w:r>
-    </w:p>
-    <w:p>
-      <w:pPr>
-        <w:pStyle w:val="Prrafodelista"/>
-        <w:numPr>
-          <w:ilvl w:val="0"/>
-          <w:numId w:val="7"/>
-        </w:numPr>
-        <w:rPr>
-          <w:rFonts w:ascii="Arial" w:hAnsi="Arial" w:cs="Arial"/>
-          <w:lang w:val="es-CO"/>
-        </w:rPr>
-      </w:pPr>
-      <w:r>
-        <w:rPr>
-          <w:rFonts w:ascii="Arial" w:hAnsi="Arial" w:cs="Arial"/>
-          <w:lang w:val="es-CO"/>
-        </w:rPr>
-        <w:t>Hombre: Subgrupo de datos correspondientes a los hombres.</w:t>
-      </w:r>
-    </w:p>
-    <w:p>
-      <w:pPr>
-        <w:pStyle w:val="Prrafodelista"/>
-        <w:numPr>
-          <w:ilvl w:val="0"/>
-          <w:numId w:val="7"/>
-        </w:numPr>
-        <w:rPr>
-          <w:rFonts w:ascii="Arial" w:hAnsi="Arial" w:cs="Arial"/>
-          <w:lang w:val="es-CO"/>
-        </w:rPr>
-      </w:pPr>
-      <w:r>
-        <w:rPr>
-          <w:rFonts w:ascii="Arial" w:hAnsi="Arial" w:cs="Arial"/>
-          <w:lang w:val="es-CO"/>
-        </w:rPr>
-        <w:t>Mujer: Subgrupo de datos correspondientes a las mujeres.</w:t>
-      </w:r>
-    </w:p>
-    <w:p>
-      <w:pPr>
-        <w:rPr>
-          <w:rFonts w:ascii="Arial" w:hAnsi="Arial" w:cs="Arial"/>
-          <w:lang w:val="es-CO"/>
-        </w:rPr>
-      </w:pPr>
     </w:p>
     <w:sectPr>
       <w:pgSz w:w="12240" w:h="15840"/>

</xml_diff>

<commit_message>
Actualiza fuentes de datos con hoja 5.2PM
</commit_message>
<xml_diff>
--- a/Documentacion/Fuentes de Datos.docx
+++ b/Documentacion/Fuentes de Datos.docx
@@ -3276,11 +3276,20 @@
           <w:lang w:val="es-CO"/>
         </w:rPr>
       </w:pPr>
-      <w:r>
-        <w:rPr>
-          <w:rFonts w:ascii="Arial" w:hAnsi="Arial" w:cs="Arial"/>
-          <w:lang w:val="es-CO"/>
-        </w:rPr>
+    </w:p>
+    <w:p>
+      <w:pPr>
+        <w:rPr>
+          <w:rFonts w:ascii="Arial" w:hAnsi="Arial" w:cs="Arial"/>
+          <w:lang w:val="es-CO"/>
+        </w:rPr>
+      </w:pPr>
+      <w:r>
+        <w:rPr>
+          <w:rFonts w:ascii="Arial" w:hAnsi="Arial" w:cs="Arial"/>
+          <w:lang w:val="es-CO"/>
+        </w:rPr>
+        <w:lastRenderedPageBreak/>
         <w:t>Columnas:</w:t>
       </w:r>
     </w:p>
@@ -3301,7 +3310,6 @@
           <w:rFonts w:ascii="Arial" w:hAnsi="Arial" w:cs="Arial"/>
           <w:lang w:val="es-CO"/>
         </w:rPr>
-        <w:lastRenderedPageBreak/>
         <w:t>Total (entero): Cantidad total.</w:t>
       </w:r>
     </w:p>
@@ -3674,14 +3682,6 @@
           <w:lang w:val="es-CO"/>
         </w:rPr>
       </w:pPr>
-    </w:p>
-    <w:p>
-      <w:pPr>
-        <w:rPr>
-          <w:rFonts w:ascii="Arial" w:hAnsi="Arial" w:cs="Arial"/>
-          <w:lang w:val="es-CO"/>
-        </w:rPr>
-      </w:pPr>
       <w:r>
         <w:rPr>
           <w:rFonts w:ascii="Arial" w:hAnsi="Arial" w:cs="Arial"/>
@@ -3707,7 +3707,21 @@
           <w:rFonts w:ascii="Arial" w:hAnsi="Arial" w:cs="Arial"/>
           <w:lang w:val="es-CO"/>
         </w:rPr>
-        <w:t>Total: Grupo con resumen cantidades totales.</w:t>
+        <w:t xml:space="preserve">Total: Grupo con resumen </w:t>
+      </w:r>
+      <w:r>
+        <w:rPr>
+          <w:rFonts w:ascii="Arial" w:hAnsi="Arial" w:cs="Arial"/>
+          <w:lang w:val="es-CO"/>
+        </w:rPr>
+        <w:t xml:space="preserve">de </w:t>
+      </w:r>
+      <w:r>
+        <w:rPr>
+          <w:rFonts w:ascii="Arial" w:hAnsi="Arial" w:cs="Arial"/>
+          <w:lang w:val="es-CO"/>
+        </w:rPr>
+        <w:t>cantidades totales.</w:t>
       </w:r>
     </w:p>
     <w:p>
@@ -3882,14 +3896,6 @@
           <w:lang w:val="es-CO"/>
         </w:rPr>
       </w:pPr>
-    </w:p>
-    <w:p>
-      <w:pPr>
-        <w:rPr>
-          <w:rFonts w:ascii="Arial" w:hAnsi="Arial" w:cs="Arial"/>
-          <w:lang w:val="es-CO"/>
-        </w:rPr>
-      </w:pPr>
       <w:r>
         <w:rPr>
           <w:rFonts w:ascii="Arial" w:hAnsi="Arial" w:cs="Arial"/>
@@ -4195,7 +4201,517 @@
           <w:rFonts w:ascii="Arial" w:hAnsi="Arial" w:cs="Arial"/>
           <w:lang w:val="es-CO"/>
         </w:rPr>
+        <w:t>Otro pariente (entero): Cantidad de censados que son otro tipo de pariente del jefe del hogar.</w:t>
+      </w:r>
+    </w:p>
+    <w:p>
+      <w:pPr>
+        <w:pStyle w:val="Prrafodelista"/>
+        <w:numPr>
+          <w:ilvl w:val="0"/>
+          <w:numId w:val="5"/>
+        </w:numPr>
+        <w:rPr>
+          <w:rFonts w:ascii="Arial" w:hAnsi="Arial" w:cs="Arial"/>
+          <w:lang w:val="es-CO"/>
+        </w:rPr>
+      </w:pPr>
+      <w:r>
+        <w:rPr>
+          <w:rFonts w:ascii="Arial" w:hAnsi="Arial" w:cs="Arial"/>
+          <w:lang w:val="es-CO"/>
+        </w:rPr>
         <w:lastRenderedPageBreak/>
+        <w:t>Empleado(a) del servicio doméstico (entero): Cantidad de censados que son empleados domésticos del jefe del hogar.</w:t>
+      </w:r>
+    </w:p>
+    <w:p>
+      <w:pPr>
+        <w:pStyle w:val="Prrafodelista"/>
+        <w:numPr>
+          <w:ilvl w:val="0"/>
+          <w:numId w:val="5"/>
+        </w:numPr>
+        <w:rPr>
+          <w:rFonts w:ascii="Arial" w:hAnsi="Arial" w:cs="Arial"/>
+          <w:lang w:val="es-CO"/>
+        </w:rPr>
+      </w:pPr>
+      <w:r>
+        <w:rPr>
+          <w:rFonts w:ascii="Arial" w:hAnsi="Arial" w:cs="Arial"/>
+          <w:lang w:val="es-CO"/>
+        </w:rPr>
+        <w:t>No pariente (entero): Cantidad de censados que no son parientes del jefe del hogar.</w:t>
+      </w:r>
+    </w:p>
+    <w:p>
+      <w:pPr>
+        <w:rPr>
+          <w:rFonts w:ascii="Arial" w:hAnsi="Arial" w:cs="Arial"/>
+          <w:lang w:val="es-CO"/>
+        </w:rPr>
+      </w:pPr>
+      <w:r>
+        <w:rPr>
+          <w:rFonts w:ascii="Arial" w:hAnsi="Arial" w:cs="Arial"/>
+          <w:lang w:val="es-CO"/>
+        </w:rPr>
+        <w:t>Agrupaciones:</w:t>
+      </w:r>
+    </w:p>
+    <w:p>
+      <w:pPr>
+        <w:pStyle w:val="Prrafodelista"/>
+        <w:numPr>
+          <w:ilvl w:val="0"/>
+          <w:numId w:val="6"/>
+        </w:numPr>
+        <w:rPr>
+          <w:rFonts w:ascii="Arial" w:hAnsi="Arial" w:cs="Arial"/>
+          <w:lang w:val="es-CO"/>
+        </w:rPr>
+      </w:pPr>
+      <w:r>
+        <w:rPr>
+          <w:rFonts w:ascii="Arial" w:hAnsi="Arial" w:cs="Arial"/>
+          <w:lang w:val="es-CO"/>
+        </w:rPr>
+        <w:t>Total: Grupo con resumen cantidades totales.</w:t>
+      </w:r>
+    </w:p>
+    <w:p>
+      <w:pPr>
+        <w:pStyle w:val="Prrafodelista"/>
+        <w:numPr>
+          <w:ilvl w:val="0"/>
+          <w:numId w:val="6"/>
+        </w:numPr>
+        <w:rPr>
+          <w:rFonts w:ascii="Arial" w:hAnsi="Arial" w:cs="Arial"/>
+          <w:lang w:val="es-CO"/>
+        </w:rPr>
+      </w:pPr>
+      <w:r>
+        <w:rPr>
+          <w:rFonts w:ascii="Arial" w:hAnsi="Arial" w:cs="Arial"/>
+          <w:lang w:val="es-CO"/>
+        </w:rPr>
+        <w:t>Cabecera: Grupo con resumen de datos correspondientes a las cabeceras municipales.</w:t>
+      </w:r>
+    </w:p>
+    <w:p>
+      <w:pPr>
+        <w:rPr>
+          <w:rFonts w:ascii="Arial" w:hAnsi="Arial" w:cs="Arial"/>
+          <w:lang w:val="es-CO"/>
+        </w:rPr>
+      </w:pPr>
+      <w:r>
+        <w:rPr>
+          <w:rFonts w:ascii="Arial" w:hAnsi="Arial" w:cs="Arial"/>
+          <w:lang w:val="es-CO"/>
+        </w:rPr>
+        <w:t>Rural disperso: Grupo con resumen de datos correspondiente a la zona rural.</w:t>
+      </w:r>
+    </w:p>
+    <w:p>
+      <w:pPr>
+        <w:rPr>
+          <w:rFonts w:ascii="Arial" w:hAnsi="Arial" w:cs="Arial"/>
+          <w:lang w:val="es-CO"/>
+        </w:rPr>
+      </w:pPr>
+    </w:p>
+    <w:p>
+      <w:pPr>
+        <w:rPr>
+          <w:rFonts w:ascii="Arial" w:hAnsi="Arial" w:cs="Arial"/>
+          <w:b/>
+          <w:bCs/>
+          <w:lang w:val="es-CO"/>
+        </w:rPr>
+      </w:pPr>
+      <w:r>
+        <w:rPr>
+          <w:rFonts w:ascii="Arial" w:hAnsi="Arial" w:cs="Arial"/>
+          <w:b/>
+          <w:bCs/>
+          <w:lang w:val="es-CO"/>
+        </w:rPr>
+        <w:t>5.2PM</w:t>
+      </w:r>
+    </w:p>
+    <w:p>
+      <w:pPr>
+        <w:rPr>
+          <w:rFonts w:ascii="Arial" w:hAnsi="Arial" w:cs="Arial"/>
+          <w:lang w:val="es-CO"/>
+        </w:rPr>
+      </w:pPr>
+      <w:r>
+        <w:rPr>
+          <w:rFonts w:ascii="Arial" w:hAnsi="Arial" w:cs="Arial"/>
+          <w:lang w:val="es-CO"/>
+        </w:rPr>
+        <w:t xml:space="preserve">Contiene 17 columnas y </w:t>
+      </w:r>
+      <w:r>
+        <w:rPr>
+          <w:rFonts w:ascii="Arial" w:hAnsi="Arial" w:cs="Arial"/>
+          <w:lang w:val="es-CO"/>
+        </w:rPr>
+        <w:t>2</w:t>
+      </w:r>
+      <w:r>
+        <w:rPr>
+          <w:rFonts w:ascii="Arial" w:hAnsi="Arial" w:cs="Arial"/>
+          <w:lang w:val="es-CO"/>
+        </w:rPr>
+        <w:t xml:space="preserve"> agrupaciones, cada agrupación tiene </w:t>
+      </w:r>
+      <w:r>
+        <w:rPr>
+          <w:rFonts w:ascii="Arial" w:hAnsi="Arial" w:cs="Arial"/>
+          <w:lang w:val="es-CO"/>
+        </w:rPr>
+        <w:t>3</w:t>
+      </w:r>
+      <w:r>
+        <w:rPr>
+          <w:rFonts w:ascii="Arial" w:hAnsi="Arial" w:cs="Arial"/>
+          <w:lang w:val="es-CO"/>
+        </w:rPr>
+        <w:t xml:space="preserve"> subgrupos </w:t>
+      </w:r>
+      <w:r>
+        <w:rPr>
+          <w:rFonts w:ascii="Arial" w:hAnsi="Arial" w:cs="Arial"/>
+          <w:lang w:val="es-CO"/>
+        </w:rPr>
+        <w:t xml:space="preserve">y cada subgrupo tiene 18 subgrupos </w:t>
+      </w:r>
+      <w:r>
+        <w:rPr>
+          <w:rFonts w:ascii="Arial" w:hAnsi="Arial" w:cs="Arial"/>
+          <w:lang w:val="es-CO"/>
+        </w:rPr>
+        <w:t>que corresponden a rangos de edad.</w:t>
+      </w:r>
+    </w:p>
+    <w:p>
+      <w:pPr>
+        <w:rPr>
+          <w:rFonts w:ascii="Arial" w:hAnsi="Arial" w:cs="Arial"/>
+          <w:lang w:val="es-CO"/>
+        </w:rPr>
+      </w:pPr>
+      <w:r>
+        <w:rPr>
+          <w:rFonts w:ascii="Arial" w:hAnsi="Arial" w:cs="Arial"/>
+          <w:lang w:val="es-CO"/>
+        </w:rPr>
+        <w:t>Columnas:</w:t>
+      </w:r>
+    </w:p>
+    <w:p>
+      <w:pPr>
+        <w:pStyle w:val="Prrafodelista"/>
+        <w:numPr>
+          <w:ilvl w:val="0"/>
+          <w:numId w:val="5"/>
+        </w:numPr>
+        <w:rPr>
+          <w:rFonts w:ascii="Arial" w:hAnsi="Arial" w:cs="Arial"/>
+          <w:lang w:val="es-CO"/>
+        </w:rPr>
+      </w:pPr>
+      <w:r>
+        <w:rPr>
+          <w:rFonts w:ascii="Arial" w:hAnsi="Arial" w:cs="Arial"/>
+          <w:lang w:val="es-CO"/>
+        </w:rPr>
+        <w:t>Total (entero): Cantidad total.</w:t>
+      </w:r>
+    </w:p>
+    <w:p>
+      <w:pPr>
+        <w:pStyle w:val="Prrafodelista"/>
+        <w:numPr>
+          <w:ilvl w:val="0"/>
+          <w:numId w:val="5"/>
+        </w:numPr>
+        <w:rPr>
+          <w:rFonts w:ascii="Arial" w:hAnsi="Arial" w:cs="Arial"/>
+          <w:lang w:val="es-CO"/>
+        </w:rPr>
+      </w:pPr>
+      <w:r>
+        <w:rPr>
+          <w:rFonts w:ascii="Arial" w:hAnsi="Arial" w:cs="Arial"/>
+          <w:lang w:val="es-CO"/>
+        </w:rPr>
+        <w:t>Jefe(a) del hogar (entero): Cantidad de censados que son jefes del hogar.</w:t>
+      </w:r>
+    </w:p>
+    <w:p>
+      <w:pPr>
+        <w:pStyle w:val="Prrafodelista"/>
+        <w:numPr>
+          <w:ilvl w:val="0"/>
+          <w:numId w:val="5"/>
+        </w:numPr>
+        <w:rPr>
+          <w:rFonts w:ascii="Arial" w:hAnsi="Arial" w:cs="Arial"/>
+          <w:lang w:val="es-CO"/>
+        </w:rPr>
+      </w:pPr>
+      <w:r>
+        <w:rPr>
+          <w:rFonts w:ascii="Arial" w:hAnsi="Arial" w:cs="Arial"/>
+          <w:lang w:val="es-CO"/>
+        </w:rPr>
+        <w:t>Pareja (Conyugue, Compañero(a), esposo(a)) (entero): Cantidad de censados que son pareja del jefe del hogar.</w:t>
+      </w:r>
+    </w:p>
+    <w:p>
+      <w:pPr>
+        <w:pStyle w:val="Prrafodelista"/>
+        <w:numPr>
+          <w:ilvl w:val="0"/>
+          <w:numId w:val="5"/>
+        </w:numPr>
+        <w:rPr>
+          <w:rFonts w:ascii="Arial" w:hAnsi="Arial" w:cs="Arial"/>
+          <w:lang w:val="es-CO"/>
+        </w:rPr>
+      </w:pPr>
+      <w:r>
+        <w:rPr>
+          <w:rFonts w:ascii="Arial" w:hAnsi="Arial" w:cs="Arial"/>
+          <w:lang w:val="es-CO"/>
+        </w:rPr>
+        <w:t>Hijo(a) (entero): Cantidad de censados que son hijos del jefe del hogar.</w:t>
+      </w:r>
+    </w:p>
+    <w:p>
+      <w:pPr>
+        <w:pStyle w:val="Prrafodelista"/>
+        <w:numPr>
+          <w:ilvl w:val="0"/>
+          <w:numId w:val="5"/>
+        </w:numPr>
+        <w:rPr>
+          <w:rFonts w:ascii="Arial" w:hAnsi="Arial" w:cs="Arial"/>
+          <w:lang w:val="es-CO"/>
+        </w:rPr>
+      </w:pPr>
+      <w:r>
+        <w:rPr>
+          <w:rFonts w:ascii="Arial" w:hAnsi="Arial" w:cs="Arial"/>
+          <w:lang w:val="es-CO"/>
+        </w:rPr>
+        <w:t>Hijastro(a) (entero): Cantidad de censados que son hijastros del jefe de hogar.</w:t>
+      </w:r>
+    </w:p>
+    <w:p>
+      <w:pPr>
+        <w:pStyle w:val="Prrafodelista"/>
+        <w:numPr>
+          <w:ilvl w:val="0"/>
+          <w:numId w:val="5"/>
+        </w:numPr>
+        <w:rPr>
+          <w:rFonts w:ascii="Arial" w:hAnsi="Arial" w:cs="Arial"/>
+          <w:lang w:val="es-CO"/>
+        </w:rPr>
+      </w:pPr>
+      <w:r>
+        <w:rPr>
+          <w:rFonts w:ascii="Arial" w:hAnsi="Arial" w:cs="Arial"/>
+          <w:lang w:val="es-CO"/>
+        </w:rPr>
+        <w:t>Yerno/nuera (entero): Cantidad de censados que son yernos o nueras del jefe del hogar.</w:t>
+      </w:r>
+    </w:p>
+    <w:p>
+      <w:pPr>
+        <w:pStyle w:val="Prrafodelista"/>
+        <w:numPr>
+          <w:ilvl w:val="0"/>
+          <w:numId w:val="5"/>
+        </w:numPr>
+        <w:rPr>
+          <w:rFonts w:ascii="Arial" w:hAnsi="Arial" w:cs="Arial"/>
+          <w:lang w:val="es-CO"/>
+        </w:rPr>
+      </w:pPr>
+      <w:r>
+        <w:rPr>
+          <w:rFonts w:ascii="Arial" w:hAnsi="Arial" w:cs="Arial"/>
+          <w:lang w:val="es-CO"/>
+        </w:rPr>
+        <w:t>Padre/madre (entero): Cantidad de censados que son padres o madres del jefe del hogar.</w:t>
+      </w:r>
+    </w:p>
+    <w:p>
+      <w:pPr>
+        <w:pStyle w:val="Prrafodelista"/>
+        <w:numPr>
+          <w:ilvl w:val="0"/>
+          <w:numId w:val="5"/>
+        </w:numPr>
+        <w:rPr>
+          <w:rFonts w:ascii="Arial" w:hAnsi="Arial" w:cs="Arial"/>
+          <w:lang w:val="es-CO"/>
+        </w:rPr>
+      </w:pPr>
+      <w:r>
+        <w:rPr>
+          <w:rFonts w:ascii="Arial" w:hAnsi="Arial" w:cs="Arial"/>
+          <w:lang w:val="es-CO"/>
+        </w:rPr>
+        <w:t>Padrastro, madrastra (entero): Cantidad de censados que son padrastros o madrastras del jefe del hogar.</w:t>
+      </w:r>
+    </w:p>
+    <w:p>
+      <w:pPr>
+        <w:pStyle w:val="Prrafodelista"/>
+        <w:numPr>
+          <w:ilvl w:val="0"/>
+          <w:numId w:val="5"/>
+        </w:numPr>
+        <w:rPr>
+          <w:rFonts w:ascii="Arial" w:hAnsi="Arial" w:cs="Arial"/>
+          <w:lang w:val="es-CO"/>
+        </w:rPr>
+      </w:pPr>
+      <w:r>
+        <w:rPr>
+          <w:rFonts w:ascii="Arial" w:hAnsi="Arial" w:cs="Arial"/>
+          <w:lang w:val="es-CO"/>
+        </w:rPr>
+        <w:t>Suegro(a) (entero): Cantidad de censados que son suegros del jefe del hogar.</w:t>
+      </w:r>
+    </w:p>
+    <w:p>
+      <w:pPr>
+        <w:pStyle w:val="Prrafodelista"/>
+        <w:numPr>
+          <w:ilvl w:val="0"/>
+          <w:numId w:val="5"/>
+        </w:numPr>
+        <w:rPr>
+          <w:rFonts w:ascii="Arial" w:hAnsi="Arial" w:cs="Arial"/>
+          <w:lang w:val="es-CO"/>
+        </w:rPr>
+      </w:pPr>
+      <w:r>
+        <w:rPr>
+          <w:rFonts w:ascii="Arial" w:hAnsi="Arial" w:cs="Arial"/>
+          <w:lang w:val="es-CO"/>
+        </w:rPr>
+        <w:t>Hermano(a) (entero): Cantidad de censados que son hermanos del jefe del hogar.</w:t>
+      </w:r>
+    </w:p>
+    <w:p>
+      <w:pPr>
+        <w:pStyle w:val="Prrafodelista"/>
+        <w:numPr>
+          <w:ilvl w:val="0"/>
+          <w:numId w:val="5"/>
+        </w:numPr>
+        <w:rPr>
+          <w:rFonts w:ascii="Arial" w:hAnsi="Arial" w:cs="Arial"/>
+          <w:lang w:val="es-CO"/>
+        </w:rPr>
+      </w:pPr>
+      <w:r>
+        <w:rPr>
+          <w:rFonts w:ascii="Arial" w:hAnsi="Arial" w:cs="Arial"/>
+          <w:lang w:val="es-CO"/>
+        </w:rPr>
+        <w:t>Hermanastro(a) (entero): Cantidad de censados que son hermanastros del jefe del hogar.</w:t>
+      </w:r>
+    </w:p>
+    <w:p>
+      <w:pPr>
+        <w:pStyle w:val="Prrafodelista"/>
+        <w:numPr>
+          <w:ilvl w:val="0"/>
+          <w:numId w:val="5"/>
+        </w:numPr>
+        <w:rPr>
+          <w:rFonts w:ascii="Arial" w:hAnsi="Arial" w:cs="Arial"/>
+          <w:lang w:val="es-CO"/>
+        </w:rPr>
+      </w:pPr>
+      <w:r>
+        <w:rPr>
+          <w:rFonts w:ascii="Arial" w:hAnsi="Arial" w:cs="Arial"/>
+          <w:lang w:val="es-CO"/>
+        </w:rPr>
+        <w:t>Cuñado(a) (entero): Cantidad de censados que son cuñados del jefe del hogar.</w:t>
+      </w:r>
+    </w:p>
+    <w:p>
+      <w:pPr>
+        <w:pStyle w:val="Prrafodelista"/>
+        <w:numPr>
+          <w:ilvl w:val="0"/>
+          <w:numId w:val="5"/>
+        </w:numPr>
+        <w:rPr>
+          <w:rFonts w:ascii="Arial" w:hAnsi="Arial" w:cs="Arial"/>
+          <w:lang w:val="es-CO"/>
+        </w:rPr>
+      </w:pPr>
+      <w:r>
+        <w:rPr>
+          <w:rFonts w:ascii="Arial" w:hAnsi="Arial" w:cs="Arial"/>
+          <w:lang w:val="es-CO"/>
+        </w:rPr>
+        <w:lastRenderedPageBreak/>
+        <w:t>Nieto(a) (entero): Cantidad de censados que son nietos del jefe del hogar.</w:t>
+      </w:r>
+    </w:p>
+    <w:p>
+      <w:pPr>
+        <w:pStyle w:val="Prrafodelista"/>
+        <w:numPr>
+          <w:ilvl w:val="0"/>
+          <w:numId w:val="5"/>
+        </w:numPr>
+        <w:rPr>
+          <w:rFonts w:ascii="Arial" w:hAnsi="Arial" w:cs="Arial"/>
+          <w:lang w:val="es-CO"/>
+        </w:rPr>
+      </w:pPr>
+      <w:r>
+        <w:rPr>
+          <w:rFonts w:ascii="Arial" w:hAnsi="Arial" w:cs="Arial"/>
+          <w:lang w:val="es-CO"/>
+        </w:rPr>
+        <w:t>Abuelo(a) (entero): Cantidad de censados que son abuelos del jefe del hogar.</w:t>
+      </w:r>
+    </w:p>
+    <w:p>
+      <w:pPr>
+        <w:pStyle w:val="Prrafodelista"/>
+        <w:numPr>
+          <w:ilvl w:val="0"/>
+          <w:numId w:val="5"/>
+        </w:numPr>
+        <w:rPr>
+          <w:rFonts w:ascii="Arial" w:hAnsi="Arial" w:cs="Arial"/>
+          <w:lang w:val="es-CO"/>
+        </w:rPr>
+      </w:pPr>
+      <w:r>
+        <w:rPr>
+          <w:rFonts w:ascii="Arial" w:hAnsi="Arial" w:cs="Arial"/>
+          <w:lang w:val="es-CO"/>
+        </w:rPr>
         <w:t>Otro pariente (entero): Cantidad de censados que son otro tipo de pariente del jefe del hogar.</w:t>
       </w:r>
     </w:p>
@@ -4246,14 +4762,6 @@
           <w:lang w:val="es-CO"/>
         </w:rPr>
       </w:pPr>
-    </w:p>
-    <w:p>
-      <w:pPr>
-        <w:rPr>
-          <w:rFonts w:ascii="Arial" w:hAnsi="Arial" w:cs="Arial"/>
-          <w:lang w:val="es-CO"/>
-        </w:rPr>
-      </w:pPr>
       <w:r>
         <w:rPr>
           <w:rFonts w:ascii="Arial" w:hAnsi="Arial" w:cs="Arial"/>
@@ -4279,7 +4787,56 @@
           <w:rFonts w:ascii="Arial" w:hAnsi="Arial" w:cs="Arial"/>
           <w:lang w:val="es-CO"/>
         </w:rPr>
-        <w:t>Total: Grupo con resumen cantidades totales.</w:t>
+        <w:t xml:space="preserve">Hombre: </w:t>
+      </w:r>
+      <w:r>
+        <w:rPr>
+          <w:rFonts w:ascii="Arial" w:hAnsi="Arial" w:cs="Arial"/>
+          <w:lang w:val="es-CO"/>
+        </w:rPr>
+        <w:t xml:space="preserve">Grupo con resumen de datos correspondiente </w:t>
+      </w:r>
+      <w:r>
+        <w:rPr>
+          <w:rFonts w:ascii="Arial" w:hAnsi="Arial" w:cs="Arial"/>
+          <w:lang w:val="es-CO"/>
+        </w:rPr>
+        <w:t>a los hombres.</w:t>
+      </w:r>
+    </w:p>
+    <w:p>
+      <w:pPr>
+        <w:pStyle w:val="Prrafodelista"/>
+        <w:numPr>
+          <w:ilvl w:val="0"/>
+          <w:numId w:val="8"/>
+        </w:numPr>
+        <w:rPr>
+          <w:rFonts w:ascii="Arial" w:hAnsi="Arial" w:cs="Arial"/>
+          <w:lang w:val="es-CO"/>
+        </w:rPr>
+      </w:pPr>
+      <w:r>
+        <w:rPr>
+          <w:rFonts w:ascii="Arial" w:hAnsi="Arial" w:cs="Arial"/>
+          <w:lang w:val="es-CO"/>
+        </w:rPr>
+        <w:t>Mujer: Grupo con resumen de datos correspondiente a las mujeres.</w:t>
+      </w:r>
+    </w:p>
+    <w:p>
+      <w:pPr>
+        <w:rPr>
+          <w:rFonts w:ascii="Arial" w:hAnsi="Arial" w:cs="Arial"/>
+          <w:lang w:val="es-CO"/>
+        </w:rPr>
+      </w:pPr>
+      <w:r>
+        <w:rPr>
+          <w:rFonts w:ascii="Arial" w:hAnsi="Arial" w:cs="Arial"/>
+          <w:lang w:val="es-CO"/>
+        </w:rPr>
+        <w:t>Subgrupos:</w:t>
       </w:r>
     </w:p>
     <w:p>
@@ -4299,23 +4856,120 @@
           <w:rFonts w:ascii="Arial" w:hAnsi="Arial" w:cs="Arial"/>
           <w:lang w:val="es-CO"/>
         </w:rPr>
-        <w:t>Cabecera: Grupo con resumen de datos correspondientes a las cabeceras municipales.</w:t>
-      </w:r>
-    </w:p>
-    <w:p>
-      <w:pPr>
-        <w:rPr>
-          <w:rFonts w:ascii="Arial" w:hAnsi="Arial" w:cs="Arial"/>
-          <w:lang w:val="es-CO"/>
-        </w:rPr>
-      </w:pPr>
-      <w:r>
-        <w:rPr>
-          <w:rFonts w:ascii="Arial" w:hAnsi="Arial" w:cs="Arial"/>
-          <w:lang w:val="es-CO"/>
-        </w:rPr>
-        <w:t>Rural disperso: Grupo con resumen de datos correspondiente a la zona rural.</w:t>
-      </w:r>
+        <w:t xml:space="preserve">Total: </w:t>
+      </w:r>
+      <w:r>
+        <w:rPr>
+          <w:rFonts w:ascii="Arial" w:hAnsi="Arial" w:cs="Arial"/>
+          <w:lang w:val="es-CO"/>
+        </w:rPr>
+        <w:t>Subg</w:t>
+      </w:r>
+      <w:r>
+        <w:rPr>
+          <w:rFonts w:ascii="Arial" w:hAnsi="Arial" w:cs="Arial"/>
+          <w:lang w:val="es-CO"/>
+        </w:rPr>
+        <w:t xml:space="preserve">rupo con resumen </w:t>
+      </w:r>
+      <w:r>
+        <w:rPr>
+          <w:rFonts w:ascii="Arial" w:hAnsi="Arial" w:cs="Arial"/>
+          <w:lang w:val="es-CO"/>
+        </w:rPr>
+        <w:t xml:space="preserve">de </w:t>
+      </w:r>
+      <w:r>
+        <w:rPr>
+          <w:rFonts w:ascii="Arial" w:hAnsi="Arial" w:cs="Arial"/>
+          <w:lang w:val="es-CO"/>
+        </w:rPr>
+        <w:t>cantidades totales.</w:t>
+      </w:r>
+    </w:p>
+    <w:p>
+      <w:pPr>
+        <w:pStyle w:val="Prrafodelista"/>
+        <w:numPr>
+          <w:ilvl w:val="0"/>
+          <w:numId w:val="6"/>
+        </w:numPr>
+        <w:rPr>
+          <w:rFonts w:ascii="Arial" w:hAnsi="Arial" w:cs="Arial"/>
+          <w:lang w:val="es-CO"/>
+        </w:rPr>
+      </w:pPr>
+      <w:r>
+        <w:rPr>
+          <w:rFonts w:ascii="Arial" w:hAnsi="Arial" w:cs="Arial"/>
+          <w:lang w:val="es-CO"/>
+        </w:rPr>
+        <w:t xml:space="preserve">Cabecera: </w:t>
+      </w:r>
+      <w:r>
+        <w:rPr>
+          <w:rFonts w:ascii="Arial" w:hAnsi="Arial" w:cs="Arial"/>
+          <w:lang w:val="es-CO"/>
+        </w:rPr>
+        <w:t>Subg</w:t>
+      </w:r>
+      <w:r>
+        <w:rPr>
+          <w:rFonts w:ascii="Arial" w:hAnsi="Arial" w:cs="Arial"/>
+          <w:lang w:val="es-CO"/>
+        </w:rPr>
+        <w:t>rupo con resumen de datos correspondientes a las cabeceras municipales.</w:t>
+      </w:r>
+    </w:p>
+    <w:p>
+      <w:pPr>
+        <w:pStyle w:val="Prrafodelista"/>
+        <w:numPr>
+          <w:ilvl w:val="0"/>
+          <w:numId w:val="6"/>
+        </w:numPr>
+        <w:rPr>
+          <w:rFonts w:ascii="Arial" w:hAnsi="Arial" w:cs="Arial"/>
+          <w:lang w:val="es-CO"/>
+        </w:rPr>
+      </w:pPr>
+      <w:r>
+        <w:rPr>
+          <w:rFonts w:ascii="Arial" w:hAnsi="Arial" w:cs="Arial"/>
+          <w:lang w:val="es-CO"/>
+        </w:rPr>
+        <w:t xml:space="preserve">Rural disperso: </w:t>
+      </w:r>
+      <w:r>
+        <w:rPr>
+          <w:rFonts w:ascii="Arial" w:hAnsi="Arial" w:cs="Arial"/>
+          <w:lang w:val="es-CO"/>
+        </w:rPr>
+        <w:t>Subg</w:t>
+      </w:r>
+      <w:r>
+        <w:rPr>
+          <w:rFonts w:ascii="Arial" w:hAnsi="Arial" w:cs="Arial"/>
+          <w:lang w:val="es-CO"/>
+        </w:rPr>
+        <w:t>rupo con resumen de datos correspondiente a la zona rural.</w:t>
+      </w:r>
+    </w:p>
+    <w:p>
+      <w:pPr>
+        <w:rPr>
+          <w:rFonts w:ascii="Arial" w:hAnsi="Arial" w:cs="Arial"/>
+          <w:lang w:val="es-CO"/>
+        </w:rPr>
+      </w:pPr>
+    </w:p>
+    <w:p>
+      <w:pPr>
+        <w:rPr>
+          <w:rFonts w:ascii="Arial" w:hAnsi="Arial" w:cs="Arial"/>
+          <w:lang w:val="es-CO"/>
+        </w:rPr>
+      </w:pPr>
     </w:p>
     <w:sectPr>
       <w:pgSz w:w="12240" w:h="15840"/>
@@ -4443,6 +5097,119 @@
     </w:lvl>
   </w:abstractNum>
   <w:abstractNum w:abstractNumId="1" w15:restartNumberingAfterBreak="0">
+    <w:nsid w:val="36ED691A"/>
+    <w:multiLevelType w:val="hybridMultilevel"/>
+    <w:tmpl w:val="56FC6232"/>
+    <w:lvl w:ilvl="0" w:tplc="04090001">
+      <w:start w:val="1"/>
+      <w:numFmt w:val="bullet"/>
+      <w:lvlText w:val=""/>
+      <w:lvlJc w:val="left"/>
+      <w:pPr>
+        <w:ind w:left="720" w:hanging="360"/>
+      </w:pPr>
+      <w:rPr>
+        <w:rFonts w:ascii="Symbol" w:hAnsi="Symbol" w:hint="default"/>
+      </w:rPr>
+    </w:lvl>
+    <w:lvl w:ilvl="1" w:tplc="04090003" w:tentative="1">
+      <w:start w:val="1"/>
+      <w:numFmt w:val="bullet"/>
+      <w:lvlText w:val="o"/>
+      <w:lvlJc w:val="left"/>
+      <w:pPr>
+        <w:ind w:left="1440" w:hanging="360"/>
+      </w:pPr>
+      <w:rPr>
+        <w:rFonts w:ascii="Courier New" w:hAnsi="Courier New" w:cs="Courier New" w:hint="default"/>
+      </w:rPr>
+    </w:lvl>
+    <w:lvl w:ilvl="2" w:tplc="04090005" w:tentative="1">
+      <w:start w:val="1"/>
+      <w:numFmt w:val="bullet"/>
+      <w:lvlText w:val=""/>
+      <w:lvlJc w:val="left"/>
+      <w:pPr>
+        <w:ind w:left="2160" w:hanging="360"/>
+      </w:pPr>
+      <w:rPr>
+        <w:rFonts w:ascii="Wingdings" w:hAnsi="Wingdings" w:hint="default"/>
+      </w:rPr>
+    </w:lvl>
+    <w:lvl w:ilvl="3" w:tplc="04090001" w:tentative="1">
+      <w:start w:val="1"/>
+      <w:numFmt w:val="bullet"/>
+      <w:lvlText w:val=""/>
+      <w:lvlJc w:val="left"/>
+      <w:pPr>
+        <w:ind w:left="2880" w:hanging="360"/>
+      </w:pPr>
+      <w:rPr>
+        <w:rFonts w:ascii="Symbol" w:hAnsi="Symbol" w:hint="default"/>
+      </w:rPr>
+    </w:lvl>
+    <w:lvl w:ilvl="4" w:tplc="04090003" w:tentative="1">
+      <w:start w:val="1"/>
+      <w:numFmt w:val="bullet"/>
+      <w:lvlText w:val="o"/>
+      <w:lvlJc w:val="left"/>
+      <w:pPr>
+        <w:ind w:left="3600" w:hanging="360"/>
+      </w:pPr>
+      <w:rPr>
+        <w:rFonts w:ascii="Courier New" w:hAnsi="Courier New" w:cs="Courier New" w:hint="default"/>
+      </w:rPr>
+    </w:lvl>
+    <w:lvl w:ilvl="5" w:tplc="04090005" w:tentative="1">
+      <w:start w:val="1"/>
+      <w:numFmt w:val="bullet"/>
+      <w:lvlText w:val=""/>
+      <w:lvlJc w:val="left"/>
+      <w:pPr>
+        <w:ind w:left="4320" w:hanging="360"/>
+      </w:pPr>
+      <w:rPr>
+        <w:rFonts w:ascii="Wingdings" w:hAnsi="Wingdings" w:hint="default"/>
+      </w:rPr>
+    </w:lvl>
+    <w:lvl w:ilvl="6" w:tplc="04090001" w:tentative="1">
+      <w:start w:val="1"/>
+      <w:numFmt w:val="bullet"/>
+      <w:lvlText w:val=""/>
+      <w:lvlJc w:val="left"/>
+      <w:pPr>
+        <w:ind w:left="5040" w:hanging="360"/>
+      </w:pPr>
+      <w:rPr>
+        <w:rFonts w:ascii="Symbol" w:hAnsi="Symbol" w:hint="default"/>
+      </w:rPr>
+    </w:lvl>
+    <w:lvl w:ilvl="7" w:tplc="04090003" w:tentative="1">
+      <w:start w:val="1"/>
+      <w:numFmt w:val="bullet"/>
+      <w:lvlText w:val="o"/>
+      <w:lvlJc w:val="left"/>
+      <w:pPr>
+        <w:ind w:left="5760" w:hanging="360"/>
+      </w:pPr>
+      <w:rPr>
+        <w:rFonts w:ascii="Courier New" w:hAnsi="Courier New" w:cs="Courier New" w:hint="default"/>
+      </w:rPr>
+    </w:lvl>
+    <w:lvl w:ilvl="8" w:tplc="04090005" w:tentative="1">
+      <w:start w:val="1"/>
+      <w:numFmt w:val="bullet"/>
+      <w:lvlText w:val=""/>
+      <w:lvlJc w:val="left"/>
+      <w:pPr>
+        <w:ind w:left="6480" w:hanging="360"/>
+      </w:pPr>
+      <w:rPr>
+        <w:rFonts w:ascii="Wingdings" w:hAnsi="Wingdings" w:hint="default"/>
+      </w:rPr>
+    </w:lvl>
+  </w:abstractNum>
+  <w:abstractNum w:abstractNumId="2" w15:restartNumberingAfterBreak="0">
     <w:nsid w:val="521C4194"/>
     <w:multiLevelType w:val="hybridMultilevel"/>
     <w:tmpl w:val="0542FC48"/>
@@ -4555,7 +5322,7 @@
       </w:rPr>
     </w:lvl>
   </w:abstractNum>
-  <w:abstractNum w:abstractNumId="2" w15:restartNumberingAfterBreak="0">
+  <w:abstractNum w:abstractNumId="3" w15:restartNumberingAfterBreak="0">
     <w:nsid w:val="52D63117"/>
     <w:multiLevelType w:val="hybridMultilevel"/>
     <w:tmpl w:val="036E0984"/>
@@ -4668,7 +5435,7 @@
       </w:rPr>
     </w:lvl>
   </w:abstractNum>
-  <w:abstractNum w:abstractNumId="3" w15:restartNumberingAfterBreak="0">
+  <w:abstractNum w:abstractNumId="4" w15:restartNumberingAfterBreak="0">
     <w:nsid w:val="608B0027"/>
     <w:multiLevelType w:val="hybridMultilevel"/>
     <w:tmpl w:val="1A2A0CCE"/>
@@ -4781,7 +5548,7 @@
       </w:rPr>
     </w:lvl>
   </w:abstractNum>
-  <w:abstractNum w:abstractNumId="4" w15:restartNumberingAfterBreak="0">
+  <w:abstractNum w:abstractNumId="5" w15:restartNumberingAfterBreak="0">
     <w:nsid w:val="6B39307D"/>
     <w:multiLevelType w:val="hybridMultilevel"/>
     <w:tmpl w:val="BE94EE76"/>
@@ -4894,7 +5661,7 @@
       </w:rPr>
     </w:lvl>
   </w:abstractNum>
-  <w:abstractNum w:abstractNumId="5" w15:restartNumberingAfterBreak="0">
+  <w:abstractNum w:abstractNumId="6" w15:restartNumberingAfterBreak="0">
     <w:nsid w:val="6EF91E29"/>
     <w:multiLevelType w:val="hybridMultilevel"/>
     <w:tmpl w:val="90A0CFD2"/>
@@ -5007,7 +5774,7 @@
       </w:rPr>
     </w:lvl>
   </w:abstractNum>
-  <w:abstractNum w:abstractNumId="6" w15:restartNumberingAfterBreak="0">
+  <w:abstractNum w:abstractNumId="7" w15:restartNumberingAfterBreak="0">
     <w:nsid w:val="736117B3"/>
     <w:multiLevelType w:val="hybridMultilevel"/>
     <w:tmpl w:val="B902F320"/>
@@ -5121,25 +5888,28 @@
     </w:lvl>
   </w:abstractNum>
   <w:num w:numId="1" w16cid:durableId="824902107">
+    <w:abstractNumId w:val="4"/>
+  </w:num>
+  <w:num w:numId="2" w16cid:durableId="617299781">
+    <w:abstractNumId w:val="6"/>
+  </w:num>
+  <w:num w:numId="3" w16cid:durableId="1048263498">
     <w:abstractNumId w:val="3"/>
   </w:num>
-  <w:num w:numId="2" w16cid:durableId="617299781">
-    <w:abstractNumId w:val="5"/>
-  </w:num>
-  <w:num w:numId="3" w16cid:durableId="1048263498">
+  <w:num w:numId="4" w16cid:durableId="237983024">
     <w:abstractNumId w:val="2"/>
-  </w:num>
-  <w:num w:numId="4" w16cid:durableId="237983024">
-    <w:abstractNumId w:val="1"/>
   </w:num>
   <w:num w:numId="5" w16cid:durableId="325859572">
     <w:abstractNumId w:val="0"/>
   </w:num>
   <w:num w:numId="6" w16cid:durableId="398870548">
-    <w:abstractNumId w:val="4"/>
+    <w:abstractNumId w:val="5"/>
   </w:num>
   <w:num w:numId="7" w16cid:durableId="1317153043">
-    <w:abstractNumId w:val="6"/>
+    <w:abstractNumId w:val="7"/>
+  </w:num>
+  <w:num w:numId="8" w16cid:durableId="430202784">
+    <w:abstractNumId w:val="1"/>
   </w:num>
 </w:numbering>
 </file>

</xml_diff>

<commit_message>
Actualiza fuentes de datos con hoja 12PM
</commit_message>
<xml_diff>
--- a/Documentacion/Fuentes de Datos.docx
+++ b/Documentacion/Fuentes de Datos.docx
@@ -100,7 +100,7 @@
           <w:rFonts w:ascii="Arial" w:hAnsi="Arial" w:cs="Arial"/>
           <w:lang w:val="es-CO"/>
         </w:rPr>
-        <w:t>4</w:t>
+        <w:t>5</w:t>
       </w:r>
       <w:r>
         <w:rPr>
@@ -759,27 +759,7 @@
           <w:iCs/>
           <w:lang w:val="es-CO"/>
         </w:rPr>
-        <w:t>Censo Viterbo Caldas 2018/Data/</w:t>
-      </w:r>
-      <w:proofErr w:type="spellStart"/>
-      <w:r>
-        <w:rPr>
-          <w:rFonts w:ascii="Arial" w:hAnsi="Arial" w:cs="Arial"/>
-          <w:i/>
-          <w:iCs/>
-          <w:lang w:val="es-CO"/>
-        </w:rPr>
-        <w:t>Datasets</w:t>
-      </w:r>
-      <w:proofErr w:type="spellEnd"/>
-      <w:r>
-        <w:rPr>
-          <w:rFonts w:ascii="Arial" w:hAnsi="Arial" w:cs="Arial"/>
-          <w:i/>
-          <w:iCs/>
-          <w:lang w:val="es-CO"/>
-        </w:rPr>
-        <w:t>/</w:t>
+        <w:t>Censo Viterbo Caldas 2018/Data/Datasets/</w:t>
       </w:r>
     </w:p>
     <w:p>
@@ -2946,23 +2926,7 @@
           <w:rFonts w:ascii="Arial" w:hAnsi="Arial" w:cs="Arial"/>
           <w:lang w:val="es-CO"/>
         </w:rPr>
-        <w:t>(</w:t>
-      </w:r>
-      <w:proofErr w:type="spellStart"/>
-      <w:r>
-        <w:rPr>
-          <w:rFonts w:ascii="Arial" w:hAnsi="Arial" w:cs="Arial"/>
-          <w:lang w:val="es-CO"/>
-        </w:rPr>
-        <w:t>blank</w:t>
-      </w:r>
-      <w:proofErr w:type="spellEnd"/>
-      <w:r>
-        <w:rPr>
-          <w:rFonts w:ascii="Arial" w:hAnsi="Arial" w:cs="Arial"/>
-          <w:lang w:val="es-CO"/>
-        </w:rPr>
-        <w:t>) (texto): Título en blanco, contiene las edades.</w:t>
+        <w:t>(blank) (texto): Título en blanco, contiene las edades.</w:t>
       </w:r>
     </w:p>
     <w:p>
@@ -4354,49 +4318,7 @@
           <w:rFonts w:ascii="Arial" w:hAnsi="Arial" w:cs="Arial"/>
           <w:lang w:val="es-CO"/>
         </w:rPr>
-        <w:t xml:space="preserve">Contiene 17 columnas y </w:t>
-      </w:r>
-      <w:r>
-        <w:rPr>
-          <w:rFonts w:ascii="Arial" w:hAnsi="Arial" w:cs="Arial"/>
-          <w:lang w:val="es-CO"/>
-        </w:rPr>
-        <w:t>2</w:t>
-      </w:r>
-      <w:r>
-        <w:rPr>
-          <w:rFonts w:ascii="Arial" w:hAnsi="Arial" w:cs="Arial"/>
-          <w:lang w:val="es-CO"/>
-        </w:rPr>
-        <w:t xml:space="preserve"> agrupaciones, cada agrupación tiene </w:t>
-      </w:r>
-      <w:r>
-        <w:rPr>
-          <w:rFonts w:ascii="Arial" w:hAnsi="Arial" w:cs="Arial"/>
-          <w:lang w:val="es-CO"/>
-        </w:rPr>
-        <w:t>3</w:t>
-      </w:r>
-      <w:r>
-        <w:rPr>
-          <w:rFonts w:ascii="Arial" w:hAnsi="Arial" w:cs="Arial"/>
-          <w:lang w:val="es-CO"/>
-        </w:rPr>
-        <w:t xml:space="preserve"> subgrupos </w:t>
-      </w:r>
-      <w:r>
-        <w:rPr>
-          <w:rFonts w:ascii="Arial" w:hAnsi="Arial" w:cs="Arial"/>
-          <w:lang w:val="es-CO"/>
-        </w:rPr>
-        <w:t xml:space="preserve">y cada subgrupo tiene 18 subgrupos </w:t>
-      </w:r>
-      <w:r>
-        <w:rPr>
-          <w:rFonts w:ascii="Arial" w:hAnsi="Arial" w:cs="Arial"/>
-          <w:lang w:val="es-CO"/>
-        </w:rPr>
-        <w:t>que corresponden a rangos de edad.</w:t>
+        <w:t>Contiene 17 columnas y 2 agrupaciones, cada agrupación tiene 3 subgrupos y cada subgrupo tiene 18 subgrupos que corresponden a rangos de edad.</w:t>
       </w:r>
     </w:p>
     <w:p>
@@ -4787,21 +4709,7 @@
           <w:rFonts w:ascii="Arial" w:hAnsi="Arial" w:cs="Arial"/>
           <w:lang w:val="es-CO"/>
         </w:rPr>
-        <w:t xml:space="preserve">Hombre: </w:t>
-      </w:r>
-      <w:r>
-        <w:rPr>
-          <w:rFonts w:ascii="Arial" w:hAnsi="Arial" w:cs="Arial"/>
-          <w:lang w:val="es-CO"/>
-        </w:rPr>
-        <w:t xml:space="preserve">Grupo con resumen de datos correspondiente </w:t>
-      </w:r>
-      <w:r>
-        <w:rPr>
-          <w:rFonts w:ascii="Arial" w:hAnsi="Arial" w:cs="Arial"/>
-          <w:lang w:val="es-CO"/>
-        </w:rPr>
-        <w:t>a los hombres.</w:t>
+        <w:t>Hombre: Grupo con resumen de datos correspondiente a los hombres.</w:t>
       </w:r>
     </w:p>
     <w:p>
@@ -4856,35 +4764,7 @@
           <w:rFonts w:ascii="Arial" w:hAnsi="Arial" w:cs="Arial"/>
           <w:lang w:val="es-CO"/>
         </w:rPr>
-        <w:t xml:space="preserve">Total: </w:t>
-      </w:r>
-      <w:r>
-        <w:rPr>
-          <w:rFonts w:ascii="Arial" w:hAnsi="Arial" w:cs="Arial"/>
-          <w:lang w:val="es-CO"/>
-        </w:rPr>
-        <w:t>Subg</w:t>
-      </w:r>
-      <w:r>
-        <w:rPr>
-          <w:rFonts w:ascii="Arial" w:hAnsi="Arial" w:cs="Arial"/>
-          <w:lang w:val="es-CO"/>
-        </w:rPr>
-        <w:t xml:space="preserve">rupo con resumen </w:t>
-      </w:r>
-      <w:r>
-        <w:rPr>
-          <w:rFonts w:ascii="Arial" w:hAnsi="Arial" w:cs="Arial"/>
-          <w:lang w:val="es-CO"/>
-        </w:rPr>
-        <w:t xml:space="preserve">de </w:t>
-      </w:r>
-      <w:r>
-        <w:rPr>
-          <w:rFonts w:ascii="Arial" w:hAnsi="Arial" w:cs="Arial"/>
-          <w:lang w:val="es-CO"/>
-        </w:rPr>
-        <w:t>cantidades totales.</w:t>
+        <w:t>Total: Subgrupo con resumen de cantidades totales.</w:t>
       </w:r>
     </w:p>
     <w:p>
@@ -4904,21 +4784,7 @@
           <w:rFonts w:ascii="Arial" w:hAnsi="Arial" w:cs="Arial"/>
           <w:lang w:val="es-CO"/>
         </w:rPr>
-        <w:t xml:space="preserve">Cabecera: </w:t>
-      </w:r>
-      <w:r>
-        <w:rPr>
-          <w:rFonts w:ascii="Arial" w:hAnsi="Arial" w:cs="Arial"/>
-          <w:lang w:val="es-CO"/>
-        </w:rPr>
-        <w:t>Subg</w:t>
-      </w:r>
-      <w:r>
-        <w:rPr>
-          <w:rFonts w:ascii="Arial" w:hAnsi="Arial" w:cs="Arial"/>
-          <w:lang w:val="es-CO"/>
-        </w:rPr>
-        <w:t>rupo con resumen de datos correspondientes a las cabeceras municipales.</w:t>
+        <w:t>Cabecera: Subgrupo con resumen de datos correspondientes a las cabeceras municipales.</w:t>
       </w:r>
     </w:p>
     <w:p>
@@ -4938,35 +4804,397 @@
           <w:rFonts w:ascii="Arial" w:hAnsi="Arial" w:cs="Arial"/>
           <w:lang w:val="es-CO"/>
         </w:rPr>
-        <w:t xml:space="preserve">Rural disperso: </w:t>
-      </w:r>
-      <w:r>
-        <w:rPr>
-          <w:rFonts w:ascii="Arial" w:hAnsi="Arial" w:cs="Arial"/>
-          <w:lang w:val="es-CO"/>
-        </w:rPr>
-        <w:t>Subg</w:t>
-      </w:r>
-      <w:r>
-        <w:rPr>
-          <w:rFonts w:ascii="Arial" w:hAnsi="Arial" w:cs="Arial"/>
-          <w:lang w:val="es-CO"/>
-        </w:rPr>
-        <w:t>rupo con resumen de datos correspondiente a la zona rural.</w:t>
-      </w:r>
-    </w:p>
-    <w:p>
-      <w:pPr>
-        <w:rPr>
-          <w:rFonts w:ascii="Arial" w:hAnsi="Arial" w:cs="Arial"/>
-          <w:lang w:val="es-CO"/>
-        </w:rPr>
-      </w:pPr>
-    </w:p>
-    <w:p>
-      <w:pPr>
-        <w:rPr>
-          <w:rFonts w:ascii="Arial" w:hAnsi="Arial" w:cs="Arial"/>
+        <w:t>Rural disperso: Subgrupo con resumen de datos correspondiente a la zona rural.</w:t>
+      </w:r>
+    </w:p>
+    <w:p>
+      <w:pPr>
+        <w:rPr>
+          <w:rFonts w:ascii="Arial" w:hAnsi="Arial" w:cs="Arial"/>
+          <w:lang w:val="es-CO"/>
+        </w:rPr>
+      </w:pPr>
+    </w:p>
+    <w:p>
+      <w:pPr>
+        <w:rPr>
+          <w:rFonts w:ascii="Arial" w:hAnsi="Arial" w:cs="Arial"/>
+          <w:b/>
+          <w:bCs/>
+          <w:lang w:val="es-CO"/>
+        </w:rPr>
+      </w:pPr>
+      <w:r>
+        <w:rPr>
+          <w:rFonts w:ascii="Arial" w:hAnsi="Arial" w:cs="Arial"/>
+          <w:b/>
+          <w:bCs/>
+          <w:lang w:val="es-CO"/>
+        </w:rPr>
+        <w:t>12PM</w:t>
+      </w:r>
+    </w:p>
+    <w:p>
+      <w:pPr>
+        <w:rPr>
+          <w:rFonts w:ascii="Arial" w:hAnsi="Arial" w:cs="Arial"/>
+          <w:lang w:val="es-CO"/>
+        </w:rPr>
+      </w:pPr>
+      <w:r>
+        <w:rPr>
+          <w:rFonts w:ascii="Arial" w:hAnsi="Arial" w:cs="Arial"/>
+          <w:lang w:val="es-CO"/>
+        </w:rPr>
+        <w:t xml:space="preserve">Contiene 8 columnas fuertemente agrupadas por </w:t>
+      </w:r>
+      <w:r>
+        <w:rPr>
+          <w:rFonts w:ascii="Arial" w:hAnsi="Arial" w:cs="Arial"/>
+          <w:i/>
+          <w:iCs/>
+          <w:lang w:val="es-CO"/>
+        </w:rPr>
+        <w:t xml:space="preserve">Total </w:t>
+      </w:r>
+      <w:r>
+        <w:rPr>
+          <w:rFonts w:ascii="Arial" w:hAnsi="Arial" w:cs="Arial"/>
+          <w:lang w:val="es-CO"/>
+        </w:rPr>
+        <w:t xml:space="preserve">(Resumen total de datos), </w:t>
+      </w:r>
+      <w:r>
+        <w:rPr>
+          <w:rFonts w:ascii="Arial" w:hAnsi="Arial" w:cs="Arial"/>
+          <w:i/>
+          <w:iCs/>
+          <w:lang w:val="es-CO"/>
+        </w:rPr>
+        <w:t xml:space="preserve">Cabecera </w:t>
+      </w:r>
+      <w:r>
+        <w:rPr>
+          <w:rFonts w:ascii="Arial" w:hAnsi="Arial" w:cs="Arial"/>
+          <w:lang w:val="es-CO"/>
+        </w:rPr>
+        <w:t>(Grupo con datos correspondientes a las cabeceras municipales)</w:t>
+      </w:r>
+      <w:r>
+        <w:rPr>
+          <w:rFonts w:ascii="Arial" w:hAnsi="Arial" w:cs="Arial"/>
+          <w:i/>
+          <w:iCs/>
+          <w:lang w:val="es-CO"/>
+        </w:rPr>
+        <w:t xml:space="preserve">, Centro Poblado </w:t>
+      </w:r>
+      <w:r>
+        <w:rPr>
+          <w:rFonts w:ascii="Arial" w:hAnsi="Arial" w:cs="Arial"/>
+          <w:lang w:val="es-CO"/>
+        </w:rPr>
+        <w:t>(Grupo con datos correspondientes a centros poblados)</w:t>
+      </w:r>
+      <w:r>
+        <w:rPr>
+          <w:rFonts w:ascii="Arial" w:hAnsi="Arial" w:cs="Arial"/>
+          <w:i/>
+          <w:iCs/>
+          <w:lang w:val="es-CO"/>
+        </w:rPr>
+        <w:t xml:space="preserve">, Rural Disperso </w:t>
+      </w:r>
+      <w:r>
+        <w:rPr>
+          <w:rFonts w:ascii="Arial" w:hAnsi="Arial" w:cs="Arial"/>
+          <w:lang w:val="es-CO"/>
+        </w:rPr>
+        <w:t>(Grupo con datos correspondientes a ciudadanos que habitan en las zonas rurales, pero no en centros poblados</w:t>
+      </w:r>
+      <w:r>
+        <w:rPr>
+          <w:rFonts w:ascii="Arial" w:hAnsi="Arial" w:cs="Arial"/>
+          <w:lang w:val="es-CO"/>
+        </w:rPr>
+        <w:t>).</w:t>
+      </w:r>
+    </w:p>
+    <w:p>
+      <w:pPr>
+        <w:rPr>
+          <w:rFonts w:ascii="Arial" w:hAnsi="Arial" w:cs="Arial"/>
+          <w:lang w:val="es-CO"/>
+        </w:rPr>
+      </w:pPr>
+      <w:r>
+        <w:rPr>
+          <w:rFonts w:ascii="Arial" w:hAnsi="Arial" w:cs="Arial"/>
+          <w:lang w:val="es-CO"/>
+        </w:rPr>
+        <w:t>Contiene filas correspondientes a grupos de edad.</w:t>
+      </w:r>
+    </w:p>
+    <w:p>
+      <w:pPr>
+        <w:rPr>
+          <w:rFonts w:ascii="Arial" w:hAnsi="Arial" w:cs="Arial"/>
+          <w:lang w:val="es-CO"/>
+        </w:rPr>
+      </w:pPr>
+      <w:r>
+        <w:rPr>
+          <w:rFonts w:ascii="Arial" w:hAnsi="Arial" w:cs="Arial"/>
+          <w:lang w:val="es-CO"/>
+        </w:rPr>
+        <w:t>Columnas:</w:t>
+      </w:r>
+    </w:p>
+    <w:p>
+      <w:pPr>
+        <w:pStyle w:val="Prrafodelista"/>
+        <w:numPr>
+          <w:ilvl w:val="0"/>
+          <w:numId w:val="9"/>
+        </w:numPr>
+        <w:rPr>
+          <w:rFonts w:ascii="Arial" w:hAnsi="Arial" w:cs="Arial"/>
+          <w:lang w:val="es-CO"/>
+        </w:rPr>
+      </w:pPr>
+      <w:r>
+        <w:rPr>
+          <w:rFonts w:ascii="Arial" w:hAnsi="Arial" w:cs="Arial"/>
+          <w:lang w:val="es-CO"/>
+        </w:rPr>
+        <w:t>Total (entero):</w:t>
+      </w:r>
+      <w:r>
+        <w:rPr>
+          <w:rFonts w:ascii="Arial" w:hAnsi="Arial" w:cs="Arial"/>
+          <w:lang w:val="es-CO"/>
+        </w:rPr>
+        <w:t xml:space="preserve"> Cantidad total de censados en el grupo</w:t>
+      </w:r>
+      <w:r>
+        <w:rPr>
+          <w:rFonts w:ascii="Arial" w:hAnsi="Arial" w:cs="Arial"/>
+          <w:lang w:val="es-CO"/>
+        </w:rPr>
+        <w:t>.</w:t>
+      </w:r>
+    </w:p>
+    <w:p>
+      <w:pPr>
+        <w:pStyle w:val="Prrafodelista"/>
+        <w:numPr>
+          <w:ilvl w:val="0"/>
+          <w:numId w:val="9"/>
+        </w:numPr>
+        <w:rPr>
+          <w:rFonts w:ascii="Arial" w:hAnsi="Arial" w:cs="Arial"/>
+          <w:lang w:val="es-CO"/>
+        </w:rPr>
+      </w:pPr>
+      <w:r>
+        <w:rPr>
+          <w:rFonts w:ascii="Arial" w:hAnsi="Arial" w:cs="Arial"/>
+          <w:lang w:val="es-CO"/>
+        </w:rPr>
+        <w:t xml:space="preserve">Indígena (entero): </w:t>
+      </w:r>
+      <w:r>
+        <w:rPr>
+          <w:rFonts w:ascii="Arial" w:hAnsi="Arial" w:cs="Arial"/>
+          <w:lang w:val="es-CO"/>
+        </w:rPr>
+        <w:t>Cantidad de censados que se reconocen como indígenas.</w:t>
+      </w:r>
+    </w:p>
+    <w:p>
+      <w:pPr>
+        <w:pStyle w:val="Prrafodelista"/>
+        <w:numPr>
+          <w:ilvl w:val="0"/>
+          <w:numId w:val="9"/>
+        </w:numPr>
+        <w:rPr>
+          <w:rFonts w:ascii="Arial" w:hAnsi="Arial" w:cs="Arial"/>
+          <w:lang w:val="es-CO"/>
+        </w:rPr>
+      </w:pPr>
+      <w:r>
+        <w:rPr>
+          <w:rFonts w:ascii="Arial" w:hAnsi="Arial" w:cs="Arial"/>
+          <w:lang w:val="es-CO"/>
+        </w:rPr>
+        <w:t>Gitano(a) o Rrom (entero): Cantidad de censados que se reconocen como gitanos o romaníes.</w:t>
+      </w:r>
+    </w:p>
+    <w:p>
+      <w:pPr>
+        <w:pStyle w:val="Prrafodelista"/>
+        <w:numPr>
+          <w:ilvl w:val="0"/>
+          <w:numId w:val="9"/>
+        </w:numPr>
+        <w:rPr>
+          <w:rFonts w:ascii="Arial" w:hAnsi="Arial" w:cs="Arial"/>
+          <w:lang w:val="es-CO"/>
+        </w:rPr>
+      </w:pPr>
+      <w:r>
+        <w:rPr>
+          <w:rFonts w:ascii="Arial" w:hAnsi="Arial" w:cs="Arial"/>
+          <w:lang w:val="es-CO"/>
+        </w:rPr>
+        <w:t>Raizal del Archipielago de San Andrés, Providencia y Santa Catalina (entero): Cantidad de censados que se reconocen como r</w:t>
+      </w:r>
+      <w:r>
+        <w:rPr>
+          <w:rFonts w:ascii="Arial" w:hAnsi="Arial" w:cs="Arial"/>
+          <w:lang w:val="es-CO"/>
+        </w:rPr>
+        <w:t>aizal</w:t>
+      </w:r>
+      <w:r>
+        <w:rPr>
+          <w:rFonts w:ascii="Arial" w:hAnsi="Arial" w:cs="Arial"/>
+          <w:lang w:val="es-CO"/>
+        </w:rPr>
+        <w:t>es</w:t>
+      </w:r>
+      <w:r>
+        <w:rPr>
+          <w:rFonts w:ascii="Arial" w:hAnsi="Arial" w:cs="Arial"/>
+          <w:lang w:val="es-CO"/>
+        </w:rPr>
+        <w:t xml:space="preserve"> del Archipi</w:t>
+      </w:r>
+      <w:r>
+        <w:rPr>
+          <w:rFonts w:ascii="Arial" w:hAnsi="Arial" w:cs="Arial"/>
+          <w:lang w:val="es-CO"/>
+        </w:rPr>
+        <w:t>é</w:t>
+      </w:r>
+      <w:r>
+        <w:rPr>
+          <w:rFonts w:ascii="Arial" w:hAnsi="Arial" w:cs="Arial"/>
+          <w:lang w:val="es-CO"/>
+        </w:rPr>
+        <w:t>lago de San Andrés, Providencia y Santa Catalina</w:t>
+      </w:r>
+      <w:r>
+        <w:rPr>
+          <w:rFonts w:ascii="Arial" w:hAnsi="Arial" w:cs="Arial"/>
+          <w:lang w:val="es-CO"/>
+        </w:rPr>
+        <w:t>.</w:t>
+      </w:r>
+    </w:p>
+    <w:p>
+      <w:pPr>
+        <w:pStyle w:val="Prrafodelista"/>
+        <w:numPr>
+          <w:ilvl w:val="0"/>
+          <w:numId w:val="9"/>
+        </w:numPr>
+        <w:rPr>
+          <w:rFonts w:ascii="Arial" w:hAnsi="Arial" w:cs="Arial"/>
+          <w:lang w:val="es-CO"/>
+        </w:rPr>
+      </w:pPr>
+      <w:r>
+        <w:rPr>
+          <w:rFonts w:ascii="Arial" w:hAnsi="Arial" w:cs="Arial"/>
+          <w:lang w:val="es-CO"/>
+        </w:rPr>
+        <w:lastRenderedPageBreak/>
+        <w:t>Palenquero(a) de San Basilio (entero): Cantidad de censados que se reconocen como palenqueros de San Basilio.</w:t>
+      </w:r>
+    </w:p>
+    <w:p>
+      <w:pPr>
+        <w:pStyle w:val="Prrafodelista"/>
+        <w:numPr>
+          <w:ilvl w:val="0"/>
+          <w:numId w:val="9"/>
+        </w:numPr>
+        <w:rPr>
+          <w:rFonts w:ascii="Arial" w:hAnsi="Arial" w:cs="Arial"/>
+          <w:lang w:val="es-CO"/>
+        </w:rPr>
+      </w:pPr>
+      <w:r>
+        <w:rPr>
+          <w:rFonts w:ascii="Arial" w:hAnsi="Arial" w:cs="Arial"/>
+          <w:lang w:val="es-CO"/>
+        </w:rPr>
+        <w:t xml:space="preserve">Negro(a), Mulato(a), Afrodescendiente, Afrocolombiano(a) (entero): </w:t>
+      </w:r>
+      <w:r>
+        <w:rPr>
+          <w:rFonts w:ascii="Arial" w:hAnsi="Arial" w:cs="Arial"/>
+          <w:lang w:val="es-CO"/>
+        </w:rPr>
+        <w:t>Cantidad de censados que se reconocen como negros, mulatos, afrodescendientes o afrocolombianos.</w:t>
+      </w:r>
+    </w:p>
+    <w:p>
+      <w:pPr>
+        <w:pStyle w:val="Prrafodelista"/>
+        <w:numPr>
+          <w:ilvl w:val="0"/>
+          <w:numId w:val="9"/>
+        </w:numPr>
+        <w:rPr>
+          <w:rFonts w:ascii="Arial" w:hAnsi="Arial" w:cs="Arial"/>
+          <w:lang w:val="es-CO"/>
+        </w:rPr>
+      </w:pPr>
+      <w:r>
+        <w:rPr>
+          <w:rFonts w:ascii="Arial" w:hAnsi="Arial" w:cs="Arial"/>
+          <w:lang w:val="es-CO"/>
+        </w:rPr>
+        <w:t>Ningún grupo étnico (entero): Cantidad de censados que no se reconocen en ningún grupo étnico.</w:t>
+      </w:r>
+    </w:p>
+    <w:p>
+      <w:pPr>
+        <w:pStyle w:val="Prrafodelista"/>
+        <w:numPr>
+          <w:ilvl w:val="0"/>
+          <w:numId w:val="9"/>
+        </w:numPr>
+        <w:rPr>
+          <w:rFonts w:ascii="Arial" w:hAnsi="Arial" w:cs="Arial"/>
+          <w:lang w:val="es-CO"/>
+        </w:rPr>
+      </w:pPr>
+      <w:r>
+        <w:rPr>
+          <w:rFonts w:ascii="Arial" w:hAnsi="Arial" w:cs="Arial"/>
+          <w:lang w:val="es-CO"/>
+        </w:rPr>
+        <w:t>Sin información (entero): Cantidad de censados de los cuales no se tiene información sobre autorreconocimiento étnico.</w:t>
+      </w:r>
+    </w:p>
+    <w:p>
+      <w:pPr>
+        <w:rPr>
+          <w:rFonts w:ascii="Arial" w:hAnsi="Arial" w:cs="Arial"/>
+          <w:lang w:val="es-CO"/>
+        </w:rPr>
+      </w:pPr>
+    </w:p>
+    <w:p>
+      <w:pPr>
+        <w:rPr>
+          <w:rFonts w:ascii="Arial" w:hAnsi="Arial" w:cs="Arial"/>
+          <w:i/>
+          <w:iCs/>
           <w:lang w:val="es-CO"/>
         </w:rPr>
       </w:pPr>
@@ -5778,6 +6006,119 @@
     <w:nsid w:val="736117B3"/>
     <w:multiLevelType w:val="hybridMultilevel"/>
     <w:tmpl w:val="B902F320"/>
+    <w:lvl w:ilvl="0" w:tplc="04090001">
+      <w:start w:val="1"/>
+      <w:numFmt w:val="bullet"/>
+      <w:lvlText w:val=""/>
+      <w:lvlJc w:val="left"/>
+      <w:pPr>
+        <w:ind w:left="720" w:hanging="360"/>
+      </w:pPr>
+      <w:rPr>
+        <w:rFonts w:ascii="Symbol" w:hAnsi="Symbol" w:hint="default"/>
+      </w:rPr>
+    </w:lvl>
+    <w:lvl w:ilvl="1" w:tplc="04090003" w:tentative="1">
+      <w:start w:val="1"/>
+      <w:numFmt w:val="bullet"/>
+      <w:lvlText w:val="o"/>
+      <w:lvlJc w:val="left"/>
+      <w:pPr>
+        <w:ind w:left="1440" w:hanging="360"/>
+      </w:pPr>
+      <w:rPr>
+        <w:rFonts w:ascii="Courier New" w:hAnsi="Courier New" w:cs="Courier New" w:hint="default"/>
+      </w:rPr>
+    </w:lvl>
+    <w:lvl w:ilvl="2" w:tplc="04090005" w:tentative="1">
+      <w:start w:val="1"/>
+      <w:numFmt w:val="bullet"/>
+      <w:lvlText w:val=""/>
+      <w:lvlJc w:val="left"/>
+      <w:pPr>
+        <w:ind w:left="2160" w:hanging="360"/>
+      </w:pPr>
+      <w:rPr>
+        <w:rFonts w:ascii="Wingdings" w:hAnsi="Wingdings" w:hint="default"/>
+      </w:rPr>
+    </w:lvl>
+    <w:lvl w:ilvl="3" w:tplc="04090001" w:tentative="1">
+      <w:start w:val="1"/>
+      <w:numFmt w:val="bullet"/>
+      <w:lvlText w:val=""/>
+      <w:lvlJc w:val="left"/>
+      <w:pPr>
+        <w:ind w:left="2880" w:hanging="360"/>
+      </w:pPr>
+      <w:rPr>
+        <w:rFonts w:ascii="Symbol" w:hAnsi="Symbol" w:hint="default"/>
+      </w:rPr>
+    </w:lvl>
+    <w:lvl w:ilvl="4" w:tplc="04090003" w:tentative="1">
+      <w:start w:val="1"/>
+      <w:numFmt w:val="bullet"/>
+      <w:lvlText w:val="o"/>
+      <w:lvlJc w:val="left"/>
+      <w:pPr>
+        <w:ind w:left="3600" w:hanging="360"/>
+      </w:pPr>
+      <w:rPr>
+        <w:rFonts w:ascii="Courier New" w:hAnsi="Courier New" w:cs="Courier New" w:hint="default"/>
+      </w:rPr>
+    </w:lvl>
+    <w:lvl w:ilvl="5" w:tplc="04090005" w:tentative="1">
+      <w:start w:val="1"/>
+      <w:numFmt w:val="bullet"/>
+      <w:lvlText w:val=""/>
+      <w:lvlJc w:val="left"/>
+      <w:pPr>
+        <w:ind w:left="4320" w:hanging="360"/>
+      </w:pPr>
+      <w:rPr>
+        <w:rFonts w:ascii="Wingdings" w:hAnsi="Wingdings" w:hint="default"/>
+      </w:rPr>
+    </w:lvl>
+    <w:lvl w:ilvl="6" w:tplc="04090001" w:tentative="1">
+      <w:start w:val="1"/>
+      <w:numFmt w:val="bullet"/>
+      <w:lvlText w:val=""/>
+      <w:lvlJc w:val="left"/>
+      <w:pPr>
+        <w:ind w:left="5040" w:hanging="360"/>
+      </w:pPr>
+      <w:rPr>
+        <w:rFonts w:ascii="Symbol" w:hAnsi="Symbol" w:hint="default"/>
+      </w:rPr>
+    </w:lvl>
+    <w:lvl w:ilvl="7" w:tplc="04090003" w:tentative="1">
+      <w:start w:val="1"/>
+      <w:numFmt w:val="bullet"/>
+      <w:lvlText w:val="o"/>
+      <w:lvlJc w:val="left"/>
+      <w:pPr>
+        <w:ind w:left="5760" w:hanging="360"/>
+      </w:pPr>
+      <w:rPr>
+        <w:rFonts w:ascii="Courier New" w:hAnsi="Courier New" w:cs="Courier New" w:hint="default"/>
+      </w:rPr>
+    </w:lvl>
+    <w:lvl w:ilvl="8" w:tplc="04090005" w:tentative="1">
+      <w:start w:val="1"/>
+      <w:numFmt w:val="bullet"/>
+      <w:lvlText w:val=""/>
+      <w:lvlJc w:val="left"/>
+      <w:pPr>
+        <w:ind w:left="6480" w:hanging="360"/>
+      </w:pPr>
+      <w:rPr>
+        <w:rFonts w:ascii="Wingdings" w:hAnsi="Wingdings" w:hint="default"/>
+      </w:rPr>
+    </w:lvl>
+  </w:abstractNum>
+  <w:abstractNum w:abstractNumId="8" w15:restartNumberingAfterBreak="0">
+    <w:nsid w:val="73AA7E9E"/>
+    <w:multiLevelType w:val="hybridMultilevel"/>
+    <w:tmpl w:val="8EAE28E8"/>
     <w:lvl w:ilvl="0" w:tplc="04090001">
       <w:start w:val="1"/>
       <w:numFmt w:val="bullet"/>
@@ -5910,6 +6251,9 @@
   </w:num>
   <w:num w:numId="8" w16cid:durableId="430202784">
     <w:abstractNumId w:val="1"/>
+  </w:num>
+  <w:num w:numId="9" w16cid:durableId="1169177289">
+    <w:abstractNumId w:val="8"/>
   </w:num>
 </w:numbering>
 </file>

</xml_diff>

<commit_message>
Actualiza fuentes de datos con hoja 13PM
</commit_message>
<xml_diff>
--- a/Documentacion/Fuentes de Datos.docx
+++ b/Documentacion/Fuentes de Datos.docx
@@ -5048,49 +5048,7 @@
           <w:rFonts w:ascii="Arial" w:hAnsi="Arial" w:cs="Arial"/>
           <w:lang w:val="es-CO"/>
         </w:rPr>
-        <w:t>Raizal del Archipielago de San Andrés, Providencia y Santa Catalina (entero): Cantidad de censados que se reconocen como r</w:t>
-      </w:r>
-      <w:r>
-        <w:rPr>
-          <w:rFonts w:ascii="Arial" w:hAnsi="Arial" w:cs="Arial"/>
-          <w:lang w:val="es-CO"/>
-        </w:rPr>
-        <w:t>aizal</w:t>
-      </w:r>
-      <w:r>
-        <w:rPr>
-          <w:rFonts w:ascii="Arial" w:hAnsi="Arial" w:cs="Arial"/>
-          <w:lang w:val="es-CO"/>
-        </w:rPr>
-        <w:t>es</w:t>
-      </w:r>
-      <w:r>
-        <w:rPr>
-          <w:rFonts w:ascii="Arial" w:hAnsi="Arial" w:cs="Arial"/>
-          <w:lang w:val="es-CO"/>
-        </w:rPr>
-        <w:t xml:space="preserve"> del Archipi</w:t>
-      </w:r>
-      <w:r>
-        <w:rPr>
-          <w:rFonts w:ascii="Arial" w:hAnsi="Arial" w:cs="Arial"/>
-          <w:lang w:val="es-CO"/>
-        </w:rPr>
-        <w:t>é</w:t>
-      </w:r>
-      <w:r>
-        <w:rPr>
-          <w:rFonts w:ascii="Arial" w:hAnsi="Arial" w:cs="Arial"/>
-          <w:lang w:val="es-CO"/>
-        </w:rPr>
-        <w:t>lago de San Andrés, Providencia y Santa Catalina</w:t>
-      </w:r>
-      <w:r>
-        <w:rPr>
-          <w:rFonts w:ascii="Arial" w:hAnsi="Arial" w:cs="Arial"/>
-          <w:lang w:val="es-CO"/>
-        </w:rPr>
-        <w:t>.</w:t>
+        <w:t>Raizal del Archipielago de San Andrés, Providencia y Santa Catalina (entero): Cantidad de censados que se reconocen como raizales del Archipiélago de San Andrés, Providencia y Santa Catalina.</w:t>
       </w:r>
     </w:p>
     <w:p>
@@ -5188,6 +5146,369 @@
           <w:lang w:val="es-CO"/>
         </w:rPr>
       </w:pPr>
+    </w:p>
+    <w:p>
+      <w:pPr>
+        <w:rPr>
+          <w:rFonts w:ascii="Arial" w:hAnsi="Arial" w:cs="Arial"/>
+          <w:b/>
+          <w:bCs/>
+          <w:lang w:val="es-CO"/>
+        </w:rPr>
+      </w:pPr>
+      <w:r>
+        <w:rPr>
+          <w:rFonts w:ascii="Arial" w:hAnsi="Arial" w:cs="Arial"/>
+          <w:b/>
+          <w:bCs/>
+          <w:lang w:val="es-CO"/>
+        </w:rPr>
+        <w:t>13PM</w:t>
+      </w:r>
+    </w:p>
+    <w:p>
+      <w:pPr>
+        <w:rPr>
+          <w:rFonts w:ascii="Arial" w:hAnsi="Arial" w:cs="Arial"/>
+          <w:lang w:val="es-CO"/>
+        </w:rPr>
+      </w:pPr>
+      <w:r>
+        <w:rPr>
+          <w:rFonts w:ascii="Arial" w:hAnsi="Arial" w:cs="Arial"/>
+          <w:lang w:val="es-CO"/>
+        </w:rPr>
+        <w:t xml:space="preserve">Contiene 8 columnas fuertemente agrupadas por </w:t>
+      </w:r>
+      <w:r>
+        <w:rPr>
+          <w:rFonts w:ascii="Arial" w:hAnsi="Arial" w:cs="Arial"/>
+          <w:i/>
+          <w:iCs/>
+          <w:lang w:val="es-CO"/>
+        </w:rPr>
+        <w:t xml:space="preserve">Total </w:t>
+      </w:r>
+      <w:r>
+        <w:rPr>
+          <w:rFonts w:ascii="Arial" w:hAnsi="Arial" w:cs="Arial"/>
+          <w:lang w:val="es-CO"/>
+        </w:rPr>
+        <w:t xml:space="preserve">(Resumen total de datos), </w:t>
+      </w:r>
+      <w:r>
+        <w:rPr>
+          <w:rFonts w:ascii="Arial" w:hAnsi="Arial" w:cs="Arial"/>
+          <w:i/>
+          <w:iCs/>
+          <w:lang w:val="es-CO"/>
+        </w:rPr>
+        <w:t xml:space="preserve">Cabecera </w:t>
+      </w:r>
+      <w:r>
+        <w:rPr>
+          <w:rFonts w:ascii="Arial" w:hAnsi="Arial" w:cs="Arial"/>
+          <w:lang w:val="es-CO"/>
+        </w:rPr>
+        <w:t>(Grupo con datos correspondientes a las cabeceras municipales)</w:t>
+      </w:r>
+      <w:r>
+        <w:rPr>
+          <w:rFonts w:ascii="Arial" w:hAnsi="Arial" w:cs="Arial"/>
+          <w:i/>
+          <w:iCs/>
+          <w:lang w:val="es-CO"/>
+        </w:rPr>
+        <w:t xml:space="preserve">, Centro Poblado </w:t>
+      </w:r>
+      <w:r>
+        <w:rPr>
+          <w:rFonts w:ascii="Arial" w:hAnsi="Arial" w:cs="Arial"/>
+          <w:lang w:val="es-CO"/>
+        </w:rPr>
+        <w:t>(Grupo con datos correspondientes a centros poblados)</w:t>
+      </w:r>
+      <w:r>
+        <w:rPr>
+          <w:rFonts w:ascii="Arial" w:hAnsi="Arial" w:cs="Arial"/>
+          <w:i/>
+          <w:iCs/>
+          <w:lang w:val="es-CO"/>
+        </w:rPr>
+        <w:t xml:space="preserve">, Rural Disperso </w:t>
+      </w:r>
+      <w:r>
+        <w:rPr>
+          <w:rFonts w:ascii="Arial" w:hAnsi="Arial" w:cs="Arial"/>
+          <w:lang w:val="es-CO"/>
+        </w:rPr>
+        <w:t>(Grupo con datos correspondientes a ciudadanos que habitan en las zonas rurales, pero no en centros poblados</w:t>
+      </w:r>
+      <w:r>
+        <w:rPr>
+          <w:rFonts w:ascii="Arial" w:hAnsi="Arial" w:cs="Arial"/>
+          <w:lang w:val="es-CO"/>
+        </w:rPr>
+        <w:t>)</w:t>
+      </w:r>
+      <w:r>
+        <w:rPr>
+          <w:rFonts w:ascii="Arial" w:hAnsi="Arial" w:cs="Arial"/>
+          <w:lang w:val="es-CO"/>
+        </w:rPr>
+        <w:t>, y contiene 3 agrupaciones.</w:t>
+      </w:r>
+    </w:p>
+    <w:p>
+      <w:pPr>
+        <w:rPr>
+          <w:rFonts w:ascii="Arial" w:hAnsi="Arial" w:cs="Arial"/>
+          <w:lang w:val="es-CO"/>
+        </w:rPr>
+      </w:pPr>
+      <w:r>
+        <w:rPr>
+          <w:rFonts w:ascii="Arial" w:hAnsi="Arial" w:cs="Arial"/>
+          <w:lang w:val="es-CO"/>
+        </w:rPr>
+        <w:t>Columnas:</w:t>
+      </w:r>
+    </w:p>
+    <w:p>
+      <w:pPr>
+        <w:pStyle w:val="Prrafodelista"/>
+        <w:numPr>
+          <w:ilvl w:val="0"/>
+          <w:numId w:val="9"/>
+        </w:numPr>
+        <w:rPr>
+          <w:rFonts w:ascii="Arial" w:hAnsi="Arial" w:cs="Arial"/>
+          <w:lang w:val="es-CO"/>
+        </w:rPr>
+      </w:pPr>
+      <w:r>
+        <w:rPr>
+          <w:rFonts w:ascii="Arial" w:hAnsi="Arial" w:cs="Arial"/>
+          <w:lang w:val="es-CO"/>
+        </w:rPr>
+        <w:t>Total (entero): Cantidad total de censados en el grupo.</w:t>
+      </w:r>
+    </w:p>
+    <w:p>
+      <w:pPr>
+        <w:pStyle w:val="Prrafodelista"/>
+        <w:numPr>
+          <w:ilvl w:val="0"/>
+          <w:numId w:val="9"/>
+        </w:numPr>
+        <w:rPr>
+          <w:rFonts w:ascii="Arial" w:hAnsi="Arial" w:cs="Arial"/>
+          <w:lang w:val="es-CO"/>
+        </w:rPr>
+      </w:pPr>
+      <w:r>
+        <w:rPr>
+          <w:rFonts w:ascii="Arial" w:hAnsi="Arial" w:cs="Arial"/>
+          <w:lang w:val="es-CO"/>
+        </w:rPr>
+        <w:t>Indígena (entero): Cantidad de censados que se reconocen como indígenas.</w:t>
+      </w:r>
+    </w:p>
+    <w:p>
+      <w:pPr>
+        <w:pStyle w:val="Prrafodelista"/>
+        <w:numPr>
+          <w:ilvl w:val="0"/>
+          <w:numId w:val="9"/>
+        </w:numPr>
+        <w:rPr>
+          <w:rFonts w:ascii="Arial" w:hAnsi="Arial" w:cs="Arial"/>
+          <w:lang w:val="es-CO"/>
+        </w:rPr>
+      </w:pPr>
+      <w:r>
+        <w:rPr>
+          <w:rFonts w:ascii="Arial" w:hAnsi="Arial" w:cs="Arial"/>
+          <w:lang w:val="es-CO"/>
+        </w:rPr>
+        <w:t>Gitano(a) o Rrom (entero): Cantidad de censados que se reconocen como gitanos o romaníes.</w:t>
+      </w:r>
+    </w:p>
+    <w:p>
+      <w:pPr>
+        <w:pStyle w:val="Prrafodelista"/>
+        <w:numPr>
+          <w:ilvl w:val="0"/>
+          <w:numId w:val="9"/>
+        </w:numPr>
+        <w:rPr>
+          <w:rFonts w:ascii="Arial" w:hAnsi="Arial" w:cs="Arial"/>
+          <w:lang w:val="es-CO"/>
+        </w:rPr>
+      </w:pPr>
+      <w:r>
+        <w:rPr>
+          <w:rFonts w:ascii="Arial" w:hAnsi="Arial" w:cs="Arial"/>
+          <w:lang w:val="es-CO"/>
+        </w:rPr>
+        <w:t>Raizal del Archipielago de San Andrés, Providencia y Santa Catalina (entero): Cantidad de censados que se reconocen como raizales del Archipiélago de San Andrés, Providencia y Santa Catalina.</w:t>
+      </w:r>
+    </w:p>
+    <w:p>
+      <w:pPr>
+        <w:pStyle w:val="Prrafodelista"/>
+        <w:numPr>
+          <w:ilvl w:val="0"/>
+          <w:numId w:val="9"/>
+        </w:numPr>
+        <w:rPr>
+          <w:rFonts w:ascii="Arial" w:hAnsi="Arial" w:cs="Arial"/>
+          <w:lang w:val="es-CO"/>
+        </w:rPr>
+      </w:pPr>
+      <w:r>
+        <w:rPr>
+          <w:rFonts w:ascii="Arial" w:hAnsi="Arial" w:cs="Arial"/>
+          <w:lang w:val="es-CO"/>
+        </w:rPr>
+        <w:t>Palenquero(a) de San Basilio (entero): Cantidad de censados que se reconocen como palenqueros de San Basilio.</w:t>
+      </w:r>
+    </w:p>
+    <w:p>
+      <w:pPr>
+        <w:pStyle w:val="Prrafodelista"/>
+        <w:numPr>
+          <w:ilvl w:val="0"/>
+          <w:numId w:val="9"/>
+        </w:numPr>
+        <w:rPr>
+          <w:rFonts w:ascii="Arial" w:hAnsi="Arial" w:cs="Arial"/>
+          <w:lang w:val="es-CO"/>
+        </w:rPr>
+      </w:pPr>
+      <w:r>
+        <w:rPr>
+          <w:rFonts w:ascii="Arial" w:hAnsi="Arial" w:cs="Arial"/>
+          <w:lang w:val="es-CO"/>
+        </w:rPr>
+        <w:t>Negro(a), Mulato(a), Afrodescendiente, Afrocolombiano(a) (entero): Cantidad de censados que se reconocen como negros, mulatos, afrodescendientes o afrocolombianos.</w:t>
+      </w:r>
+    </w:p>
+    <w:p>
+      <w:pPr>
+        <w:pStyle w:val="Prrafodelista"/>
+        <w:numPr>
+          <w:ilvl w:val="0"/>
+          <w:numId w:val="9"/>
+        </w:numPr>
+        <w:rPr>
+          <w:rFonts w:ascii="Arial" w:hAnsi="Arial" w:cs="Arial"/>
+          <w:lang w:val="es-CO"/>
+        </w:rPr>
+      </w:pPr>
+      <w:r>
+        <w:rPr>
+          <w:rFonts w:ascii="Arial" w:hAnsi="Arial" w:cs="Arial"/>
+          <w:lang w:val="es-CO"/>
+        </w:rPr>
+        <w:t>Ningún grupo étnico (entero): Cantidad de censados que no se reconocen en ningún grupo étnico.</w:t>
+      </w:r>
+    </w:p>
+    <w:p>
+      <w:pPr>
+        <w:pStyle w:val="Prrafodelista"/>
+        <w:numPr>
+          <w:ilvl w:val="0"/>
+          <w:numId w:val="9"/>
+        </w:numPr>
+        <w:rPr>
+          <w:rFonts w:ascii="Arial" w:hAnsi="Arial" w:cs="Arial"/>
+          <w:lang w:val="es-CO"/>
+        </w:rPr>
+      </w:pPr>
+      <w:r>
+        <w:rPr>
+          <w:rFonts w:ascii="Arial" w:hAnsi="Arial" w:cs="Arial"/>
+          <w:lang w:val="es-CO"/>
+        </w:rPr>
+        <w:t>Sin información (entero): Cantidad de censados de los cuales no se tiene información sobre autorreconocimiento étnico.</w:t>
+      </w:r>
+    </w:p>
+    <w:p>
+      <w:pPr>
+        <w:rPr>
+          <w:rFonts w:ascii="Arial" w:hAnsi="Arial" w:cs="Arial"/>
+          <w:lang w:val="es-CO"/>
+        </w:rPr>
+      </w:pPr>
+      <w:r>
+        <w:rPr>
+          <w:rFonts w:ascii="Arial" w:hAnsi="Arial" w:cs="Arial"/>
+          <w:lang w:val="es-CO"/>
+        </w:rPr>
+        <w:t>Agrupaciones:</w:t>
+      </w:r>
+    </w:p>
+    <w:p>
+      <w:pPr>
+        <w:pStyle w:val="Prrafodelista"/>
+        <w:numPr>
+          <w:ilvl w:val="0"/>
+          <w:numId w:val="10"/>
+        </w:numPr>
+        <w:rPr>
+          <w:rFonts w:ascii="Arial" w:hAnsi="Arial" w:cs="Arial"/>
+          <w:lang w:val="es-CO"/>
+        </w:rPr>
+      </w:pPr>
+      <w:r>
+        <w:rPr>
+          <w:rFonts w:ascii="Arial" w:hAnsi="Arial" w:cs="Arial"/>
+          <w:lang w:val="es-CO"/>
+        </w:rPr>
+        <w:t>Total: Resumen del total.</w:t>
+      </w:r>
+    </w:p>
+    <w:p>
+      <w:pPr>
+        <w:pStyle w:val="Prrafodelista"/>
+        <w:numPr>
+          <w:ilvl w:val="0"/>
+          <w:numId w:val="10"/>
+        </w:numPr>
+        <w:rPr>
+          <w:rFonts w:ascii="Arial" w:hAnsi="Arial" w:cs="Arial"/>
+          <w:lang w:val="es-CO"/>
+        </w:rPr>
+      </w:pPr>
+      <w:r>
+        <w:rPr>
+          <w:rFonts w:ascii="Arial" w:hAnsi="Arial" w:cs="Arial"/>
+          <w:lang w:val="es-CO"/>
+        </w:rPr>
+        <w:lastRenderedPageBreak/>
+        <w:t>Territorio no étnico: Grupo con resumen de datos correspondiente a ciudadanos que habitan en territorios no étnicos.</w:t>
+      </w:r>
+    </w:p>
+    <w:p>
+      <w:pPr>
+        <w:pStyle w:val="Prrafodelista"/>
+        <w:numPr>
+          <w:ilvl w:val="0"/>
+          <w:numId w:val="10"/>
+        </w:numPr>
+        <w:rPr>
+          <w:rFonts w:ascii="Arial" w:hAnsi="Arial" w:cs="Arial"/>
+          <w:lang w:val="es-CO"/>
+        </w:rPr>
+      </w:pPr>
+      <w:r>
+        <w:rPr>
+          <w:rFonts w:ascii="Arial" w:hAnsi="Arial" w:cs="Arial"/>
+          <w:lang w:val="es-CO"/>
+        </w:rPr>
+        <w:t>Resguardo indígena: Grupo con resumen de datos correspondiente a ciudadanos que habitan en resguardos indígenas.</w:t>
+      </w:r>
     </w:p>
     <w:p>
       <w:pPr>
@@ -5212,6 +5533,119 @@
 <file path=word/numbering.xml><?xml version="1.0" encoding="utf-8"?>
 <w:numbering xmlns:wpc="http://schemas.microsoft.com/office/word/2010/wordprocessingCanvas" xmlns:cx="http://schemas.microsoft.com/office/drawing/2014/chartex" xmlns:cx1="http://schemas.microsoft.com/office/drawing/2015/9/8/chartex" xmlns:cx2="http://schemas.microsoft.com/office/drawing/2015/10/21/chartex" xmlns:cx3="http://schemas.microsoft.com/office/drawing/2016/5/9/chartex" xmlns:cx4="http://schemas.microsoft.com/office/drawing/2016/5/10/chartex" xmlns:cx5="http://schemas.microsoft.com/office/drawing/2016/5/11/chartex" xmlns:cx6="http://schemas.microsoft.com/office/drawing/2016/5/12/chartex" xmlns:cx7="http://schemas.microsoft.com/office/drawing/2016/5/13/chartex" xmlns:cx8="http://schemas.microsoft.com/office/drawing/2016/5/14/chartex" xmlns:mc="http://schemas.openxmlformats.org/markup-compatibility/2006" xmlns:aink="http://schemas.microsoft.com/office/drawing/2016/ink" xmlns:am3d="http://schemas.microsoft.com/office/drawing/2017/model3d" xmlns:o="urn:schemas-microsoft-com:office:office" xmlns:oel="http://schemas.microsoft.com/office/2019/extlst" xmlns:r="http://schemas.openxmlformats.org/officeDocument/2006/relationships" xmlns:m="http://schemas.openxmlformats.org/officeDocument/2006/math" xmlns:v="urn:schemas-microsoft-com:vml" xmlns:wp14="http://schemas.microsoft.com/office/word/2010/wordprocessingDrawing" xmlns:wp="http://schemas.openxmlformats.org/drawingml/2006/wordprocessingDrawing" xmlns:w10="urn:schemas-microsoft-com:office:word" xmlns:w="http://schemas.openxmlformats.org/wordprocessingml/2006/main" xmlns:w14="http://schemas.microsoft.com/office/word/2010/wordml" xmlns:w15="http://schemas.microsoft.com/office/word/2012/wordml" xmlns:w16cex="http://schemas.microsoft.com/office/word/2018/wordml/cex" xmlns:w16cid="http://schemas.microsoft.com/office/word/2016/wordml/cid" xmlns:w16="http://schemas.microsoft.com/office/word/2018/wordml" xmlns:w16du="http://schemas.microsoft.com/office/word/2023/wordml/word16du" xmlns:w16sdtdh="http://schemas.microsoft.com/office/word/2020/wordml/sdtdatahash" xmlns:w16sdtfl="http://schemas.microsoft.com/office/word/2024/wordml/sdtformatlock" xmlns:w16se="http://schemas.microsoft.com/office/word/2015/wordml/symex" xmlns:wpg="http://schemas.microsoft.com/office/word/2010/wordprocessingGroup" xmlns:wpi="http://schemas.microsoft.com/office/word/2010/wordprocessingInk" xmlns:wne="http://schemas.microsoft.com/office/word/2006/wordml" xmlns:wps="http://schemas.microsoft.com/office/word/2010/wordprocessingShape" mc:Ignorable="w14 w15 w16se w16cid w16 w16cex w16sdtdh w16sdtfl w16du wp14">
   <w:abstractNum w:abstractNumId="0" w15:restartNumberingAfterBreak="0">
+    <w:nsid w:val="0CF8322A"/>
+    <w:multiLevelType w:val="hybridMultilevel"/>
+    <w:tmpl w:val="539CFB74"/>
+    <w:lvl w:ilvl="0" w:tplc="04090001">
+      <w:start w:val="1"/>
+      <w:numFmt w:val="bullet"/>
+      <w:lvlText w:val=""/>
+      <w:lvlJc w:val="left"/>
+      <w:pPr>
+        <w:ind w:left="720" w:hanging="360"/>
+      </w:pPr>
+      <w:rPr>
+        <w:rFonts w:ascii="Symbol" w:hAnsi="Symbol" w:hint="default"/>
+      </w:rPr>
+    </w:lvl>
+    <w:lvl w:ilvl="1" w:tplc="04090003" w:tentative="1">
+      <w:start w:val="1"/>
+      <w:numFmt w:val="bullet"/>
+      <w:lvlText w:val="o"/>
+      <w:lvlJc w:val="left"/>
+      <w:pPr>
+        <w:ind w:left="1440" w:hanging="360"/>
+      </w:pPr>
+      <w:rPr>
+        <w:rFonts w:ascii="Courier New" w:hAnsi="Courier New" w:cs="Courier New" w:hint="default"/>
+      </w:rPr>
+    </w:lvl>
+    <w:lvl w:ilvl="2" w:tplc="04090005" w:tentative="1">
+      <w:start w:val="1"/>
+      <w:numFmt w:val="bullet"/>
+      <w:lvlText w:val=""/>
+      <w:lvlJc w:val="left"/>
+      <w:pPr>
+        <w:ind w:left="2160" w:hanging="360"/>
+      </w:pPr>
+      <w:rPr>
+        <w:rFonts w:ascii="Wingdings" w:hAnsi="Wingdings" w:hint="default"/>
+      </w:rPr>
+    </w:lvl>
+    <w:lvl w:ilvl="3" w:tplc="04090001" w:tentative="1">
+      <w:start w:val="1"/>
+      <w:numFmt w:val="bullet"/>
+      <w:lvlText w:val=""/>
+      <w:lvlJc w:val="left"/>
+      <w:pPr>
+        <w:ind w:left="2880" w:hanging="360"/>
+      </w:pPr>
+      <w:rPr>
+        <w:rFonts w:ascii="Symbol" w:hAnsi="Symbol" w:hint="default"/>
+      </w:rPr>
+    </w:lvl>
+    <w:lvl w:ilvl="4" w:tplc="04090003" w:tentative="1">
+      <w:start w:val="1"/>
+      <w:numFmt w:val="bullet"/>
+      <w:lvlText w:val="o"/>
+      <w:lvlJc w:val="left"/>
+      <w:pPr>
+        <w:ind w:left="3600" w:hanging="360"/>
+      </w:pPr>
+      <w:rPr>
+        <w:rFonts w:ascii="Courier New" w:hAnsi="Courier New" w:cs="Courier New" w:hint="default"/>
+      </w:rPr>
+    </w:lvl>
+    <w:lvl w:ilvl="5" w:tplc="04090005" w:tentative="1">
+      <w:start w:val="1"/>
+      <w:numFmt w:val="bullet"/>
+      <w:lvlText w:val=""/>
+      <w:lvlJc w:val="left"/>
+      <w:pPr>
+        <w:ind w:left="4320" w:hanging="360"/>
+      </w:pPr>
+      <w:rPr>
+        <w:rFonts w:ascii="Wingdings" w:hAnsi="Wingdings" w:hint="default"/>
+      </w:rPr>
+    </w:lvl>
+    <w:lvl w:ilvl="6" w:tplc="04090001" w:tentative="1">
+      <w:start w:val="1"/>
+      <w:numFmt w:val="bullet"/>
+      <w:lvlText w:val=""/>
+      <w:lvlJc w:val="left"/>
+      <w:pPr>
+        <w:ind w:left="5040" w:hanging="360"/>
+      </w:pPr>
+      <w:rPr>
+        <w:rFonts w:ascii="Symbol" w:hAnsi="Symbol" w:hint="default"/>
+      </w:rPr>
+    </w:lvl>
+    <w:lvl w:ilvl="7" w:tplc="04090003" w:tentative="1">
+      <w:start w:val="1"/>
+      <w:numFmt w:val="bullet"/>
+      <w:lvlText w:val="o"/>
+      <w:lvlJc w:val="left"/>
+      <w:pPr>
+        <w:ind w:left="5760" w:hanging="360"/>
+      </w:pPr>
+      <w:rPr>
+        <w:rFonts w:ascii="Courier New" w:hAnsi="Courier New" w:cs="Courier New" w:hint="default"/>
+      </w:rPr>
+    </w:lvl>
+    <w:lvl w:ilvl="8" w:tplc="04090005" w:tentative="1">
+      <w:start w:val="1"/>
+      <w:numFmt w:val="bullet"/>
+      <w:lvlText w:val=""/>
+      <w:lvlJc w:val="left"/>
+      <w:pPr>
+        <w:ind w:left="6480" w:hanging="360"/>
+      </w:pPr>
+      <w:rPr>
+        <w:rFonts w:ascii="Wingdings" w:hAnsi="Wingdings" w:hint="default"/>
+      </w:rPr>
+    </w:lvl>
+  </w:abstractNum>
+  <w:abstractNum w:abstractNumId="1" w15:restartNumberingAfterBreak="0">
     <w:nsid w:val="1AE62D74"/>
     <w:multiLevelType w:val="hybridMultilevel"/>
     <w:tmpl w:val="CA0E2AF4"/>
@@ -5324,7 +5758,7 @@
       </w:rPr>
     </w:lvl>
   </w:abstractNum>
-  <w:abstractNum w:abstractNumId="1" w15:restartNumberingAfterBreak="0">
+  <w:abstractNum w:abstractNumId="2" w15:restartNumberingAfterBreak="0">
     <w:nsid w:val="36ED691A"/>
     <w:multiLevelType w:val="hybridMultilevel"/>
     <w:tmpl w:val="56FC6232"/>
@@ -5437,7 +5871,7 @@
       </w:rPr>
     </w:lvl>
   </w:abstractNum>
-  <w:abstractNum w:abstractNumId="2" w15:restartNumberingAfterBreak="0">
+  <w:abstractNum w:abstractNumId="3" w15:restartNumberingAfterBreak="0">
     <w:nsid w:val="521C4194"/>
     <w:multiLevelType w:val="hybridMultilevel"/>
     <w:tmpl w:val="0542FC48"/>
@@ -5550,7 +5984,7 @@
       </w:rPr>
     </w:lvl>
   </w:abstractNum>
-  <w:abstractNum w:abstractNumId="3" w15:restartNumberingAfterBreak="0">
+  <w:abstractNum w:abstractNumId="4" w15:restartNumberingAfterBreak="0">
     <w:nsid w:val="52D63117"/>
     <w:multiLevelType w:val="hybridMultilevel"/>
     <w:tmpl w:val="036E0984"/>
@@ -5663,7 +6097,7 @@
       </w:rPr>
     </w:lvl>
   </w:abstractNum>
-  <w:abstractNum w:abstractNumId="4" w15:restartNumberingAfterBreak="0">
+  <w:abstractNum w:abstractNumId="5" w15:restartNumberingAfterBreak="0">
     <w:nsid w:val="608B0027"/>
     <w:multiLevelType w:val="hybridMultilevel"/>
     <w:tmpl w:val="1A2A0CCE"/>
@@ -5776,7 +6210,7 @@
       </w:rPr>
     </w:lvl>
   </w:abstractNum>
-  <w:abstractNum w:abstractNumId="5" w15:restartNumberingAfterBreak="0">
+  <w:abstractNum w:abstractNumId="6" w15:restartNumberingAfterBreak="0">
     <w:nsid w:val="6B39307D"/>
     <w:multiLevelType w:val="hybridMultilevel"/>
     <w:tmpl w:val="BE94EE76"/>
@@ -5889,7 +6323,7 @@
       </w:rPr>
     </w:lvl>
   </w:abstractNum>
-  <w:abstractNum w:abstractNumId="6" w15:restartNumberingAfterBreak="0">
+  <w:abstractNum w:abstractNumId="7" w15:restartNumberingAfterBreak="0">
     <w:nsid w:val="6EF91E29"/>
     <w:multiLevelType w:val="hybridMultilevel"/>
     <w:tmpl w:val="90A0CFD2"/>
@@ -6002,7 +6436,7 @@
       </w:rPr>
     </w:lvl>
   </w:abstractNum>
-  <w:abstractNum w:abstractNumId="7" w15:restartNumberingAfterBreak="0">
+  <w:abstractNum w:abstractNumId="8" w15:restartNumberingAfterBreak="0">
     <w:nsid w:val="736117B3"/>
     <w:multiLevelType w:val="hybridMultilevel"/>
     <w:tmpl w:val="B902F320"/>
@@ -6115,7 +6549,7 @@
       </w:rPr>
     </w:lvl>
   </w:abstractNum>
-  <w:abstractNum w:abstractNumId="8" w15:restartNumberingAfterBreak="0">
+  <w:abstractNum w:abstractNumId="9" w15:restartNumberingAfterBreak="0">
     <w:nsid w:val="73AA7E9E"/>
     <w:multiLevelType w:val="hybridMultilevel"/>
     <w:tmpl w:val="8EAE28E8"/>
@@ -6229,31 +6663,34 @@
     </w:lvl>
   </w:abstractNum>
   <w:num w:numId="1" w16cid:durableId="824902107">
+    <w:abstractNumId w:val="5"/>
+  </w:num>
+  <w:num w:numId="2" w16cid:durableId="617299781">
+    <w:abstractNumId w:val="7"/>
+  </w:num>
+  <w:num w:numId="3" w16cid:durableId="1048263498">
     <w:abstractNumId w:val="4"/>
   </w:num>
-  <w:num w:numId="2" w16cid:durableId="617299781">
+  <w:num w:numId="4" w16cid:durableId="237983024">
+    <w:abstractNumId w:val="3"/>
+  </w:num>
+  <w:num w:numId="5" w16cid:durableId="325859572">
+    <w:abstractNumId w:val="1"/>
+  </w:num>
+  <w:num w:numId="6" w16cid:durableId="398870548">
     <w:abstractNumId w:val="6"/>
   </w:num>
-  <w:num w:numId="3" w16cid:durableId="1048263498">
-    <w:abstractNumId w:val="3"/>
+  <w:num w:numId="7" w16cid:durableId="1317153043">
+    <w:abstractNumId w:val="8"/>
   </w:num>
-  <w:num w:numId="4" w16cid:durableId="237983024">
+  <w:num w:numId="8" w16cid:durableId="430202784">
     <w:abstractNumId w:val="2"/>
   </w:num>
-  <w:num w:numId="5" w16cid:durableId="325859572">
+  <w:num w:numId="9" w16cid:durableId="1169177289">
+    <w:abstractNumId w:val="9"/>
+  </w:num>
+  <w:num w:numId="10" w16cid:durableId="965619825">
     <w:abstractNumId w:val="0"/>
-  </w:num>
-  <w:num w:numId="6" w16cid:durableId="398870548">
-    <w:abstractNumId w:val="5"/>
-  </w:num>
-  <w:num w:numId="7" w16cid:durableId="1317153043">
-    <w:abstractNumId w:val="7"/>
-  </w:num>
-  <w:num w:numId="8" w16cid:durableId="430202784">
-    <w:abstractNumId w:val="1"/>
-  </w:num>
-  <w:num w:numId="9" w16cid:durableId="1169177289">
-    <w:abstractNumId w:val="8"/>
   </w:num>
 </w:numbering>
 </file>

</xml_diff>

<commit_message>
Actualiza fuentes de datos con hoja 14PM
</commit_message>
<xml_diff>
--- a/Documentacion/Fuentes de Datos.docx
+++ b/Documentacion/Fuentes de Datos.docx
@@ -100,7 +100,7 @@
           <w:rFonts w:ascii="Arial" w:hAnsi="Arial" w:cs="Arial"/>
           <w:lang w:val="es-CO"/>
         </w:rPr>
-        <w:t>5</w:t>
+        <w:t>6</w:t>
       </w:r>
       <w:r>
         <w:rPr>
@@ -759,7 +759,27 @@
           <w:iCs/>
           <w:lang w:val="es-CO"/>
         </w:rPr>
-        <w:t>Censo Viterbo Caldas 2018/Data/Datasets/</w:t>
+        <w:t>Censo Viterbo Caldas 2018/Data/</w:t>
+      </w:r>
+      <w:proofErr w:type="spellStart"/>
+      <w:r>
+        <w:rPr>
+          <w:rFonts w:ascii="Arial" w:hAnsi="Arial" w:cs="Arial"/>
+          <w:i/>
+          <w:iCs/>
+          <w:lang w:val="es-CO"/>
+        </w:rPr>
+        <w:t>Datasets</w:t>
+      </w:r>
+      <w:proofErr w:type="spellEnd"/>
+      <w:r>
+        <w:rPr>
+          <w:rFonts w:ascii="Arial" w:hAnsi="Arial" w:cs="Arial"/>
+          <w:i/>
+          <w:iCs/>
+          <w:lang w:val="es-CO"/>
+        </w:rPr>
+        <w:t>/</w:t>
       </w:r>
     </w:p>
     <w:p>
@@ -2926,7 +2946,23 @@
           <w:rFonts w:ascii="Arial" w:hAnsi="Arial" w:cs="Arial"/>
           <w:lang w:val="es-CO"/>
         </w:rPr>
-        <w:t>(blank) (texto): Título en blanco, contiene las edades.</w:t>
+        <w:t>(</w:t>
+      </w:r>
+      <w:proofErr w:type="spellStart"/>
+      <w:r>
+        <w:rPr>
+          <w:rFonts w:ascii="Arial" w:hAnsi="Arial" w:cs="Arial"/>
+          <w:lang w:val="es-CO"/>
+        </w:rPr>
+        <w:t>blank</w:t>
+      </w:r>
+      <w:proofErr w:type="spellEnd"/>
+      <w:r>
+        <w:rPr>
+          <w:rFonts w:ascii="Arial" w:hAnsi="Arial" w:cs="Arial"/>
+          <w:lang w:val="es-CO"/>
+        </w:rPr>
+        <w:t>) (texto): Título en blanco, contiene las edades.</w:t>
       </w:r>
     </w:p>
     <w:p>
@@ -5028,7 +5064,23 @@
           <w:rFonts w:ascii="Arial" w:hAnsi="Arial" w:cs="Arial"/>
           <w:lang w:val="es-CO"/>
         </w:rPr>
-        <w:t>Gitano(a) o Rrom (entero): Cantidad de censados que se reconocen como gitanos o romaníes.</w:t>
+        <w:t xml:space="preserve">Gitano(a) o </w:t>
+      </w:r>
+      <w:proofErr w:type="spellStart"/>
+      <w:r>
+        <w:rPr>
+          <w:rFonts w:ascii="Arial" w:hAnsi="Arial" w:cs="Arial"/>
+          <w:lang w:val="es-CO"/>
+        </w:rPr>
+        <w:t>Rrom</w:t>
+      </w:r>
+      <w:proofErr w:type="spellEnd"/>
+      <w:r>
+        <w:rPr>
+          <w:rFonts w:ascii="Arial" w:hAnsi="Arial" w:cs="Arial"/>
+          <w:lang w:val="es-CO"/>
+        </w:rPr>
+        <w:t xml:space="preserve"> (entero): Cantidad de censados que se reconocen como gitanos o romaníes.</w:t>
       </w:r>
     </w:p>
     <w:p>
@@ -5048,7 +5100,23 @@
           <w:rFonts w:ascii="Arial" w:hAnsi="Arial" w:cs="Arial"/>
           <w:lang w:val="es-CO"/>
         </w:rPr>
-        <w:t>Raizal del Archipielago de San Andrés, Providencia y Santa Catalina (entero): Cantidad de censados que se reconocen como raizales del Archipiélago de San Andrés, Providencia y Santa Catalina.</w:t>
+        <w:t xml:space="preserve">Raizal del </w:t>
+      </w:r>
+      <w:proofErr w:type="spellStart"/>
+      <w:r>
+        <w:rPr>
+          <w:rFonts w:ascii="Arial" w:hAnsi="Arial" w:cs="Arial"/>
+          <w:lang w:val="es-CO"/>
+        </w:rPr>
+        <w:t>Archipielago</w:t>
+      </w:r>
+      <w:proofErr w:type="spellEnd"/>
+      <w:r>
+        <w:rPr>
+          <w:rFonts w:ascii="Arial" w:hAnsi="Arial" w:cs="Arial"/>
+          <w:lang w:val="es-CO"/>
+        </w:rPr>
+        <w:t xml:space="preserve"> de San Andrés, Providencia y Santa Catalina (entero): Cantidad de censados que se reconocen como raizales del Archipiélago de San Andrés, Providencia y Santa Catalina.</w:t>
       </w:r>
     </w:p>
     <w:p>
@@ -5249,14 +5317,7 @@
           <w:rFonts w:ascii="Arial" w:hAnsi="Arial" w:cs="Arial"/>
           <w:lang w:val="es-CO"/>
         </w:rPr>
-        <w:t>)</w:t>
-      </w:r>
-      <w:r>
-        <w:rPr>
-          <w:rFonts w:ascii="Arial" w:hAnsi="Arial" w:cs="Arial"/>
-          <w:lang w:val="es-CO"/>
-        </w:rPr>
-        <w:t>, y contiene 3 agrupaciones.</w:t>
+        <w:t>), y contiene 3 agrupaciones.</w:t>
       </w:r>
     </w:p>
     <w:p>
@@ -5331,7 +5392,23 @@
           <w:rFonts w:ascii="Arial" w:hAnsi="Arial" w:cs="Arial"/>
           <w:lang w:val="es-CO"/>
         </w:rPr>
-        <w:t>Gitano(a) o Rrom (entero): Cantidad de censados que se reconocen como gitanos o romaníes.</w:t>
+        <w:t xml:space="preserve">Gitano(a) o </w:t>
+      </w:r>
+      <w:proofErr w:type="spellStart"/>
+      <w:r>
+        <w:rPr>
+          <w:rFonts w:ascii="Arial" w:hAnsi="Arial" w:cs="Arial"/>
+          <w:lang w:val="es-CO"/>
+        </w:rPr>
+        <w:t>Rrom</w:t>
+      </w:r>
+      <w:proofErr w:type="spellEnd"/>
+      <w:r>
+        <w:rPr>
+          <w:rFonts w:ascii="Arial" w:hAnsi="Arial" w:cs="Arial"/>
+          <w:lang w:val="es-CO"/>
+        </w:rPr>
+        <w:t xml:space="preserve"> (entero): Cantidad de censados que se reconocen como gitanos o romaníes.</w:t>
       </w:r>
     </w:p>
     <w:p>
@@ -5351,7 +5428,23 @@
           <w:rFonts w:ascii="Arial" w:hAnsi="Arial" w:cs="Arial"/>
           <w:lang w:val="es-CO"/>
         </w:rPr>
-        <w:t>Raizal del Archipielago de San Andrés, Providencia y Santa Catalina (entero): Cantidad de censados que se reconocen como raizales del Archipiélago de San Andrés, Providencia y Santa Catalina.</w:t>
+        <w:t xml:space="preserve">Raizal del </w:t>
+      </w:r>
+      <w:proofErr w:type="spellStart"/>
+      <w:r>
+        <w:rPr>
+          <w:rFonts w:ascii="Arial" w:hAnsi="Arial" w:cs="Arial"/>
+          <w:lang w:val="es-CO"/>
+        </w:rPr>
+        <w:t>Archipielago</w:t>
+      </w:r>
+      <w:proofErr w:type="spellEnd"/>
+      <w:r>
+        <w:rPr>
+          <w:rFonts w:ascii="Arial" w:hAnsi="Arial" w:cs="Arial"/>
+          <w:lang w:val="es-CO"/>
+        </w:rPr>
+        <w:t xml:space="preserve"> de San Andrés, Providencia y Santa Catalina (entero): Cantidad de censados que se reconocen como raizales del Archipiélago de San Andrés, Providencia y Santa Catalina.</w:t>
       </w:r>
     </w:p>
     <w:p>
@@ -5514,11 +5607,610 @@
       <w:pPr>
         <w:rPr>
           <w:rFonts w:ascii="Arial" w:hAnsi="Arial" w:cs="Arial"/>
+          <w:lang w:val="es-CO"/>
+        </w:rPr>
+      </w:pPr>
+    </w:p>
+    <w:p>
+      <w:pPr>
+        <w:rPr>
+          <w:rFonts w:ascii="Arial" w:hAnsi="Arial" w:cs="Arial"/>
+          <w:b/>
+          <w:bCs/>
+          <w:lang w:val="es-CO"/>
+        </w:rPr>
+      </w:pPr>
+      <w:r>
+        <w:rPr>
+          <w:rFonts w:ascii="Arial" w:hAnsi="Arial" w:cs="Arial"/>
+          <w:b/>
+          <w:bCs/>
+          <w:lang w:val="es-CO"/>
+        </w:rPr>
+        <w:t>14PM</w:t>
+      </w:r>
+    </w:p>
+    <w:p>
+      <w:pPr>
+        <w:rPr>
+          <w:rFonts w:ascii="Arial" w:hAnsi="Arial" w:cs="Arial"/>
           <w:i/>
           <w:iCs/>
           <w:lang w:val="es-CO"/>
         </w:rPr>
       </w:pPr>
+      <w:r>
+        <w:rPr>
+          <w:rFonts w:ascii="Arial" w:hAnsi="Arial" w:cs="Arial"/>
+          <w:lang w:val="es-CO"/>
+        </w:rPr>
+        <w:t xml:space="preserve">Contiene 15 columnas fuertemente agrupadas por </w:t>
+      </w:r>
+      <w:r>
+        <w:rPr>
+          <w:rFonts w:ascii="Arial" w:hAnsi="Arial" w:cs="Arial"/>
+          <w:i/>
+          <w:iCs/>
+          <w:lang w:val="es-CO"/>
+        </w:rPr>
+        <w:t xml:space="preserve">Total </w:t>
+      </w:r>
+      <w:r>
+        <w:rPr>
+          <w:rFonts w:ascii="Arial" w:hAnsi="Arial" w:cs="Arial"/>
+          <w:lang w:val="es-CO"/>
+        </w:rPr>
+        <w:t xml:space="preserve">(Resumen total de datos), </w:t>
+      </w:r>
+      <w:r>
+        <w:rPr>
+          <w:rFonts w:ascii="Arial" w:hAnsi="Arial" w:cs="Arial"/>
+          <w:i/>
+          <w:iCs/>
+          <w:lang w:val="es-CO"/>
+        </w:rPr>
+        <w:t xml:space="preserve">Cabecera </w:t>
+      </w:r>
+      <w:r>
+        <w:rPr>
+          <w:rFonts w:ascii="Arial" w:hAnsi="Arial" w:cs="Arial"/>
+          <w:lang w:val="es-CO"/>
+        </w:rPr>
+        <w:t>(Grupo con datos correspondientes a las cabeceras municipales)</w:t>
+      </w:r>
+      <w:r>
+        <w:rPr>
+          <w:rFonts w:ascii="Arial" w:hAnsi="Arial" w:cs="Arial"/>
+          <w:i/>
+          <w:iCs/>
+          <w:lang w:val="es-CO"/>
+        </w:rPr>
+        <w:t xml:space="preserve">, Centro Poblado </w:t>
+      </w:r>
+      <w:r>
+        <w:rPr>
+          <w:rFonts w:ascii="Arial" w:hAnsi="Arial" w:cs="Arial"/>
+          <w:lang w:val="es-CO"/>
+        </w:rPr>
+        <w:t>(Grupo con datos correspondientes a centros poblados)</w:t>
+      </w:r>
+      <w:r>
+        <w:rPr>
+          <w:rFonts w:ascii="Arial" w:hAnsi="Arial" w:cs="Arial"/>
+          <w:i/>
+          <w:iCs/>
+          <w:lang w:val="es-CO"/>
+        </w:rPr>
+        <w:t xml:space="preserve">, Rural Disperso </w:t>
+      </w:r>
+      <w:r>
+        <w:rPr>
+          <w:rFonts w:ascii="Arial" w:hAnsi="Arial" w:cs="Arial"/>
+          <w:lang w:val="es-CO"/>
+        </w:rPr>
+        <w:t>(Grupo con datos correspondientes a ciudadanos que habitan en las zonas rurales, pero no en centros poblados</w:t>
+      </w:r>
+      <w:r>
+        <w:rPr>
+          <w:rFonts w:ascii="Arial" w:hAnsi="Arial" w:cs="Arial"/>
+          <w:lang w:val="es-CO"/>
+        </w:rPr>
+        <w:t>)</w:t>
+      </w:r>
+      <w:r>
+        <w:rPr>
+          <w:rFonts w:ascii="Arial" w:hAnsi="Arial" w:cs="Arial"/>
+          <w:lang w:val="es-CO"/>
+        </w:rPr>
+        <w:t xml:space="preserve">, y a su vez contienen subgrupos por </w:t>
+      </w:r>
+      <w:r>
+        <w:rPr>
+          <w:rFonts w:ascii="Arial" w:hAnsi="Arial" w:cs="Arial"/>
+          <w:i/>
+          <w:iCs/>
+          <w:lang w:val="es-CO"/>
+        </w:rPr>
+        <w:t>Tuvo alguna enfermedad en los 30 días</w:t>
+      </w:r>
+      <w:r>
+        <w:rPr>
+          <w:rFonts w:ascii="Arial" w:hAnsi="Arial" w:cs="Arial"/>
+          <w:lang w:val="es-CO"/>
+        </w:rPr>
+        <w:t xml:space="preserve"> y </w:t>
+      </w:r>
+      <w:r>
+        <w:rPr>
+          <w:rFonts w:ascii="Arial" w:hAnsi="Arial" w:cs="Arial"/>
+          <w:i/>
+          <w:iCs/>
+          <w:lang w:val="es-CO"/>
+        </w:rPr>
+        <w:t>Servicio de salud donde acudieron.</w:t>
+      </w:r>
+    </w:p>
+    <w:p>
+      <w:pPr>
+        <w:rPr>
+          <w:rFonts w:ascii="Arial" w:hAnsi="Arial" w:cs="Arial"/>
+          <w:lang w:val="es-CO"/>
+        </w:rPr>
+      </w:pPr>
+      <w:r>
+        <w:rPr>
+          <w:rFonts w:ascii="Arial" w:hAnsi="Arial" w:cs="Arial"/>
+          <w:lang w:val="es-CO"/>
+        </w:rPr>
+        <w:t>Contiene filas correspondientes a grupos de edad.</w:t>
+      </w:r>
+    </w:p>
+    <w:p>
+      <w:pPr>
+        <w:rPr>
+          <w:rFonts w:ascii="Arial" w:hAnsi="Arial" w:cs="Arial"/>
+          <w:lang w:val="es-CO"/>
+        </w:rPr>
+      </w:pPr>
+      <w:r>
+        <w:rPr>
+          <w:rFonts w:ascii="Arial" w:hAnsi="Arial" w:cs="Arial"/>
+          <w:lang w:val="es-CO"/>
+        </w:rPr>
+        <w:t>Columnas:</w:t>
+      </w:r>
+    </w:p>
+    <w:p>
+      <w:pPr>
+        <w:pStyle w:val="Prrafodelista"/>
+        <w:numPr>
+          <w:ilvl w:val="0"/>
+          <w:numId w:val="11"/>
+        </w:numPr>
+        <w:rPr>
+          <w:rFonts w:ascii="Arial" w:hAnsi="Arial" w:cs="Arial"/>
+          <w:lang w:val="es-CO"/>
+        </w:rPr>
+      </w:pPr>
+      <w:proofErr w:type="gramStart"/>
+      <w:r>
+        <w:rPr>
+          <w:rFonts w:ascii="Arial" w:hAnsi="Arial" w:cs="Arial"/>
+          <w:lang w:val="es-CO"/>
+        </w:rPr>
+        <w:t>Total</w:t>
+      </w:r>
+      <w:proofErr w:type="gramEnd"/>
+      <w:r>
+        <w:rPr>
+          <w:rFonts w:ascii="Arial" w:hAnsi="Arial" w:cs="Arial"/>
+          <w:lang w:val="es-CO"/>
+        </w:rPr>
+        <w:t xml:space="preserve"> personas (entero): Cantidad total de censados del grupo.</w:t>
+      </w:r>
+    </w:p>
+    <w:p>
+      <w:pPr>
+        <w:pStyle w:val="Prrafodelista"/>
+        <w:numPr>
+          <w:ilvl w:val="0"/>
+          <w:numId w:val="11"/>
+        </w:numPr>
+        <w:rPr>
+          <w:rFonts w:ascii="Arial" w:hAnsi="Arial" w:cs="Arial"/>
+          <w:lang w:val="es-CO"/>
+        </w:rPr>
+      </w:pPr>
+      <w:r>
+        <w:rPr>
+          <w:rFonts w:ascii="Arial" w:hAnsi="Arial" w:cs="Arial"/>
+          <w:lang w:val="es-CO"/>
+        </w:rPr>
+        <w:t>Sí (entero): Cantidad de censados que tuvieron alguna enfermedad los últimos 30 días.</w:t>
+      </w:r>
+    </w:p>
+    <w:p>
+      <w:pPr>
+        <w:pStyle w:val="Prrafodelista"/>
+        <w:numPr>
+          <w:ilvl w:val="0"/>
+          <w:numId w:val="11"/>
+        </w:numPr>
+        <w:rPr>
+          <w:rFonts w:ascii="Arial" w:hAnsi="Arial" w:cs="Arial"/>
+          <w:lang w:val="es-CO"/>
+        </w:rPr>
+      </w:pPr>
+      <w:r>
+        <w:rPr>
+          <w:rFonts w:ascii="Arial" w:hAnsi="Arial" w:cs="Arial"/>
+          <w:lang w:val="es-CO"/>
+        </w:rPr>
+        <w:t>No (entero): Cantidad de censados que no tuvieron alguna enfermedad los últimos 30 días.</w:t>
+      </w:r>
+    </w:p>
+    <w:p>
+      <w:pPr>
+        <w:pStyle w:val="Prrafodelista"/>
+        <w:numPr>
+          <w:ilvl w:val="0"/>
+          <w:numId w:val="11"/>
+        </w:numPr>
+        <w:rPr>
+          <w:rFonts w:ascii="Arial" w:hAnsi="Arial" w:cs="Arial"/>
+          <w:lang w:val="es-CO"/>
+        </w:rPr>
+      </w:pPr>
+      <w:proofErr w:type="gramStart"/>
+      <w:r>
+        <w:rPr>
+          <w:rFonts w:ascii="Arial" w:hAnsi="Arial" w:cs="Arial"/>
+          <w:lang w:val="es-CO"/>
+        </w:rPr>
+        <w:t>Total</w:t>
+      </w:r>
+      <w:proofErr w:type="gramEnd"/>
+      <w:r>
+        <w:rPr>
+          <w:rFonts w:ascii="Arial" w:hAnsi="Arial" w:cs="Arial"/>
+          <w:lang w:val="es-CO"/>
+        </w:rPr>
+        <w:t xml:space="preserve"> personas que tuvieron alguna enfermedad (entero): Cantidad total de censados que tuvieron alguna enfermedad los últimos 30 días.</w:t>
+      </w:r>
+    </w:p>
+    <w:p>
+      <w:pPr>
+        <w:pStyle w:val="Prrafodelista"/>
+        <w:numPr>
+          <w:ilvl w:val="0"/>
+          <w:numId w:val="11"/>
+        </w:numPr>
+        <w:rPr>
+          <w:rFonts w:ascii="Arial" w:hAnsi="Arial" w:cs="Arial"/>
+          <w:lang w:val="es-CO"/>
+        </w:rPr>
+      </w:pPr>
+      <w:r>
+        <w:rPr>
+          <w:rFonts w:ascii="Arial" w:hAnsi="Arial" w:cs="Arial"/>
+          <w:lang w:val="es-CO"/>
+        </w:rPr>
+        <w:t>Sin información (entero): Cantidad de censados de los cuales no se tiene información acerca de si tuvieron alguna enfermedad los últimos 30 días.</w:t>
+      </w:r>
+    </w:p>
+    <w:p>
+      <w:pPr>
+        <w:pStyle w:val="Prrafodelista"/>
+        <w:numPr>
+          <w:ilvl w:val="0"/>
+          <w:numId w:val="11"/>
+        </w:numPr>
+        <w:rPr>
+          <w:rFonts w:ascii="Arial" w:hAnsi="Arial" w:cs="Arial"/>
+          <w:lang w:val="es-CO"/>
+        </w:rPr>
+      </w:pPr>
+      <w:r>
+        <w:rPr>
+          <w:rFonts w:ascii="Arial" w:hAnsi="Arial" w:cs="Arial"/>
+          <w:lang w:val="es-CO"/>
+        </w:rPr>
+        <w:t xml:space="preserve">A la entidad de seguridad social en salud a la cual está afiliado (entero): Cantidad de censados que </w:t>
+      </w:r>
+      <w:r>
+        <w:rPr>
+          <w:rFonts w:ascii="Arial" w:hAnsi="Arial" w:cs="Arial"/>
+          <w:lang w:val="es-CO"/>
+        </w:rPr>
+        <w:t xml:space="preserve">tuvieron alguna enfermedad los últimos 30 días y </w:t>
+      </w:r>
+      <w:r>
+        <w:rPr>
+          <w:rFonts w:ascii="Arial" w:hAnsi="Arial" w:cs="Arial"/>
+          <w:lang w:val="es-CO"/>
+        </w:rPr>
+        <w:t>acudieron a la entidad de seguridad social en salud a la cual están afiliados</w:t>
+      </w:r>
+      <w:r>
+        <w:rPr>
+          <w:rFonts w:ascii="Arial" w:hAnsi="Arial" w:cs="Arial"/>
+          <w:lang w:val="es-CO"/>
+        </w:rPr>
+        <w:t>.</w:t>
+      </w:r>
+    </w:p>
+    <w:p>
+      <w:pPr>
+        <w:pStyle w:val="Prrafodelista"/>
+        <w:numPr>
+          <w:ilvl w:val="0"/>
+          <w:numId w:val="11"/>
+        </w:numPr>
+        <w:rPr>
+          <w:rFonts w:ascii="Arial" w:hAnsi="Arial" w:cs="Arial"/>
+          <w:lang w:val="es-CO"/>
+        </w:rPr>
+      </w:pPr>
+      <w:r>
+        <w:rPr>
+          <w:rFonts w:ascii="Arial" w:hAnsi="Arial" w:cs="Arial"/>
+          <w:lang w:val="es-CO"/>
+        </w:rPr>
+        <w:t xml:space="preserve">A un médico particular (entero): </w:t>
+      </w:r>
+      <w:r>
+        <w:rPr>
+          <w:rFonts w:ascii="Arial" w:hAnsi="Arial" w:cs="Arial"/>
+          <w:lang w:val="es-CO"/>
+        </w:rPr>
+        <w:t>Cantidad de censados que tuvieron alguna enfermedad los últimos 30 días y</w:t>
+      </w:r>
+      <w:r>
+        <w:rPr>
+          <w:rFonts w:ascii="Arial" w:hAnsi="Arial" w:cs="Arial"/>
+          <w:lang w:val="es-CO"/>
+        </w:rPr>
+        <w:t xml:space="preserve"> acudieron a un médico particular.</w:t>
+      </w:r>
+    </w:p>
+    <w:p>
+      <w:pPr>
+        <w:pStyle w:val="Prrafodelista"/>
+        <w:numPr>
+          <w:ilvl w:val="0"/>
+          <w:numId w:val="11"/>
+        </w:numPr>
+        <w:rPr>
+          <w:rFonts w:ascii="Arial" w:hAnsi="Arial" w:cs="Arial"/>
+          <w:lang w:val="es-CO"/>
+        </w:rPr>
+      </w:pPr>
+      <w:r>
+        <w:rPr>
+          <w:rFonts w:ascii="Arial" w:hAnsi="Arial" w:cs="Arial"/>
+          <w:lang w:val="es-CO"/>
+        </w:rPr>
+        <w:t xml:space="preserve">A un boticario, farmaceuta, droguista (entero): </w:t>
+      </w:r>
+      <w:r>
+        <w:rPr>
+          <w:rFonts w:ascii="Arial" w:hAnsi="Arial" w:cs="Arial"/>
+          <w:lang w:val="es-CO"/>
+        </w:rPr>
+        <w:t>Cantidad de censados que tuvieron alguna enfermedad los últimos 30 días y</w:t>
+      </w:r>
+      <w:r>
+        <w:rPr>
+          <w:rFonts w:ascii="Arial" w:hAnsi="Arial" w:cs="Arial"/>
+          <w:lang w:val="es-CO"/>
+        </w:rPr>
+        <w:t xml:space="preserve"> acudieron a un boticario, farmaceuta o droguista.</w:t>
+      </w:r>
+    </w:p>
+    <w:p>
+      <w:pPr>
+        <w:pStyle w:val="Prrafodelista"/>
+        <w:numPr>
+          <w:ilvl w:val="0"/>
+          <w:numId w:val="11"/>
+        </w:numPr>
+        <w:rPr>
+          <w:rFonts w:ascii="Arial" w:hAnsi="Arial" w:cs="Arial"/>
+          <w:lang w:val="es-CO"/>
+        </w:rPr>
+      </w:pPr>
+      <w:r>
+        <w:rPr>
+          <w:rFonts w:ascii="Arial" w:hAnsi="Arial" w:cs="Arial"/>
+          <w:lang w:val="es-CO"/>
+        </w:rPr>
+        <w:t xml:space="preserve">A terapias alternativas (entero): </w:t>
+      </w:r>
+      <w:r>
+        <w:rPr>
+          <w:rFonts w:ascii="Arial" w:hAnsi="Arial" w:cs="Arial"/>
+          <w:lang w:val="es-CO"/>
+        </w:rPr>
+        <w:t>Cantidad de censados que tuvieron alguna enfermedad los últimos 30 días y</w:t>
+      </w:r>
+      <w:r>
+        <w:rPr>
+          <w:rFonts w:ascii="Arial" w:hAnsi="Arial" w:cs="Arial"/>
+          <w:lang w:val="es-CO"/>
+        </w:rPr>
+        <w:t xml:space="preserve"> acudieron a terapias alternativas.</w:t>
+      </w:r>
+    </w:p>
+    <w:p>
+      <w:pPr>
+        <w:pStyle w:val="Prrafodelista"/>
+        <w:numPr>
+          <w:ilvl w:val="0"/>
+          <w:numId w:val="11"/>
+        </w:numPr>
+        <w:rPr>
+          <w:rFonts w:ascii="Arial" w:hAnsi="Arial" w:cs="Arial"/>
+          <w:lang w:val="es-CO"/>
+        </w:rPr>
+      </w:pPr>
+      <w:r>
+        <w:rPr>
+          <w:rFonts w:ascii="Arial" w:hAnsi="Arial" w:cs="Arial"/>
+          <w:lang w:val="es-CO"/>
+        </w:rPr>
+        <w:t xml:space="preserve">Acudió a una autoridad indígena espiritual (entero): </w:t>
+      </w:r>
+      <w:r>
+        <w:rPr>
+          <w:rFonts w:ascii="Arial" w:hAnsi="Arial" w:cs="Arial"/>
+          <w:lang w:val="es-CO"/>
+        </w:rPr>
+        <w:t>Cantidad de censados que tuvieron alguna enfermedad los últimos 30 días y</w:t>
+      </w:r>
+      <w:r>
+        <w:rPr>
+          <w:rFonts w:ascii="Arial" w:hAnsi="Arial" w:cs="Arial"/>
+          <w:lang w:val="es-CO"/>
+        </w:rPr>
+        <w:t xml:space="preserve"> acudieron a una autoridad indígena espiritual.</w:t>
+      </w:r>
+    </w:p>
+    <w:p>
+      <w:pPr>
+        <w:pStyle w:val="Prrafodelista"/>
+        <w:numPr>
+          <w:ilvl w:val="0"/>
+          <w:numId w:val="11"/>
+        </w:numPr>
+        <w:rPr>
+          <w:rFonts w:ascii="Arial" w:hAnsi="Arial" w:cs="Arial"/>
+          <w:lang w:val="es-CO"/>
+        </w:rPr>
+      </w:pPr>
+      <w:r>
+        <w:rPr>
+          <w:rFonts w:ascii="Arial" w:hAnsi="Arial" w:cs="Arial"/>
+          <w:lang w:val="es-CO"/>
+        </w:rPr>
+        <w:lastRenderedPageBreak/>
+        <w:t xml:space="preserve">Otro médico de un grupo étnico (entero): </w:t>
+      </w:r>
+      <w:r>
+        <w:rPr>
+          <w:rFonts w:ascii="Arial" w:hAnsi="Arial" w:cs="Arial"/>
+          <w:lang w:val="es-CO"/>
+        </w:rPr>
+        <w:t>Cantidad de censados que tuvieron alguna enfermedad los últimos 30 días y</w:t>
+      </w:r>
+      <w:r>
+        <w:rPr>
+          <w:rFonts w:ascii="Arial" w:hAnsi="Arial" w:cs="Arial"/>
+          <w:lang w:val="es-CO"/>
+        </w:rPr>
+        <w:t xml:space="preserve"> acudieron a otro médico de un grupo étnico.</w:t>
+      </w:r>
+    </w:p>
+    <w:p>
+      <w:pPr>
+        <w:pStyle w:val="Prrafodelista"/>
+        <w:numPr>
+          <w:ilvl w:val="0"/>
+          <w:numId w:val="11"/>
+        </w:numPr>
+        <w:rPr>
+          <w:rFonts w:ascii="Arial" w:hAnsi="Arial" w:cs="Arial"/>
+          <w:lang w:val="es-CO"/>
+        </w:rPr>
+      </w:pPr>
+      <w:r>
+        <w:rPr>
+          <w:rFonts w:ascii="Arial" w:hAnsi="Arial" w:cs="Arial"/>
+          <w:lang w:val="es-CO"/>
+        </w:rPr>
+        <w:t xml:space="preserve">Usó remedios caseros (entero): </w:t>
+      </w:r>
+      <w:r>
+        <w:rPr>
+          <w:rFonts w:ascii="Arial" w:hAnsi="Arial" w:cs="Arial"/>
+          <w:lang w:val="es-CO"/>
+        </w:rPr>
+        <w:t>Cantidad de censados que tuvieron alguna enfermedad los últimos 30 días y</w:t>
+      </w:r>
+      <w:r>
+        <w:rPr>
+          <w:rFonts w:ascii="Arial" w:hAnsi="Arial" w:cs="Arial"/>
+          <w:lang w:val="es-CO"/>
+        </w:rPr>
+        <w:t xml:space="preserve"> usaron remedios caseros.</w:t>
+      </w:r>
+    </w:p>
+    <w:p>
+      <w:pPr>
+        <w:pStyle w:val="Prrafodelista"/>
+        <w:numPr>
+          <w:ilvl w:val="0"/>
+          <w:numId w:val="11"/>
+        </w:numPr>
+        <w:rPr>
+          <w:rFonts w:ascii="Arial" w:hAnsi="Arial" w:cs="Arial"/>
+          <w:lang w:val="es-CO"/>
+        </w:rPr>
+      </w:pPr>
+      <w:r>
+        <w:rPr>
+          <w:rFonts w:ascii="Arial" w:hAnsi="Arial" w:cs="Arial"/>
+          <w:lang w:val="es-CO"/>
+        </w:rPr>
+        <w:t xml:space="preserve">Se autorrecetó (entero): </w:t>
+      </w:r>
+      <w:r>
+        <w:rPr>
+          <w:rFonts w:ascii="Arial" w:hAnsi="Arial" w:cs="Arial"/>
+          <w:lang w:val="es-CO"/>
+        </w:rPr>
+        <w:t>Cantidad de censados que tuvieron alguna enfermedad los últimos 30 días y</w:t>
+      </w:r>
+      <w:r>
+        <w:rPr>
+          <w:rFonts w:ascii="Arial" w:hAnsi="Arial" w:cs="Arial"/>
+          <w:lang w:val="es-CO"/>
+        </w:rPr>
+        <w:t xml:space="preserve"> se autorrecetaron.</w:t>
+      </w:r>
+    </w:p>
+    <w:p>
+      <w:pPr>
+        <w:pStyle w:val="Prrafodelista"/>
+        <w:numPr>
+          <w:ilvl w:val="0"/>
+          <w:numId w:val="11"/>
+        </w:numPr>
+        <w:rPr>
+          <w:rFonts w:ascii="Arial" w:hAnsi="Arial" w:cs="Arial"/>
+          <w:lang w:val="es-CO"/>
+        </w:rPr>
+      </w:pPr>
+      <w:r>
+        <w:rPr>
+          <w:rFonts w:ascii="Arial" w:hAnsi="Arial" w:cs="Arial"/>
+          <w:lang w:val="es-CO"/>
+        </w:rPr>
+        <w:t xml:space="preserve">No hizo nada (entero): </w:t>
+      </w:r>
+      <w:r>
+        <w:rPr>
+          <w:rFonts w:ascii="Arial" w:hAnsi="Arial" w:cs="Arial"/>
+          <w:lang w:val="es-CO"/>
+        </w:rPr>
+        <w:t>Cantidad de censados que tuvieron alguna enfermedad los últimos 30 días y</w:t>
+      </w:r>
+      <w:r>
+        <w:rPr>
+          <w:rFonts w:ascii="Arial" w:hAnsi="Arial" w:cs="Arial"/>
+          <w:lang w:val="es-CO"/>
+        </w:rPr>
+        <w:t xml:space="preserve"> no hicieron nada al respecto.</w:t>
+      </w:r>
     </w:p>
     <w:sectPr>
       <w:pgSz w:w="12240" w:h="15840"/>
@@ -6098,6 +6790,119 @@
     </w:lvl>
   </w:abstractNum>
   <w:abstractNum w:abstractNumId="5" w15:restartNumberingAfterBreak="0">
+    <w:nsid w:val="55821CAC"/>
+    <w:multiLevelType w:val="hybridMultilevel"/>
+    <w:tmpl w:val="61F8020E"/>
+    <w:lvl w:ilvl="0" w:tplc="04090001">
+      <w:start w:val="1"/>
+      <w:numFmt w:val="bullet"/>
+      <w:lvlText w:val=""/>
+      <w:lvlJc w:val="left"/>
+      <w:pPr>
+        <w:ind w:left="720" w:hanging="360"/>
+      </w:pPr>
+      <w:rPr>
+        <w:rFonts w:ascii="Symbol" w:hAnsi="Symbol" w:hint="default"/>
+      </w:rPr>
+    </w:lvl>
+    <w:lvl w:ilvl="1" w:tplc="04090003" w:tentative="1">
+      <w:start w:val="1"/>
+      <w:numFmt w:val="bullet"/>
+      <w:lvlText w:val="o"/>
+      <w:lvlJc w:val="left"/>
+      <w:pPr>
+        <w:ind w:left="1440" w:hanging="360"/>
+      </w:pPr>
+      <w:rPr>
+        <w:rFonts w:ascii="Courier New" w:hAnsi="Courier New" w:cs="Courier New" w:hint="default"/>
+      </w:rPr>
+    </w:lvl>
+    <w:lvl w:ilvl="2" w:tplc="04090005" w:tentative="1">
+      <w:start w:val="1"/>
+      <w:numFmt w:val="bullet"/>
+      <w:lvlText w:val=""/>
+      <w:lvlJc w:val="left"/>
+      <w:pPr>
+        <w:ind w:left="2160" w:hanging="360"/>
+      </w:pPr>
+      <w:rPr>
+        <w:rFonts w:ascii="Wingdings" w:hAnsi="Wingdings" w:hint="default"/>
+      </w:rPr>
+    </w:lvl>
+    <w:lvl w:ilvl="3" w:tplc="04090001" w:tentative="1">
+      <w:start w:val="1"/>
+      <w:numFmt w:val="bullet"/>
+      <w:lvlText w:val=""/>
+      <w:lvlJc w:val="left"/>
+      <w:pPr>
+        <w:ind w:left="2880" w:hanging="360"/>
+      </w:pPr>
+      <w:rPr>
+        <w:rFonts w:ascii="Symbol" w:hAnsi="Symbol" w:hint="default"/>
+      </w:rPr>
+    </w:lvl>
+    <w:lvl w:ilvl="4" w:tplc="04090003" w:tentative="1">
+      <w:start w:val="1"/>
+      <w:numFmt w:val="bullet"/>
+      <w:lvlText w:val="o"/>
+      <w:lvlJc w:val="left"/>
+      <w:pPr>
+        <w:ind w:left="3600" w:hanging="360"/>
+      </w:pPr>
+      <w:rPr>
+        <w:rFonts w:ascii="Courier New" w:hAnsi="Courier New" w:cs="Courier New" w:hint="default"/>
+      </w:rPr>
+    </w:lvl>
+    <w:lvl w:ilvl="5" w:tplc="04090005" w:tentative="1">
+      <w:start w:val="1"/>
+      <w:numFmt w:val="bullet"/>
+      <w:lvlText w:val=""/>
+      <w:lvlJc w:val="left"/>
+      <w:pPr>
+        <w:ind w:left="4320" w:hanging="360"/>
+      </w:pPr>
+      <w:rPr>
+        <w:rFonts w:ascii="Wingdings" w:hAnsi="Wingdings" w:hint="default"/>
+      </w:rPr>
+    </w:lvl>
+    <w:lvl w:ilvl="6" w:tplc="04090001" w:tentative="1">
+      <w:start w:val="1"/>
+      <w:numFmt w:val="bullet"/>
+      <w:lvlText w:val=""/>
+      <w:lvlJc w:val="left"/>
+      <w:pPr>
+        <w:ind w:left="5040" w:hanging="360"/>
+      </w:pPr>
+      <w:rPr>
+        <w:rFonts w:ascii="Symbol" w:hAnsi="Symbol" w:hint="default"/>
+      </w:rPr>
+    </w:lvl>
+    <w:lvl w:ilvl="7" w:tplc="04090003" w:tentative="1">
+      <w:start w:val="1"/>
+      <w:numFmt w:val="bullet"/>
+      <w:lvlText w:val="o"/>
+      <w:lvlJc w:val="left"/>
+      <w:pPr>
+        <w:ind w:left="5760" w:hanging="360"/>
+      </w:pPr>
+      <w:rPr>
+        <w:rFonts w:ascii="Courier New" w:hAnsi="Courier New" w:cs="Courier New" w:hint="default"/>
+      </w:rPr>
+    </w:lvl>
+    <w:lvl w:ilvl="8" w:tplc="04090005" w:tentative="1">
+      <w:start w:val="1"/>
+      <w:numFmt w:val="bullet"/>
+      <w:lvlText w:val=""/>
+      <w:lvlJc w:val="left"/>
+      <w:pPr>
+        <w:ind w:left="6480" w:hanging="360"/>
+      </w:pPr>
+      <w:rPr>
+        <w:rFonts w:ascii="Wingdings" w:hAnsi="Wingdings" w:hint="default"/>
+      </w:rPr>
+    </w:lvl>
+  </w:abstractNum>
+  <w:abstractNum w:abstractNumId="6" w15:restartNumberingAfterBreak="0">
     <w:nsid w:val="608B0027"/>
     <w:multiLevelType w:val="hybridMultilevel"/>
     <w:tmpl w:val="1A2A0CCE"/>
@@ -6210,7 +7015,7 @@
       </w:rPr>
     </w:lvl>
   </w:abstractNum>
-  <w:abstractNum w:abstractNumId="6" w15:restartNumberingAfterBreak="0">
+  <w:abstractNum w:abstractNumId="7" w15:restartNumberingAfterBreak="0">
     <w:nsid w:val="6B39307D"/>
     <w:multiLevelType w:val="hybridMultilevel"/>
     <w:tmpl w:val="BE94EE76"/>
@@ -6323,7 +7128,7 @@
       </w:rPr>
     </w:lvl>
   </w:abstractNum>
-  <w:abstractNum w:abstractNumId="7" w15:restartNumberingAfterBreak="0">
+  <w:abstractNum w:abstractNumId="8" w15:restartNumberingAfterBreak="0">
     <w:nsid w:val="6EF91E29"/>
     <w:multiLevelType w:val="hybridMultilevel"/>
     <w:tmpl w:val="90A0CFD2"/>
@@ -6436,7 +7241,7 @@
       </w:rPr>
     </w:lvl>
   </w:abstractNum>
-  <w:abstractNum w:abstractNumId="8" w15:restartNumberingAfterBreak="0">
+  <w:abstractNum w:abstractNumId="9" w15:restartNumberingAfterBreak="0">
     <w:nsid w:val="736117B3"/>
     <w:multiLevelType w:val="hybridMultilevel"/>
     <w:tmpl w:val="B902F320"/>
@@ -6549,7 +7354,7 @@
       </w:rPr>
     </w:lvl>
   </w:abstractNum>
-  <w:abstractNum w:abstractNumId="9" w15:restartNumberingAfterBreak="0">
+  <w:abstractNum w:abstractNumId="10" w15:restartNumberingAfterBreak="0">
     <w:nsid w:val="73AA7E9E"/>
     <w:multiLevelType w:val="hybridMultilevel"/>
     <w:tmpl w:val="8EAE28E8"/>
@@ -6663,10 +7468,10 @@
     </w:lvl>
   </w:abstractNum>
   <w:num w:numId="1" w16cid:durableId="824902107">
-    <w:abstractNumId w:val="5"/>
+    <w:abstractNumId w:val="6"/>
   </w:num>
   <w:num w:numId="2" w16cid:durableId="617299781">
-    <w:abstractNumId w:val="7"/>
+    <w:abstractNumId w:val="8"/>
   </w:num>
   <w:num w:numId="3" w16cid:durableId="1048263498">
     <w:abstractNumId w:val="4"/>
@@ -6678,19 +7483,22 @@
     <w:abstractNumId w:val="1"/>
   </w:num>
   <w:num w:numId="6" w16cid:durableId="398870548">
-    <w:abstractNumId w:val="6"/>
+    <w:abstractNumId w:val="7"/>
   </w:num>
   <w:num w:numId="7" w16cid:durableId="1317153043">
-    <w:abstractNumId w:val="8"/>
+    <w:abstractNumId w:val="9"/>
   </w:num>
   <w:num w:numId="8" w16cid:durableId="430202784">
     <w:abstractNumId w:val="2"/>
   </w:num>
   <w:num w:numId="9" w16cid:durableId="1169177289">
-    <w:abstractNumId w:val="9"/>
+    <w:abstractNumId w:val="10"/>
   </w:num>
   <w:num w:numId="10" w16cid:durableId="965619825">
     <w:abstractNumId w:val="0"/>
+  </w:num>
+  <w:num w:numId="11" w16cid:durableId="1154027656">
+    <w:abstractNumId w:val="5"/>
   </w:num>
 </w:numbering>
 </file>

</xml_diff>

<commit_message>
Actualiza fuentes de datos con hoja 15PM
</commit_message>
<xml_diff>
--- a/Documentacion/Fuentes de Datos.docx
+++ b/Documentacion/Fuentes de Datos.docx
@@ -100,7 +100,7 @@
           <w:rFonts w:ascii="Arial" w:hAnsi="Arial" w:cs="Arial"/>
           <w:lang w:val="es-CO"/>
         </w:rPr>
-        <w:t>6</w:t>
+        <w:t>7</w:t>
       </w:r>
       <w:r>
         <w:rPr>
@@ -759,27 +759,7 @@
           <w:iCs/>
           <w:lang w:val="es-CO"/>
         </w:rPr>
-        <w:t>Censo Viterbo Caldas 2018/Data/</w:t>
-      </w:r>
-      <w:proofErr w:type="spellStart"/>
-      <w:r>
-        <w:rPr>
-          <w:rFonts w:ascii="Arial" w:hAnsi="Arial" w:cs="Arial"/>
-          <w:i/>
-          <w:iCs/>
-          <w:lang w:val="es-CO"/>
-        </w:rPr>
-        <w:t>Datasets</w:t>
-      </w:r>
-      <w:proofErr w:type="spellEnd"/>
-      <w:r>
-        <w:rPr>
-          <w:rFonts w:ascii="Arial" w:hAnsi="Arial" w:cs="Arial"/>
-          <w:i/>
-          <w:iCs/>
-          <w:lang w:val="es-CO"/>
-        </w:rPr>
-        <w:t>/</w:t>
+        <w:t>Censo Viterbo Caldas 2018/Data/Datasets/</w:t>
       </w:r>
     </w:p>
     <w:p>
@@ -2946,23 +2926,7 @@
           <w:rFonts w:ascii="Arial" w:hAnsi="Arial" w:cs="Arial"/>
           <w:lang w:val="es-CO"/>
         </w:rPr>
-        <w:t>(</w:t>
-      </w:r>
-      <w:proofErr w:type="spellStart"/>
-      <w:r>
-        <w:rPr>
-          <w:rFonts w:ascii="Arial" w:hAnsi="Arial" w:cs="Arial"/>
-          <w:lang w:val="es-CO"/>
-        </w:rPr>
-        <w:t>blank</w:t>
-      </w:r>
-      <w:proofErr w:type="spellEnd"/>
-      <w:r>
-        <w:rPr>
-          <w:rFonts w:ascii="Arial" w:hAnsi="Arial" w:cs="Arial"/>
-          <w:lang w:val="es-CO"/>
-        </w:rPr>
-        <w:t>) (texto): Título en blanco, contiene las edades.</w:t>
+        <w:t>(blank) (texto): Título en blanco, contiene las edades.</w:t>
       </w:r>
     </w:p>
     <w:p>
@@ -5064,23 +5028,7 @@
           <w:rFonts w:ascii="Arial" w:hAnsi="Arial" w:cs="Arial"/>
           <w:lang w:val="es-CO"/>
         </w:rPr>
-        <w:t xml:space="preserve">Gitano(a) o </w:t>
-      </w:r>
-      <w:proofErr w:type="spellStart"/>
-      <w:r>
-        <w:rPr>
-          <w:rFonts w:ascii="Arial" w:hAnsi="Arial" w:cs="Arial"/>
-          <w:lang w:val="es-CO"/>
-        </w:rPr>
-        <w:t>Rrom</w:t>
-      </w:r>
-      <w:proofErr w:type="spellEnd"/>
-      <w:r>
-        <w:rPr>
-          <w:rFonts w:ascii="Arial" w:hAnsi="Arial" w:cs="Arial"/>
-          <w:lang w:val="es-CO"/>
-        </w:rPr>
-        <w:t xml:space="preserve"> (entero): Cantidad de censados que se reconocen como gitanos o romaníes.</w:t>
+        <w:t>Gitano(a) o Rrom (entero): Cantidad de censados que se reconocen como gitanos o romaníes.</w:t>
       </w:r>
     </w:p>
     <w:p>
@@ -5100,23 +5048,7 @@
           <w:rFonts w:ascii="Arial" w:hAnsi="Arial" w:cs="Arial"/>
           <w:lang w:val="es-CO"/>
         </w:rPr>
-        <w:t xml:space="preserve">Raizal del </w:t>
-      </w:r>
-      <w:proofErr w:type="spellStart"/>
-      <w:r>
-        <w:rPr>
-          <w:rFonts w:ascii="Arial" w:hAnsi="Arial" w:cs="Arial"/>
-          <w:lang w:val="es-CO"/>
-        </w:rPr>
-        <w:t>Archipielago</w:t>
-      </w:r>
-      <w:proofErr w:type="spellEnd"/>
-      <w:r>
-        <w:rPr>
-          <w:rFonts w:ascii="Arial" w:hAnsi="Arial" w:cs="Arial"/>
-          <w:lang w:val="es-CO"/>
-        </w:rPr>
-        <w:t xml:space="preserve"> de San Andrés, Providencia y Santa Catalina (entero): Cantidad de censados que se reconocen como raizales del Archipiélago de San Andrés, Providencia y Santa Catalina.</w:t>
+        <w:t>Raizal del Archipielago de San Andrés, Providencia y Santa Catalina (entero): Cantidad de censados que se reconocen como raizales del Archipiélago de San Andrés, Providencia y Santa Catalina.</w:t>
       </w:r>
     </w:p>
     <w:p>
@@ -5392,23 +5324,7 @@
           <w:rFonts w:ascii="Arial" w:hAnsi="Arial" w:cs="Arial"/>
           <w:lang w:val="es-CO"/>
         </w:rPr>
-        <w:t xml:space="preserve">Gitano(a) o </w:t>
-      </w:r>
-      <w:proofErr w:type="spellStart"/>
-      <w:r>
-        <w:rPr>
-          <w:rFonts w:ascii="Arial" w:hAnsi="Arial" w:cs="Arial"/>
-          <w:lang w:val="es-CO"/>
-        </w:rPr>
-        <w:t>Rrom</w:t>
-      </w:r>
-      <w:proofErr w:type="spellEnd"/>
-      <w:r>
-        <w:rPr>
-          <w:rFonts w:ascii="Arial" w:hAnsi="Arial" w:cs="Arial"/>
-          <w:lang w:val="es-CO"/>
-        </w:rPr>
-        <w:t xml:space="preserve"> (entero): Cantidad de censados que se reconocen como gitanos o romaníes.</w:t>
+        <w:t>Gitano(a) o Rrom (entero): Cantidad de censados que se reconocen como gitanos o romaníes.</w:t>
       </w:r>
     </w:p>
     <w:p>
@@ -5428,23 +5344,7 @@
           <w:rFonts w:ascii="Arial" w:hAnsi="Arial" w:cs="Arial"/>
           <w:lang w:val="es-CO"/>
         </w:rPr>
-        <w:t xml:space="preserve">Raizal del </w:t>
-      </w:r>
-      <w:proofErr w:type="spellStart"/>
-      <w:r>
-        <w:rPr>
-          <w:rFonts w:ascii="Arial" w:hAnsi="Arial" w:cs="Arial"/>
-          <w:lang w:val="es-CO"/>
-        </w:rPr>
-        <w:t>Archipielago</w:t>
-      </w:r>
-      <w:proofErr w:type="spellEnd"/>
-      <w:r>
-        <w:rPr>
-          <w:rFonts w:ascii="Arial" w:hAnsi="Arial" w:cs="Arial"/>
-          <w:lang w:val="es-CO"/>
-        </w:rPr>
-        <w:t xml:space="preserve"> de San Andrés, Providencia y Santa Catalina (entero): Cantidad de censados que se reconocen como raizales del Archipiélago de San Andrés, Providencia y Santa Catalina.</w:t>
+        <w:t>Raizal del Archipielago de San Andrés, Providencia y Santa Catalina (entero): Cantidad de censados que se reconocen como raizales del Archipiélago de San Andrés, Providencia y Santa Catalina.</w:t>
       </w:r>
     </w:p>
     <w:p>
@@ -5715,14 +5615,7 @@
           <w:rFonts w:ascii="Arial" w:hAnsi="Arial" w:cs="Arial"/>
           <w:lang w:val="es-CO"/>
         </w:rPr>
-        <w:t>)</w:t>
-      </w:r>
-      <w:r>
-        <w:rPr>
-          <w:rFonts w:ascii="Arial" w:hAnsi="Arial" w:cs="Arial"/>
-          <w:lang w:val="es-CO"/>
-        </w:rPr>
-        <w:t xml:space="preserve">, y a su vez contienen subgrupos por </w:t>
+        <w:t xml:space="preserve">), y a su vez contienen subgrupos por </w:t>
       </w:r>
       <w:r>
         <w:rPr>
@@ -5792,21 +5685,12 @@
           <w:lang w:val="es-CO"/>
         </w:rPr>
       </w:pPr>
-      <w:proofErr w:type="gramStart"/>
-      <w:r>
-        <w:rPr>
-          <w:rFonts w:ascii="Arial" w:hAnsi="Arial" w:cs="Arial"/>
-          <w:lang w:val="es-CO"/>
-        </w:rPr>
-        <w:t>Total</w:t>
-      </w:r>
-      <w:proofErr w:type="gramEnd"/>
-      <w:r>
-        <w:rPr>
-          <w:rFonts w:ascii="Arial" w:hAnsi="Arial" w:cs="Arial"/>
-          <w:lang w:val="es-CO"/>
-        </w:rPr>
-        <w:t xml:space="preserve"> personas (entero): Cantidad total de censados del grupo.</w:t>
+      <w:r>
+        <w:rPr>
+          <w:rFonts w:ascii="Arial" w:hAnsi="Arial" w:cs="Arial"/>
+          <w:lang w:val="es-CO"/>
+        </w:rPr>
+        <w:t>Total personas (entero): Cantidad total de censados del grupo.</w:t>
       </w:r>
     </w:p>
     <w:p>
@@ -5861,21 +5745,12 @@
           <w:lang w:val="es-CO"/>
         </w:rPr>
       </w:pPr>
-      <w:proofErr w:type="gramStart"/>
-      <w:r>
-        <w:rPr>
-          <w:rFonts w:ascii="Arial" w:hAnsi="Arial" w:cs="Arial"/>
-          <w:lang w:val="es-CO"/>
-        </w:rPr>
-        <w:t>Total</w:t>
-      </w:r>
-      <w:proofErr w:type="gramEnd"/>
-      <w:r>
-        <w:rPr>
-          <w:rFonts w:ascii="Arial" w:hAnsi="Arial" w:cs="Arial"/>
-          <w:lang w:val="es-CO"/>
-        </w:rPr>
-        <w:t xml:space="preserve"> personas que tuvieron alguna enfermedad (entero): Cantidad total de censados que tuvieron alguna enfermedad los últimos 30 días.</w:t>
+      <w:r>
+        <w:rPr>
+          <w:rFonts w:ascii="Arial" w:hAnsi="Arial" w:cs="Arial"/>
+          <w:lang w:val="es-CO"/>
+        </w:rPr>
+        <w:t>Total personas que tuvieron alguna enfermedad (entero): Cantidad total de censados que tuvieron alguna enfermedad los últimos 30 días.</w:t>
       </w:r>
     </w:p>
     <w:p>
@@ -5956,21 +5831,7 @@
           <w:rFonts w:ascii="Arial" w:hAnsi="Arial" w:cs="Arial"/>
           <w:lang w:val="es-CO"/>
         </w:rPr>
-        <w:t xml:space="preserve">A un médico particular (entero): </w:t>
-      </w:r>
-      <w:r>
-        <w:rPr>
-          <w:rFonts w:ascii="Arial" w:hAnsi="Arial" w:cs="Arial"/>
-          <w:lang w:val="es-CO"/>
-        </w:rPr>
-        <w:t>Cantidad de censados que tuvieron alguna enfermedad los últimos 30 días y</w:t>
-      </w:r>
-      <w:r>
-        <w:rPr>
-          <w:rFonts w:ascii="Arial" w:hAnsi="Arial" w:cs="Arial"/>
-          <w:lang w:val="es-CO"/>
-        </w:rPr>
-        <w:t xml:space="preserve"> acudieron a un médico particular.</w:t>
+        <w:t>A un médico particular (entero): Cantidad de censados que tuvieron alguna enfermedad los últimos 30 días y acudieron a un médico particular.</w:t>
       </w:r>
     </w:p>
     <w:p>
@@ -5990,21 +5851,7 @@
           <w:rFonts w:ascii="Arial" w:hAnsi="Arial" w:cs="Arial"/>
           <w:lang w:val="es-CO"/>
         </w:rPr>
-        <w:t xml:space="preserve">A un boticario, farmaceuta, droguista (entero): </w:t>
-      </w:r>
-      <w:r>
-        <w:rPr>
-          <w:rFonts w:ascii="Arial" w:hAnsi="Arial" w:cs="Arial"/>
-          <w:lang w:val="es-CO"/>
-        </w:rPr>
-        <w:t>Cantidad de censados que tuvieron alguna enfermedad los últimos 30 días y</w:t>
-      </w:r>
-      <w:r>
-        <w:rPr>
-          <w:rFonts w:ascii="Arial" w:hAnsi="Arial" w:cs="Arial"/>
-          <w:lang w:val="es-CO"/>
-        </w:rPr>
-        <w:t xml:space="preserve"> acudieron a un boticario, farmaceuta o droguista.</w:t>
+        <w:t>A un boticario, farmaceuta, droguista (entero): Cantidad de censados que tuvieron alguna enfermedad los últimos 30 días y acudieron a un boticario, farmaceuta o droguista.</w:t>
       </w:r>
     </w:p>
     <w:p>
@@ -6024,21 +5871,7 @@
           <w:rFonts w:ascii="Arial" w:hAnsi="Arial" w:cs="Arial"/>
           <w:lang w:val="es-CO"/>
         </w:rPr>
-        <w:t xml:space="preserve">A terapias alternativas (entero): </w:t>
-      </w:r>
-      <w:r>
-        <w:rPr>
-          <w:rFonts w:ascii="Arial" w:hAnsi="Arial" w:cs="Arial"/>
-          <w:lang w:val="es-CO"/>
-        </w:rPr>
-        <w:t>Cantidad de censados que tuvieron alguna enfermedad los últimos 30 días y</w:t>
-      </w:r>
-      <w:r>
-        <w:rPr>
-          <w:rFonts w:ascii="Arial" w:hAnsi="Arial" w:cs="Arial"/>
-          <w:lang w:val="es-CO"/>
-        </w:rPr>
-        <w:t xml:space="preserve"> acudieron a terapias alternativas.</w:t>
+        <w:t>A terapias alternativas (entero): Cantidad de censados que tuvieron alguna enfermedad los últimos 30 días y acudieron a terapias alternativas.</w:t>
       </w:r>
     </w:p>
     <w:p>
@@ -6058,21 +5891,7 @@
           <w:rFonts w:ascii="Arial" w:hAnsi="Arial" w:cs="Arial"/>
           <w:lang w:val="es-CO"/>
         </w:rPr>
-        <w:t xml:space="preserve">Acudió a una autoridad indígena espiritual (entero): </w:t>
-      </w:r>
-      <w:r>
-        <w:rPr>
-          <w:rFonts w:ascii="Arial" w:hAnsi="Arial" w:cs="Arial"/>
-          <w:lang w:val="es-CO"/>
-        </w:rPr>
-        <w:t>Cantidad de censados que tuvieron alguna enfermedad los últimos 30 días y</w:t>
-      </w:r>
-      <w:r>
-        <w:rPr>
-          <w:rFonts w:ascii="Arial" w:hAnsi="Arial" w:cs="Arial"/>
-          <w:lang w:val="es-CO"/>
-        </w:rPr>
-        <w:t xml:space="preserve"> acudieron a una autoridad indígena espiritual.</w:t>
+        <w:t>Acudió a una autoridad indígena espiritual (entero): Cantidad de censados que tuvieron alguna enfermedad los últimos 30 días y acudieron a una autoridad indígena espiritual.</w:t>
       </w:r>
     </w:p>
     <w:p>
@@ -6093,21 +5912,7 @@
           <w:lang w:val="es-CO"/>
         </w:rPr>
         <w:lastRenderedPageBreak/>
-        <w:t xml:space="preserve">Otro médico de un grupo étnico (entero): </w:t>
-      </w:r>
-      <w:r>
-        <w:rPr>
-          <w:rFonts w:ascii="Arial" w:hAnsi="Arial" w:cs="Arial"/>
-          <w:lang w:val="es-CO"/>
-        </w:rPr>
-        <w:t>Cantidad de censados que tuvieron alguna enfermedad los últimos 30 días y</w:t>
-      </w:r>
-      <w:r>
-        <w:rPr>
-          <w:rFonts w:ascii="Arial" w:hAnsi="Arial" w:cs="Arial"/>
-          <w:lang w:val="es-CO"/>
-        </w:rPr>
-        <w:t xml:space="preserve"> acudieron a otro médico de un grupo étnico.</w:t>
+        <w:t>Otro médico de un grupo étnico (entero): Cantidad de censados que tuvieron alguna enfermedad los últimos 30 días y acudieron a otro médico de un grupo étnico.</w:t>
       </w:r>
     </w:p>
     <w:p>
@@ -6127,21 +5932,7 @@
           <w:rFonts w:ascii="Arial" w:hAnsi="Arial" w:cs="Arial"/>
           <w:lang w:val="es-CO"/>
         </w:rPr>
-        <w:t xml:space="preserve">Usó remedios caseros (entero): </w:t>
-      </w:r>
-      <w:r>
-        <w:rPr>
-          <w:rFonts w:ascii="Arial" w:hAnsi="Arial" w:cs="Arial"/>
-          <w:lang w:val="es-CO"/>
-        </w:rPr>
-        <w:t>Cantidad de censados que tuvieron alguna enfermedad los últimos 30 días y</w:t>
-      </w:r>
-      <w:r>
-        <w:rPr>
-          <w:rFonts w:ascii="Arial" w:hAnsi="Arial" w:cs="Arial"/>
-          <w:lang w:val="es-CO"/>
-        </w:rPr>
-        <w:t xml:space="preserve"> usaron remedios caseros.</w:t>
+        <w:t>Usó remedios caseros (entero): Cantidad de censados que tuvieron alguna enfermedad los últimos 30 días y usaron remedios caseros.</w:t>
       </w:r>
     </w:p>
     <w:p>
@@ -6161,21 +5952,7 @@
           <w:rFonts w:ascii="Arial" w:hAnsi="Arial" w:cs="Arial"/>
           <w:lang w:val="es-CO"/>
         </w:rPr>
-        <w:t xml:space="preserve">Se autorrecetó (entero): </w:t>
-      </w:r>
-      <w:r>
-        <w:rPr>
-          <w:rFonts w:ascii="Arial" w:hAnsi="Arial" w:cs="Arial"/>
-          <w:lang w:val="es-CO"/>
-        </w:rPr>
-        <w:t>Cantidad de censados que tuvieron alguna enfermedad los últimos 30 días y</w:t>
-      </w:r>
-      <w:r>
-        <w:rPr>
-          <w:rFonts w:ascii="Arial" w:hAnsi="Arial" w:cs="Arial"/>
-          <w:lang w:val="es-CO"/>
-        </w:rPr>
-        <w:t xml:space="preserve"> se autorrecetaron.</w:t>
+        <w:t>Se autorrecetó (entero): Cantidad de censados que tuvieron alguna enfermedad los últimos 30 días y se autorrecetaron.</w:t>
       </w:r>
     </w:p>
     <w:p>
@@ -6195,21 +5972,280 @@
           <w:rFonts w:ascii="Arial" w:hAnsi="Arial" w:cs="Arial"/>
           <w:lang w:val="es-CO"/>
         </w:rPr>
-        <w:t xml:space="preserve">No hizo nada (entero): </w:t>
-      </w:r>
-      <w:r>
-        <w:rPr>
-          <w:rFonts w:ascii="Arial" w:hAnsi="Arial" w:cs="Arial"/>
-          <w:lang w:val="es-CO"/>
-        </w:rPr>
-        <w:t>Cantidad de censados que tuvieron alguna enfermedad los últimos 30 días y</w:t>
-      </w:r>
-      <w:r>
-        <w:rPr>
-          <w:rFonts w:ascii="Arial" w:hAnsi="Arial" w:cs="Arial"/>
-          <w:lang w:val="es-CO"/>
-        </w:rPr>
-        <w:t xml:space="preserve"> no hicieron nada al respecto.</w:t>
+        <w:t>No hizo nada (entero): Cantidad de censados que tuvieron alguna enfermedad los últimos 30 días y no hicieron nada al respecto.</w:t>
+      </w:r>
+    </w:p>
+    <w:p>
+      <w:pPr>
+        <w:rPr>
+          <w:rFonts w:ascii="Arial" w:hAnsi="Arial" w:cs="Arial"/>
+          <w:lang w:val="es-CO"/>
+        </w:rPr>
+      </w:pPr>
+    </w:p>
+    <w:p>
+      <w:pPr>
+        <w:rPr>
+          <w:rFonts w:ascii="Arial" w:hAnsi="Arial" w:cs="Arial"/>
+          <w:b/>
+          <w:bCs/>
+          <w:lang w:val="es-CO"/>
+        </w:rPr>
+      </w:pPr>
+      <w:r>
+        <w:rPr>
+          <w:rFonts w:ascii="Arial" w:hAnsi="Arial" w:cs="Arial"/>
+          <w:b/>
+          <w:bCs/>
+          <w:lang w:val="es-CO"/>
+        </w:rPr>
+        <w:t>15PM</w:t>
+      </w:r>
+    </w:p>
+    <w:p>
+      <w:pPr>
+        <w:rPr>
+          <w:rFonts w:ascii="Arial" w:hAnsi="Arial" w:cs="Arial"/>
+          <w:lang w:val="es-CO"/>
+        </w:rPr>
+      </w:pPr>
+      <w:r>
+        <w:rPr>
+          <w:rFonts w:ascii="Arial" w:hAnsi="Arial" w:cs="Arial"/>
+          <w:lang w:val="es-CO"/>
+        </w:rPr>
+        <w:t>Contiene 9 columnas y 3 agrupaciones.</w:t>
+      </w:r>
+    </w:p>
+    <w:p>
+      <w:pPr>
+        <w:rPr>
+          <w:rFonts w:ascii="Arial" w:hAnsi="Arial" w:cs="Arial"/>
+          <w:lang w:val="es-CO"/>
+        </w:rPr>
+      </w:pPr>
+      <w:r>
+        <w:rPr>
+          <w:rFonts w:ascii="Arial" w:hAnsi="Arial" w:cs="Arial"/>
+          <w:lang w:val="es-CO"/>
+        </w:rPr>
+        <w:t>Columnas:</w:t>
+      </w:r>
+    </w:p>
+    <w:p>
+      <w:pPr>
+        <w:pStyle w:val="Prrafodelista"/>
+        <w:numPr>
+          <w:ilvl w:val="0"/>
+          <w:numId w:val="13"/>
+        </w:numPr>
+        <w:rPr>
+          <w:rFonts w:ascii="Arial" w:hAnsi="Arial" w:cs="Arial"/>
+          <w:lang w:val="es-CO"/>
+        </w:rPr>
+      </w:pPr>
+      <w:r>
+        <w:rPr>
+          <w:rFonts w:ascii="Arial" w:hAnsi="Arial" w:cs="Arial"/>
+          <w:lang w:val="es-CO"/>
+        </w:rPr>
+        <w:t>Total personas menores de 5 años (entero): Cantidad de personas censadas menores de 5 años.</w:t>
+      </w:r>
+    </w:p>
+    <w:p>
+      <w:pPr>
+        <w:pStyle w:val="Prrafodelista"/>
+        <w:numPr>
+          <w:ilvl w:val="0"/>
+          <w:numId w:val="13"/>
+        </w:numPr>
+        <w:rPr>
+          <w:rFonts w:ascii="Arial" w:hAnsi="Arial" w:cs="Arial"/>
+          <w:lang w:val="es-CO"/>
+        </w:rPr>
+      </w:pPr>
+      <w:r>
+        <w:rPr>
+          <w:rFonts w:ascii="Arial" w:hAnsi="Arial" w:cs="Arial"/>
+          <w:lang w:val="es-CO"/>
+        </w:rPr>
+        <w:t>Asiste a un hogar comunitario, jardín, centro de desarrollo infantil o colegio (entero): Cantidad de menores de 5 años censados que asisten a un hogar comunitario, jardín, centro de desarrollo infantil, o colegio la mayor parte del tiempo entre semana.</w:t>
+      </w:r>
+    </w:p>
+    <w:p>
+      <w:pPr>
+        <w:pStyle w:val="Prrafodelista"/>
+        <w:numPr>
+          <w:ilvl w:val="0"/>
+          <w:numId w:val="13"/>
+        </w:numPr>
+        <w:rPr>
+          <w:rFonts w:ascii="Arial" w:hAnsi="Arial" w:cs="Arial"/>
+          <w:lang w:val="es-CO"/>
+        </w:rPr>
+      </w:pPr>
+      <w:r>
+        <w:rPr>
+          <w:rFonts w:ascii="Arial" w:hAnsi="Arial" w:cs="Arial"/>
+          <w:lang w:val="es-CO"/>
+        </w:rPr>
+        <w:t>Con su padre o madre en la vivienda (entero): Cantidad de menores de 5 años censados que permanecen con su padre o madre en la vivienda la mayor parte del tiempo entre semana.</w:t>
+      </w:r>
+    </w:p>
+    <w:p>
+      <w:pPr>
+        <w:pStyle w:val="Prrafodelista"/>
+        <w:numPr>
+          <w:ilvl w:val="0"/>
+          <w:numId w:val="13"/>
+        </w:numPr>
+        <w:rPr>
+          <w:rFonts w:ascii="Arial" w:hAnsi="Arial" w:cs="Arial"/>
+          <w:lang w:val="es-CO"/>
+        </w:rPr>
+      </w:pPr>
+      <w:r>
+        <w:rPr>
+          <w:rFonts w:ascii="Arial" w:hAnsi="Arial" w:cs="Arial"/>
+          <w:lang w:val="es-CO"/>
+        </w:rPr>
+        <w:t>Con su padre o madre en el trabajo (entero): Cantidad de menores de 5 años censados que permanecen con su padre o madre en el trabajo la mayor parte del tiempo entre semana.</w:t>
+      </w:r>
+    </w:p>
+    <w:p>
+      <w:pPr>
+        <w:pStyle w:val="Prrafodelista"/>
+        <w:numPr>
+          <w:ilvl w:val="0"/>
+          <w:numId w:val="13"/>
+        </w:numPr>
+        <w:rPr>
+          <w:rFonts w:ascii="Arial" w:hAnsi="Arial" w:cs="Arial"/>
+          <w:lang w:val="es-CO"/>
+        </w:rPr>
+      </w:pPr>
+      <w:r>
+        <w:rPr>
+          <w:rFonts w:ascii="Arial" w:hAnsi="Arial" w:cs="Arial"/>
+          <w:lang w:val="es-CO"/>
+        </w:rPr>
+        <w:t>En la vivienda donde vive el niño al cuidado de un pariente o una persona de 18 años o más (entero): Cantidad de menores de 5 años censados que permanecen en la vivienda donde viven al cuidado de un pariente o una persona mayor de edad</w:t>
+      </w:r>
+      <w:r>
+        <w:rPr>
+          <w:rFonts w:ascii="Arial" w:hAnsi="Arial" w:cs="Arial"/>
+          <w:lang w:val="es-CO"/>
+        </w:rPr>
+        <w:t xml:space="preserve"> la mayor parte del tiempo entre semana</w:t>
+      </w:r>
+      <w:r>
+        <w:rPr>
+          <w:rFonts w:ascii="Arial" w:hAnsi="Arial" w:cs="Arial"/>
+          <w:lang w:val="es-CO"/>
+        </w:rPr>
+        <w:t>.</w:t>
+      </w:r>
+    </w:p>
+    <w:p>
+      <w:pPr>
+        <w:pStyle w:val="Prrafodelista"/>
+        <w:numPr>
+          <w:ilvl w:val="0"/>
+          <w:numId w:val="13"/>
+        </w:numPr>
+        <w:rPr>
+          <w:rFonts w:ascii="Arial" w:hAnsi="Arial" w:cs="Arial"/>
+          <w:lang w:val="es-CO"/>
+        </w:rPr>
+      </w:pPr>
+      <w:r>
+        <w:rPr>
+          <w:rFonts w:ascii="Arial" w:hAnsi="Arial" w:cs="Arial"/>
+          <w:lang w:val="es-CO"/>
+        </w:rPr>
+        <w:t>En l</w:t>
+      </w:r>
+      <w:r>
+        <w:rPr>
+          <w:rFonts w:ascii="Arial" w:hAnsi="Arial" w:cs="Arial"/>
+          <w:lang w:val="es-CO"/>
+        </w:rPr>
+        <w:t>a</w:t>
+      </w:r>
+      <w:r>
+        <w:rPr>
+          <w:rFonts w:ascii="Arial" w:hAnsi="Arial" w:cs="Arial"/>
+          <w:lang w:val="es-CO"/>
+        </w:rPr>
+        <w:t xml:space="preserve"> vivienda donde vive el niño</w:t>
+      </w:r>
+      <w:r>
+        <w:rPr>
+          <w:rFonts w:ascii="Arial" w:hAnsi="Arial" w:cs="Arial"/>
+          <w:lang w:val="es-CO"/>
+        </w:rPr>
+        <w:t xml:space="preserve"> al cuidado de un pariente o una persona menor de 18 años (entero): Cantidad de menores de 5 años censados que permanecen en la vivienda donde viven al cuidado de un pariente o persona menor de 18 años la mayor parte del tiempo entre semana.</w:t>
+      </w:r>
+    </w:p>
+    <w:p>
+      <w:pPr>
+        <w:pStyle w:val="Prrafodelista"/>
+        <w:numPr>
+          <w:ilvl w:val="0"/>
+          <w:numId w:val="13"/>
+        </w:numPr>
+        <w:rPr>
+          <w:rFonts w:ascii="Arial" w:hAnsi="Arial" w:cs="Arial"/>
+          <w:lang w:val="es-CO"/>
+        </w:rPr>
+      </w:pPr>
+      <w:r>
+        <w:rPr>
+          <w:rFonts w:ascii="Arial" w:hAnsi="Arial" w:cs="Arial"/>
+          <w:lang w:val="es-CO"/>
+        </w:rPr>
+        <w:t>Al cuidado de un pariente o de otra persona en otro lugar (entero): Cantidad de menores de 5 años censados que permanecen al cuidado de un pariente u otra persona en un lugar diferente a los mencionados la mayor parte del tiempo entre semana.</w:t>
+      </w:r>
+    </w:p>
+    <w:p>
+      <w:pPr>
+        <w:pStyle w:val="Prrafodelista"/>
+        <w:numPr>
+          <w:ilvl w:val="0"/>
+          <w:numId w:val="13"/>
+        </w:numPr>
+        <w:rPr>
+          <w:rFonts w:ascii="Arial" w:hAnsi="Arial" w:cs="Arial"/>
+          <w:lang w:val="es-CO"/>
+        </w:rPr>
+      </w:pPr>
+      <w:r>
+        <w:rPr>
+          <w:rFonts w:ascii="Arial" w:hAnsi="Arial" w:cs="Arial"/>
+          <w:lang w:val="es-CO"/>
+        </w:rPr>
+        <w:lastRenderedPageBreak/>
+        <w:t>En la vivienda, solo (entero): Cantidad de menores de 5 años que permanecen en la vivienda solos la mayor parte del tiempo entre semana.</w:t>
+      </w:r>
+    </w:p>
+    <w:p>
+      <w:pPr>
+        <w:pStyle w:val="Prrafodelista"/>
+        <w:numPr>
+          <w:ilvl w:val="0"/>
+          <w:numId w:val="13"/>
+        </w:numPr>
+        <w:rPr>
+          <w:rFonts w:ascii="Arial" w:hAnsi="Arial" w:cs="Arial"/>
+          <w:lang w:val="es-CO"/>
+        </w:rPr>
+      </w:pPr>
+      <w:r>
+        <w:rPr>
+          <w:rFonts w:ascii="Arial" w:hAnsi="Arial" w:cs="Arial"/>
+          <w:lang w:val="es-CO"/>
+        </w:rPr>
+        <w:t>Sin información (entero): Cantidad de menores de 5 años censados de los cuales no se tiene información sobre donde permanecen la mayor parte del tiempo entre semana.</w:t>
       </w:r>
     </w:p>
     <w:sectPr>
@@ -6564,6 +6600,119 @@
     </w:lvl>
   </w:abstractNum>
   <w:abstractNum w:abstractNumId="3" w15:restartNumberingAfterBreak="0">
+    <w:nsid w:val="4DD52E8B"/>
+    <w:multiLevelType w:val="hybridMultilevel"/>
+    <w:tmpl w:val="B000A1DE"/>
+    <w:lvl w:ilvl="0" w:tplc="04090001">
+      <w:start w:val="1"/>
+      <w:numFmt w:val="bullet"/>
+      <w:lvlText w:val=""/>
+      <w:lvlJc w:val="left"/>
+      <w:pPr>
+        <w:ind w:left="720" w:hanging="360"/>
+      </w:pPr>
+      <w:rPr>
+        <w:rFonts w:ascii="Symbol" w:hAnsi="Symbol" w:hint="default"/>
+      </w:rPr>
+    </w:lvl>
+    <w:lvl w:ilvl="1" w:tplc="04090003" w:tentative="1">
+      <w:start w:val="1"/>
+      <w:numFmt w:val="bullet"/>
+      <w:lvlText w:val="o"/>
+      <w:lvlJc w:val="left"/>
+      <w:pPr>
+        <w:ind w:left="1440" w:hanging="360"/>
+      </w:pPr>
+      <w:rPr>
+        <w:rFonts w:ascii="Courier New" w:hAnsi="Courier New" w:cs="Courier New" w:hint="default"/>
+      </w:rPr>
+    </w:lvl>
+    <w:lvl w:ilvl="2" w:tplc="04090005" w:tentative="1">
+      <w:start w:val="1"/>
+      <w:numFmt w:val="bullet"/>
+      <w:lvlText w:val=""/>
+      <w:lvlJc w:val="left"/>
+      <w:pPr>
+        <w:ind w:left="2160" w:hanging="360"/>
+      </w:pPr>
+      <w:rPr>
+        <w:rFonts w:ascii="Wingdings" w:hAnsi="Wingdings" w:hint="default"/>
+      </w:rPr>
+    </w:lvl>
+    <w:lvl w:ilvl="3" w:tplc="04090001" w:tentative="1">
+      <w:start w:val="1"/>
+      <w:numFmt w:val="bullet"/>
+      <w:lvlText w:val=""/>
+      <w:lvlJc w:val="left"/>
+      <w:pPr>
+        <w:ind w:left="2880" w:hanging="360"/>
+      </w:pPr>
+      <w:rPr>
+        <w:rFonts w:ascii="Symbol" w:hAnsi="Symbol" w:hint="default"/>
+      </w:rPr>
+    </w:lvl>
+    <w:lvl w:ilvl="4" w:tplc="04090003" w:tentative="1">
+      <w:start w:val="1"/>
+      <w:numFmt w:val="bullet"/>
+      <w:lvlText w:val="o"/>
+      <w:lvlJc w:val="left"/>
+      <w:pPr>
+        <w:ind w:left="3600" w:hanging="360"/>
+      </w:pPr>
+      <w:rPr>
+        <w:rFonts w:ascii="Courier New" w:hAnsi="Courier New" w:cs="Courier New" w:hint="default"/>
+      </w:rPr>
+    </w:lvl>
+    <w:lvl w:ilvl="5" w:tplc="04090005" w:tentative="1">
+      <w:start w:val="1"/>
+      <w:numFmt w:val="bullet"/>
+      <w:lvlText w:val=""/>
+      <w:lvlJc w:val="left"/>
+      <w:pPr>
+        <w:ind w:left="4320" w:hanging="360"/>
+      </w:pPr>
+      <w:rPr>
+        <w:rFonts w:ascii="Wingdings" w:hAnsi="Wingdings" w:hint="default"/>
+      </w:rPr>
+    </w:lvl>
+    <w:lvl w:ilvl="6" w:tplc="04090001" w:tentative="1">
+      <w:start w:val="1"/>
+      <w:numFmt w:val="bullet"/>
+      <w:lvlText w:val=""/>
+      <w:lvlJc w:val="left"/>
+      <w:pPr>
+        <w:ind w:left="5040" w:hanging="360"/>
+      </w:pPr>
+      <w:rPr>
+        <w:rFonts w:ascii="Symbol" w:hAnsi="Symbol" w:hint="default"/>
+      </w:rPr>
+    </w:lvl>
+    <w:lvl w:ilvl="7" w:tplc="04090003" w:tentative="1">
+      <w:start w:val="1"/>
+      <w:numFmt w:val="bullet"/>
+      <w:lvlText w:val="o"/>
+      <w:lvlJc w:val="left"/>
+      <w:pPr>
+        <w:ind w:left="5760" w:hanging="360"/>
+      </w:pPr>
+      <w:rPr>
+        <w:rFonts w:ascii="Courier New" w:hAnsi="Courier New" w:cs="Courier New" w:hint="default"/>
+      </w:rPr>
+    </w:lvl>
+    <w:lvl w:ilvl="8" w:tplc="04090005" w:tentative="1">
+      <w:start w:val="1"/>
+      <w:numFmt w:val="bullet"/>
+      <w:lvlText w:val=""/>
+      <w:lvlJc w:val="left"/>
+      <w:pPr>
+        <w:ind w:left="6480" w:hanging="360"/>
+      </w:pPr>
+      <w:rPr>
+        <w:rFonts w:ascii="Wingdings" w:hAnsi="Wingdings" w:hint="default"/>
+      </w:rPr>
+    </w:lvl>
+  </w:abstractNum>
+  <w:abstractNum w:abstractNumId="4" w15:restartNumberingAfterBreak="0">
     <w:nsid w:val="521C4194"/>
     <w:multiLevelType w:val="hybridMultilevel"/>
     <w:tmpl w:val="0542FC48"/>
@@ -6676,7 +6825,7 @@
       </w:rPr>
     </w:lvl>
   </w:abstractNum>
-  <w:abstractNum w:abstractNumId="4" w15:restartNumberingAfterBreak="0">
+  <w:abstractNum w:abstractNumId="5" w15:restartNumberingAfterBreak="0">
     <w:nsid w:val="52D63117"/>
     <w:multiLevelType w:val="hybridMultilevel"/>
     <w:tmpl w:val="036E0984"/>
@@ -6789,7 +6938,7 @@
       </w:rPr>
     </w:lvl>
   </w:abstractNum>
-  <w:abstractNum w:abstractNumId="5" w15:restartNumberingAfterBreak="0">
+  <w:abstractNum w:abstractNumId="6" w15:restartNumberingAfterBreak="0">
     <w:nsid w:val="55821CAC"/>
     <w:multiLevelType w:val="hybridMultilevel"/>
     <w:tmpl w:val="61F8020E"/>
@@ -6902,7 +7051,7 @@
       </w:rPr>
     </w:lvl>
   </w:abstractNum>
-  <w:abstractNum w:abstractNumId="6" w15:restartNumberingAfterBreak="0">
+  <w:abstractNum w:abstractNumId="7" w15:restartNumberingAfterBreak="0">
     <w:nsid w:val="608B0027"/>
     <w:multiLevelType w:val="hybridMultilevel"/>
     <w:tmpl w:val="1A2A0CCE"/>
@@ -7015,7 +7164,7 @@
       </w:rPr>
     </w:lvl>
   </w:abstractNum>
-  <w:abstractNum w:abstractNumId="7" w15:restartNumberingAfterBreak="0">
+  <w:abstractNum w:abstractNumId="8" w15:restartNumberingAfterBreak="0">
     <w:nsid w:val="6B39307D"/>
     <w:multiLevelType w:val="hybridMultilevel"/>
     <w:tmpl w:val="BE94EE76"/>
@@ -7128,7 +7277,7 @@
       </w:rPr>
     </w:lvl>
   </w:abstractNum>
-  <w:abstractNum w:abstractNumId="8" w15:restartNumberingAfterBreak="0">
+  <w:abstractNum w:abstractNumId="9" w15:restartNumberingAfterBreak="0">
     <w:nsid w:val="6EF91E29"/>
     <w:multiLevelType w:val="hybridMultilevel"/>
     <w:tmpl w:val="90A0CFD2"/>
@@ -7241,7 +7390,7 @@
       </w:rPr>
     </w:lvl>
   </w:abstractNum>
-  <w:abstractNum w:abstractNumId="9" w15:restartNumberingAfterBreak="0">
+  <w:abstractNum w:abstractNumId="10" w15:restartNumberingAfterBreak="0">
     <w:nsid w:val="736117B3"/>
     <w:multiLevelType w:val="hybridMultilevel"/>
     <w:tmpl w:val="B902F320"/>
@@ -7354,7 +7503,7 @@
       </w:rPr>
     </w:lvl>
   </w:abstractNum>
-  <w:abstractNum w:abstractNumId="10" w15:restartNumberingAfterBreak="0">
+  <w:abstractNum w:abstractNumId="11" w15:restartNumberingAfterBreak="0">
     <w:nsid w:val="73AA7E9E"/>
     <w:multiLevelType w:val="hybridMultilevel"/>
     <w:tmpl w:val="8EAE28E8"/>
@@ -7467,38 +7616,157 @@
       </w:rPr>
     </w:lvl>
   </w:abstractNum>
+  <w:abstractNum w:abstractNumId="12" w15:restartNumberingAfterBreak="0">
+    <w:nsid w:val="79993F7C"/>
+    <w:multiLevelType w:val="hybridMultilevel"/>
+    <w:tmpl w:val="8F9A8314"/>
+    <w:lvl w:ilvl="0" w:tplc="04090001">
+      <w:start w:val="1"/>
+      <w:numFmt w:val="bullet"/>
+      <w:lvlText w:val=""/>
+      <w:lvlJc w:val="left"/>
+      <w:pPr>
+        <w:ind w:left="720" w:hanging="360"/>
+      </w:pPr>
+      <w:rPr>
+        <w:rFonts w:ascii="Symbol" w:hAnsi="Symbol" w:hint="default"/>
+      </w:rPr>
+    </w:lvl>
+    <w:lvl w:ilvl="1" w:tplc="04090003" w:tentative="1">
+      <w:start w:val="1"/>
+      <w:numFmt w:val="bullet"/>
+      <w:lvlText w:val="o"/>
+      <w:lvlJc w:val="left"/>
+      <w:pPr>
+        <w:ind w:left="1440" w:hanging="360"/>
+      </w:pPr>
+      <w:rPr>
+        <w:rFonts w:ascii="Courier New" w:hAnsi="Courier New" w:cs="Courier New" w:hint="default"/>
+      </w:rPr>
+    </w:lvl>
+    <w:lvl w:ilvl="2" w:tplc="04090005" w:tentative="1">
+      <w:start w:val="1"/>
+      <w:numFmt w:val="bullet"/>
+      <w:lvlText w:val=""/>
+      <w:lvlJc w:val="left"/>
+      <w:pPr>
+        <w:ind w:left="2160" w:hanging="360"/>
+      </w:pPr>
+      <w:rPr>
+        <w:rFonts w:ascii="Wingdings" w:hAnsi="Wingdings" w:hint="default"/>
+      </w:rPr>
+    </w:lvl>
+    <w:lvl w:ilvl="3" w:tplc="04090001" w:tentative="1">
+      <w:start w:val="1"/>
+      <w:numFmt w:val="bullet"/>
+      <w:lvlText w:val=""/>
+      <w:lvlJc w:val="left"/>
+      <w:pPr>
+        <w:ind w:left="2880" w:hanging="360"/>
+      </w:pPr>
+      <w:rPr>
+        <w:rFonts w:ascii="Symbol" w:hAnsi="Symbol" w:hint="default"/>
+      </w:rPr>
+    </w:lvl>
+    <w:lvl w:ilvl="4" w:tplc="04090003" w:tentative="1">
+      <w:start w:val="1"/>
+      <w:numFmt w:val="bullet"/>
+      <w:lvlText w:val="o"/>
+      <w:lvlJc w:val="left"/>
+      <w:pPr>
+        <w:ind w:left="3600" w:hanging="360"/>
+      </w:pPr>
+      <w:rPr>
+        <w:rFonts w:ascii="Courier New" w:hAnsi="Courier New" w:cs="Courier New" w:hint="default"/>
+      </w:rPr>
+    </w:lvl>
+    <w:lvl w:ilvl="5" w:tplc="04090005" w:tentative="1">
+      <w:start w:val="1"/>
+      <w:numFmt w:val="bullet"/>
+      <w:lvlText w:val=""/>
+      <w:lvlJc w:val="left"/>
+      <w:pPr>
+        <w:ind w:left="4320" w:hanging="360"/>
+      </w:pPr>
+      <w:rPr>
+        <w:rFonts w:ascii="Wingdings" w:hAnsi="Wingdings" w:hint="default"/>
+      </w:rPr>
+    </w:lvl>
+    <w:lvl w:ilvl="6" w:tplc="04090001" w:tentative="1">
+      <w:start w:val="1"/>
+      <w:numFmt w:val="bullet"/>
+      <w:lvlText w:val=""/>
+      <w:lvlJc w:val="left"/>
+      <w:pPr>
+        <w:ind w:left="5040" w:hanging="360"/>
+      </w:pPr>
+      <w:rPr>
+        <w:rFonts w:ascii="Symbol" w:hAnsi="Symbol" w:hint="default"/>
+      </w:rPr>
+    </w:lvl>
+    <w:lvl w:ilvl="7" w:tplc="04090003" w:tentative="1">
+      <w:start w:val="1"/>
+      <w:numFmt w:val="bullet"/>
+      <w:lvlText w:val="o"/>
+      <w:lvlJc w:val="left"/>
+      <w:pPr>
+        <w:ind w:left="5760" w:hanging="360"/>
+      </w:pPr>
+      <w:rPr>
+        <w:rFonts w:ascii="Courier New" w:hAnsi="Courier New" w:cs="Courier New" w:hint="default"/>
+      </w:rPr>
+    </w:lvl>
+    <w:lvl w:ilvl="8" w:tplc="04090005" w:tentative="1">
+      <w:start w:val="1"/>
+      <w:numFmt w:val="bullet"/>
+      <w:lvlText w:val=""/>
+      <w:lvlJc w:val="left"/>
+      <w:pPr>
+        <w:ind w:left="6480" w:hanging="360"/>
+      </w:pPr>
+      <w:rPr>
+        <w:rFonts w:ascii="Wingdings" w:hAnsi="Wingdings" w:hint="default"/>
+      </w:rPr>
+    </w:lvl>
+  </w:abstractNum>
   <w:num w:numId="1" w16cid:durableId="824902107">
-    <w:abstractNumId w:val="6"/>
+    <w:abstractNumId w:val="7"/>
   </w:num>
   <w:num w:numId="2" w16cid:durableId="617299781">
-    <w:abstractNumId w:val="8"/>
+    <w:abstractNumId w:val="9"/>
   </w:num>
   <w:num w:numId="3" w16cid:durableId="1048263498">
-    <w:abstractNumId w:val="4"/>
+    <w:abstractNumId w:val="5"/>
   </w:num>
   <w:num w:numId="4" w16cid:durableId="237983024">
-    <w:abstractNumId w:val="3"/>
+    <w:abstractNumId w:val="4"/>
   </w:num>
   <w:num w:numId="5" w16cid:durableId="325859572">
     <w:abstractNumId w:val="1"/>
   </w:num>
   <w:num w:numId="6" w16cid:durableId="398870548">
-    <w:abstractNumId w:val="7"/>
+    <w:abstractNumId w:val="8"/>
   </w:num>
   <w:num w:numId="7" w16cid:durableId="1317153043">
-    <w:abstractNumId w:val="9"/>
+    <w:abstractNumId w:val="10"/>
   </w:num>
   <w:num w:numId="8" w16cid:durableId="430202784">
     <w:abstractNumId w:val="2"/>
   </w:num>
   <w:num w:numId="9" w16cid:durableId="1169177289">
-    <w:abstractNumId w:val="10"/>
+    <w:abstractNumId w:val="11"/>
   </w:num>
   <w:num w:numId="10" w16cid:durableId="965619825">
     <w:abstractNumId w:val="0"/>
   </w:num>
   <w:num w:numId="11" w16cid:durableId="1154027656">
-    <w:abstractNumId w:val="5"/>
+    <w:abstractNumId w:val="6"/>
+  </w:num>
+  <w:num w:numId="12" w16cid:durableId="867530551">
+    <w:abstractNumId w:val="3"/>
+  </w:num>
+  <w:num w:numId="13" w16cid:durableId="464351712">
+    <w:abstractNumId w:val="12"/>
   </w:num>
 </w:numbering>
 </file>

</xml_diff>

<commit_message>
Actualiza fuentes de datos con hoja 16PM
</commit_message>
<xml_diff>
--- a/Documentacion/Fuentes de Datos.docx
+++ b/Documentacion/Fuentes de Datos.docx
@@ -100,7 +100,7 @@
           <w:rFonts w:ascii="Arial" w:hAnsi="Arial" w:cs="Arial"/>
           <w:lang w:val="es-CO"/>
         </w:rPr>
-        <w:t>7</w:t>
+        <w:t>8</w:t>
       </w:r>
       <w:r>
         <w:rPr>
@@ -4266,6 +4266,11 @@
     </w:p>
     <w:p>
       <w:pPr>
+        <w:pStyle w:val="Prrafodelista"/>
+        <w:numPr>
+          <w:ilvl w:val="0"/>
+          <w:numId w:val="6"/>
+        </w:numPr>
         <w:rPr>
           <w:rFonts w:ascii="Arial" w:hAnsi="Arial" w:cs="Arial"/>
           <w:lang w:val="es-CO"/>
@@ -6247,6 +6252,306 @@
         </w:rPr>
         <w:t>Sin información (entero): Cantidad de menores de 5 años censados de los cuales no se tiene información sobre donde permanecen la mayor parte del tiempo entre semana.</w:t>
       </w:r>
+    </w:p>
+    <w:p>
+      <w:pPr>
+        <w:rPr>
+          <w:rFonts w:ascii="Arial" w:hAnsi="Arial" w:cs="Arial"/>
+          <w:lang w:val="es-CO"/>
+        </w:rPr>
+      </w:pPr>
+    </w:p>
+    <w:p>
+      <w:pPr>
+        <w:rPr>
+          <w:rFonts w:ascii="Arial" w:hAnsi="Arial" w:cs="Arial"/>
+          <w:b/>
+          <w:bCs/>
+          <w:lang w:val="es-CO"/>
+        </w:rPr>
+      </w:pPr>
+      <w:r>
+        <w:rPr>
+          <w:rFonts w:ascii="Arial" w:hAnsi="Arial" w:cs="Arial"/>
+          <w:b/>
+          <w:bCs/>
+          <w:lang w:val="es-CO"/>
+        </w:rPr>
+        <w:t>16PM</w:t>
+      </w:r>
+    </w:p>
+    <w:p>
+      <w:pPr>
+        <w:rPr>
+          <w:rFonts w:ascii="Arial" w:hAnsi="Arial" w:cs="Arial"/>
+          <w:lang w:val="es-CO"/>
+        </w:rPr>
+      </w:pPr>
+      <w:r>
+        <w:rPr>
+          <w:rFonts w:ascii="Arial" w:hAnsi="Arial" w:cs="Arial"/>
+          <w:lang w:val="es-CO"/>
+        </w:rPr>
+        <w:t xml:space="preserve">Contiene 3 columnas fuertemente agrupadas por </w:t>
+      </w:r>
+      <w:r>
+        <w:rPr>
+          <w:rFonts w:ascii="Arial" w:hAnsi="Arial" w:cs="Arial"/>
+          <w:i/>
+          <w:iCs/>
+          <w:lang w:val="es-CO"/>
+        </w:rPr>
+        <w:t>Total</w:t>
+      </w:r>
+      <w:r>
+        <w:rPr>
+          <w:rFonts w:ascii="Arial" w:hAnsi="Arial" w:cs="Arial"/>
+          <w:lang w:val="es-CO"/>
+        </w:rPr>
+        <w:t xml:space="preserve"> (resumen total de datos), </w:t>
+      </w:r>
+      <w:r>
+        <w:rPr>
+          <w:rFonts w:ascii="Arial" w:hAnsi="Arial" w:cs="Arial"/>
+          <w:i/>
+          <w:iCs/>
+          <w:lang w:val="es-CO"/>
+        </w:rPr>
+        <w:t>Si</w:t>
+      </w:r>
+      <w:r>
+        <w:rPr>
+          <w:rFonts w:ascii="Arial" w:hAnsi="Arial" w:cs="Arial"/>
+          <w:lang w:val="es-CO"/>
+        </w:rPr>
+        <w:t xml:space="preserve"> (grupo con datos correspondientes a los censados que saben leer y escribir), </w:t>
+      </w:r>
+      <w:r>
+        <w:rPr>
+          <w:rFonts w:ascii="Arial" w:hAnsi="Arial" w:cs="Arial"/>
+          <w:i/>
+          <w:iCs/>
+          <w:lang w:val="es-CO"/>
+        </w:rPr>
+        <w:t xml:space="preserve">No </w:t>
+      </w:r>
+      <w:r>
+        <w:rPr>
+          <w:rFonts w:ascii="Arial" w:hAnsi="Arial" w:cs="Arial"/>
+          <w:lang w:val="es-CO"/>
+        </w:rPr>
+        <w:t xml:space="preserve">(grupo con datos correspondientes a los censados que no saben leer y escribir), </w:t>
+      </w:r>
+      <w:r>
+        <w:rPr>
+          <w:rFonts w:ascii="Arial" w:hAnsi="Arial" w:cs="Arial"/>
+          <w:i/>
+          <w:iCs/>
+          <w:lang w:val="es-CO"/>
+        </w:rPr>
+        <w:t xml:space="preserve">Sin información </w:t>
+      </w:r>
+      <w:r>
+        <w:rPr>
+          <w:rFonts w:ascii="Arial" w:hAnsi="Arial" w:cs="Arial"/>
+          <w:lang w:val="es-CO"/>
+        </w:rPr>
+        <w:t>(grupo con datos correspondientes a los censados de los cuales no se conoce si saben leer y escribir)</w:t>
+      </w:r>
+    </w:p>
+    <w:p>
+      <w:pPr>
+        <w:rPr>
+          <w:rFonts w:ascii="Arial" w:hAnsi="Arial" w:cs="Arial"/>
+          <w:lang w:val="es-CO"/>
+        </w:rPr>
+      </w:pPr>
+      <w:r>
+        <w:rPr>
+          <w:rFonts w:ascii="Arial" w:hAnsi="Arial" w:cs="Arial"/>
+          <w:lang w:val="es-CO"/>
+        </w:rPr>
+        <w:t>Contiene 4 agrupaciones.</w:t>
+      </w:r>
+    </w:p>
+    <w:p>
+      <w:pPr>
+        <w:rPr>
+          <w:rFonts w:ascii="Arial" w:hAnsi="Arial" w:cs="Arial"/>
+          <w:lang w:val="es-CO"/>
+        </w:rPr>
+      </w:pPr>
+      <w:r>
+        <w:rPr>
+          <w:rFonts w:ascii="Arial" w:hAnsi="Arial" w:cs="Arial"/>
+          <w:lang w:val="es-CO"/>
+        </w:rPr>
+        <w:t>Columnas:</w:t>
+      </w:r>
+    </w:p>
+    <w:p>
+      <w:pPr>
+        <w:pStyle w:val="Prrafodelista"/>
+        <w:numPr>
+          <w:ilvl w:val="0"/>
+          <w:numId w:val="14"/>
+        </w:numPr>
+        <w:rPr>
+          <w:rFonts w:ascii="Arial" w:hAnsi="Arial" w:cs="Arial"/>
+          <w:lang w:val="es-CO"/>
+        </w:rPr>
+      </w:pPr>
+      <w:r>
+        <w:rPr>
+          <w:rFonts w:ascii="Arial" w:hAnsi="Arial" w:cs="Arial"/>
+          <w:lang w:val="es-CO"/>
+        </w:rPr>
+        <w:t>Total (entero): Cantidad total.</w:t>
+      </w:r>
+    </w:p>
+    <w:p>
+      <w:pPr>
+        <w:pStyle w:val="Prrafodelista"/>
+        <w:numPr>
+          <w:ilvl w:val="0"/>
+          <w:numId w:val="14"/>
+        </w:numPr>
+        <w:rPr>
+          <w:rFonts w:ascii="Arial" w:hAnsi="Arial" w:cs="Arial"/>
+          <w:lang w:val="es-CO"/>
+        </w:rPr>
+      </w:pPr>
+      <w:r>
+        <w:rPr>
+          <w:rFonts w:ascii="Arial" w:hAnsi="Arial" w:cs="Arial"/>
+          <w:lang w:val="es-CO"/>
+        </w:rPr>
+        <w:t>Hombre (entero): Cantidad de hombres.</w:t>
+      </w:r>
+    </w:p>
+    <w:p>
+      <w:pPr>
+        <w:pStyle w:val="Prrafodelista"/>
+        <w:numPr>
+          <w:ilvl w:val="0"/>
+          <w:numId w:val="14"/>
+        </w:numPr>
+        <w:rPr>
+          <w:rFonts w:ascii="Arial" w:hAnsi="Arial" w:cs="Arial"/>
+          <w:lang w:val="es-CO"/>
+        </w:rPr>
+      </w:pPr>
+      <w:r>
+        <w:rPr>
+          <w:rFonts w:ascii="Arial" w:hAnsi="Arial" w:cs="Arial"/>
+          <w:lang w:val="es-CO"/>
+        </w:rPr>
+        <w:t>Mujer (entero): Cantidad de mujeres.</w:t>
+      </w:r>
+    </w:p>
+    <w:p>
+      <w:pPr>
+        <w:rPr>
+          <w:rFonts w:ascii="Arial" w:hAnsi="Arial" w:cs="Arial"/>
+          <w:lang w:val="es-CO"/>
+        </w:rPr>
+      </w:pPr>
+      <w:r>
+        <w:rPr>
+          <w:rFonts w:ascii="Arial" w:hAnsi="Arial" w:cs="Arial"/>
+          <w:lang w:val="es-CO"/>
+        </w:rPr>
+        <w:t>Agrupaciones:</w:t>
+      </w:r>
+    </w:p>
+    <w:p>
+      <w:pPr>
+        <w:pStyle w:val="Prrafodelista"/>
+        <w:numPr>
+          <w:ilvl w:val="0"/>
+          <w:numId w:val="3"/>
+        </w:numPr>
+        <w:rPr>
+          <w:rFonts w:ascii="Arial" w:hAnsi="Arial" w:cs="Arial"/>
+          <w:lang w:val="es-CO"/>
+        </w:rPr>
+      </w:pPr>
+      <w:r>
+        <w:rPr>
+          <w:rFonts w:ascii="Arial" w:hAnsi="Arial" w:cs="Arial"/>
+          <w:lang w:val="es-CO"/>
+        </w:rPr>
+        <w:t>Total: Grupo con resumen de datos totales.</w:t>
+      </w:r>
+    </w:p>
+    <w:p>
+      <w:pPr>
+        <w:pStyle w:val="Prrafodelista"/>
+        <w:numPr>
+          <w:ilvl w:val="0"/>
+          <w:numId w:val="3"/>
+        </w:numPr>
+        <w:rPr>
+          <w:rFonts w:ascii="Arial" w:hAnsi="Arial" w:cs="Arial"/>
+          <w:lang w:val="es-CO"/>
+        </w:rPr>
+      </w:pPr>
+      <w:r>
+        <w:rPr>
+          <w:rFonts w:ascii="Arial" w:hAnsi="Arial" w:cs="Arial"/>
+          <w:lang w:val="es-CO"/>
+        </w:rPr>
+        <w:t>Cabecera: Grupo con resumen de datos correspondientes a las cabeceras municipales</w:t>
+      </w:r>
+    </w:p>
+    <w:p>
+      <w:pPr>
+        <w:pStyle w:val="Prrafodelista"/>
+        <w:numPr>
+          <w:ilvl w:val="0"/>
+          <w:numId w:val="3"/>
+        </w:numPr>
+        <w:rPr>
+          <w:rFonts w:ascii="Arial" w:hAnsi="Arial" w:cs="Arial"/>
+          <w:lang w:val="es-CO"/>
+        </w:rPr>
+      </w:pPr>
+      <w:r>
+        <w:rPr>
+          <w:rFonts w:ascii="Arial" w:hAnsi="Arial" w:cs="Arial"/>
+          <w:lang w:val="es-CO"/>
+        </w:rPr>
+        <w:t>Centro Poblado: Grupo con resumen de datos correspondientes a centros poblados.</w:t>
+      </w:r>
+    </w:p>
+    <w:p>
+      <w:pPr>
+        <w:pStyle w:val="Prrafodelista"/>
+        <w:numPr>
+          <w:ilvl w:val="0"/>
+          <w:numId w:val="3"/>
+        </w:numPr>
+        <w:rPr>
+          <w:rFonts w:ascii="Arial" w:hAnsi="Arial" w:cs="Arial"/>
+          <w:lang w:val="es-CO"/>
+        </w:rPr>
+      </w:pPr>
+      <w:r>
+        <w:rPr>
+          <w:rFonts w:ascii="Arial" w:hAnsi="Arial" w:cs="Arial"/>
+          <w:lang w:val="es-CO"/>
+        </w:rPr>
+        <w:t>Rural disperso: Grupo con resumen de datos correspondientes a ciudadanos que habitan en las zonas rurales, pero no en centros poblados.</w:t>
+      </w:r>
+    </w:p>
+    <w:p>
+      <w:pPr>
+        <w:pStyle w:val="Prrafodelista"/>
+        <w:rPr>
+          <w:rFonts w:ascii="Arial" w:hAnsi="Arial" w:cs="Arial"/>
+          <w:lang w:val="es-CO"/>
+        </w:rPr>
+      </w:pPr>
     </w:p>
     <w:sectPr>
       <w:pgSz w:w="12240" w:h="15840"/>
@@ -6487,6 +6792,232 @@
     </w:lvl>
   </w:abstractNum>
   <w:abstractNum w:abstractNumId="2" w15:restartNumberingAfterBreak="0">
+    <w:nsid w:val="251E3883"/>
+    <w:multiLevelType w:val="hybridMultilevel"/>
+    <w:tmpl w:val="79007C6E"/>
+    <w:lvl w:ilvl="0" w:tplc="04090001">
+      <w:start w:val="1"/>
+      <w:numFmt w:val="bullet"/>
+      <w:lvlText w:val=""/>
+      <w:lvlJc w:val="left"/>
+      <w:pPr>
+        <w:ind w:left="720" w:hanging="360"/>
+      </w:pPr>
+      <w:rPr>
+        <w:rFonts w:ascii="Symbol" w:hAnsi="Symbol" w:hint="default"/>
+      </w:rPr>
+    </w:lvl>
+    <w:lvl w:ilvl="1" w:tplc="04090003" w:tentative="1">
+      <w:start w:val="1"/>
+      <w:numFmt w:val="bullet"/>
+      <w:lvlText w:val="o"/>
+      <w:lvlJc w:val="left"/>
+      <w:pPr>
+        <w:ind w:left="1440" w:hanging="360"/>
+      </w:pPr>
+      <w:rPr>
+        <w:rFonts w:ascii="Courier New" w:hAnsi="Courier New" w:cs="Courier New" w:hint="default"/>
+      </w:rPr>
+    </w:lvl>
+    <w:lvl w:ilvl="2" w:tplc="04090005" w:tentative="1">
+      <w:start w:val="1"/>
+      <w:numFmt w:val="bullet"/>
+      <w:lvlText w:val=""/>
+      <w:lvlJc w:val="left"/>
+      <w:pPr>
+        <w:ind w:left="2160" w:hanging="360"/>
+      </w:pPr>
+      <w:rPr>
+        <w:rFonts w:ascii="Wingdings" w:hAnsi="Wingdings" w:hint="default"/>
+      </w:rPr>
+    </w:lvl>
+    <w:lvl w:ilvl="3" w:tplc="04090001" w:tentative="1">
+      <w:start w:val="1"/>
+      <w:numFmt w:val="bullet"/>
+      <w:lvlText w:val=""/>
+      <w:lvlJc w:val="left"/>
+      <w:pPr>
+        <w:ind w:left="2880" w:hanging="360"/>
+      </w:pPr>
+      <w:rPr>
+        <w:rFonts w:ascii="Symbol" w:hAnsi="Symbol" w:hint="default"/>
+      </w:rPr>
+    </w:lvl>
+    <w:lvl w:ilvl="4" w:tplc="04090003" w:tentative="1">
+      <w:start w:val="1"/>
+      <w:numFmt w:val="bullet"/>
+      <w:lvlText w:val="o"/>
+      <w:lvlJc w:val="left"/>
+      <w:pPr>
+        <w:ind w:left="3600" w:hanging="360"/>
+      </w:pPr>
+      <w:rPr>
+        <w:rFonts w:ascii="Courier New" w:hAnsi="Courier New" w:cs="Courier New" w:hint="default"/>
+      </w:rPr>
+    </w:lvl>
+    <w:lvl w:ilvl="5" w:tplc="04090005" w:tentative="1">
+      <w:start w:val="1"/>
+      <w:numFmt w:val="bullet"/>
+      <w:lvlText w:val=""/>
+      <w:lvlJc w:val="left"/>
+      <w:pPr>
+        <w:ind w:left="4320" w:hanging="360"/>
+      </w:pPr>
+      <w:rPr>
+        <w:rFonts w:ascii="Wingdings" w:hAnsi="Wingdings" w:hint="default"/>
+      </w:rPr>
+    </w:lvl>
+    <w:lvl w:ilvl="6" w:tplc="04090001" w:tentative="1">
+      <w:start w:val="1"/>
+      <w:numFmt w:val="bullet"/>
+      <w:lvlText w:val=""/>
+      <w:lvlJc w:val="left"/>
+      <w:pPr>
+        <w:ind w:left="5040" w:hanging="360"/>
+      </w:pPr>
+      <w:rPr>
+        <w:rFonts w:ascii="Symbol" w:hAnsi="Symbol" w:hint="default"/>
+      </w:rPr>
+    </w:lvl>
+    <w:lvl w:ilvl="7" w:tplc="04090003" w:tentative="1">
+      <w:start w:val="1"/>
+      <w:numFmt w:val="bullet"/>
+      <w:lvlText w:val="o"/>
+      <w:lvlJc w:val="left"/>
+      <w:pPr>
+        <w:ind w:left="5760" w:hanging="360"/>
+      </w:pPr>
+      <w:rPr>
+        <w:rFonts w:ascii="Courier New" w:hAnsi="Courier New" w:cs="Courier New" w:hint="default"/>
+      </w:rPr>
+    </w:lvl>
+    <w:lvl w:ilvl="8" w:tplc="04090005" w:tentative="1">
+      <w:start w:val="1"/>
+      <w:numFmt w:val="bullet"/>
+      <w:lvlText w:val=""/>
+      <w:lvlJc w:val="left"/>
+      <w:pPr>
+        <w:ind w:left="6480" w:hanging="360"/>
+      </w:pPr>
+      <w:rPr>
+        <w:rFonts w:ascii="Wingdings" w:hAnsi="Wingdings" w:hint="default"/>
+      </w:rPr>
+    </w:lvl>
+  </w:abstractNum>
+  <w:abstractNum w:abstractNumId="3" w15:restartNumberingAfterBreak="0">
+    <w:nsid w:val="30E02CDF"/>
+    <w:multiLevelType w:val="hybridMultilevel"/>
+    <w:tmpl w:val="41F842BA"/>
+    <w:lvl w:ilvl="0" w:tplc="04090001">
+      <w:start w:val="1"/>
+      <w:numFmt w:val="bullet"/>
+      <w:lvlText w:val=""/>
+      <w:lvlJc w:val="left"/>
+      <w:pPr>
+        <w:ind w:left="720" w:hanging="360"/>
+      </w:pPr>
+      <w:rPr>
+        <w:rFonts w:ascii="Symbol" w:hAnsi="Symbol" w:hint="default"/>
+      </w:rPr>
+    </w:lvl>
+    <w:lvl w:ilvl="1" w:tplc="04090003" w:tentative="1">
+      <w:start w:val="1"/>
+      <w:numFmt w:val="bullet"/>
+      <w:lvlText w:val="o"/>
+      <w:lvlJc w:val="left"/>
+      <w:pPr>
+        <w:ind w:left="1440" w:hanging="360"/>
+      </w:pPr>
+      <w:rPr>
+        <w:rFonts w:ascii="Courier New" w:hAnsi="Courier New" w:cs="Courier New" w:hint="default"/>
+      </w:rPr>
+    </w:lvl>
+    <w:lvl w:ilvl="2" w:tplc="04090005" w:tentative="1">
+      <w:start w:val="1"/>
+      <w:numFmt w:val="bullet"/>
+      <w:lvlText w:val=""/>
+      <w:lvlJc w:val="left"/>
+      <w:pPr>
+        <w:ind w:left="2160" w:hanging="360"/>
+      </w:pPr>
+      <w:rPr>
+        <w:rFonts w:ascii="Wingdings" w:hAnsi="Wingdings" w:hint="default"/>
+      </w:rPr>
+    </w:lvl>
+    <w:lvl w:ilvl="3" w:tplc="04090001" w:tentative="1">
+      <w:start w:val="1"/>
+      <w:numFmt w:val="bullet"/>
+      <w:lvlText w:val=""/>
+      <w:lvlJc w:val="left"/>
+      <w:pPr>
+        <w:ind w:left="2880" w:hanging="360"/>
+      </w:pPr>
+      <w:rPr>
+        <w:rFonts w:ascii="Symbol" w:hAnsi="Symbol" w:hint="default"/>
+      </w:rPr>
+    </w:lvl>
+    <w:lvl w:ilvl="4" w:tplc="04090003" w:tentative="1">
+      <w:start w:val="1"/>
+      <w:numFmt w:val="bullet"/>
+      <w:lvlText w:val="o"/>
+      <w:lvlJc w:val="left"/>
+      <w:pPr>
+        <w:ind w:left="3600" w:hanging="360"/>
+      </w:pPr>
+      <w:rPr>
+        <w:rFonts w:ascii="Courier New" w:hAnsi="Courier New" w:cs="Courier New" w:hint="default"/>
+      </w:rPr>
+    </w:lvl>
+    <w:lvl w:ilvl="5" w:tplc="04090005" w:tentative="1">
+      <w:start w:val="1"/>
+      <w:numFmt w:val="bullet"/>
+      <w:lvlText w:val=""/>
+      <w:lvlJc w:val="left"/>
+      <w:pPr>
+        <w:ind w:left="4320" w:hanging="360"/>
+      </w:pPr>
+      <w:rPr>
+        <w:rFonts w:ascii="Wingdings" w:hAnsi="Wingdings" w:hint="default"/>
+      </w:rPr>
+    </w:lvl>
+    <w:lvl w:ilvl="6" w:tplc="04090001" w:tentative="1">
+      <w:start w:val="1"/>
+      <w:numFmt w:val="bullet"/>
+      <w:lvlText w:val=""/>
+      <w:lvlJc w:val="left"/>
+      <w:pPr>
+        <w:ind w:left="5040" w:hanging="360"/>
+      </w:pPr>
+      <w:rPr>
+        <w:rFonts w:ascii="Symbol" w:hAnsi="Symbol" w:hint="default"/>
+      </w:rPr>
+    </w:lvl>
+    <w:lvl w:ilvl="7" w:tplc="04090003" w:tentative="1">
+      <w:start w:val="1"/>
+      <w:numFmt w:val="bullet"/>
+      <w:lvlText w:val="o"/>
+      <w:lvlJc w:val="left"/>
+      <w:pPr>
+        <w:ind w:left="5760" w:hanging="360"/>
+      </w:pPr>
+      <w:rPr>
+        <w:rFonts w:ascii="Courier New" w:hAnsi="Courier New" w:cs="Courier New" w:hint="default"/>
+      </w:rPr>
+    </w:lvl>
+    <w:lvl w:ilvl="8" w:tplc="04090005" w:tentative="1">
+      <w:start w:val="1"/>
+      <w:numFmt w:val="bullet"/>
+      <w:lvlText w:val=""/>
+      <w:lvlJc w:val="left"/>
+      <w:pPr>
+        <w:ind w:left="6480" w:hanging="360"/>
+      </w:pPr>
+      <w:rPr>
+        <w:rFonts w:ascii="Wingdings" w:hAnsi="Wingdings" w:hint="default"/>
+      </w:rPr>
+    </w:lvl>
+  </w:abstractNum>
+  <w:abstractNum w:abstractNumId="4" w15:restartNumberingAfterBreak="0">
     <w:nsid w:val="36ED691A"/>
     <w:multiLevelType w:val="hybridMultilevel"/>
     <w:tmpl w:val="56FC6232"/>
@@ -6599,7 +7130,7 @@
       </w:rPr>
     </w:lvl>
   </w:abstractNum>
-  <w:abstractNum w:abstractNumId="3" w15:restartNumberingAfterBreak="0">
+  <w:abstractNum w:abstractNumId="5" w15:restartNumberingAfterBreak="0">
     <w:nsid w:val="4DD52E8B"/>
     <w:multiLevelType w:val="hybridMultilevel"/>
     <w:tmpl w:val="B000A1DE"/>
@@ -6712,7 +7243,7 @@
       </w:rPr>
     </w:lvl>
   </w:abstractNum>
-  <w:abstractNum w:abstractNumId="4" w15:restartNumberingAfterBreak="0">
+  <w:abstractNum w:abstractNumId="6" w15:restartNumberingAfterBreak="0">
     <w:nsid w:val="521C4194"/>
     <w:multiLevelType w:val="hybridMultilevel"/>
     <w:tmpl w:val="0542FC48"/>
@@ -6825,7 +7356,7 @@
       </w:rPr>
     </w:lvl>
   </w:abstractNum>
-  <w:abstractNum w:abstractNumId="5" w15:restartNumberingAfterBreak="0">
+  <w:abstractNum w:abstractNumId="7" w15:restartNumberingAfterBreak="0">
     <w:nsid w:val="52D63117"/>
     <w:multiLevelType w:val="hybridMultilevel"/>
     <w:tmpl w:val="036E0984"/>
@@ -6938,7 +7469,7 @@
       </w:rPr>
     </w:lvl>
   </w:abstractNum>
-  <w:abstractNum w:abstractNumId="6" w15:restartNumberingAfterBreak="0">
+  <w:abstractNum w:abstractNumId="8" w15:restartNumberingAfterBreak="0">
     <w:nsid w:val="55821CAC"/>
     <w:multiLevelType w:val="hybridMultilevel"/>
     <w:tmpl w:val="61F8020E"/>
@@ -7051,7 +7582,7 @@
       </w:rPr>
     </w:lvl>
   </w:abstractNum>
-  <w:abstractNum w:abstractNumId="7" w15:restartNumberingAfterBreak="0">
+  <w:abstractNum w:abstractNumId="9" w15:restartNumberingAfterBreak="0">
     <w:nsid w:val="608B0027"/>
     <w:multiLevelType w:val="hybridMultilevel"/>
     <w:tmpl w:val="1A2A0CCE"/>
@@ -7164,7 +7695,7 @@
       </w:rPr>
     </w:lvl>
   </w:abstractNum>
-  <w:abstractNum w:abstractNumId="8" w15:restartNumberingAfterBreak="0">
+  <w:abstractNum w:abstractNumId="10" w15:restartNumberingAfterBreak="0">
     <w:nsid w:val="6B39307D"/>
     <w:multiLevelType w:val="hybridMultilevel"/>
     <w:tmpl w:val="BE94EE76"/>
@@ -7277,7 +7808,7 @@
       </w:rPr>
     </w:lvl>
   </w:abstractNum>
-  <w:abstractNum w:abstractNumId="9" w15:restartNumberingAfterBreak="0">
+  <w:abstractNum w:abstractNumId="11" w15:restartNumberingAfterBreak="0">
     <w:nsid w:val="6EF91E29"/>
     <w:multiLevelType w:val="hybridMultilevel"/>
     <w:tmpl w:val="90A0CFD2"/>
@@ -7390,7 +7921,7 @@
       </w:rPr>
     </w:lvl>
   </w:abstractNum>
-  <w:abstractNum w:abstractNumId="10" w15:restartNumberingAfterBreak="0">
+  <w:abstractNum w:abstractNumId="12" w15:restartNumberingAfterBreak="0">
     <w:nsid w:val="736117B3"/>
     <w:multiLevelType w:val="hybridMultilevel"/>
     <w:tmpl w:val="B902F320"/>
@@ -7503,7 +8034,7 @@
       </w:rPr>
     </w:lvl>
   </w:abstractNum>
-  <w:abstractNum w:abstractNumId="11" w15:restartNumberingAfterBreak="0">
+  <w:abstractNum w:abstractNumId="13" w15:restartNumberingAfterBreak="0">
     <w:nsid w:val="73AA7E9E"/>
     <w:multiLevelType w:val="hybridMultilevel"/>
     <w:tmpl w:val="8EAE28E8"/>
@@ -7616,7 +8147,7 @@
       </w:rPr>
     </w:lvl>
   </w:abstractNum>
-  <w:abstractNum w:abstractNumId="12" w15:restartNumberingAfterBreak="0">
+  <w:abstractNum w:abstractNumId="14" w15:restartNumberingAfterBreak="0">
     <w:nsid w:val="79993F7C"/>
     <w:multiLevelType w:val="hybridMultilevel"/>
     <w:tmpl w:val="8F9A8314"/>
@@ -7730,43 +8261,49 @@
     </w:lvl>
   </w:abstractNum>
   <w:num w:numId="1" w16cid:durableId="824902107">
+    <w:abstractNumId w:val="9"/>
+  </w:num>
+  <w:num w:numId="2" w16cid:durableId="617299781">
+    <w:abstractNumId w:val="11"/>
+  </w:num>
+  <w:num w:numId="3" w16cid:durableId="1048263498">
     <w:abstractNumId w:val="7"/>
   </w:num>
-  <w:num w:numId="2" w16cid:durableId="617299781">
-    <w:abstractNumId w:val="9"/>
-  </w:num>
-  <w:num w:numId="3" w16cid:durableId="1048263498">
-    <w:abstractNumId w:val="5"/>
-  </w:num>
   <w:num w:numId="4" w16cid:durableId="237983024">
-    <w:abstractNumId w:val="4"/>
+    <w:abstractNumId w:val="6"/>
   </w:num>
   <w:num w:numId="5" w16cid:durableId="325859572">
     <w:abstractNumId w:val="1"/>
   </w:num>
   <w:num w:numId="6" w16cid:durableId="398870548">
-    <w:abstractNumId w:val="8"/>
+    <w:abstractNumId w:val="10"/>
   </w:num>
   <w:num w:numId="7" w16cid:durableId="1317153043">
-    <w:abstractNumId w:val="10"/>
+    <w:abstractNumId w:val="12"/>
   </w:num>
   <w:num w:numId="8" w16cid:durableId="430202784">
-    <w:abstractNumId w:val="2"/>
+    <w:abstractNumId w:val="4"/>
   </w:num>
   <w:num w:numId="9" w16cid:durableId="1169177289">
-    <w:abstractNumId w:val="11"/>
+    <w:abstractNumId w:val="13"/>
   </w:num>
   <w:num w:numId="10" w16cid:durableId="965619825">
     <w:abstractNumId w:val="0"/>
   </w:num>
   <w:num w:numId="11" w16cid:durableId="1154027656">
-    <w:abstractNumId w:val="6"/>
+    <w:abstractNumId w:val="8"/>
   </w:num>
   <w:num w:numId="12" w16cid:durableId="867530551">
+    <w:abstractNumId w:val="5"/>
+  </w:num>
+  <w:num w:numId="13" w16cid:durableId="464351712">
+    <w:abstractNumId w:val="14"/>
+  </w:num>
+  <w:num w:numId="14" w16cid:durableId="676274769">
     <w:abstractNumId w:val="3"/>
   </w:num>
-  <w:num w:numId="13" w16cid:durableId="464351712">
-    <w:abstractNumId w:val="12"/>
+  <w:num w:numId="15" w16cid:durableId="1423530884">
+    <w:abstractNumId w:val="2"/>
   </w:num>
 </w:numbering>
 </file>

</xml_diff>

<commit_message>
Actualiza fuentes de datos con hoja 17PM
</commit_message>
<xml_diff>
--- a/Documentacion/Fuentes de Datos.docx
+++ b/Documentacion/Fuentes de Datos.docx
@@ -6546,12 +6546,549 @@
     </w:p>
     <w:p>
       <w:pPr>
-        <w:pStyle w:val="Prrafodelista"/>
-        <w:rPr>
-          <w:rFonts w:ascii="Arial" w:hAnsi="Arial" w:cs="Arial"/>
-          <w:lang w:val="es-CO"/>
-        </w:rPr>
-      </w:pPr>
+        <w:rPr>
+          <w:rFonts w:ascii="Arial" w:hAnsi="Arial" w:cs="Arial"/>
+          <w:lang w:val="es-CO"/>
+        </w:rPr>
+      </w:pPr>
+    </w:p>
+    <w:p>
+      <w:pPr>
+        <w:rPr>
+          <w:rFonts w:ascii="Arial" w:hAnsi="Arial" w:cs="Arial"/>
+          <w:b/>
+          <w:bCs/>
+          <w:lang w:val="es-CO"/>
+        </w:rPr>
+      </w:pPr>
+      <w:r>
+        <w:rPr>
+          <w:rFonts w:ascii="Arial" w:hAnsi="Arial" w:cs="Arial"/>
+          <w:b/>
+          <w:bCs/>
+          <w:lang w:val="es-CO"/>
+        </w:rPr>
+        <w:t>17PM</w:t>
+      </w:r>
+    </w:p>
+    <w:p>
+      <w:pPr>
+        <w:rPr>
+          <w:rFonts w:ascii="Arial" w:hAnsi="Arial" w:cs="Arial"/>
+          <w:lang w:val="es-CO"/>
+        </w:rPr>
+      </w:pPr>
+      <w:r>
+        <w:rPr>
+          <w:rFonts w:ascii="Arial" w:hAnsi="Arial" w:cs="Arial"/>
+          <w:lang w:val="es-CO"/>
+        </w:rPr>
+        <w:t>Contiene 16 columnas y 3 agrupaciones.</w:t>
+      </w:r>
+    </w:p>
+    <w:p>
+      <w:pPr>
+        <w:rPr>
+          <w:rFonts w:ascii="Arial" w:hAnsi="Arial" w:cs="Arial"/>
+          <w:lang w:val="es-CO"/>
+        </w:rPr>
+      </w:pPr>
+      <w:r>
+        <w:rPr>
+          <w:rFonts w:ascii="Arial" w:hAnsi="Arial" w:cs="Arial"/>
+          <w:lang w:val="es-CO"/>
+        </w:rPr>
+        <w:t>Columnas:</w:t>
+      </w:r>
+    </w:p>
+    <w:p>
+      <w:pPr>
+        <w:pStyle w:val="Prrafodelista"/>
+        <w:numPr>
+          <w:ilvl w:val="0"/>
+          <w:numId w:val="16"/>
+        </w:numPr>
+        <w:rPr>
+          <w:rFonts w:ascii="Arial" w:hAnsi="Arial" w:cs="Arial"/>
+          <w:lang w:val="es-CO"/>
+        </w:rPr>
+      </w:pPr>
+      <w:r>
+        <w:rPr>
+          <w:rFonts w:ascii="Arial" w:hAnsi="Arial" w:cs="Arial"/>
+          <w:lang w:val="es-CO"/>
+        </w:rPr>
+        <w:t>Total (entero): Cantidad total de censados.</w:t>
+      </w:r>
+    </w:p>
+    <w:p>
+      <w:pPr>
+        <w:pStyle w:val="Prrafodelista"/>
+        <w:numPr>
+          <w:ilvl w:val="0"/>
+          <w:numId w:val="16"/>
+        </w:numPr>
+        <w:rPr>
+          <w:rFonts w:ascii="Arial" w:hAnsi="Arial" w:cs="Arial"/>
+          <w:lang w:val="es-CO"/>
+        </w:rPr>
+      </w:pPr>
+      <w:r>
+        <w:rPr>
+          <w:rFonts w:ascii="Arial" w:hAnsi="Arial" w:cs="Arial"/>
+          <w:lang w:val="es-CO"/>
+        </w:rPr>
+        <w:t>Ninguno (entero): Cantidad de censados sin ningún nivel educativo.</w:t>
+      </w:r>
+    </w:p>
+    <w:p>
+      <w:pPr>
+        <w:pStyle w:val="Prrafodelista"/>
+        <w:numPr>
+          <w:ilvl w:val="0"/>
+          <w:numId w:val="16"/>
+        </w:numPr>
+        <w:rPr>
+          <w:rFonts w:ascii="Arial" w:hAnsi="Arial" w:cs="Arial"/>
+          <w:lang w:val="es-CO"/>
+        </w:rPr>
+      </w:pPr>
+      <w:r>
+        <w:rPr>
+          <w:rFonts w:ascii="Arial" w:hAnsi="Arial" w:cs="Arial"/>
+          <w:lang w:val="es-CO"/>
+        </w:rPr>
+        <w:t>Preescolar (entero): Cantidad de censados cuyo máximo nivel educativo es preescolar.</w:t>
+      </w:r>
+    </w:p>
+    <w:p>
+      <w:pPr>
+        <w:pStyle w:val="Prrafodelista"/>
+        <w:numPr>
+          <w:ilvl w:val="0"/>
+          <w:numId w:val="16"/>
+        </w:numPr>
+        <w:rPr>
+          <w:rFonts w:ascii="Arial" w:hAnsi="Arial" w:cs="Arial"/>
+          <w:lang w:val="es-CO"/>
+        </w:rPr>
+      </w:pPr>
+      <w:r>
+        <w:rPr>
+          <w:rFonts w:ascii="Arial" w:hAnsi="Arial" w:cs="Arial"/>
+          <w:lang w:val="es-CO"/>
+        </w:rPr>
+        <w:lastRenderedPageBreak/>
+        <w:t>Primaria completa (entero): Cantidad de censados cuyo máximo nivel educativo es primaria completa.</w:t>
+      </w:r>
+    </w:p>
+    <w:p>
+      <w:pPr>
+        <w:pStyle w:val="Prrafodelista"/>
+        <w:numPr>
+          <w:ilvl w:val="0"/>
+          <w:numId w:val="16"/>
+        </w:numPr>
+        <w:rPr>
+          <w:rFonts w:ascii="Arial" w:hAnsi="Arial" w:cs="Arial"/>
+          <w:lang w:val="es-CO"/>
+        </w:rPr>
+      </w:pPr>
+      <w:r>
+        <w:rPr>
+          <w:rFonts w:ascii="Arial" w:hAnsi="Arial" w:cs="Arial"/>
+          <w:lang w:val="es-CO"/>
+        </w:rPr>
+        <w:t xml:space="preserve">Primaria incompleta (entero): </w:t>
+      </w:r>
+      <w:r>
+        <w:rPr>
+          <w:rFonts w:ascii="Arial" w:hAnsi="Arial" w:cs="Arial"/>
+          <w:lang w:val="es-CO"/>
+        </w:rPr>
+        <w:t>Cantidad de censados cuyo máximo nivel educativo es</w:t>
+      </w:r>
+      <w:r>
+        <w:rPr>
+          <w:rFonts w:ascii="Arial" w:hAnsi="Arial" w:cs="Arial"/>
+          <w:lang w:val="es-CO"/>
+        </w:rPr>
+        <w:t xml:space="preserve"> primaria incompleta.</w:t>
+      </w:r>
+    </w:p>
+    <w:p>
+      <w:pPr>
+        <w:pStyle w:val="Prrafodelista"/>
+        <w:numPr>
+          <w:ilvl w:val="0"/>
+          <w:numId w:val="16"/>
+        </w:numPr>
+        <w:rPr>
+          <w:rFonts w:ascii="Arial" w:hAnsi="Arial" w:cs="Arial"/>
+          <w:lang w:val="es-CO"/>
+        </w:rPr>
+      </w:pPr>
+      <w:r>
+        <w:rPr>
+          <w:rFonts w:ascii="Arial" w:hAnsi="Arial" w:cs="Arial"/>
+          <w:lang w:val="es-CO"/>
+        </w:rPr>
+        <w:t xml:space="preserve">Secundaria completa (entero): </w:t>
+      </w:r>
+      <w:r>
+        <w:rPr>
+          <w:rFonts w:ascii="Arial" w:hAnsi="Arial" w:cs="Arial"/>
+          <w:lang w:val="es-CO"/>
+        </w:rPr>
+        <w:t>Cantidad de censados cuyo máximo nivel educativo es</w:t>
+      </w:r>
+      <w:r>
+        <w:rPr>
+          <w:rFonts w:ascii="Arial" w:hAnsi="Arial" w:cs="Arial"/>
+          <w:lang w:val="es-CO"/>
+        </w:rPr>
+        <w:t xml:space="preserve"> secundaria completa.</w:t>
+      </w:r>
+    </w:p>
+    <w:p>
+      <w:pPr>
+        <w:pStyle w:val="Prrafodelista"/>
+        <w:numPr>
+          <w:ilvl w:val="0"/>
+          <w:numId w:val="16"/>
+        </w:numPr>
+        <w:rPr>
+          <w:rFonts w:ascii="Arial" w:hAnsi="Arial" w:cs="Arial"/>
+          <w:lang w:val="es-CO"/>
+        </w:rPr>
+      </w:pPr>
+      <w:r>
+        <w:rPr>
+          <w:rFonts w:ascii="Arial" w:hAnsi="Arial" w:cs="Arial"/>
+          <w:lang w:val="es-CO"/>
+        </w:rPr>
+        <w:t xml:space="preserve">Secundaria incompleta (entero): </w:t>
+      </w:r>
+      <w:r>
+        <w:rPr>
+          <w:rFonts w:ascii="Arial" w:hAnsi="Arial" w:cs="Arial"/>
+          <w:lang w:val="es-CO"/>
+        </w:rPr>
+        <w:t>Cantidad de censados cuyo máximo nivel educativo es</w:t>
+      </w:r>
+      <w:r>
+        <w:rPr>
+          <w:rFonts w:ascii="Arial" w:hAnsi="Arial" w:cs="Arial"/>
+          <w:lang w:val="es-CO"/>
+        </w:rPr>
+        <w:t xml:space="preserve"> secundaria incompleta.</w:t>
+      </w:r>
+    </w:p>
+    <w:p>
+      <w:pPr>
+        <w:pStyle w:val="Prrafodelista"/>
+        <w:numPr>
+          <w:ilvl w:val="0"/>
+          <w:numId w:val="16"/>
+        </w:numPr>
+        <w:rPr>
+          <w:rFonts w:ascii="Arial" w:hAnsi="Arial" w:cs="Arial"/>
+          <w:lang w:val="es-CO"/>
+        </w:rPr>
+      </w:pPr>
+      <w:r>
+        <w:rPr>
+          <w:rFonts w:ascii="Arial" w:hAnsi="Arial" w:cs="Arial"/>
+          <w:lang w:val="es-CO"/>
+        </w:rPr>
+        <w:t xml:space="preserve">Media Completa (entero): </w:t>
+      </w:r>
+      <w:r>
+        <w:rPr>
+          <w:rFonts w:ascii="Arial" w:hAnsi="Arial" w:cs="Arial"/>
+          <w:lang w:val="es-CO"/>
+        </w:rPr>
+        <w:t>Cantidad de censados cuyo máximo nivel educativo es</w:t>
+      </w:r>
+      <w:r>
+        <w:rPr>
+          <w:rFonts w:ascii="Arial" w:hAnsi="Arial" w:cs="Arial"/>
+          <w:lang w:val="es-CO"/>
+        </w:rPr>
+        <w:t xml:space="preserve"> educación media completa.</w:t>
+      </w:r>
+    </w:p>
+    <w:p>
+      <w:pPr>
+        <w:pStyle w:val="Prrafodelista"/>
+        <w:numPr>
+          <w:ilvl w:val="0"/>
+          <w:numId w:val="16"/>
+        </w:numPr>
+        <w:rPr>
+          <w:rFonts w:ascii="Arial" w:hAnsi="Arial" w:cs="Arial"/>
+          <w:lang w:val="es-CO"/>
+        </w:rPr>
+      </w:pPr>
+      <w:r>
+        <w:rPr>
+          <w:rFonts w:ascii="Arial" w:hAnsi="Arial" w:cs="Arial"/>
+          <w:lang w:val="es-CO"/>
+        </w:rPr>
+        <w:t xml:space="preserve">Media incompleta (entero): </w:t>
+      </w:r>
+      <w:r>
+        <w:rPr>
+          <w:rFonts w:ascii="Arial" w:hAnsi="Arial" w:cs="Arial"/>
+          <w:lang w:val="es-CO"/>
+        </w:rPr>
+        <w:t>Cantidad de censados cuyo máximo nivel educativo es</w:t>
+      </w:r>
+      <w:r>
+        <w:rPr>
+          <w:rFonts w:ascii="Arial" w:hAnsi="Arial" w:cs="Arial"/>
+          <w:lang w:val="es-CO"/>
+        </w:rPr>
+        <w:t xml:space="preserve"> educación media incompleta.</w:t>
+      </w:r>
+    </w:p>
+    <w:p>
+      <w:pPr>
+        <w:pStyle w:val="Prrafodelista"/>
+        <w:numPr>
+          <w:ilvl w:val="0"/>
+          <w:numId w:val="16"/>
+        </w:numPr>
+        <w:rPr>
+          <w:rFonts w:ascii="Arial" w:hAnsi="Arial" w:cs="Arial"/>
+          <w:lang w:val="es-CO"/>
+        </w:rPr>
+      </w:pPr>
+      <w:r>
+        <w:rPr>
+          <w:rFonts w:ascii="Arial" w:hAnsi="Arial" w:cs="Arial"/>
+          <w:lang w:val="es-CO"/>
+        </w:rPr>
+        <w:t xml:space="preserve">Normal completa (entero): </w:t>
+      </w:r>
+      <w:r>
+        <w:rPr>
+          <w:rFonts w:ascii="Arial" w:hAnsi="Arial" w:cs="Arial"/>
+          <w:lang w:val="es-CO"/>
+        </w:rPr>
+        <w:t>Cantidad de censados cuyo máximo nivel educativo es</w:t>
+      </w:r>
+      <w:r>
+        <w:rPr>
+          <w:rFonts w:ascii="Arial" w:hAnsi="Arial" w:cs="Arial"/>
+          <w:lang w:val="es-CO"/>
+        </w:rPr>
+        <w:t xml:space="preserve"> educación normal completa.</w:t>
+      </w:r>
+    </w:p>
+    <w:p>
+      <w:pPr>
+        <w:pStyle w:val="Prrafodelista"/>
+        <w:numPr>
+          <w:ilvl w:val="0"/>
+          <w:numId w:val="16"/>
+        </w:numPr>
+        <w:rPr>
+          <w:rFonts w:ascii="Arial" w:hAnsi="Arial" w:cs="Arial"/>
+          <w:lang w:val="es-CO"/>
+        </w:rPr>
+      </w:pPr>
+      <w:r>
+        <w:rPr>
+          <w:rFonts w:ascii="Arial" w:hAnsi="Arial" w:cs="Arial"/>
+          <w:lang w:val="es-CO"/>
+        </w:rPr>
+        <w:t xml:space="preserve">Normal incompleta (entero): </w:t>
+      </w:r>
+      <w:r>
+        <w:rPr>
+          <w:rFonts w:ascii="Arial" w:hAnsi="Arial" w:cs="Arial"/>
+          <w:lang w:val="es-CO"/>
+        </w:rPr>
+        <w:t>Cantidad de censados cuyo máximo nivel educativo es</w:t>
+      </w:r>
+      <w:r>
+        <w:rPr>
+          <w:rFonts w:ascii="Arial" w:hAnsi="Arial" w:cs="Arial"/>
+          <w:lang w:val="es-CO"/>
+        </w:rPr>
+        <w:t xml:space="preserve"> educación normal incompleta.</w:t>
+      </w:r>
+    </w:p>
+    <w:p>
+      <w:pPr>
+        <w:pStyle w:val="Prrafodelista"/>
+        <w:numPr>
+          <w:ilvl w:val="0"/>
+          <w:numId w:val="16"/>
+        </w:numPr>
+        <w:rPr>
+          <w:rFonts w:ascii="Arial" w:hAnsi="Arial" w:cs="Arial"/>
+          <w:lang w:val="es-CO"/>
+        </w:rPr>
+      </w:pPr>
+      <w:r>
+        <w:rPr>
+          <w:rFonts w:ascii="Arial" w:hAnsi="Arial" w:cs="Arial"/>
+          <w:lang w:val="es-CO"/>
+        </w:rPr>
+        <w:t xml:space="preserve">Tecnico (entero): </w:t>
+      </w:r>
+      <w:r>
+        <w:rPr>
+          <w:rFonts w:ascii="Arial" w:hAnsi="Arial" w:cs="Arial"/>
+          <w:lang w:val="es-CO"/>
+        </w:rPr>
+        <w:t>Cantidad de censados cuyo máximo nivel educativo es</w:t>
+      </w:r>
+      <w:r>
+        <w:rPr>
+          <w:rFonts w:ascii="Arial" w:hAnsi="Arial" w:cs="Arial"/>
+          <w:lang w:val="es-CO"/>
+        </w:rPr>
+        <w:t xml:space="preserve"> técnico.</w:t>
+      </w:r>
+    </w:p>
+    <w:p>
+      <w:pPr>
+        <w:pStyle w:val="Prrafodelista"/>
+        <w:numPr>
+          <w:ilvl w:val="0"/>
+          <w:numId w:val="16"/>
+        </w:numPr>
+        <w:rPr>
+          <w:rFonts w:ascii="Arial" w:hAnsi="Arial" w:cs="Arial"/>
+          <w:lang w:val="es-CO"/>
+        </w:rPr>
+      </w:pPr>
+      <w:r>
+        <w:rPr>
+          <w:rFonts w:ascii="Arial" w:hAnsi="Arial" w:cs="Arial"/>
+          <w:lang w:val="es-CO"/>
+        </w:rPr>
+        <w:t xml:space="preserve">Tecnológico (entero): </w:t>
+      </w:r>
+      <w:r>
+        <w:rPr>
+          <w:rFonts w:ascii="Arial" w:hAnsi="Arial" w:cs="Arial"/>
+          <w:lang w:val="es-CO"/>
+        </w:rPr>
+        <w:t>Cantidad de censados cuyo máximo nivel educativo es</w:t>
+      </w:r>
+      <w:r>
+        <w:rPr>
+          <w:rFonts w:ascii="Arial" w:hAnsi="Arial" w:cs="Arial"/>
+          <w:lang w:val="es-CO"/>
+        </w:rPr>
+        <w:t xml:space="preserve"> tecnológico.</w:t>
+      </w:r>
+    </w:p>
+    <w:p>
+      <w:pPr>
+        <w:pStyle w:val="Prrafodelista"/>
+        <w:numPr>
+          <w:ilvl w:val="0"/>
+          <w:numId w:val="16"/>
+        </w:numPr>
+        <w:rPr>
+          <w:rFonts w:ascii="Arial" w:hAnsi="Arial" w:cs="Arial"/>
+          <w:lang w:val="es-CO"/>
+        </w:rPr>
+      </w:pPr>
+      <w:r>
+        <w:rPr>
+          <w:rFonts w:ascii="Arial" w:hAnsi="Arial" w:cs="Arial"/>
+          <w:lang w:val="es-CO"/>
+        </w:rPr>
+        <w:t xml:space="preserve">Universitario (entero): </w:t>
+      </w:r>
+      <w:r>
+        <w:rPr>
+          <w:rFonts w:ascii="Arial" w:hAnsi="Arial" w:cs="Arial"/>
+          <w:lang w:val="es-CO"/>
+        </w:rPr>
+        <w:t>Cantidad de censados cuyo máximo nivel educativo es</w:t>
+      </w:r>
+      <w:r>
+        <w:rPr>
+          <w:rFonts w:ascii="Arial" w:hAnsi="Arial" w:cs="Arial"/>
+          <w:lang w:val="es-CO"/>
+        </w:rPr>
+        <w:t xml:space="preserve"> universitario.</w:t>
+      </w:r>
+    </w:p>
+    <w:p>
+      <w:pPr>
+        <w:pStyle w:val="Prrafodelista"/>
+        <w:numPr>
+          <w:ilvl w:val="0"/>
+          <w:numId w:val="16"/>
+        </w:numPr>
+        <w:rPr>
+          <w:rFonts w:ascii="Arial" w:hAnsi="Arial" w:cs="Arial"/>
+          <w:lang w:val="es-CO"/>
+        </w:rPr>
+      </w:pPr>
+      <w:r>
+        <w:rPr>
+          <w:rFonts w:ascii="Arial" w:hAnsi="Arial" w:cs="Arial"/>
+          <w:lang w:val="es-CO"/>
+        </w:rPr>
+        <w:t xml:space="preserve">Especialización, Maestría, Doctorado (entero): </w:t>
+      </w:r>
+      <w:r>
+        <w:rPr>
+          <w:rFonts w:ascii="Arial" w:hAnsi="Arial" w:cs="Arial"/>
+          <w:lang w:val="es-CO"/>
+        </w:rPr>
+        <w:t>Cantidad de censados cuyo máximo nivel educativo es</w:t>
+      </w:r>
+      <w:r>
+        <w:rPr>
+          <w:rFonts w:ascii="Arial" w:hAnsi="Arial" w:cs="Arial"/>
+          <w:lang w:val="es-CO"/>
+        </w:rPr>
+        <w:t xml:space="preserve"> especialización maestría o doctorado.</w:t>
+      </w:r>
+    </w:p>
+    <w:p>
+      <w:pPr>
+        <w:pStyle w:val="Prrafodelista"/>
+        <w:numPr>
+          <w:ilvl w:val="0"/>
+          <w:numId w:val="16"/>
+        </w:numPr>
+        <w:rPr>
+          <w:rFonts w:ascii="Arial" w:hAnsi="Arial" w:cs="Arial"/>
+          <w:lang w:val="es-CO"/>
+        </w:rPr>
+      </w:pPr>
+      <w:r>
+        <w:rPr>
+          <w:rFonts w:ascii="Arial" w:hAnsi="Arial" w:cs="Arial"/>
+          <w:lang w:val="es-CO"/>
+        </w:rPr>
+        <w:t xml:space="preserve">Sin información (entero): </w:t>
+      </w:r>
+      <w:r>
+        <w:rPr>
+          <w:rFonts w:ascii="Arial" w:hAnsi="Arial" w:cs="Arial"/>
+          <w:lang w:val="es-CO"/>
+        </w:rPr>
+        <w:t xml:space="preserve">Cantidad de censados </w:t>
+      </w:r>
+      <w:r>
+        <w:rPr>
+          <w:rFonts w:ascii="Arial" w:hAnsi="Arial" w:cs="Arial"/>
+          <w:lang w:val="es-CO"/>
+        </w:rPr>
+        <w:t>de los cuales no se tiene información acerca de su nivel educativo.</w:t>
+      </w:r>
     </w:p>
     <w:sectPr>
       <w:pgSz w:w="12240" w:h="15840"/>
@@ -6679,6 +7216,119 @@
     </w:lvl>
   </w:abstractNum>
   <w:abstractNum w:abstractNumId="1" w15:restartNumberingAfterBreak="0">
+    <w:nsid w:val="19A165BB"/>
+    <w:multiLevelType w:val="hybridMultilevel"/>
+    <w:tmpl w:val="FEF24976"/>
+    <w:lvl w:ilvl="0" w:tplc="04090001">
+      <w:start w:val="1"/>
+      <w:numFmt w:val="bullet"/>
+      <w:lvlText w:val=""/>
+      <w:lvlJc w:val="left"/>
+      <w:pPr>
+        <w:ind w:left="720" w:hanging="360"/>
+      </w:pPr>
+      <w:rPr>
+        <w:rFonts w:ascii="Symbol" w:hAnsi="Symbol" w:hint="default"/>
+      </w:rPr>
+    </w:lvl>
+    <w:lvl w:ilvl="1" w:tplc="04090003" w:tentative="1">
+      <w:start w:val="1"/>
+      <w:numFmt w:val="bullet"/>
+      <w:lvlText w:val="o"/>
+      <w:lvlJc w:val="left"/>
+      <w:pPr>
+        <w:ind w:left="1440" w:hanging="360"/>
+      </w:pPr>
+      <w:rPr>
+        <w:rFonts w:ascii="Courier New" w:hAnsi="Courier New" w:cs="Courier New" w:hint="default"/>
+      </w:rPr>
+    </w:lvl>
+    <w:lvl w:ilvl="2" w:tplc="04090005" w:tentative="1">
+      <w:start w:val="1"/>
+      <w:numFmt w:val="bullet"/>
+      <w:lvlText w:val=""/>
+      <w:lvlJc w:val="left"/>
+      <w:pPr>
+        <w:ind w:left="2160" w:hanging="360"/>
+      </w:pPr>
+      <w:rPr>
+        <w:rFonts w:ascii="Wingdings" w:hAnsi="Wingdings" w:hint="default"/>
+      </w:rPr>
+    </w:lvl>
+    <w:lvl w:ilvl="3" w:tplc="04090001" w:tentative="1">
+      <w:start w:val="1"/>
+      <w:numFmt w:val="bullet"/>
+      <w:lvlText w:val=""/>
+      <w:lvlJc w:val="left"/>
+      <w:pPr>
+        <w:ind w:left="2880" w:hanging="360"/>
+      </w:pPr>
+      <w:rPr>
+        <w:rFonts w:ascii="Symbol" w:hAnsi="Symbol" w:hint="default"/>
+      </w:rPr>
+    </w:lvl>
+    <w:lvl w:ilvl="4" w:tplc="04090003" w:tentative="1">
+      <w:start w:val="1"/>
+      <w:numFmt w:val="bullet"/>
+      <w:lvlText w:val="o"/>
+      <w:lvlJc w:val="left"/>
+      <w:pPr>
+        <w:ind w:left="3600" w:hanging="360"/>
+      </w:pPr>
+      <w:rPr>
+        <w:rFonts w:ascii="Courier New" w:hAnsi="Courier New" w:cs="Courier New" w:hint="default"/>
+      </w:rPr>
+    </w:lvl>
+    <w:lvl w:ilvl="5" w:tplc="04090005" w:tentative="1">
+      <w:start w:val="1"/>
+      <w:numFmt w:val="bullet"/>
+      <w:lvlText w:val=""/>
+      <w:lvlJc w:val="left"/>
+      <w:pPr>
+        <w:ind w:left="4320" w:hanging="360"/>
+      </w:pPr>
+      <w:rPr>
+        <w:rFonts w:ascii="Wingdings" w:hAnsi="Wingdings" w:hint="default"/>
+      </w:rPr>
+    </w:lvl>
+    <w:lvl w:ilvl="6" w:tplc="04090001" w:tentative="1">
+      <w:start w:val="1"/>
+      <w:numFmt w:val="bullet"/>
+      <w:lvlText w:val=""/>
+      <w:lvlJc w:val="left"/>
+      <w:pPr>
+        <w:ind w:left="5040" w:hanging="360"/>
+      </w:pPr>
+      <w:rPr>
+        <w:rFonts w:ascii="Symbol" w:hAnsi="Symbol" w:hint="default"/>
+      </w:rPr>
+    </w:lvl>
+    <w:lvl w:ilvl="7" w:tplc="04090003" w:tentative="1">
+      <w:start w:val="1"/>
+      <w:numFmt w:val="bullet"/>
+      <w:lvlText w:val="o"/>
+      <w:lvlJc w:val="left"/>
+      <w:pPr>
+        <w:ind w:left="5760" w:hanging="360"/>
+      </w:pPr>
+      <w:rPr>
+        <w:rFonts w:ascii="Courier New" w:hAnsi="Courier New" w:cs="Courier New" w:hint="default"/>
+      </w:rPr>
+    </w:lvl>
+    <w:lvl w:ilvl="8" w:tplc="04090005" w:tentative="1">
+      <w:start w:val="1"/>
+      <w:numFmt w:val="bullet"/>
+      <w:lvlText w:val=""/>
+      <w:lvlJc w:val="left"/>
+      <w:pPr>
+        <w:ind w:left="6480" w:hanging="360"/>
+      </w:pPr>
+      <w:rPr>
+        <w:rFonts w:ascii="Wingdings" w:hAnsi="Wingdings" w:hint="default"/>
+      </w:rPr>
+    </w:lvl>
+  </w:abstractNum>
+  <w:abstractNum w:abstractNumId="2" w15:restartNumberingAfterBreak="0">
     <w:nsid w:val="1AE62D74"/>
     <w:multiLevelType w:val="hybridMultilevel"/>
     <w:tmpl w:val="CA0E2AF4"/>
@@ -6791,7 +7441,7 @@
       </w:rPr>
     </w:lvl>
   </w:abstractNum>
-  <w:abstractNum w:abstractNumId="2" w15:restartNumberingAfterBreak="0">
+  <w:abstractNum w:abstractNumId="3" w15:restartNumberingAfterBreak="0">
     <w:nsid w:val="251E3883"/>
     <w:multiLevelType w:val="hybridMultilevel"/>
     <w:tmpl w:val="79007C6E"/>
@@ -6904,7 +7554,7 @@
       </w:rPr>
     </w:lvl>
   </w:abstractNum>
-  <w:abstractNum w:abstractNumId="3" w15:restartNumberingAfterBreak="0">
+  <w:abstractNum w:abstractNumId="4" w15:restartNumberingAfterBreak="0">
     <w:nsid w:val="30E02CDF"/>
     <w:multiLevelType w:val="hybridMultilevel"/>
     <w:tmpl w:val="41F842BA"/>
@@ -7017,7 +7667,7 @@
       </w:rPr>
     </w:lvl>
   </w:abstractNum>
-  <w:abstractNum w:abstractNumId="4" w15:restartNumberingAfterBreak="0">
+  <w:abstractNum w:abstractNumId="5" w15:restartNumberingAfterBreak="0">
     <w:nsid w:val="36ED691A"/>
     <w:multiLevelType w:val="hybridMultilevel"/>
     <w:tmpl w:val="56FC6232"/>
@@ -7130,7 +7780,7 @@
       </w:rPr>
     </w:lvl>
   </w:abstractNum>
-  <w:abstractNum w:abstractNumId="5" w15:restartNumberingAfterBreak="0">
+  <w:abstractNum w:abstractNumId="6" w15:restartNumberingAfterBreak="0">
     <w:nsid w:val="4DD52E8B"/>
     <w:multiLevelType w:val="hybridMultilevel"/>
     <w:tmpl w:val="B000A1DE"/>
@@ -7243,7 +7893,7 @@
       </w:rPr>
     </w:lvl>
   </w:abstractNum>
-  <w:abstractNum w:abstractNumId="6" w15:restartNumberingAfterBreak="0">
+  <w:abstractNum w:abstractNumId="7" w15:restartNumberingAfterBreak="0">
     <w:nsid w:val="521C4194"/>
     <w:multiLevelType w:val="hybridMultilevel"/>
     <w:tmpl w:val="0542FC48"/>
@@ -7356,7 +8006,7 @@
       </w:rPr>
     </w:lvl>
   </w:abstractNum>
-  <w:abstractNum w:abstractNumId="7" w15:restartNumberingAfterBreak="0">
+  <w:abstractNum w:abstractNumId="8" w15:restartNumberingAfterBreak="0">
     <w:nsid w:val="52D63117"/>
     <w:multiLevelType w:val="hybridMultilevel"/>
     <w:tmpl w:val="036E0984"/>
@@ -7469,7 +8119,7 @@
       </w:rPr>
     </w:lvl>
   </w:abstractNum>
-  <w:abstractNum w:abstractNumId="8" w15:restartNumberingAfterBreak="0">
+  <w:abstractNum w:abstractNumId="9" w15:restartNumberingAfterBreak="0">
     <w:nsid w:val="55821CAC"/>
     <w:multiLevelType w:val="hybridMultilevel"/>
     <w:tmpl w:val="61F8020E"/>
@@ -7582,7 +8232,7 @@
       </w:rPr>
     </w:lvl>
   </w:abstractNum>
-  <w:abstractNum w:abstractNumId="9" w15:restartNumberingAfterBreak="0">
+  <w:abstractNum w:abstractNumId="10" w15:restartNumberingAfterBreak="0">
     <w:nsid w:val="608B0027"/>
     <w:multiLevelType w:val="hybridMultilevel"/>
     <w:tmpl w:val="1A2A0CCE"/>
@@ -7695,7 +8345,7 @@
       </w:rPr>
     </w:lvl>
   </w:abstractNum>
-  <w:abstractNum w:abstractNumId="10" w15:restartNumberingAfterBreak="0">
+  <w:abstractNum w:abstractNumId="11" w15:restartNumberingAfterBreak="0">
     <w:nsid w:val="6B39307D"/>
     <w:multiLevelType w:val="hybridMultilevel"/>
     <w:tmpl w:val="BE94EE76"/>
@@ -7808,7 +8458,7 @@
       </w:rPr>
     </w:lvl>
   </w:abstractNum>
-  <w:abstractNum w:abstractNumId="11" w15:restartNumberingAfterBreak="0">
+  <w:abstractNum w:abstractNumId="12" w15:restartNumberingAfterBreak="0">
     <w:nsid w:val="6EF91E29"/>
     <w:multiLevelType w:val="hybridMultilevel"/>
     <w:tmpl w:val="90A0CFD2"/>
@@ -7921,7 +8571,7 @@
       </w:rPr>
     </w:lvl>
   </w:abstractNum>
-  <w:abstractNum w:abstractNumId="12" w15:restartNumberingAfterBreak="0">
+  <w:abstractNum w:abstractNumId="13" w15:restartNumberingAfterBreak="0">
     <w:nsid w:val="736117B3"/>
     <w:multiLevelType w:val="hybridMultilevel"/>
     <w:tmpl w:val="B902F320"/>
@@ -8034,7 +8684,7 @@
       </w:rPr>
     </w:lvl>
   </w:abstractNum>
-  <w:abstractNum w:abstractNumId="13" w15:restartNumberingAfterBreak="0">
+  <w:abstractNum w:abstractNumId="14" w15:restartNumberingAfterBreak="0">
     <w:nsid w:val="73AA7E9E"/>
     <w:multiLevelType w:val="hybridMultilevel"/>
     <w:tmpl w:val="8EAE28E8"/>
@@ -8147,7 +8797,7 @@
       </w:rPr>
     </w:lvl>
   </w:abstractNum>
-  <w:abstractNum w:abstractNumId="14" w15:restartNumberingAfterBreak="0">
+  <w:abstractNum w:abstractNumId="15" w15:restartNumberingAfterBreak="0">
     <w:nsid w:val="79993F7C"/>
     <w:multiLevelType w:val="hybridMultilevel"/>
     <w:tmpl w:val="8F9A8314"/>
@@ -8261,49 +8911,52 @@
     </w:lvl>
   </w:abstractNum>
   <w:num w:numId="1" w16cid:durableId="824902107">
-    <w:abstractNumId w:val="9"/>
+    <w:abstractNumId w:val="10"/>
   </w:num>
   <w:num w:numId="2" w16cid:durableId="617299781">
+    <w:abstractNumId w:val="12"/>
+  </w:num>
+  <w:num w:numId="3" w16cid:durableId="1048263498">
+    <w:abstractNumId w:val="8"/>
+  </w:num>
+  <w:num w:numId="4" w16cid:durableId="237983024">
+    <w:abstractNumId w:val="7"/>
+  </w:num>
+  <w:num w:numId="5" w16cid:durableId="325859572">
+    <w:abstractNumId w:val="2"/>
+  </w:num>
+  <w:num w:numId="6" w16cid:durableId="398870548">
     <w:abstractNumId w:val="11"/>
   </w:num>
-  <w:num w:numId="3" w16cid:durableId="1048263498">
-    <w:abstractNumId w:val="7"/>
-  </w:num>
-  <w:num w:numId="4" w16cid:durableId="237983024">
-    <w:abstractNumId w:val="6"/>
-  </w:num>
-  <w:num w:numId="5" w16cid:durableId="325859572">
-    <w:abstractNumId w:val="1"/>
-  </w:num>
-  <w:num w:numId="6" w16cid:durableId="398870548">
-    <w:abstractNumId w:val="10"/>
-  </w:num>
   <w:num w:numId="7" w16cid:durableId="1317153043">
-    <w:abstractNumId w:val="12"/>
+    <w:abstractNumId w:val="13"/>
   </w:num>
   <w:num w:numId="8" w16cid:durableId="430202784">
-    <w:abstractNumId w:val="4"/>
+    <w:abstractNumId w:val="5"/>
   </w:num>
   <w:num w:numId="9" w16cid:durableId="1169177289">
-    <w:abstractNumId w:val="13"/>
+    <w:abstractNumId w:val="14"/>
   </w:num>
   <w:num w:numId="10" w16cid:durableId="965619825">
     <w:abstractNumId w:val="0"/>
   </w:num>
   <w:num w:numId="11" w16cid:durableId="1154027656">
-    <w:abstractNumId w:val="8"/>
+    <w:abstractNumId w:val="9"/>
   </w:num>
   <w:num w:numId="12" w16cid:durableId="867530551">
-    <w:abstractNumId w:val="5"/>
+    <w:abstractNumId w:val="6"/>
   </w:num>
   <w:num w:numId="13" w16cid:durableId="464351712">
-    <w:abstractNumId w:val="14"/>
+    <w:abstractNumId w:val="15"/>
   </w:num>
   <w:num w:numId="14" w16cid:durableId="676274769">
+    <w:abstractNumId w:val="4"/>
+  </w:num>
+  <w:num w:numId="15" w16cid:durableId="1423530884">
     <w:abstractNumId w:val="3"/>
   </w:num>
-  <w:num w:numId="15" w16cid:durableId="1423530884">
-    <w:abstractNumId w:val="2"/>
+  <w:num w:numId="16" w16cid:durableId="799149697">
+    <w:abstractNumId w:val="1"/>
   </w:num>
 </w:numbering>
 </file>

</xml_diff>

<commit_message>
Actualiza fuentes de datos con hoja 18PM
</commit_message>
<xml_diff>
--- a/Documentacion/Fuentes de Datos.docx
+++ b/Documentacion/Fuentes de Datos.docx
@@ -759,7 +759,27 @@
           <w:iCs/>
           <w:lang w:val="es-CO"/>
         </w:rPr>
-        <w:t>Censo Viterbo Caldas 2018/Data/Datasets/</w:t>
+        <w:t>Censo Viterbo Caldas 2018/Data/</w:t>
+      </w:r>
+      <w:proofErr w:type="spellStart"/>
+      <w:r>
+        <w:rPr>
+          <w:rFonts w:ascii="Arial" w:hAnsi="Arial" w:cs="Arial"/>
+          <w:i/>
+          <w:iCs/>
+          <w:lang w:val="es-CO"/>
+        </w:rPr>
+        <w:t>Datasets</w:t>
+      </w:r>
+      <w:proofErr w:type="spellEnd"/>
+      <w:r>
+        <w:rPr>
+          <w:rFonts w:ascii="Arial" w:hAnsi="Arial" w:cs="Arial"/>
+          <w:i/>
+          <w:iCs/>
+          <w:lang w:val="es-CO"/>
+        </w:rPr>
+        <w:t>/</w:t>
       </w:r>
     </w:p>
     <w:p>
@@ -2926,7 +2946,23 @@
           <w:rFonts w:ascii="Arial" w:hAnsi="Arial" w:cs="Arial"/>
           <w:lang w:val="es-CO"/>
         </w:rPr>
-        <w:t>(blank) (texto): Título en blanco, contiene las edades.</w:t>
+        <w:t>(</w:t>
+      </w:r>
+      <w:proofErr w:type="spellStart"/>
+      <w:r>
+        <w:rPr>
+          <w:rFonts w:ascii="Arial" w:hAnsi="Arial" w:cs="Arial"/>
+          <w:lang w:val="es-CO"/>
+        </w:rPr>
+        <w:t>blank</w:t>
+      </w:r>
+      <w:proofErr w:type="spellEnd"/>
+      <w:r>
+        <w:rPr>
+          <w:rFonts w:ascii="Arial" w:hAnsi="Arial" w:cs="Arial"/>
+          <w:lang w:val="es-CO"/>
+        </w:rPr>
+        <w:t>) (texto): Título en blanco, contiene las edades.</w:t>
       </w:r>
     </w:p>
     <w:p>
@@ -5033,7 +5069,23 @@
           <w:rFonts w:ascii="Arial" w:hAnsi="Arial" w:cs="Arial"/>
           <w:lang w:val="es-CO"/>
         </w:rPr>
-        <w:t>Gitano(a) o Rrom (entero): Cantidad de censados que se reconocen como gitanos o romaníes.</w:t>
+        <w:t xml:space="preserve">Gitano(a) o </w:t>
+      </w:r>
+      <w:proofErr w:type="spellStart"/>
+      <w:r>
+        <w:rPr>
+          <w:rFonts w:ascii="Arial" w:hAnsi="Arial" w:cs="Arial"/>
+          <w:lang w:val="es-CO"/>
+        </w:rPr>
+        <w:t>Rrom</w:t>
+      </w:r>
+      <w:proofErr w:type="spellEnd"/>
+      <w:r>
+        <w:rPr>
+          <w:rFonts w:ascii="Arial" w:hAnsi="Arial" w:cs="Arial"/>
+          <w:lang w:val="es-CO"/>
+        </w:rPr>
+        <w:t xml:space="preserve"> (entero): Cantidad de censados que se reconocen como gitanos o romaníes.</w:t>
       </w:r>
     </w:p>
     <w:p>
@@ -5053,7 +5105,23 @@
           <w:rFonts w:ascii="Arial" w:hAnsi="Arial" w:cs="Arial"/>
           <w:lang w:val="es-CO"/>
         </w:rPr>
-        <w:t>Raizal del Archipielago de San Andrés, Providencia y Santa Catalina (entero): Cantidad de censados que se reconocen como raizales del Archipiélago de San Andrés, Providencia y Santa Catalina.</w:t>
+        <w:t xml:space="preserve">Raizal del </w:t>
+      </w:r>
+      <w:proofErr w:type="spellStart"/>
+      <w:r>
+        <w:rPr>
+          <w:rFonts w:ascii="Arial" w:hAnsi="Arial" w:cs="Arial"/>
+          <w:lang w:val="es-CO"/>
+        </w:rPr>
+        <w:t>Archipielago</w:t>
+      </w:r>
+      <w:proofErr w:type="spellEnd"/>
+      <w:r>
+        <w:rPr>
+          <w:rFonts w:ascii="Arial" w:hAnsi="Arial" w:cs="Arial"/>
+          <w:lang w:val="es-CO"/>
+        </w:rPr>
+        <w:t xml:space="preserve"> de San Andrés, Providencia y Santa Catalina (entero): Cantidad de censados que se reconocen como raizales del Archipiélago de San Andrés, Providencia y Santa Catalina.</w:t>
       </w:r>
     </w:p>
     <w:p>
@@ -5329,7 +5397,23 @@
           <w:rFonts w:ascii="Arial" w:hAnsi="Arial" w:cs="Arial"/>
           <w:lang w:val="es-CO"/>
         </w:rPr>
-        <w:t>Gitano(a) o Rrom (entero): Cantidad de censados que se reconocen como gitanos o romaníes.</w:t>
+        <w:t xml:space="preserve">Gitano(a) o </w:t>
+      </w:r>
+      <w:proofErr w:type="spellStart"/>
+      <w:r>
+        <w:rPr>
+          <w:rFonts w:ascii="Arial" w:hAnsi="Arial" w:cs="Arial"/>
+          <w:lang w:val="es-CO"/>
+        </w:rPr>
+        <w:t>Rrom</w:t>
+      </w:r>
+      <w:proofErr w:type="spellEnd"/>
+      <w:r>
+        <w:rPr>
+          <w:rFonts w:ascii="Arial" w:hAnsi="Arial" w:cs="Arial"/>
+          <w:lang w:val="es-CO"/>
+        </w:rPr>
+        <w:t xml:space="preserve"> (entero): Cantidad de censados que se reconocen como gitanos o romaníes.</w:t>
       </w:r>
     </w:p>
     <w:p>
@@ -5349,7 +5433,23 @@
           <w:rFonts w:ascii="Arial" w:hAnsi="Arial" w:cs="Arial"/>
           <w:lang w:val="es-CO"/>
         </w:rPr>
-        <w:t>Raizal del Archipielago de San Andrés, Providencia y Santa Catalina (entero): Cantidad de censados que se reconocen como raizales del Archipiélago de San Andrés, Providencia y Santa Catalina.</w:t>
+        <w:t xml:space="preserve">Raizal del </w:t>
+      </w:r>
+      <w:proofErr w:type="spellStart"/>
+      <w:r>
+        <w:rPr>
+          <w:rFonts w:ascii="Arial" w:hAnsi="Arial" w:cs="Arial"/>
+          <w:lang w:val="es-CO"/>
+        </w:rPr>
+        <w:t>Archipielago</w:t>
+      </w:r>
+      <w:proofErr w:type="spellEnd"/>
+      <w:r>
+        <w:rPr>
+          <w:rFonts w:ascii="Arial" w:hAnsi="Arial" w:cs="Arial"/>
+          <w:lang w:val="es-CO"/>
+        </w:rPr>
+        <w:t xml:space="preserve"> de San Andrés, Providencia y Santa Catalina (entero): Cantidad de censados que se reconocen como raizales del Archipiélago de San Andrés, Providencia y Santa Catalina.</w:t>
       </w:r>
     </w:p>
     <w:p>
@@ -6699,21 +6799,7 @@
           <w:rFonts w:ascii="Arial" w:hAnsi="Arial" w:cs="Arial"/>
           <w:lang w:val="es-CO"/>
         </w:rPr>
-        <w:t xml:space="preserve">Primaria incompleta (entero): </w:t>
-      </w:r>
-      <w:r>
-        <w:rPr>
-          <w:rFonts w:ascii="Arial" w:hAnsi="Arial" w:cs="Arial"/>
-          <w:lang w:val="es-CO"/>
-        </w:rPr>
-        <w:t>Cantidad de censados cuyo máximo nivel educativo es</w:t>
-      </w:r>
-      <w:r>
-        <w:rPr>
-          <w:rFonts w:ascii="Arial" w:hAnsi="Arial" w:cs="Arial"/>
-          <w:lang w:val="es-CO"/>
-        </w:rPr>
-        <w:t xml:space="preserve"> primaria incompleta.</w:t>
+        <w:t>Primaria incompleta (entero): Cantidad de censados cuyo máximo nivel educativo es primaria incompleta.</w:t>
       </w:r>
     </w:p>
     <w:p>
@@ -6733,21 +6819,7 @@
           <w:rFonts w:ascii="Arial" w:hAnsi="Arial" w:cs="Arial"/>
           <w:lang w:val="es-CO"/>
         </w:rPr>
-        <w:t xml:space="preserve">Secundaria completa (entero): </w:t>
-      </w:r>
-      <w:r>
-        <w:rPr>
-          <w:rFonts w:ascii="Arial" w:hAnsi="Arial" w:cs="Arial"/>
-          <w:lang w:val="es-CO"/>
-        </w:rPr>
-        <w:t>Cantidad de censados cuyo máximo nivel educativo es</w:t>
-      </w:r>
-      <w:r>
-        <w:rPr>
-          <w:rFonts w:ascii="Arial" w:hAnsi="Arial" w:cs="Arial"/>
-          <w:lang w:val="es-CO"/>
-        </w:rPr>
-        <w:t xml:space="preserve"> secundaria completa.</w:t>
+        <w:t>Secundaria completa (entero): Cantidad de censados cuyo máximo nivel educativo es secundaria completa.</w:t>
       </w:r>
     </w:p>
     <w:p>
@@ -6767,21 +6839,7 @@
           <w:rFonts w:ascii="Arial" w:hAnsi="Arial" w:cs="Arial"/>
           <w:lang w:val="es-CO"/>
         </w:rPr>
-        <w:t xml:space="preserve">Secundaria incompleta (entero): </w:t>
-      </w:r>
-      <w:r>
-        <w:rPr>
-          <w:rFonts w:ascii="Arial" w:hAnsi="Arial" w:cs="Arial"/>
-          <w:lang w:val="es-CO"/>
-        </w:rPr>
-        <w:t>Cantidad de censados cuyo máximo nivel educativo es</w:t>
-      </w:r>
-      <w:r>
-        <w:rPr>
-          <w:rFonts w:ascii="Arial" w:hAnsi="Arial" w:cs="Arial"/>
-          <w:lang w:val="es-CO"/>
-        </w:rPr>
-        <w:t xml:space="preserve"> secundaria incompleta.</w:t>
+        <w:t>Secundaria incompleta (entero): Cantidad de censados cuyo máximo nivel educativo es secundaria incompleta.</w:t>
       </w:r>
     </w:p>
     <w:p>
@@ -6801,21 +6859,7 @@
           <w:rFonts w:ascii="Arial" w:hAnsi="Arial" w:cs="Arial"/>
           <w:lang w:val="es-CO"/>
         </w:rPr>
-        <w:t xml:space="preserve">Media Completa (entero): </w:t>
-      </w:r>
-      <w:r>
-        <w:rPr>
-          <w:rFonts w:ascii="Arial" w:hAnsi="Arial" w:cs="Arial"/>
-          <w:lang w:val="es-CO"/>
-        </w:rPr>
-        <w:t>Cantidad de censados cuyo máximo nivel educativo es</w:t>
-      </w:r>
-      <w:r>
-        <w:rPr>
-          <w:rFonts w:ascii="Arial" w:hAnsi="Arial" w:cs="Arial"/>
-          <w:lang w:val="es-CO"/>
-        </w:rPr>
-        <w:t xml:space="preserve"> educación media completa.</w:t>
+        <w:t>Media Completa (entero): Cantidad de censados cuyo máximo nivel educativo es educación media completa.</w:t>
       </w:r>
     </w:p>
     <w:p>
@@ -6835,21 +6879,7 @@
           <w:rFonts w:ascii="Arial" w:hAnsi="Arial" w:cs="Arial"/>
           <w:lang w:val="es-CO"/>
         </w:rPr>
-        <w:t xml:space="preserve">Media incompleta (entero): </w:t>
-      </w:r>
-      <w:r>
-        <w:rPr>
-          <w:rFonts w:ascii="Arial" w:hAnsi="Arial" w:cs="Arial"/>
-          <w:lang w:val="es-CO"/>
-        </w:rPr>
-        <w:t>Cantidad de censados cuyo máximo nivel educativo es</w:t>
-      </w:r>
-      <w:r>
-        <w:rPr>
-          <w:rFonts w:ascii="Arial" w:hAnsi="Arial" w:cs="Arial"/>
-          <w:lang w:val="es-CO"/>
-        </w:rPr>
-        <w:t xml:space="preserve"> educación media incompleta.</w:t>
+        <w:t>Media incompleta (entero): Cantidad de censados cuyo máximo nivel educativo es educación media incompleta.</w:t>
       </w:r>
     </w:p>
     <w:p>
@@ -6869,21 +6899,7 @@
           <w:rFonts w:ascii="Arial" w:hAnsi="Arial" w:cs="Arial"/>
           <w:lang w:val="es-CO"/>
         </w:rPr>
-        <w:t xml:space="preserve">Normal completa (entero): </w:t>
-      </w:r>
-      <w:r>
-        <w:rPr>
-          <w:rFonts w:ascii="Arial" w:hAnsi="Arial" w:cs="Arial"/>
-          <w:lang w:val="es-CO"/>
-        </w:rPr>
-        <w:t>Cantidad de censados cuyo máximo nivel educativo es</w:t>
-      </w:r>
-      <w:r>
-        <w:rPr>
-          <w:rFonts w:ascii="Arial" w:hAnsi="Arial" w:cs="Arial"/>
-          <w:lang w:val="es-CO"/>
-        </w:rPr>
-        <w:t xml:space="preserve"> educación normal completa.</w:t>
+        <w:t>Normal completa (entero): Cantidad de censados cuyo máximo nivel educativo es educación normal completa.</w:t>
       </w:r>
     </w:p>
     <w:p>
@@ -6903,21 +6919,7 @@
           <w:rFonts w:ascii="Arial" w:hAnsi="Arial" w:cs="Arial"/>
           <w:lang w:val="es-CO"/>
         </w:rPr>
-        <w:t xml:space="preserve">Normal incompleta (entero): </w:t>
-      </w:r>
-      <w:r>
-        <w:rPr>
-          <w:rFonts w:ascii="Arial" w:hAnsi="Arial" w:cs="Arial"/>
-          <w:lang w:val="es-CO"/>
-        </w:rPr>
-        <w:t>Cantidad de censados cuyo máximo nivel educativo es</w:t>
-      </w:r>
-      <w:r>
-        <w:rPr>
-          <w:rFonts w:ascii="Arial" w:hAnsi="Arial" w:cs="Arial"/>
-          <w:lang w:val="es-CO"/>
-        </w:rPr>
-        <w:t xml:space="preserve"> educación normal incompleta.</w:t>
+        <w:t>Normal incompleta (entero): Cantidad de censados cuyo máximo nivel educativo es educación normal incompleta.</w:t>
       </w:r>
     </w:p>
     <w:p>
@@ -6932,26 +6934,21 @@
           <w:lang w:val="es-CO"/>
         </w:rPr>
       </w:pPr>
-      <w:r>
-        <w:rPr>
-          <w:rFonts w:ascii="Arial" w:hAnsi="Arial" w:cs="Arial"/>
-          <w:lang w:val="es-CO"/>
-        </w:rPr>
-        <w:t xml:space="preserve">Tecnico (entero): </w:t>
-      </w:r>
-      <w:r>
-        <w:rPr>
-          <w:rFonts w:ascii="Arial" w:hAnsi="Arial" w:cs="Arial"/>
-          <w:lang w:val="es-CO"/>
-        </w:rPr>
-        <w:t>Cantidad de censados cuyo máximo nivel educativo es</w:t>
-      </w:r>
-      <w:r>
-        <w:rPr>
-          <w:rFonts w:ascii="Arial" w:hAnsi="Arial" w:cs="Arial"/>
-          <w:lang w:val="es-CO"/>
-        </w:rPr>
-        <w:t xml:space="preserve"> técnico.</w:t>
+      <w:proofErr w:type="spellStart"/>
+      <w:r>
+        <w:rPr>
+          <w:rFonts w:ascii="Arial" w:hAnsi="Arial" w:cs="Arial"/>
+          <w:lang w:val="es-CO"/>
+        </w:rPr>
+        <w:t>Tecnico</w:t>
+      </w:r>
+      <w:proofErr w:type="spellEnd"/>
+      <w:r>
+        <w:rPr>
+          <w:rFonts w:ascii="Arial" w:hAnsi="Arial" w:cs="Arial"/>
+          <w:lang w:val="es-CO"/>
+        </w:rPr>
+        <w:t xml:space="preserve"> (entero): Cantidad de censados cuyo máximo nivel educativo es técnico.</w:t>
       </w:r>
     </w:p>
     <w:p>
@@ -6971,21 +6968,7 @@
           <w:rFonts w:ascii="Arial" w:hAnsi="Arial" w:cs="Arial"/>
           <w:lang w:val="es-CO"/>
         </w:rPr>
-        <w:t xml:space="preserve">Tecnológico (entero): </w:t>
-      </w:r>
-      <w:r>
-        <w:rPr>
-          <w:rFonts w:ascii="Arial" w:hAnsi="Arial" w:cs="Arial"/>
-          <w:lang w:val="es-CO"/>
-        </w:rPr>
-        <w:t>Cantidad de censados cuyo máximo nivel educativo es</w:t>
-      </w:r>
-      <w:r>
-        <w:rPr>
-          <w:rFonts w:ascii="Arial" w:hAnsi="Arial" w:cs="Arial"/>
-          <w:lang w:val="es-CO"/>
-        </w:rPr>
-        <w:t xml:space="preserve"> tecnológico.</w:t>
+        <w:t>Tecnológico (entero): Cantidad de censados cuyo máximo nivel educativo es tecnológico.</w:t>
       </w:r>
     </w:p>
     <w:p>
@@ -7005,21 +6988,7 @@
           <w:rFonts w:ascii="Arial" w:hAnsi="Arial" w:cs="Arial"/>
           <w:lang w:val="es-CO"/>
         </w:rPr>
-        <w:t xml:space="preserve">Universitario (entero): </w:t>
-      </w:r>
-      <w:r>
-        <w:rPr>
-          <w:rFonts w:ascii="Arial" w:hAnsi="Arial" w:cs="Arial"/>
-          <w:lang w:val="es-CO"/>
-        </w:rPr>
-        <w:t>Cantidad de censados cuyo máximo nivel educativo es</w:t>
-      </w:r>
-      <w:r>
-        <w:rPr>
-          <w:rFonts w:ascii="Arial" w:hAnsi="Arial" w:cs="Arial"/>
-          <w:lang w:val="es-CO"/>
-        </w:rPr>
-        <w:t xml:space="preserve"> universitario.</w:t>
+        <w:t>Universitario (entero): Cantidad de censados cuyo máximo nivel educativo es universitario.</w:t>
       </w:r>
     </w:p>
     <w:p>
@@ -7039,21 +7008,7 @@
           <w:rFonts w:ascii="Arial" w:hAnsi="Arial" w:cs="Arial"/>
           <w:lang w:val="es-CO"/>
         </w:rPr>
-        <w:t xml:space="preserve">Especialización, Maestría, Doctorado (entero): </w:t>
-      </w:r>
-      <w:r>
-        <w:rPr>
-          <w:rFonts w:ascii="Arial" w:hAnsi="Arial" w:cs="Arial"/>
-          <w:lang w:val="es-CO"/>
-        </w:rPr>
-        <w:t>Cantidad de censados cuyo máximo nivel educativo es</w:t>
-      </w:r>
-      <w:r>
-        <w:rPr>
-          <w:rFonts w:ascii="Arial" w:hAnsi="Arial" w:cs="Arial"/>
-          <w:lang w:val="es-CO"/>
-        </w:rPr>
-        <w:t xml:space="preserve"> especialización maestría o doctorado.</w:t>
+        <w:t>Especialización, Maestría, Doctorado (entero): Cantidad de censados cuyo máximo nivel educativo es especialización maestría o doctorado.</w:t>
       </w:r>
     </w:p>
     <w:p>
@@ -7073,22 +7028,325 @@
           <w:rFonts w:ascii="Arial" w:hAnsi="Arial" w:cs="Arial"/>
           <w:lang w:val="es-CO"/>
         </w:rPr>
-        <w:t xml:space="preserve">Sin información (entero): </w:t>
-      </w:r>
-      <w:r>
-        <w:rPr>
-          <w:rFonts w:ascii="Arial" w:hAnsi="Arial" w:cs="Arial"/>
-          <w:lang w:val="es-CO"/>
-        </w:rPr>
-        <w:t xml:space="preserve">Cantidad de censados </w:t>
-      </w:r>
-      <w:r>
-        <w:rPr>
-          <w:rFonts w:ascii="Arial" w:hAnsi="Arial" w:cs="Arial"/>
-          <w:lang w:val="es-CO"/>
-        </w:rPr>
-        <w:t>de los cuales no se tiene información acerca de su nivel educativo.</w:t>
-      </w:r>
+        <w:t>Sin información (entero): Cantidad de censados de los cuales no se tiene información acerca de su nivel educativo.</w:t>
+      </w:r>
+    </w:p>
+    <w:p>
+      <w:pPr>
+        <w:rPr>
+          <w:rFonts w:ascii="Arial" w:hAnsi="Arial" w:cs="Arial"/>
+          <w:lang w:val="es-CO"/>
+        </w:rPr>
+      </w:pPr>
+    </w:p>
+    <w:p>
+      <w:pPr>
+        <w:rPr>
+          <w:rFonts w:ascii="Arial" w:hAnsi="Arial" w:cs="Arial"/>
+          <w:b/>
+          <w:bCs/>
+          <w:lang w:val="es-CO"/>
+        </w:rPr>
+      </w:pPr>
+      <w:r>
+        <w:rPr>
+          <w:rFonts w:ascii="Arial" w:hAnsi="Arial" w:cs="Arial"/>
+          <w:b/>
+          <w:bCs/>
+          <w:lang w:val="es-CO"/>
+        </w:rPr>
+        <w:t>18PM</w:t>
+      </w:r>
+    </w:p>
+    <w:p>
+      <w:pPr>
+        <w:rPr>
+          <w:rFonts w:ascii="Arial" w:hAnsi="Arial" w:cs="Arial"/>
+          <w:lang w:val="es-CO"/>
+        </w:rPr>
+      </w:pPr>
+      <w:r>
+        <w:rPr>
+          <w:rFonts w:ascii="Arial" w:hAnsi="Arial" w:cs="Arial"/>
+          <w:lang w:val="es-CO"/>
+        </w:rPr>
+        <w:t xml:space="preserve">Contiene 3 columnas fuertemente agrupadas por </w:t>
+      </w:r>
+      <w:r>
+        <w:rPr>
+          <w:rFonts w:ascii="Arial" w:hAnsi="Arial" w:cs="Arial"/>
+          <w:i/>
+          <w:iCs/>
+          <w:lang w:val="es-CO"/>
+        </w:rPr>
+        <w:t>Total</w:t>
+      </w:r>
+      <w:r>
+        <w:rPr>
+          <w:rFonts w:ascii="Arial" w:hAnsi="Arial" w:cs="Arial"/>
+          <w:lang w:val="es-CO"/>
+        </w:rPr>
+        <w:t xml:space="preserve"> (resumen total de datos), </w:t>
+      </w:r>
+      <w:r>
+        <w:rPr>
+          <w:rFonts w:ascii="Arial" w:hAnsi="Arial" w:cs="Arial"/>
+          <w:i/>
+          <w:iCs/>
+          <w:lang w:val="es-CO"/>
+        </w:rPr>
+        <w:t>Si</w:t>
+      </w:r>
+      <w:r>
+        <w:rPr>
+          <w:rFonts w:ascii="Arial" w:hAnsi="Arial" w:cs="Arial"/>
+          <w:lang w:val="es-CO"/>
+        </w:rPr>
+        <w:t xml:space="preserve"> (grupo con datos correspondientes a los censados que</w:t>
+      </w:r>
+      <w:r>
+        <w:rPr>
+          <w:rFonts w:ascii="Arial" w:hAnsi="Arial" w:cs="Arial"/>
+          <w:lang w:val="es-CO"/>
+        </w:rPr>
+        <w:t xml:space="preserve"> asisten a alguna institución educativa</w:t>
+      </w:r>
+      <w:r>
+        <w:rPr>
+          <w:rFonts w:ascii="Arial" w:hAnsi="Arial" w:cs="Arial"/>
+          <w:lang w:val="es-CO"/>
+        </w:rPr>
+        <w:t xml:space="preserve">), </w:t>
+      </w:r>
+      <w:r>
+        <w:rPr>
+          <w:rFonts w:ascii="Arial" w:hAnsi="Arial" w:cs="Arial"/>
+          <w:i/>
+          <w:iCs/>
+          <w:lang w:val="es-CO"/>
+        </w:rPr>
+        <w:t xml:space="preserve">No </w:t>
+      </w:r>
+      <w:r>
+        <w:rPr>
+          <w:rFonts w:ascii="Arial" w:hAnsi="Arial" w:cs="Arial"/>
+          <w:lang w:val="es-CO"/>
+        </w:rPr>
+        <w:t xml:space="preserve">(grupo con datos correspondientes a los censados que asisten a alguna institución educativa), </w:t>
+      </w:r>
+      <w:r>
+        <w:rPr>
+          <w:rFonts w:ascii="Arial" w:hAnsi="Arial" w:cs="Arial"/>
+          <w:i/>
+          <w:iCs/>
+          <w:lang w:val="es-CO"/>
+        </w:rPr>
+        <w:t xml:space="preserve">Sin información </w:t>
+      </w:r>
+      <w:r>
+        <w:rPr>
+          <w:rFonts w:ascii="Arial" w:hAnsi="Arial" w:cs="Arial"/>
+          <w:lang w:val="es-CO"/>
+        </w:rPr>
+        <w:t xml:space="preserve">(grupo con datos correspondientes a los censados de los cuales no se conoce si </w:t>
+      </w:r>
+      <w:r>
+        <w:rPr>
+          <w:rFonts w:ascii="Arial" w:hAnsi="Arial" w:cs="Arial"/>
+          <w:lang w:val="es-CO"/>
+        </w:rPr>
+        <w:t>asisten a alguna institución educativa</w:t>
+      </w:r>
+      <w:r>
+        <w:rPr>
+          <w:rFonts w:ascii="Arial" w:hAnsi="Arial" w:cs="Arial"/>
+          <w:lang w:val="es-CO"/>
+        </w:rPr>
+        <w:t>)</w:t>
+      </w:r>
+    </w:p>
+    <w:p>
+      <w:pPr>
+        <w:rPr>
+          <w:rFonts w:ascii="Arial" w:hAnsi="Arial" w:cs="Arial"/>
+          <w:lang w:val="es-CO"/>
+        </w:rPr>
+      </w:pPr>
+      <w:r>
+        <w:rPr>
+          <w:rFonts w:ascii="Arial" w:hAnsi="Arial" w:cs="Arial"/>
+          <w:lang w:val="es-CO"/>
+        </w:rPr>
+        <w:t>Contiene 3 agrupaciones.</w:t>
+      </w:r>
+    </w:p>
+    <w:p>
+      <w:pPr>
+        <w:rPr>
+          <w:rFonts w:ascii="Arial" w:hAnsi="Arial" w:cs="Arial"/>
+          <w:lang w:val="es-CO"/>
+        </w:rPr>
+      </w:pPr>
+      <w:r>
+        <w:rPr>
+          <w:rFonts w:ascii="Arial" w:hAnsi="Arial" w:cs="Arial"/>
+          <w:lang w:val="es-CO"/>
+        </w:rPr>
+        <w:t>Columnas:</w:t>
+      </w:r>
+    </w:p>
+    <w:p>
+      <w:pPr>
+        <w:pStyle w:val="Prrafodelista"/>
+        <w:numPr>
+          <w:ilvl w:val="0"/>
+          <w:numId w:val="14"/>
+        </w:numPr>
+        <w:rPr>
+          <w:rFonts w:ascii="Arial" w:hAnsi="Arial" w:cs="Arial"/>
+          <w:lang w:val="es-CO"/>
+        </w:rPr>
+      </w:pPr>
+      <w:r>
+        <w:rPr>
+          <w:rFonts w:ascii="Arial" w:hAnsi="Arial" w:cs="Arial"/>
+          <w:lang w:val="es-CO"/>
+        </w:rPr>
+        <w:t>Total (entero): Cantidad total.</w:t>
+      </w:r>
+    </w:p>
+    <w:p>
+      <w:pPr>
+        <w:pStyle w:val="Prrafodelista"/>
+        <w:numPr>
+          <w:ilvl w:val="0"/>
+          <w:numId w:val="14"/>
+        </w:numPr>
+        <w:rPr>
+          <w:rFonts w:ascii="Arial" w:hAnsi="Arial" w:cs="Arial"/>
+          <w:lang w:val="es-CO"/>
+        </w:rPr>
+      </w:pPr>
+      <w:r>
+        <w:rPr>
+          <w:rFonts w:ascii="Arial" w:hAnsi="Arial" w:cs="Arial"/>
+          <w:lang w:val="es-CO"/>
+        </w:rPr>
+        <w:t>Hombre (entero): Cantidad de hombres.</w:t>
+      </w:r>
+    </w:p>
+    <w:p>
+      <w:pPr>
+        <w:pStyle w:val="Prrafodelista"/>
+        <w:numPr>
+          <w:ilvl w:val="0"/>
+          <w:numId w:val="14"/>
+        </w:numPr>
+        <w:rPr>
+          <w:rFonts w:ascii="Arial" w:hAnsi="Arial" w:cs="Arial"/>
+          <w:lang w:val="es-CO"/>
+        </w:rPr>
+      </w:pPr>
+      <w:r>
+        <w:rPr>
+          <w:rFonts w:ascii="Arial" w:hAnsi="Arial" w:cs="Arial"/>
+          <w:lang w:val="es-CO"/>
+        </w:rPr>
+        <w:lastRenderedPageBreak/>
+        <w:t>Mujer (entero): Cantidad de mujeres.</w:t>
+      </w:r>
+    </w:p>
+    <w:p>
+      <w:pPr>
+        <w:rPr>
+          <w:rFonts w:ascii="Arial" w:hAnsi="Arial" w:cs="Arial"/>
+          <w:lang w:val="es-CO"/>
+        </w:rPr>
+      </w:pPr>
+      <w:r>
+        <w:rPr>
+          <w:rFonts w:ascii="Arial" w:hAnsi="Arial" w:cs="Arial"/>
+          <w:lang w:val="es-CO"/>
+        </w:rPr>
+        <w:t>Agrupaciones:</w:t>
+      </w:r>
+    </w:p>
+    <w:p>
+      <w:pPr>
+        <w:pStyle w:val="Prrafodelista"/>
+        <w:numPr>
+          <w:ilvl w:val="0"/>
+          <w:numId w:val="3"/>
+        </w:numPr>
+        <w:rPr>
+          <w:rFonts w:ascii="Arial" w:hAnsi="Arial" w:cs="Arial"/>
+          <w:lang w:val="es-CO"/>
+        </w:rPr>
+      </w:pPr>
+      <w:r>
+        <w:rPr>
+          <w:rFonts w:ascii="Arial" w:hAnsi="Arial" w:cs="Arial"/>
+          <w:lang w:val="es-CO"/>
+        </w:rPr>
+        <w:t>Total: Grupo con resumen de datos totales.</w:t>
+      </w:r>
+    </w:p>
+    <w:p>
+      <w:pPr>
+        <w:pStyle w:val="Prrafodelista"/>
+        <w:numPr>
+          <w:ilvl w:val="0"/>
+          <w:numId w:val="3"/>
+        </w:numPr>
+        <w:rPr>
+          <w:rFonts w:ascii="Arial" w:hAnsi="Arial" w:cs="Arial"/>
+          <w:lang w:val="es-CO"/>
+        </w:rPr>
+      </w:pPr>
+      <w:r>
+        <w:rPr>
+          <w:rFonts w:ascii="Arial" w:hAnsi="Arial" w:cs="Arial"/>
+          <w:lang w:val="es-CO"/>
+        </w:rPr>
+        <w:t>Cabecera: Grupo con resumen de datos correspondientes a las cabeceras municipales</w:t>
+      </w:r>
+    </w:p>
+    <w:p>
+      <w:pPr>
+        <w:pStyle w:val="Prrafodelista"/>
+        <w:numPr>
+          <w:ilvl w:val="0"/>
+          <w:numId w:val="3"/>
+        </w:numPr>
+        <w:rPr>
+          <w:rFonts w:ascii="Arial" w:hAnsi="Arial" w:cs="Arial"/>
+          <w:lang w:val="es-CO"/>
+        </w:rPr>
+      </w:pPr>
+      <w:r>
+        <w:rPr>
+          <w:rFonts w:ascii="Arial" w:hAnsi="Arial" w:cs="Arial"/>
+          <w:lang w:val="es-CO"/>
+        </w:rPr>
+        <w:t>Rural disperso: Grupo con resumen de datos correspondientes a ciudadanos que habitan en las zonas rurales, pero no en centros poblados.</w:t>
+      </w:r>
+    </w:p>
+    <w:p>
+      <w:pPr>
+        <w:pStyle w:val="Prrafodelista"/>
+        <w:rPr>
+          <w:rFonts w:ascii="Arial" w:hAnsi="Arial" w:cs="Arial"/>
+          <w:lang w:val="es-CO"/>
+        </w:rPr>
+      </w:pPr>
+    </w:p>
+    <w:p>
+      <w:pPr>
+        <w:rPr>
+          <w:rFonts w:ascii="Arial" w:hAnsi="Arial" w:cs="Arial"/>
+          <w:lang w:val="es-CO"/>
+        </w:rPr>
+      </w:pPr>
     </w:p>
     <w:sectPr>
       <w:pgSz w:w="12240" w:h="15840"/>
@@ -7216,6 +7474,119 @@
     </w:lvl>
   </w:abstractNum>
   <w:abstractNum w:abstractNumId="1" w15:restartNumberingAfterBreak="0">
+    <w:nsid w:val="0E35477E"/>
+    <w:multiLevelType w:val="hybridMultilevel"/>
+    <w:tmpl w:val="DEE6A864"/>
+    <w:lvl w:ilvl="0" w:tplc="04090001">
+      <w:start w:val="1"/>
+      <w:numFmt w:val="bullet"/>
+      <w:lvlText w:val=""/>
+      <w:lvlJc w:val="left"/>
+      <w:pPr>
+        <w:ind w:left="720" w:hanging="360"/>
+      </w:pPr>
+      <w:rPr>
+        <w:rFonts w:ascii="Symbol" w:hAnsi="Symbol" w:hint="default"/>
+      </w:rPr>
+    </w:lvl>
+    <w:lvl w:ilvl="1" w:tplc="04090003" w:tentative="1">
+      <w:start w:val="1"/>
+      <w:numFmt w:val="bullet"/>
+      <w:lvlText w:val="o"/>
+      <w:lvlJc w:val="left"/>
+      <w:pPr>
+        <w:ind w:left="1440" w:hanging="360"/>
+      </w:pPr>
+      <w:rPr>
+        <w:rFonts w:ascii="Courier New" w:hAnsi="Courier New" w:cs="Courier New" w:hint="default"/>
+      </w:rPr>
+    </w:lvl>
+    <w:lvl w:ilvl="2" w:tplc="04090005" w:tentative="1">
+      <w:start w:val="1"/>
+      <w:numFmt w:val="bullet"/>
+      <w:lvlText w:val=""/>
+      <w:lvlJc w:val="left"/>
+      <w:pPr>
+        <w:ind w:left="2160" w:hanging="360"/>
+      </w:pPr>
+      <w:rPr>
+        <w:rFonts w:ascii="Wingdings" w:hAnsi="Wingdings" w:hint="default"/>
+      </w:rPr>
+    </w:lvl>
+    <w:lvl w:ilvl="3" w:tplc="04090001" w:tentative="1">
+      <w:start w:val="1"/>
+      <w:numFmt w:val="bullet"/>
+      <w:lvlText w:val=""/>
+      <w:lvlJc w:val="left"/>
+      <w:pPr>
+        <w:ind w:left="2880" w:hanging="360"/>
+      </w:pPr>
+      <w:rPr>
+        <w:rFonts w:ascii="Symbol" w:hAnsi="Symbol" w:hint="default"/>
+      </w:rPr>
+    </w:lvl>
+    <w:lvl w:ilvl="4" w:tplc="04090003" w:tentative="1">
+      <w:start w:val="1"/>
+      <w:numFmt w:val="bullet"/>
+      <w:lvlText w:val="o"/>
+      <w:lvlJc w:val="left"/>
+      <w:pPr>
+        <w:ind w:left="3600" w:hanging="360"/>
+      </w:pPr>
+      <w:rPr>
+        <w:rFonts w:ascii="Courier New" w:hAnsi="Courier New" w:cs="Courier New" w:hint="default"/>
+      </w:rPr>
+    </w:lvl>
+    <w:lvl w:ilvl="5" w:tplc="04090005" w:tentative="1">
+      <w:start w:val="1"/>
+      <w:numFmt w:val="bullet"/>
+      <w:lvlText w:val=""/>
+      <w:lvlJc w:val="left"/>
+      <w:pPr>
+        <w:ind w:left="4320" w:hanging="360"/>
+      </w:pPr>
+      <w:rPr>
+        <w:rFonts w:ascii="Wingdings" w:hAnsi="Wingdings" w:hint="default"/>
+      </w:rPr>
+    </w:lvl>
+    <w:lvl w:ilvl="6" w:tplc="04090001" w:tentative="1">
+      <w:start w:val="1"/>
+      <w:numFmt w:val="bullet"/>
+      <w:lvlText w:val=""/>
+      <w:lvlJc w:val="left"/>
+      <w:pPr>
+        <w:ind w:left="5040" w:hanging="360"/>
+      </w:pPr>
+      <w:rPr>
+        <w:rFonts w:ascii="Symbol" w:hAnsi="Symbol" w:hint="default"/>
+      </w:rPr>
+    </w:lvl>
+    <w:lvl w:ilvl="7" w:tplc="04090003" w:tentative="1">
+      <w:start w:val="1"/>
+      <w:numFmt w:val="bullet"/>
+      <w:lvlText w:val="o"/>
+      <w:lvlJc w:val="left"/>
+      <w:pPr>
+        <w:ind w:left="5760" w:hanging="360"/>
+      </w:pPr>
+      <w:rPr>
+        <w:rFonts w:ascii="Courier New" w:hAnsi="Courier New" w:cs="Courier New" w:hint="default"/>
+      </w:rPr>
+    </w:lvl>
+    <w:lvl w:ilvl="8" w:tplc="04090005" w:tentative="1">
+      <w:start w:val="1"/>
+      <w:numFmt w:val="bullet"/>
+      <w:lvlText w:val=""/>
+      <w:lvlJc w:val="left"/>
+      <w:pPr>
+        <w:ind w:left="6480" w:hanging="360"/>
+      </w:pPr>
+      <w:rPr>
+        <w:rFonts w:ascii="Wingdings" w:hAnsi="Wingdings" w:hint="default"/>
+      </w:rPr>
+    </w:lvl>
+  </w:abstractNum>
+  <w:abstractNum w:abstractNumId="2" w15:restartNumberingAfterBreak="0">
     <w:nsid w:val="19A165BB"/>
     <w:multiLevelType w:val="hybridMultilevel"/>
     <w:tmpl w:val="FEF24976"/>
@@ -7328,7 +7699,7 @@
       </w:rPr>
     </w:lvl>
   </w:abstractNum>
-  <w:abstractNum w:abstractNumId="2" w15:restartNumberingAfterBreak="0">
+  <w:abstractNum w:abstractNumId="3" w15:restartNumberingAfterBreak="0">
     <w:nsid w:val="1AE62D74"/>
     <w:multiLevelType w:val="hybridMultilevel"/>
     <w:tmpl w:val="CA0E2AF4"/>
@@ -7441,7 +7812,7 @@
       </w:rPr>
     </w:lvl>
   </w:abstractNum>
-  <w:abstractNum w:abstractNumId="3" w15:restartNumberingAfterBreak="0">
+  <w:abstractNum w:abstractNumId="4" w15:restartNumberingAfterBreak="0">
     <w:nsid w:val="251E3883"/>
     <w:multiLevelType w:val="hybridMultilevel"/>
     <w:tmpl w:val="79007C6E"/>
@@ -7554,7 +7925,7 @@
       </w:rPr>
     </w:lvl>
   </w:abstractNum>
-  <w:abstractNum w:abstractNumId="4" w15:restartNumberingAfterBreak="0">
+  <w:abstractNum w:abstractNumId="5" w15:restartNumberingAfterBreak="0">
     <w:nsid w:val="30E02CDF"/>
     <w:multiLevelType w:val="hybridMultilevel"/>
     <w:tmpl w:val="41F842BA"/>
@@ -7667,7 +8038,7 @@
       </w:rPr>
     </w:lvl>
   </w:abstractNum>
-  <w:abstractNum w:abstractNumId="5" w15:restartNumberingAfterBreak="0">
+  <w:abstractNum w:abstractNumId="6" w15:restartNumberingAfterBreak="0">
     <w:nsid w:val="36ED691A"/>
     <w:multiLevelType w:val="hybridMultilevel"/>
     <w:tmpl w:val="56FC6232"/>
@@ -7780,7 +8151,7 @@
       </w:rPr>
     </w:lvl>
   </w:abstractNum>
-  <w:abstractNum w:abstractNumId="6" w15:restartNumberingAfterBreak="0">
+  <w:abstractNum w:abstractNumId="7" w15:restartNumberingAfterBreak="0">
     <w:nsid w:val="4DD52E8B"/>
     <w:multiLevelType w:val="hybridMultilevel"/>
     <w:tmpl w:val="B000A1DE"/>
@@ -7893,7 +8264,7 @@
       </w:rPr>
     </w:lvl>
   </w:abstractNum>
-  <w:abstractNum w:abstractNumId="7" w15:restartNumberingAfterBreak="0">
+  <w:abstractNum w:abstractNumId="8" w15:restartNumberingAfterBreak="0">
     <w:nsid w:val="521C4194"/>
     <w:multiLevelType w:val="hybridMultilevel"/>
     <w:tmpl w:val="0542FC48"/>
@@ -8006,7 +8377,7 @@
       </w:rPr>
     </w:lvl>
   </w:abstractNum>
-  <w:abstractNum w:abstractNumId="8" w15:restartNumberingAfterBreak="0">
+  <w:abstractNum w:abstractNumId="9" w15:restartNumberingAfterBreak="0">
     <w:nsid w:val="52D63117"/>
     <w:multiLevelType w:val="hybridMultilevel"/>
     <w:tmpl w:val="036E0984"/>
@@ -8119,7 +8490,7 @@
       </w:rPr>
     </w:lvl>
   </w:abstractNum>
-  <w:abstractNum w:abstractNumId="9" w15:restartNumberingAfterBreak="0">
+  <w:abstractNum w:abstractNumId="10" w15:restartNumberingAfterBreak="0">
     <w:nsid w:val="55821CAC"/>
     <w:multiLevelType w:val="hybridMultilevel"/>
     <w:tmpl w:val="61F8020E"/>
@@ -8232,7 +8603,7 @@
       </w:rPr>
     </w:lvl>
   </w:abstractNum>
-  <w:abstractNum w:abstractNumId="10" w15:restartNumberingAfterBreak="0">
+  <w:abstractNum w:abstractNumId="11" w15:restartNumberingAfterBreak="0">
     <w:nsid w:val="608B0027"/>
     <w:multiLevelType w:val="hybridMultilevel"/>
     <w:tmpl w:val="1A2A0CCE"/>
@@ -8345,7 +8716,7 @@
       </w:rPr>
     </w:lvl>
   </w:abstractNum>
-  <w:abstractNum w:abstractNumId="11" w15:restartNumberingAfterBreak="0">
+  <w:abstractNum w:abstractNumId="12" w15:restartNumberingAfterBreak="0">
     <w:nsid w:val="6B39307D"/>
     <w:multiLevelType w:val="hybridMultilevel"/>
     <w:tmpl w:val="BE94EE76"/>
@@ -8458,7 +8829,7 @@
       </w:rPr>
     </w:lvl>
   </w:abstractNum>
-  <w:abstractNum w:abstractNumId="12" w15:restartNumberingAfterBreak="0">
+  <w:abstractNum w:abstractNumId="13" w15:restartNumberingAfterBreak="0">
     <w:nsid w:val="6EF91E29"/>
     <w:multiLevelType w:val="hybridMultilevel"/>
     <w:tmpl w:val="90A0CFD2"/>
@@ -8571,7 +8942,7 @@
       </w:rPr>
     </w:lvl>
   </w:abstractNum>
-  <w:abstractNum w:abstractNumId="13" w15:restartNumberingAfterBreak="0">
+  <w:abstractNum w:abstractNumId="14" w15:restartNumberingAfterBreak="0">
     <w:nsid w:val="736117B3"/>
     <w:multiLevelType w:val="hybridMultilevel"/>
     <w:tmpl w:val="B902F320"/>
@@ -8684,7 +9055,7 @@
       </w:rPr>
     </w:lvl>
   </w:abstractNum>
-  <w:abstractNum w:abstractNumId="14" w15:restartNumberingAfterBreak="0">
+  <w:abstractNum w:abstractNumId="15" w15:restartNumberingAfterBreak="0">
     <w:nsid w:val="73AA7E9E"/>
     <w:multiLevelType w:val="hybridMultilevel"/>
     <w:tmpl w:val="8EAE28E8"/>
@@ -8797,7 +9168,7 @@
       </w:rPr>
     </w:lvl>
   </w:abstractNum>
-  <w:abstractNum w:abstractNumId="15" w15:restartNumberingAfterBreak="0">
+  <w:abstractNum w:abstractNumId="16" w15:restartNumberingAfterBreak="0">
     <w:nsid w:val="79993F7C"/>
     <w:multiLevelType w:val="hybridMultilevel"/>
     <w:tmpl w:val="8F9A8314"/>
@@ -8911,51 +9282,54 @@
     </w:lvl>
   </w:abstractNum>
   <w:num w:numId="1" w16cid:durableId="824902107">
-    <w:abstractNumId w:val="10"/>
+    <w:abstractNumId w:val="11"/>
   </w:num>
   <w:num w:numId="2" w16cid:durableId="617299781">
+    <w:abstractNumId w:val="13"/>
+  </w:num>
+  <w:num w:numId="3" w16cid:durableId="1048263498">
+    <w:abstractNumId w:val="9"/>
+  </w:num>
+  <w:num w:numId="4" w16cid:durableId="237983024">
+    <w:abstractNumId w:val="8"/>
+  </w:num>
+  <w:num w:numId="5" w16cid:durableId="325859572">
+    <w:abstractNumId w:val="3"/>
+  </w:num>
+  <w:num w:numId="6" w16cid:durableId="398870548">
     <w:abstractNumId w:val="12"/>
   </w:num>
-  <w:num w:numId="3" w16cid:durableId="1048263498">
-    <w:abstractNumId w:val="8"/>
-  </w:num>
-  <w:num w:numId="4" w16cid:durableId="237983024">
-    <w:abstractNumId w:val="7"/>
-  </w:num>
-  <w:num w:numId="5" w16cid:durableId="325859572">
-    <w:abstractNumId w:val="2"/>
-  </w:num>
-  <w:num w:numId="6" w16cid:durableId="398870548">
-    <w:abstractNumId w:val="11"/>
-  </w:num>
   <w:num w:numId="7" w16cid:durableId="1317153043">
-    <w:abstractNumId w:val="13"/>
+    <w:abstractNumId w:val="14"/>
   </w:num>
   <w:num w:numId="8" w16cid:durableId="430202784">
-    <w:abstractNumId w:val="5"/>
+    <w:abstractNumId w:val="6"/>
   </w:num>
   <w:num w:numId="9" w16cid:durableId="1169177289">
-    <w:abstractNumId w:val="14"/>
+    <w:abstractNumId w:val="15"/>
   </w:num>
   <w:num w:numId="10" w16cid:durableId="965619825">
     <w:abstractNumId w:val="0"/>
   </w:num>
   <w:num w:numId="11" w16cid:durableId="1154027656">
-    <w:abstractNumId w:val="9"/>
+    <w:abstractNumId w:val="10"/>
   </w:num>
   <w:num w:numId="12" w16cid:durableId="867530551">
-    <w:abstractNumId w:val="6"/>
+    <w:abstractNumId w:val="7"/>
   </w:num>
   <w:num w:numId="13" w16cid:durableId="464351712">
-    <w:abstractNumId w:val="15"/>
+    <w:abstractNumId w:val="16"/>
   </w:num>
   <w:num w:numId="14" w16cid:durableId="676274769">
+    <w:abstractNumId w:val="5"/>
+  </w:num>
+  <w:num w:numId="15" w16cid:durableId="1423530884">
     <w:abstractNumId w:val="4"/>
   </w:num>
-  <w:num w:numId="15" w16cid:durableId="1423530884">
-    <w:abstractNumId w:val="3"/>
+  <w:num w:numId="16" w16cid:durableId="799149697">
+    <w:abstractNumId w:val="2"/>
   </w:num>
-  <w:num w:numId="16" w16cid:durableId="799149697">
+  <w:num w:numId="17" w16cid:durableId="874973434">
     <w:abstractNumId w:val="1"/>
   </w:num>
 </w:numbering>

</xml_diff>

<commit_message>
Actualiza fuentes de datos con hoja 19PM
</commit_message>
<xml_diff>
--- a/Documentacion/Fuentes de Datos.docx
+++ b/Documentacion/Fuentes de Datos.docx
@@ -759,27 +759,7 @@
           <w:iCs/>
           <w:lang w:val="es-CO"/>
         </w:rPr>
-        <w:t>Censo Viterbo Caldas 2018/Data/</w:t>
-      </w:r>
-      <w:proofErr w:type="spellStart"/>
-      <w:r>
-        <w:rPr>
-          <w:rFonts w:ascii="Arial" w:hAnsi="Arial" w:cs="Arial"/>
-          <w:i/>
-          <w:iCs/>
-          <w:lang w:val="es-CO"/>
-        </w:rPr>
-        <w:t>Datasets</w:t>
-      </w:r>
-      <w:proofErr w:type="spellEnd"/>
-      <w:r>
-        <w:rPr>
-          <w:rFonts w:ascii="Arial" w:hAnsi="Arial" w:cs="Arial"/>
-          <w:i/>
-          <w:iCs/>
-          <w:lang w:val="es-CO"/>
-        </w:rPr>
-        <w:t>/</w:t>
+        <w:t>Censo Viterbo Caldas 2018/Data/Datasets/</w:t>
       </w:r>
     </w:p>
     <w:p>
@@ -2946,23 +2926,7 @@
           <w:rFonts w:ascii="Arial" w:hAnsi="Arial" w:cs="Arial"/>
           <w:lang w:val="es-CO"/>
         </w:rPr>
-        <w:t>(</w:t>
-      </w:r>
-      <w:proofErr w:type="spellStart"/>
-      <w:r>
-        <w:rPr>
-          <w:rFonts w:ascii="Arial" w:hAnsi="Arial" w:cs="Arial"/>
-          <w:lang w:val="es-CO"/>
-        </w:rPr>
-        <w:t>blank</w:t>
-      </w:r>
-      <w:proofErr w:type="spellEnd"/>
-      <w:r>
-        <w:rPr>
-          <w:rFonts w:ascii="Arial" w:hAnsi="Arial" w:cs="Arial"/>
-          <w:lang w:val="es-CO"/>
-        </w:rPr>
-        <w:t>) (texto): Título en blanco, contiene las edades.</w:t>
+        <w:t>(blank) (texto): Título en blanco, contiene las edades.</w:t>
       </w:r>
     </w:p>
     <w:p>
@@ -5069,23 +5033,7 @@
           <w:rFonts w:ascii="Arial" w:hAnsi="Arial" w:cs="Arial"/>
           <w:lang w:val="es-CO"/>
         </w:rPr>
-        <w:t xml:space="preserve">Gitano(a) o </w:t>
-      </w:r>
-      <w:proofErr w:type="spellStart"/>
-      <w:r>
-        <w:rPr>
-          <w:rFonts w:ascii="Arial" w:hAnsi="Arial" w:cs="Arial"/>
-          <w:lang w:val="es-CO"/>
-        </w:rPr>
-        <w:t>Rrom</w:t>
-      </w:r>
-      <w:proofErr w:type="spellEnd"/>
-      <w:r>
-        <w:rPr>
-          <w:rFonts w:ascii="Arial" w:hAnsi="Arial" w:cs="Arial"/>
-          <w:lang w:val="es-CO"/>
-        </w:rPr>
-        <w:t xml:space="preserve"> (entero): Cantidad de censados que se reconocen como gitanos o romaníes.</w:t>
+        <w:t>Gitano(a) o Rrom (entero): Cantidad de censados que se reconocen como gitanos o romaníes.</w:t>
       </w:r>
     </w:p>
     <w:p>
@@ -5105,23 +5053,7 @@
           <w:rFonts w:ascii="Arial" w:hAnsi="Arial" w:cs="Arial"/>
           <w:lang w:val="es-CO"/>
         </w:rPr>
-        <w:t xml:space="preserve">Raizal del </w:t>
-      </w:r>
-      <w:proofErr w:type="spellStart"/>
-      <w:r>
-        <w:rPr>
-          <w:rFonts w:ascii="Arial" w:hAnsi="Arial" w:cs="Arial"/>
-          <w:lang w:val="es-CO"/>
-        </w:rPr>
-        <w:t>Archipielago</w:t>
-      </w:r>
-      <w:proofErr w:type="spellEnd"/>
-      <w:r>
-        <w:rPr>
-          <w:rFonts w:ascii="Arial" w:hAnsi="Arial" w:cs="Arial"/>
-          <w:lang w:val="es-CO"/>
-        </w:rPr>
-        <w:t xml:space="preserve"> de San Andrés, Providencia y Santa Catalina (entero): Cantidad de censados que se reconocen como raizales del Archipiélago de San Andrés, Providencia y Santa Catalina.</w:t>
+        <w:t>Raizal del Archipielago de San Andrés, Providencia y Santa Catalina (entero): Cantidad de censados que se reconocen como raizales del Archipiélago de San Andrés, Providencia y Santa Catalina.</w:t>
       </w:r>
     </w:p>
     <w:p>
@@ -5397,23 +5329,7 @@
           <w:rFonts w:ascii="Arial" w:hAnsi="Arial" w:cs="Arial"/>
           <w:lang w:val="es-CO"/>
         </w:rPr>
-        <w:t xml:space="preserve">Gitano(a) o </w:t>
-      </w:r>
-      <w:proofErr w:type="spellStart"/>
-      <w:r>
-        <w:rPr>
-          <w:rFonts w:ascii="Arial" w:hAnsi="Arial" w:cs="Arial"/>
-          <w:lang w:val="es-CO"/>
-        </w:rPr>
-        <w:t>Rrom</w:t>
-      </w:r>
-      <w:proofErr w:type="spellEnd"/>
-      <w:r>
-        <w:rPr>
-          <w:rFonts w:ascii="Arial" w:hAnsi="Arial" w:cs="Arial"/>
-          <w:lang w:val="es-CO"/>
-        </w:rPr>
-        <w:t xml:space="preserve"> (entero): Cantidad de censados que se reconocen como gitanos o romaníes.</w:t>
+        <w:t>Gitano(a) o Rrom (entero): Cantidad de censados que se reconocen como gitanos o romaníes.</w:t>
       </w:r>
     </w:p>
     <w:p>
@@ -5433,23 +5349,7 @@
           <w:rFonts w:ascii="Arial" w:hAnsi="Arial" w:cs="Arial"/>
           <w:lang w:val="es-CO"/>
         </w:rPr>
-        <w:t xml:space="preserve">Raizal del </w:t>
-      </w:r>
-      <w:proofErr w:type="spellStart"/>
-      <w:r>
-        <w:rPr>
-          <w:rFonts w:ascii="Arial" w:hAnsi="Arial" w:cs="Arial"/>
-          <w:lang w:val="es-CO"/>
-        </w:rPr>
-        <w:t>Archipielago</w:t>
-      </w:r>
-      <w:proofErr w:type="spellEnd"/>
-      <w:r>
-        <w:rPr>
-          <w:rFonts w:ascii="Arial" w:hAnsi="Arial" w:cs="Arial"/>
-          <w:lang w:val="es-CO"/>
-        </w:rPr>
-        <w:t xml:space="preserve"> de San Andrés, Providencia y Santa Catalina (entero): Cantidad de censados que se reconocen como raizales del Archipiélago de San Andrés, Providencia y Santa Catalina.</w:t>
+        <w:t>Raizal del Archipielago de San Andrés, Providencia y Santa Catalina (entero): Cantidad de censados que se reconocen como raizales del Archipiélago de San Andrés, Providencia y Santa Catalina.</w:t>
       </w:r>
     </w:p>
     <w:p>
@@ -6934,21 +6834,12 @@
           <w:lang w:val="es-CO"/>
         </w:rPr>
       </w:pPr>
-      <w:proofErr w:type="spellStart"/>
-      <w:r>
-        <w:rPr>
-          <w:rFonts w:ascii="Arial" w:hAnsi="Arial" w:cs="Arial"/>
-          <w:lang w:val="es-CO"/>
-        </w:rPr>
-        <w:t>Tecnico</w:t>
-      </w:r>
-      <w:proofErr w:type="spellEnd"/>
-      <w:r>
-        <w:rPr>
-          <w:rFonts w:ascii="Arial" w:hAnsi="Arial" w:cs="Arial"/>
-          <w:lang w:val="es-CO"/>
-        </w:rPr>
-        <w:t xml:space="preserve"> (entero): Cantidad de censados cuyo máximo nivel educativo es técnico.</w:t>
+      <w:r>
+        <w:rPr>
+          <w:rFonts w:ascii="Arial" w:hAnsi="Arial" w:cs="Arial"/>
+          <w:lang w:val="es-CO"/>
+        </w:rPr>
+        <w:t>Tecnico (entero): Cantidad de censados cuyo máximo nivel educativo es técnico.</w:t>
       </w:r>
     </w:p>
     <w:p>
@@ -7102,21 +6993,7 @@
           <w:rFonts w:ascii="Arial" w:hAnsi="Arial" w:cs="Arial"/>
           <w:lang w:val="es-CO"/>
         </w:rPr>
-        <w:t xml:space="preserve"> (grupo con datos correspondientes a los censados que</w:t>
-      </w:r>
-      <w:r>
-        <w:rPr>
-          <w:rFonts w:ascii="Arial" w:hAnsi="Arial" w:cs="Arial"/>
-          <w:lang w:val="es-CO"/>
-        </w:rPr>
-        <w:t xml:space="preserve"> asisten a alguna institución educativa</w:t>
-      </w:r>
-      <w:r>
-        <w:rPr>
-          <w:rFonts w:ascii="Arial" w:hAnsi="Arial" w:cs="Arial"/>
-          <w:lang w:val="es-CO"/>
-        </w:rPr>
-        <w:t xml:space="preserve">), </w:t>
+        <w:t xml:space="preserve"> (grupo con datos correspondientes a los censados que asisten a alguna institución educativa), </w:t>
       </w:r>
       <w:r>
         <w:rPr>
@@ -7148,21 +7025,7 @@
           <w:rFonts w:ascii="Arial" w:hAnsi="Arial" w:cs="Arial"/>
           <w:lang w:val="es-CO"/>
         </w:rPr>
-        <w:t xml:space="preserve">(grupo con datos correspondientes a los censados de los cuales no se conoce si </w:t>
-      </w:r>
-      <w:r>
-        <w:rPr>
-          <w:rFonts w:ascii="Arial" w:hAnsi="Arial" w:cs="Arial"/>
-          <w:lang w:val="es-CO"/>
-        </w:rPr>
-        <w:t>asisten a alguna institución educativa</w:t>
-      </w:r>
-      <w:r>
-        <w:rPr>
-          <w:rFonts w:ascii="Arial" w:hAnsi="Arial" w:cs="Arial"/>
-          <w:lang w:val="es-CO"/>
-        </w:rPr>
-        <w:t>)</w:t>
+        <w:t>(grupo con datos correspondientes a los censados de los cuales no se conoce si asisten a alguna institución educativa)</w:t>
       </w:r>
     </w:p>
     <w:p>
@@ -7339,6 +7202,688 @@
           <w:lang w:val="es-CO"/>
         </w:rPr>
       </w:pPr>
+    </w:p>
+    <w:p>
+      <w:pPr>
+        <w:rPr>
+          <w:rFonts w:ascii="Arial" w:hAnsi="Arial" w:cs="Arial"/>
+          <w:b/>
+          <w:bCs/>
+          <w:lang w:val="es-CO"/>
+        </w:rPr>
+      </w:pPr>
+      <w:r>
+        <w:rPr>
+          <w:rFonts w:ascii="Arial" w:hAnsi="Arial" w:cs="Arial"/>
+          <w:b/>
+          <w:bCs/>
+          <w:lang w:val="es-CO"/>
+        </w:rPr>
+        <w:t>19PM</w:t>
+      </w:r>
+    </w:p>
+    <w:p>
+      <w:pPr>
+        <w:rPr>
+          <w:rFonts w:ascii="Arial" w:hAnsi="Arial" w:cs="Arial"/>
+          <w:lang w:val="es-CO"/>
+        </w:rPr>
+      </w:pPr>
+      <w:r>
+        <w:rPr>
+          <w:rFonts w:ascii="Arial" w:hAnsi="Arial" w:cs="Arial"/>
+          <w:lang w:val="es-CO"/>
+        </w:rPr>
+        <w:t>Contiene 16 columnas y 3 agrupaciones</w:t>
+      </w:r>
+      <w:r>
+        <w:rPr>
+          <w:rFonts w:ascii="Arial" w:hAnsi="Arial" w:cs="Arial"/>
+          <w:lang w:val="es-CO"/>
+        </w:rPr>
+        <w:t>, cada agrupación tiene 3 subgrupos correspondientes al sexo, y 7 subgrupos correspondientes a la pertenencia étnica.</w:t>
+      </w:r>
+    </w:p>
+    <w:p>
+      <w:pPr>
+        <w:rPr>
+          <w:rFonts w:ascii="Arial" w:hAnsi="Arial" w:cs="Arial"/>
+          <w:lang w:val="es-CO"/>
+        </w:rPr>
+      </w:pPr>
+      <w:r>
+        <w:rPr>
+          <w:rFonts w:ascii="Arial" w:hAnsi="Arial" w:cs="Arial"/>
+          <w:lang w:val="es-CO"/>
+        </w:rPr>
+        <w:t>Columnas:</w:t>
+      </w:r>
+    </w:p>
+    <w:p>
+      <w:pPr>
+        <w:pStyle w:val="Prrafodelista"/>
+        <w:numPr>
+          <w:ilvl w:val="0"/>
+          <w:numId w:val="16"/>
+        </w:numPr>
+        <w:rPr>
+          <w:rFonts w:ascii="Arial" w:hAnsi="Arial" w:cs="Arial"/>
+          <w:lang w:val="es-CO"/>
+        </w:rPr>
+      </w:pPr>
+      <w:r>
+        <w:rPr>
+          <w:rFonts w:ascii="Arial" w:hAnsi="Arial" w:cs="Arial"/>
+          <w:lang w:val="es-CO"/>
+        </w:rPr>
+        <w:t>Total (entero): Cantidad total de censados.</w:t>
+      </w:r>
+    </w:p>
+    <w:p>
+      <w:pPr>
+        <w:pStyle w:val="Prrafodelista"/>
+        <w:numPr>
+          <w:ilvl w:val="0"/>
+          <w:numId w:val="16"/>
+        </w:numPr>
+        <w:rPr>
+          <w:rFonts w:ascii="Arial" w:hAnsi="Arial" w:cs="Arial"/>
+          <w:lang w:val="es-CO"/>
+        </w:rPr>
+      </w:pPr>
+      <w:r>
+        <w:rPr>
+          <w:rFonts w:ascii="Arial" w:hAnsi="Arial" w:cs="Arial"/>
+          <w:lang w:val="es-CO"/>
+        </w:rPr>
+        <w:t>Ninguno (entero): Cantidad de censados sin ningún nivel educativo.</w:t>
+      </w:r>
+    </w:p>
+    <w:p>
+      <w:pPr>
+        <w:pStyle w:val="Prrafodelista"/>
+        <w:numPr>
+          <w:ilvl w:val="0"/>
+          <w:numId w:val="16"/>
+        </w:numPr>
+        <w:rPr>
+          <w:rFonts w:ascii="Arial" w:hAnsi="Arial" w:cs="Arial"/>
+          <w:lang w:val="es-CO"/>
+        </w:rPr>
+      </w:pPr>
+      <w:r>
+        <w:rPr>
+          <w:rFonts w:ascii="Arial" w:hAnsi="Arial" w:cs="Arial"/>
+          <w:lang w:val="es-CO"/>
+        </w:rPr>
+        <w:t>Preescolar (entero): Cantidad de censados cuyo máximo nivel educativo es preescolar.</w:t>
+      </w:r>
+    </w:p>
+    <w:p>
+      <w:pPr>
+        <w:pStyle w:val="Prrafodelista"/>
+        <w:numPr>
+          <w:ilvl w:val="0"/>
+          <w:numId w:val="16"/>
+        </w:numPr>
+        <w:rPr>
+          <w:rFonts w:ascii="Arial" w:hAnsi="Arial" w:cs="Arial"/>
+          <w:lang w:val="es-CO"/>
+        </w:rPr>
+      </w:pPr>
+      <w:r>
+        <w:rPr>
+          <w:rFonts w:ascii="Arial" w:hAnsi="Arial" w:cs="Arial"/>
+          <w:lang w:val="es-CO"/>
+        </w:rPr>
+        <w:t>Primaria completa (entero): Cantidad de censados cuyo máximo nivel educativo es primaria completa.</w:t>
+      </w:r>
+    </w:p>
+    <w:p>
+      <w:pPr>
+        <w:pStyle w:val="Prrafodelista"/>
+        <w:numPr>
+          <w:ilvl w:val="0"/>
+          <w:numId w:val="16"/>
+        </w:numPr>
+        <w:rPr>
+          <w:rFonts w:ascii="Arial" w:hAnsi="Arial" w:cs="Arial"/>
+          <w:lang w:val="es-CO"/>
+        </w:rPr>
+      </w:pPr>
+      <w:r>
+        <w:rPr>
+          <w:rFonts w:ascii="Arial" w:hAnsi="Arial" w:cs="Arial"/>
+          <w:lang w:val="es-CO"/>
+        </w:rPr>
+        <w:t>Primaria incompleta (entero): Cantidad de censados cuyo máximo nivel educativo es primaria incompleta.</w:t>
+      </w:r>
+    </w:p>
+    <w:p>
+      <w:pPr>
+        <w:pStyle w:val="Prrafodelista"/>
+        <w:numPr>
+          <w:ilvl w:val="0"/>
+          <w:numId w:val="16"/>
+        </w:numPr>
+        <w:rPr>
+          <w:rFonts w:ascii="Arial" w:hAnsi="Arial" w:cs="Arial"/>
+          <w:lang w:val="es-CO"/>
+        </w:rPr>
+      </w:pPr>
+      <w:r>
+        <w:rPr>
+          <w:rFonts w:ascii="Arial" w:hAnsi="Arial" w:cs="Arial"/>
+          <w:lang w:val="es-CO"/>
+        </w:rPr>
+        <w:t>Secundaria completa (entero): Cantidad de censados cuyo máximo nivel educativo es secundaria completa.</w:t>
+      </w:r>
+    </w:p>
+    <w:p>
+      <w:pPr>
+        <w:pStyle w:val="Prrafodelista"/>
+        <w:numPr>
+          <w:ilvl w:val="0"/>
+          <w:numId w:val="16"/>
+        </w:numPr>
+        <w:rPr>
+          <w:rFonts w:ascii="Arial" w:hAnsi="Arial" w:cs="Arial"/>
+          <w:lang w:val="es-CO"/>
+        </w:rPr>
+      </w:pPr>
+      <w:r>
+        <w:rPr>
+          <w:rFonts w:ascii="Arial" w:hAnsi="Arial" w:cs="Arial"/>
+          <w:lang w:val="es-CO"/>
+        </w:rPr>
+        <w:t>Secundaria incompleta (entero): Cantidad de censados cuyo máximo nivel educativo es secundaria incompleta.</w:t>
+      </w:r>
+    </w:p>
+    <w:p>
+      <w:pPr>
+        <w:pStyle w:val="Prrafodelista"/>
+        <w:numPr>
+          <w:ilvl w:val="0"/>
+          <w:numId w:val="16"/>
+        </w:numPr>
+        <w:rPr>
+          <w:rFonts w:ascii="Arial" w:hAnsi="Arial" w:cs="Arial"/>
+          <w:lang w:val="es-CO"/>
+        </w:rPr>
+      </w:pPr>
+      <w:r>
+        <w:rPr>
+          <w:rFonts w:ascii="Arial" w:hAnsi="Arial" w:cs="Arial"/>
+          <w:lang w:val="es-CO"/>
+        </w:rPr>
+        <w:t>Media Completa (entero): Cantidad de censados cuyo máximo nivel educativo es educación media completa.</w:t>
+      </w:r>
+    </w:p>
+    <w:p>
+      <w:pPr>
+        <w:pStyle w:val="Prrafodelista"/>
+        <w:numPr>
+          <w:ilvl w:val="0"/>
+          <w:numId w:val="16"/>
+        </w:numPr>
+        <w:rPr>
+          <w:rFonts w:ascii="Arial" w:hAnsi="Arial" w:cs="Arial"/>
+          <w:lang w:val="es-CO"/>
+        </w:rPr>
+      </w:pPr>
+      <w:r>
+        <w:rPr>
+          <w:rFonts w:ascii="Arial" w:hAnsi="Arial" w:cs="Arial"/>
+          <w:lang w:val="es-CO"/>
+        </w:rPr>
+        <w:t>Media incompleta (entero): Cantidad de censados cuyo máximo nivel educativo es educación media incompleta.</w:t>
+      </w:r>
+    </w:p>
+    <w:p>
+      <w:pPr>
+        <w:pStyle w:val="Prrafodelista"/>
+        <w:numPr>
+          <w:ilvl w:val="0"/>
+          <w:numId w:val="16"/>
+        </w:numPr>
+        <w:rPr>
+          <w:rFonts w:ascii="Arial" w:hAnsi="Arial" w:cs="Arial"/>
+          <w:lang w:val="es-CO"/>
+        </w:rPr>
+      </w:pPr>
+      <w:r>
+        <w:rPr>
+          <w:rFonts w:ascii="Arial" w:hAnsi="Arial" w:cs="Arial"/>
+          <w:lang w:val="es-CO"/>
+        </w:rPr>
+        <w:t>Normal completa (entero): Cantidad de censados cuyo máximo nivel educativo es educación normal completa.</w:t>
+      </w:r>
+    </w:p>
+    <w:p>
+      <w:pPr>
+        <w:pStyle w:val="Prrafodelista"/>
+        <w:numPr>
+          <w:ilvl w:val="0"/>
+          <w:numId w:val="16"/>
+        </w:numPr>
+        <w:rPr>
+          <w:rFonts w:ascii="Arial" w:hAnsi="Arial" w:cs="Arial"/>
+          <w:lang w:val="es-CO"/>
+        </w:rPr>
+      </w:pPr>
+      <w:r>
+        <w:rPr>
+          <w:rFonts w:ascii="Arial" w:hAnsi="Arial" w:cs="Arial"/>
+          <w:lang w:val="es-CO"/>
+        </w:rPr>
+        <w:t>Normal incompleta (entero): Cantidad de censados cuyo máximo nivel educativo es educación normal incompleta.</w:t>
+      </w:r>
+    </w:p>
+    <w:p>
+      <w:pPr>
+        <w:pStyle w:val="Prrafodelista"/>
+        <w:numPr>
+          <w:ilvl w:val="0"/>
+          <w:numId w:val="16"/>
+        </w:numPr>
+        <w:rPr>
+          <w:rFonts w:ascii="Arial" w:hAnsi="Arial" w:cs="Arial"/>
+          <w:lang w:val="es-CO"/>
+        </w:rPr>
+      </w:pPr>
+      <w:r>
+        <w:rPr>
+          <w:rFonts w:ascii="Arial" w:hAnsi="Arial" w:cs="Arial"/>
+          <w:lang w:val="es-CO"/>
+        </w:rPr>
+        <w:t>Tecnico (entero): Cantidad de censados cuyo máximo nivel educativo es técnico.</w:t>
+      </w:r>
+    </w:p>
+    <w:p>
+      <w:pPr>
+        <w:pStyle w:val="Prrafodelista"/>
+        <w:numPr>
+          <w:ilvl w:val="0"/>
+          <w:numId w:val="16"/>
+        </w:numPr>
+        <w:rPr>
+          <w:rFonts w:ascii="Arial" w:hAnsi="Arial" w:cs="Arial"/>
+          <w:lang w:val="es-CO"/>
+        </w:rPr>
+      </w:pPr>
+      <w:r>
+        <w:rPr>
+          <w:rFonts w:ascii="Arial" w:hAnsi="Arial" w:cs="Arial"/>
+          <w:lang w:val="es-CO"/>
+        </w:rPr>
+        <w:t>Tecnológico (entero): Cantidad de censados cuyo máximo nivel educativo es tecnológico.</w:t>
+      </w:r>
+    </w:p>
+    <w:p>
+      <w:pPr>
+        <w:pStyle w:val="Prrafodelista"/>
+        <w:numPr>
+          <w:ilvl w:val="0"/>
+          <w:numId w:val="16"/>
+        </w:numPr>
+        <w:rPr>
+          <w:rFonts w:ascii="Arial" w:hAnsi="Arial" w:cs="Arial"/>
+          <w:lang w:val="es-CO"/>
+        </w:rPr>
+      </w:pPr>
+      <w:r>
+        <w:rPr>
+          <w:rFonts w:ascii="Arial" w:hAnsi="Arial" w:cs="Arial"/>
+          <w:lang w:val="es-CO"/>
+        </w:rPr>
+        <w:lastRenderedPageBreak/>
+        <w:t>Universitario (entero): Cantidad de censados cuyo máximo nivel educativo es universitario.</w:t>
+      </w:r>
+    </w:p>
+    <w:p>
+      <w:pPr>
+        <w:pStyle w:val="Prrafodelista"/>
+        <w:numPr>
+          <w:ilvl w:val="0"/>
+          <w:numId w:val="16"/>
+        </w:numPr>
+        <w:rPr>
+          <w:rFonts w:ascii="Arial" w:hAnsi="Arial" w:cs="Arial"/>
+          <w:lang w:val="es-CO"/>
+        </w:rPr>
+      </w:pPr>
+      <w:r>
+        <w:rPr>
+          <w:rFonts w:ascii="Arial" w:hAnsi="Arial" w:cs="Arial"/>
+          <w:lang w:val="es-CO"/>
+        </w:rPr>
+        <w:t>Especialización, Maestría, Doctorado (entero): Cantidad de censados cuyo máximo nivel educativo es especialización maestría o doctorado.</w:t>
+      </w:r>
+    </w:p>
+    <w:p>
+      <w:pPr>
+        <w:pStyle w:val="Prrafodelista"/>
+        <w:numPr>
+          <w:ilvl w:val="0"/>
+          <w:numId w:val="16"/>
+        </w:numPr>
+        <w:rPr>
+          <w:rFonts w:ascii="Arial" w:hAnsi="Arial" w:cs="Arial"/>
+          <w:lang w:val="es-CO"/>
+        </w:rPr>
+      </w:pPr>
+      <w:r>
+        <w:rPr>
+          <w:rFonts w:ascii="Arial" w:hAnsi="Arial" w:cs="Arial"/>
+          <w:lang w:val="es-CO"/>
+        </w:rPr>
+        <w:t>Sin información (entero): Cantidad de censados de los cuales no se tiene información acerca de su nivel educativo.</w:t>
+      </w:r>
+    </w:p>
+    <w:p>
+      <w:pPr>
+        <w:rPr>
+          <w:rFonts w:ascii="Arial" w:hAnsi="Arial" w:cs="Arial"/>
+          <w:lang w:val="es-CO"/>
+        </w:rPr>
+      </w:pPr>
+      <w:r>
+        <w:rPr>
+          <w:rFonts w:ascii="Arial" w:hAnsi="Arial" w:cs="Arial"/>
+          <w:lang w:val="es-CO"/>
+        </w:rPr>
+        <w:t>Agrupaciones:</w:t>
+      </w:r>
+    </w:p>
+    <w:p>
+      <w:pPr>
+        <w:pStyle w:val="Prrafodelista"/>
+        <w:numPr>
+          <w:ilvl w:val="0"/>
+          <w:numId w:val="3"/>
+        </w:numPr>
+        <w:rPr>
+          <w:rFonts w:ascii="Arial" w:hAnsi="Arial" w:cs="Arial"/>
+          <w:lang w:val="es-CO"/>
+        </w:rPr>
+      </w:pPr>
+      <w:r>
+        <w:rPr>
+          <w:rFonts w:ascii="Arial" w:hAnsi="Arial" w:cs="Arial"/>
+          <w:lang w:val="es-CO"/>
+        </w:rPr>
+        <w:t>Total: Grupo con resumen de datos totales.</w:t>
+      </w:r>
+    </w:p>
+    <w:p>
+      <w:pPr>
+        <w:pStyle w:val="Prrafodelista"/>
+        <w:numPr>
+          <w:ilvl w:val="0"/>
+          <w:numId w:val="3"/>
+        </w:numPr>
+        <w:rPr>
+          <w:rFonts w:ascii="Arial" w:hAnsi="Arial" w:cs="Arial"/>
+          <w:lang w:val="es-CO"/>
+        </w:rPr>
+      </w:pPr>
+      <w:r>
+        <w:rPr>
+          <w:rFonts w:ascii="Arial" w:hAnsi="Arial" w:cs="Arial"/>
+          <w:lang w:val="es-CO"/>
+        </w:rPr>
+        <w:t>Cabecera: Grupo con resumen de datos correspondientes a las cabeceras municipales</w:t>
+      </w:r>
+    </w:p>
+    <w:p>
+      <w:pPr>
+        <w:pStyle w:val="Prrafodelista"/>
+        <w:numPr>
+          <w:ilvl w:val="0"/>
+          <w:numId w:val="3"/>
+        </w:numPr>
+        <w:rPr>
+          <w:rFonts w:ascii="Arial" w:hAnsi="Arial" w:cs="Arial"/>
+          <w:lang w:val="es-CO"/>
+        </w:rPr>
+      </w:pPr>
+      <w:r>
+        <w:rPr>
+          <w:rFonts w:ascii="Arial" w:hAnsi="Arial" w:cs="Arial"/>
+          <w:lang w:val="es-CO"/>
+        </w:rPr>
+        <w:t>Rural disperso: Grupo con resumen de datos correspondientes a ciudadanos que habitan en las zonas rurales, pero no en centros poblados.</w:t>
+      </w:r>
+    </w:p>
+    <w:p>
+      <w:pPr>
+        <w:rPr>
+          <w:rFonts w:ascii="Arial" w:hAnsi="Arial" w:cs="Arial"/>
+          <w:lang w:val="es-CO"/>
+        </w:rPr>
+      </w:pPr>
+      <w:r>
+        <w:rPr>
+          <w:rFonts w:ascii="Arial" w:hAnsi="Arial" w:cs="Arial"/>
+          <w:lang w:val="es-CO"/>
+        </w:rPr>
+        <w:t>Subgrupos:</w:t>
+      </w:r>
+    </w:p>
+    <w:p>
+      <w:pPr>
+        <w:pStyle w:val="Prrafodelista"/>
+        <w:numPr>
+          <w:ilvl w:val="0"/>
+          <w:numId w:val="6"/>
+        </w:numPr>
+        <w:rPr>
+          <w:rFonts w:ascii="Arial" w:hAnsi="Arial" w:cs="Arial"/>
+          <w:lang w:val="es-CO"/>
+        </w:rPr>
+      </w:pPr>
+      <w:r>
+        <w:rPr>
+          <w:rFonts w:ascii="Arial" w:hAnsi="Arial" w:cs="Arial"/>
+          <w:lang w:val="es-CO"/>
+        </w:rPr>
+        <w:t>Hombre: Grupo con resumen de datos correspondiente a los hombres.</w:t>
+      </w:r>
+    </w:p>
+    <w:p>
+      <w:pPr>
+        <w:pStyle w:val="Prrafodelista"/>
+        <w:numPr>
+          <w:ilvl w:val="0"/>
+          <w:numId w:val="8"/>
+        </w:numPr>
+        <w:rPr>
+          <w:rFonts w:ascii="Arial" w:hAnsi="Arial" w:cs="Arial"/>
+          <w:lang w:val="es-CO"/>
+        </w:rPr>
+      </w:pPr>
+      <w:r>
+        <w:rPr>
+          <w:rFonts w:ascii="Arial" w:hAnsi="Arial" w:cs="Arial"/>
+          <w:lang w:val="es-CO"/>
+        </w:rPr>
+        <w:t>Mujer: Grupo con resumen de datos correspondiente a las mujeres.</w:t>
+      </w:r>
+    </w:p>
+    <w:p>
+      <w:pPr>
+        <w:pStyle w:val="Prrafodelista"/>
+        <w:numPr>
+          <w:ilvl w:val="0"/>
+          <w:numId w:val="8"/>
+        </w:numPr>
+        <w:rPr>
+          <w:rFonts w:ascii="Arial" w:hAnsi="Arial" w:cs="Arial"/>
+          <w:lang w:val="es-CO"/>
+        </w:rPr>
+      </w:pPr>
+      <w:r>
+        <w:rPr>
+          <w:rFonts w:ascii="Arial" w:hAnsi="Arial" w:cs="Arial"/>
+          <w:lang w:val="es-CO"/>
+        </w:rPr>
+        <w:t>Total: Grupo con resumen total de datos.</w:t>
+      </w:r>
+    </w:p>
+    <w:p>
+      <w:pPr>
+        <w:rPr>
+          <w:rFonts w:ascii="Arial" w:hAnsi="Arial" w:cs="Arial"/>
+          <w:lang w:val="es-CO"/>
+        </w:rPr>
+      </w:pPr>
+      <w:r>
+        <w:rPr>
+          <w:rFonts w:ascii="Arial" w:hAnsi="Arial" w:cs="Arial"/>
+          <w:lang w:val="es-CO"/>
+        </w:rPr>
+        <w:t>Subgrupos:</w:t>
+      </w:r>
+    </w:p>
+    <w:p>
+      <w:pPr>
+        <w:pStyle w:val="Prrafodelista"/>
+        <w:numPr>
+          <w:ilvl w:val="0"/>
+          <w:numId w:val="19"/>
+        </w:numPr>
+        <w:rPr>
+          <w:rFonts w:ascii="Arial" w:hAnsi="Arial" w:cs="Arial"/>
+          <w:lang w:val="es-CO"/>
+        </w:rPr>
+      </w:pPr>
+      <w:r>
+        <w:rPr>
+          <w:rFonts w:ascii="Arial" w:hAnsi="Arial" w:cs="Arial"/>
+          <w:lang w:val="es-CO"/>
+        </w:rPr>
+        <w:t>Indígena: Grupo con resumen de datos correspondiente a indígenas.</w:t>
+      </w:r>
+    </w:p>
+    <w:p>
+      <w:pPr>
+        <w:pStyle w:val="Prrafodelista"/>
+        <w:numPr>
+          <w:ilvl w:val="0"/>
+          <w:numId w:val="19"/>
+        </w:numPr>
+        <w:rPr>
+          <w:rFonts w:ascii="Arial" w:hAnsi="Arial" w:cs="Arial"/>
+          <w:lang w:val="es-CO"/>
+        </w:rPr>
+      </w:pPr>
+      <w:r>
+        <w:rPr>
+          <w:rFonts w:ascii="Arial" w:hAnsi="Arial" w:cs="Arial"/>
+          <w:lang w:val="es-CO"/>
+        </w:rPr>
+        <w:t>Gitano(a) o Rrom: Grupo con resumen de datos correspondiente a gitanos o romaníes.</w:t>
+      </w:r>
+    </w:p>
+    <w:p>
+      <w:pPr>
+        <w:pStyle w:val="Prrafodelista"/>
+        <w:numPr>
+          <w:ilvl w:val="0"/>
+          <w:numId w:val="19"/>
+        </w:numPr>
+        <w:rPr>
+          <w:rFonts w:ascii="Arial" w:hAnsi="Arial" w:cs="Arial"/>
+          <w:lang w:val="es-CO"/>
+        </w:rPr>
+      </w:pPr>
+      <w:r>
+        <w:rPr>
+          <w:rFonts w:ascii="Arial" w:hAnsi="Arial" w:cs="Arial"/>
+          <w:lang w:val="es-CO"/>
+        </w:rPr>
+        <w:t>Palenquero(a) de San Basilio: Grupo con resumen de datos correspondiente a palenqueros de San Basilio.</w:t>
+      </w:r>
+    </w:p>
+    <w:p>
+      <w:pPr>
+        <w:pStyle w:val="Prrafodelista"/>
+        <w:numPr>
+          <w:ilvl w:val="0"/>
+          <w:numId w:val="19"/>
+        </w:numPr>
+        <w:rPr>
+          <w:rFonts w:ascii="Arial" w:hAnsi="Arial" w:cs="Arial"/>
+          <w:lang w:val="es-CO"/>
+        </w:rPr>
+      </w:pPr>
+      <w:r>
+        <w:rPr>
+          <w:rFonts w:ascii="Arial" w:hAnsi="Arial" w:cs="Arial"/>
+          <w:lang w:val="es-CO"/>
+        </w:rPr>
+        <w:t>Negro(a), Mulato(a), Afrodescendiente, Afrocolombiano(a): Grupo con resumen datos correspondiente a negros, mulatos, afrodescendientes o afrocolombianos.</w:t>
+      </w:r>
+    </w:p>
+    <w:p>
+      <w:pPr>
+        <w:pStyle w:val="Prrafodelista"/>
+        <w:numPr>
+          <w:ilvl w:val="0"/>
+          <w:numId w:val="19"/>
+        </w:numPr>
+        <w:rPr>
+          <w:rFonts w:ascii="Arial" w:hAnsi="Arial" w:cs="Arial"/>
+          <w:lang w:val="es-CO"/>
+        </w:rPr>
+      </w:pPr>
+      <w:r>
+        <w:rPr>
+          <w:rFonts w:ascii="Arial" w:hAnsi="Arial" w:cs="Arial"/>
+          <w:lang w:val="es-CO"/>
+        </w:rPr>
+        <w:t>Ningún grupo étnico: Grupo con resumen de datos correspondiente a los censados que no pertenecen a ningún grupo étnico.</w:t>
+      </w:r>
+    </w:p>
+    <w:p>
+      <w:pPr>
+        <w:pStyle w:val="Prrafodelista"/>
+        <w:numPr>
+          <w:ilvl w:val="0"/>
+          <w:numId w:val="19"/>
+        </w:numPr>
+        <w:rPr>
+          <w:rFonts w:ascii="Arial" w:hAnsi="Arial" w:cs="Arial"/>
+          <w:lang w:val="es-CO"/>
+        </w:rPr>
+      </w:pPr>
+      <w:r>
+        <w:rPr>
+          <w:rFonts w:ascii="Arial" w:hAnsi="Arial" w:cs="Arial"/>
+          <w:lang w:val="es-CO"/>
+        </w:rPr>
+        <w:t>Sin información: Grupo con resumen de datos correspondiente a los censados de los cuales no se tiene información de su pertenencia étnica.</w:t>
+      </w:r>
+    </w:p>
+    <w:p>
+      <w:pPr>
+        <w:pStyle w:val="Prrafodelista"/>
+        <w:numPr>
+          <w:ilvl w:val="0"/>
+          <w:numId w:val="19"/>
+        </w:numPr>
+        <w:rPr>
+          <w:rFonts w:ascii="Arial" w:hAnsi="Arial" w:cs="Arial"/>
+          <w:lang w:val="es-CO"/>
+        </w:rPr>
+      </w:pPr>
+      <w:r>
+        <w:rPr>
+          <w:rFonts w:ascii="Arial" w:hAnsi="Arial" w:cs="Arial"/>
+          <w:lang w:val="es-CO"/>
+        </w:rPr>
+        <w:t>Total: Grupo con resumen total de datos.</w:t>
+      </w:r>
     </w:p>
     <w:p>
       <w:pPr>
@@ -7361,6 +7906,119 @@
 <file path=word/numbering.xml><?xml version="1.0" encoding="utf-8"?>
 <w:numbering xmlns:wpc="http://schemas.microsoft.com/office/word/2010/wordprocessingCanvas" xmlns:cx="http://schemas.microsoft.com/office/drawing/2014/chartex" xmlns:cx1="http://schemas.microsoft.com/office/drawing/2015/9/8/chartex" xmlns:cx2="http://schemas.microsoft.com/office/drawing/2015/10/21/chartex" xmlns:cx3="http://schemas.microsoft.com/office/drawing/2016/5/9/chartex" xmlns:cx4="http://schemas.microsoft.com/office/drawing/2016/5/10/chartex" xmlns:cx5="http://schemas.microsoft.com/office/drawing/2016/5/11/chartex" xmlns:cx6="http://schemas.microsoft.com/office/drawing/2016/5/12/chartex" xmlns:cx7="http://schemas.microsoft.com/office/drawing/2016/5/13/chartex" xmlns:cx8="http://schemas.microsoft.com/office/drawing/2016/5/14/chartex" xmlns:mc="http://schemas.openxmlformats.org/markup-compatibility/2006" xmlns:aink="http://schemas.microsoft.com/office/drawing/2016/ink" xmlns:am3d="http://schemas.microsoft.com/office/drawing/2017/model3d" xmlns:o="urn:schemas-microsoft-com:office:office" xmlns:oel="http://schemas.microsoft.com/office/2019/extlst" xmlns:r="http://schemas.openxmlformats.org/officeDocument/2006/relationships" xmlns:m="http://schemas.openxmlformats.org/officeDocument/2006/math" xmlns:v="urn:schemas-microsoft-com:vml" xmlns:wp14="http://schemas.microsoft.com/office/word/2010/wordprocessingDrawing" xmlns:wp="http://schemas.openxmlformats.org/drawingml/2006/wordprocessingDrawing" xmlns:w10="urn:schemas-microsoft-com:office:word" xmlns:w="http://schemas.openxmlformats.org/wordprocessingml/2006/main" xmlns:w14="http://schemas.microsoft.com/office/word/2010/wordml" xmlns:w15="http://schemas.microsoft.com/office/word/2012/wordml" xmlns:w16cex="http://schemas.microsoft.com/office/word/2018/wordml/cex" xmlns:w16cid="http://schemas.microsoft.com/office/word/2016/wordml/cid" xmlns:w16="http://schemas.microsoft.com/office/word/2018/wordml" xmlns:w16du="http://schemas.microsoft.com/office/word/2023/wordml/word16du" xmlns:w16sdtdh="http://schemas.microsoft.com/office/word/2020/wordml/sdtdatahash" xmlns:w16sdtfl="http://schemas.microsoft.com/office/word/2024/wordml/sdtformatlock" xmlns:w16se="http://schemas.microsoft.com/office/word/2015/wordml/symex" xmlns:wpg="http://schemas.microsoft.com/office/word/2010/wordprocessingGroup" xmlns:wpi="http://schemas.microsoft.com/office/word/2010/wordprocessingInk" xmlns:wne="http://schemas.microsoft.com/office/word/2006/wordml" xmlns:wps="http://schemas.microsoft.com/office/word/2010/wordprocessingShape" mc:Ignorable="w14 w15 w16se w16cid w16 w16cex w16sdtdh w16sdtfl w16du wp14">
   <w:abstractNum w:abstractNumId="0" w15:restartNumberingAfterBreak="0">
+    <w:nsid w:val="082472D9"/>
+    <w:multiLevelType w:val="hybridMultilevel"/>
+    <w:tmpl w:val="A4804376"/>
+    <w:lvl w:ilvl="0" w:tplc="04090001">
+      <w:start w:val="1"/>
+      <w:numFmt w:val="bullet"/>
+      <w:lvlText w:val=""/>
+      <w:lvlJc w:val="left"/>
+      <w:pPr>
+        <w:ind w:left="720" w:hanging="360"/>
+      </w:pPr>
+      <w:rPr>
+        <w:rFonts w:ascii="Symbol" w:hAnsi="Symbol" w:hint="default"/>
+      </w:rPr>
+    </w:lvl>
+    <w:lvl w:ilvl="1" w:tplc="04090003" w:tentative="1">
+      <w:start w:val="1"/>
+      <w:numFmt w:val="bullet"/>
+      <w:lvlText w:val="o"/>
+      <w:lvlJc w:val="left"/>
+      <w:pPr>
+        <w:ind w:left="1440" w:hanging="360"/>
+      </w:pPr>
+      <w:rPr>
+        <w:rFonts w:ascii="Courier New" w:hAnsi="Courier New" w:cs="Courier New" w:hint="default"/>
+      </w:rPr>
+    </w:lvl>
+    <w:lvl w:ilvl="2" w:tplc="04090005" w:tentative="1">
+      <w:start w:val="1"/>
+      <w:numFmt w:val="bullet"/>
+      <w:lvlText w:val=""/>
+      <w:lvlJc w:val="left"/>
+      <w:pPr>
+        <w:ind w:left="2160" w:hanging="360"/>
+      </w:pPr>
+      <w:rPr>
+        <w:rFonts w:ascii="Wingdings" w:hAnsi="Wingdings" w:hint="default"/>
+      </w:rPr>
+    </w:lvl>
+    <w:lvl w:ilvl="3" w:tplc="04090001" w:tentative="1">
+      <w:start w:val="1"/>
+      <w:numFmt w:val="bullet"/>
+      <w:lvlText w:val=""/>
+      <w:lvlJc w:val="left"/>
+      <w:pPr>
+        <w:ind w:left="2880" w:hanging="360"/>
+      </w:pPr>
+      <w:rPr>
+        <w:rFonts w:ascii="Symbol" w:hAnsi="Symbol" w:hint="default"/>
+      </w:rPr>
+    </w:lvl>
+    <w:lvl w:ilvl="4" w:tplc="04090003" w:tentative="1">
+      <w:start w:val="1"/>
+      <w:numFmt w:val="bullet"/>
+      <w:lvlText w:val="o"/>
+      <w:lvlJc w:val="left"/>
+      <w:pPr>
+        <w:ind w:left="3600" w:hanging="360"/>
+      </w:pPr>
+      <w:rPr>
+        <w:rFonts w:ascii="Courier New" w:hAnsi="Courier New" w:cs="Courier New" w:hint="default"/>
+      </w:rPr>
+    </w:lvl>
+    <w:lvl w:ilvl="5" w:tplc="04090005" w:tentative="1">
+      <w:start w:val="1"/>
+      <w:numFmt w:val="bullet"/>
+      <w:lvlText w:val=""/>
+      <w:lvlJc w:val="left"/>
+      <w:pPr>
+        <w:ind w:left="4320" w:hanging="360"/>
+      </w:pPr>
+      <w:rPr>
+        <w:rFonts w:ascii="Wingdings" w:hAnsi="Wingdings" w:hint="default"/>
+      </w:rPr>
+    </w:lvl>
+    <w:lvl w:ilvl="6" w:tplc="04090001" w:tentative="1">
+      <w:start w:val="1"/>
+      <w:numFmt w:val="bullet"/>
+      <w:lvlText w:val=""/>
+      <w:lvlJc w:val="left"/>
+      <w:pPr>
+        <w:ind w:left="5040" w:hanging="360"/>
+      </w:pPr>
+      <w:rPr>
+        <w:rFonts w:ascii="Symbol" w:hAnsi="Symbol" w:hint="default"/>
+      </w:rPr>
+    </w:lvl>
+    <w:lvl w:ilvl="7" w:tplc="04090003" w:tentative="1">
+      <w:start w:val="1"/>
+      <w:numFmt w:val="bullet"/>
+      <w:lvlText w:val="o"/>
+      <w:lvlJc w:val="left"/>
+      <w:pPr>
+        <w:ind w:left="5760" w:hanging="360"/>
+      </w:pPr>
+      <w:rPr>
+        <w:rFonts w:ascii="Courier New" w:hAnsi="Courier New" w:cs="Courier New" w:hint="default"/>
+      </w:rPr>
+    </w:lvl>
+    <w:lvl w:ilvl="8" w:tplc="04090005" w:tentative="1">
+      <w:start w:val="1"/>
+      <w:numFmt w:val="bullet"/>
+      <w:lvlText w:val=""/>
+      <w:lvlJc w:val="left"/>
+      <w:pPr>
+        <w:ind w:left="6480" w:hanging="360"/>
+      </w:pPr>
+      <w:rPr>
+        <w:rFonts w:ascii="Wingdings" w:hAnsi="Wingdings" w:hint="default"/>
+      </w:rPr>
+    </w:lvl>
+  </w:abstractNum>
+  <w:abstractNum w:abstractNumId="1" w15:restartNumberingAfterBreak="0">
     <w:nsid w:val="0CF8322A"/>
     <w:multiLevelType w:val="hybridMultilevel"/>
     <w:tmpl w:val="539CFB74"/>
@@ -7473,7 +8131,7 @@
       </w:rPr>
     </w:lvl>
   </w:abstractNum>
-  <w:abstractNum w:abstractNumId="1" w15:restartNumberingAfterBreak="0">
+  <w:abstractNum w:abstractNumId="2" w15:restartNumberingAfterBreak="0">
     <w:nsid w:val="0E35477E"/>
     <w:multiLevelType w:val="hybridMultilevel"/>
     <w:tmpl w:val="DEE6A864"/>
@@ -7586,7 +8244,7 @@
       </w:rPr>
     </w:lvl>
   </w:abstractNum>
-  <w:abstractNum w:abstractNumId="2" w15:restartNumberingAfterBreak="0">
+  <w:abstractNum w:abstractNumId="3" w15:restartNumberingAfterBreak="0">
     <w:nsid w:val="19A165BB"/>
     <w:multiLevelType w:val="hybridMultilevel"/>
     <w:tmpl w:val="FEF24976"/>
@@ -7699,7 +8357,7 @@
       </w:rPr>
     </w:lvl>
   </w:abstractNum>
-  <w:abstractNum w:abstractNumId="3" w15:restartNumberingAfterBreak="0">
+  <w:abstractNum w:abstractNumId="4" w15:restartNumberingAfterBreak="0">
     <w:nsid w:val="1AE62D74"/>
     <w:multiLevelType w:val="hybridMultilevel"/>
     <w:tmpl w:val="CA0E2AF4"/>
@@ -7812,7 +8470,7 @@
       </w:rPr>
     </w:lvl>
   </w:abstractNum>
-  <w:abstractNum w:abstractNumId="4" w15:restartNumberingAfterBreak="0">
+  <w:abstractNum w:abstractNumId="5" w15:restartNumberingAfterBreak="0">
     <w:nsid w:val="251E3883"/>
     <w:multiLevelType w:val="hybridMultilevel"/>
     <w:tmpl w:val="79007C6E"/>
@@ -7925,7 +8583,7 @@
       </w:rPr>
     </w:lvl>
   </w:abstractNum>
-  <w:abstractNum w:abstractNumId="5" w15:restartNumberingAfterBreak="0">
+  <w:abstractNum w:abstractNumId="6" w15:restartNumberingAfterBreak="0">
     <w:nsid w:val="30E02CDF"/>
     <w:multiLevelType w:val="hybridMultilevel"/>
     <w:tmpl w:val="41F842BA"/>
@@ -8038,7 +8696,7 @@
       </w:rPr>
     </w:lvl>
   </w:abstractNum>
-  <w:abstractNum w:abstractNumId="6" w15:restartNumberingAfterBreak="0">
+  <w:abstractNum w:abstractNumId="7" w15:restartNumberingAfterBreak="0">
     <w:nsid w:val="36ED691A"/>
     <w:multiLevelType w:val="hybridMultilevel"/>
     <w:tmpl w:val="56FC6232"/>
@@ -8151,7 +8809,7 @@
       </w:rPr>
     </w:lvl>
   </w:abstractNum>
-  <w:abstractNum w:abstractNumId="7" w15:restartNumberingAfterBreak="0">
+  <w:abstractNum w:abstractNumId="8" w15:restartNumberingAfterBreak="0">
     <w:nsid w:val="4DD52E8B"/>
     <w:multiLevelType w:val="hybridMultilevel"/>
     <w:tmpl w:val="B000A1DE"/>
@@ -8264,7 +8922,7 @@
       </w:rPr>
     </w:lvl>
   </w:abstractNum>
-  <w:abstractNum w:abstractNumId="8" w15:restartNumberingAfterBreak="0">
+  <w:abstractNum w:abstractNumId="9" w15:restartNumberingAfterBreak="0">
     <w:nsid w:val="521C4194"/>
     <w:multiLevelType w:val="hybridMultilevel"/>
     <w:tmpl w:val="0542FC48"/>
@@ -8377,7 +9035,7 @@
       </w:rPr>
     </w:lvl>
   </w:abstractNum>
-  <w:abstractNum w:abstractNumId="9" w15:restartNumberingAfterBreak="0">
+  <w:abstractNum w:abstractNumId="10" w15:restartNumberingAfterBreak="0">
     <w:nsid w:val="52D63117"/>
     <w:multiLevelType w:val="hybridMultilevel"/>
     <w:tmpl w:val="036E0984"/>
@@ -8490,7 +9148,7 @@
       </w:rPr>
     </w:lvl>
   </w:abstractNum>
-  <w:abstractNum w:abstractNumId="10" w15:restartNumberingAfterBreak="0">
+  <w:abstractNum w:abstractNumId="11" w15:restartNumberingAfterBreak="0">
     <w:nsid w:val="55821CAC"/>
     <w:multiLevelType w:val="hybridMultilevel"/>
     <w:tmpl w:val="61F8020E"/>
@@ -8603,7 +9261,120 @@
       </w:rPr>
     </w:lvl>
   </w:abstractNum>
-  <w:abstractNum w:abstractNumId="11" w15:restartNumberingAfterBreak="0">
+  <w:abstractNum w:abstractNumId="12" w15:restartNumberingAfterBreak="0">
+    <w:nsid w:val="5EDC5BA4"/>
+    <w:multiLevelType w:val="hybridMultilevel"/>
+    <w:tmpl w:val="E34EB8A2"/>
+    <w:lvl w:ilvl="0" w:tplc="04090001">
+      <w:start w:val="1"/>
+      <w:numFmt w:val="bullet"/>
+      <w:lvlText w:val=""/>
+      <w:lvlJc w:val="left"/>
+      <w:pPr>
+        <w:ind w:left="720" w:hanging="360"/>
+      </w:pPr>
+      <w:rPr>
+        <w:rFonts w:ascii="Symbol" w:hAnsi="Symbol" w:hint="default"/>
+      </w:rPr>
+    </w:lvl>
+    <w:lvl w:ilvl="1" w:tplc="04090003" w:tentative="1">
+      <w:start w:val="1"/>
+      <w:numFmt w:val="bullet"/>
+      <w:lvlText w:val="o"/>
+      <w:lvlJc w:val="left"/>
+      <w:pPr>
+        <w:ind w:left="1440" w:hanging="360"/>
+      </w:pPr>
+      <w:rPr>
+        <w:rFonts w:ascii="Courier New" w:hAnsi="Courier New" w:cs="Courier New" w:hint="default"/>
+      </w:rPr>
+    </w:lvl>
+    <w:lvl w:ilvl="2" w:tplc="04090005" w:tentative="1">
+      <w:start w:val="1"/>
+      <w:numFmt w:val="bullet"/>
+      <w:lvlText w:val=""/>
+      <w:lvlJc w:val="left"/>
+      <w:pPr>
+        <w:ind w:left="2160" w:hanging="360"/>
+      </w:pPr>
+      <w:rPr>
+        <w:rFonts w:ascii="Wingdings" w:hAnsi="Wingdings" w:hint="default"/>
+      </w:rPr>
+    </w:lvl>
+    <w:lvl w:ilvl="3" w:tplc="04090001" w:tentative="1">
+      <w:start w:val="1"/>
+      <w:numFmt w:val="bullet"/>
+      <w:lvlText w:val=""/>
+      <w:lvlJc w:val="left"/>
+      <w:pPr>
+        <w:ind w:left="2880" w:hanging="360"/>
+      </w:pPr>
+      <w:rPr>
+        <w:rFonts w:ascii="Symbol" w:hAnsi="Symbol" w:hint="default"/>
+      </w:rPr>
+    </w:lvl>
+    <w:lvl w:ilvl="4" w:tplc="04090003" w:tentative="1">
+      <w:start w:val="1"/>
+      <w:numFmt w:val="bullet"/>
+      <w:lvlText w:val="o"/>
+      <w:lvlJc w:val="left"/>
+      <w:pPr>
+        <w:ind w:left="3600" w:hanging="360"/>
+      </w:pPr>
+      <w:rPr>
+        <w:rFonts w:ascii="Courier New" w:hAnsi="Courier New" w:cs="Courier New" w:hint="default"/>
+      </w:rPr>
+    </w:lvl>
+    <w:lvl w:ilvl="5" w:tplc="04090005" w:tentative="1">
+      <w:start w:val="1"/>
+      <w:numFmt w:val="bullet"/>
+      <w:lvlText w:val=""/>
+      <w:lvlJc w:val="left"/>
+      <w:pPr>
+        <w:ind w:left="4320" w:hanging="360"/>
+      </w:pPr>
+      <w:rPr>
+        <w:rFonts w:ascii="Wingdings" w:hAnsi="Wingdings" w:hint="default"/>
+      </w:rPr>
+    </w:lvl>
+    <w:lvl w:ilvl="6" w:tplc="04090001" w:tentative="1">
+      <w:start w:val="1"/>
+      <w:numFmt w:val="bullet"/>
+      <w:lvlText w:val=""/>
+      <w:lvlJc w:val="left"/>
+      <w:pPr>
+        <w:ind w:left="5040" w:hanging="360"/>
+      </w:pPr>
+      <w:rPr>
+        <w:rFonts w:ascii="Symbol" w:hAnsi="Symbol" w:hint="default"/>
+      </w:rPr>
+    </w:lvl>
+    <w:lvl w:ilvl="7" w:tplc="04090003" w:tentative="1">
+      <w:start w:val="1"/>
+      <w:numFmt w:val="bullet"/>
+      <w:lvlText w:val="o"/>
+      <w:lvlJc w:val="left"/>
+      <w:pPr>
+        <w:ind w:left="5760" w:hanging="360"/>
+      </w:pPr>
+      <w:rPr>
+        <w:rFonts w:ascii="Courier New" w:hAnsi="Courier New" w:cs="Courier New" w:hint="default"/>
+      </w:rPr>
+    </w:lvl>
+    <w:lvl w:ilvl="8" w:tplc="04090005" w:tentative="1">
+      <w:start w:val="1"/>
+      <w:numFmt w:val="bullet"/>
+      <w:lvlText w:val=""/>
+      <w:lvlJc w:val="left"/>
+      <w:pPr>
+        <w:ind w:left="6480" w:hanging="360"/>
+      </w:pPr>
+      <w:rPr>
+        <w:rFonts w:ascii="Wingdings" w:hAnsi="Wingdings" w:hint="default"/>
+      </w:rPr>
+    </w:lvl>
+  </w:abstractNum>
+  <w:abstractNum w:abstractNumId="13" w15:restartNumberingAfterBreak="0">
     <w:nsid w:val="608B0027"/>
     <w:multiLevelType w:val="hybridMultilevel"/>
     <w:tmpl w:val="1A2A0CCE"/>
@@ -8716,7 +9487,7 @@
       </w:rPr>
     </w:lvl>
   </w:abstractNum>
-  <w:abstractNum w:abstractNumId="12" w15:restartNumberingAfterBreak="0">
+  <w:abstractNum w:abstractNumId="14" w15:restartNumberingAfterBreak="0">
     <w:nsid w:val="6B39307D"/>
     <w:multiLevelType w:val="hybridMultilevel"/>
     <w:tmpl w:val="BE94EE76"/>
@@ -8829,7 +9600,7 @@
       </w:rPr>
     </w:lvl>
   </w:abstractNum>
-  <w:abstractNum w:abstractNumId="13" w15:restartNumberingAfterBreak="0">
+  <w:abstractNum w:abstractNumId="15" w15:restartNumberingAfterBreak="0">
     <w:nsid w:val="6EF91E29"/>
     <w:multiLevelType w:val="hybridMultilevel"/>
     <w:tmpl w:val="90A0CFD2"/>
@@ -8942,7 +9713,7 @@
       </w:rPr>
     </w:lvl>
   </w:abstractNum>
-  <w:abstractNum w:abstractNumId="14" w15:restartNumberingAfterBreak="0">
+  <w:abstractNum w:abstractNumId="16" w15:restartNumberingAfterBreak="0">
     <w:nsid w:val="736117B3"/>
     <w:multiLevelType w:val="hybridMultilevel"/>
     <w:tmpl w:val="B902F320"/>
@@ -9055,7 +9826,7 @@
       </w:rPr>
     </w:lvl>
   </w:abstractNum>
-  <w:abstractNum w:abstractNumId="15" w15:restartNumberingAfterBreak="0">
+  <w:abstractNum w:abstractNumId="17" w15:restartNumberingAfterBreak="0">
     <w:nsid w:val="73AA7E9E"/>
     <w:multiLevelType w:val="hybridMultilevel"/>
     <w:tmpl w:val="8EAE28E8"/>
@@ -9168,7 +9939,7 @@
       </w:rPr>
     </w:lvl>
   </w:abstractNum>
-  <w:abstractNum w:abstractNumId="16" w15:restartNumberingAfterBreak="0">
+  <w:abstractNum w:abstractNumId="18" w15:restartNumberingAfterBreak="0">
     <w:nsid w:val="79993F7C"/>
     <w:multiLevelType w:val="hybridMultilevel"/>
     <w:tmpl w:val="8F9A8314"/>
@@ -9282,55 +10053,61 @@
     </w:lvl>
   </w:abstractNum>
   <w:num w:numId="1" w16cid:durableId="824902107">
+    <w:abstractNumId w:val="13"/>
+  </w:num>
+  <w:num w:numId="2" w16cid:durableId="617299781">
+    <w:abstractNumId w:val="15"/>
+  </w:num>
+  <w:num w:numId="3" w16cid:durableId="1048263498">
+    <w:abstractNumId w:val="10"/>
+  </w:num>
+  <w:num w:numId="4" w16cid:durableId="237983024">
+    <w:abstractNumId w:val="9"/>
+  </w:num>
+  <w:num w:numId="5" w16cid:durableId="325859572">
+    <w:abstractNumId w:val="4"/>
+  </w:num>
+  <w:num w:numId="6" w16cid:durableId="398870548">
+    <w:abstractNumId w:val="14"/>
+  </w:num>
+  <w:num w:numId="7" w16cid:durableId="1317153043">
+    <w:abstractNumId w:val="16"/>
+  </w:num>
+  <w:num w:numId="8" w16cid:durableId="430202784">
+    <w:abstractNumId w:val="7"/>
+  </w:num>
+  <w:num w:numId="9" w16cid:durableId="1169177289">
+    <w:abstractNumId w:val="17"/>
+  </w:num>
+  <w:num w:numId="10" w16cid:durableId="965619825">
+    <w:abstractNumId w:val="1"/>
+  </w:num>
+  <w:num w:numId="11" w16cid:durableId="1154027656">
     <w:abstractNumId w:val="11"/>
   </w:num>
-  <w:num w:numId="2" w16cid:durableId="617299781">
-    <w:abstractNumId w:val="13"/>
-  </w:num>
-  <w:num w:numId="3" w16cid:durableId="1048263498">
-    <w:abstractNumId w:val="9"/>
-  </w:num>
-  <w:num w:numId="4" w16cid:durableId="237983024">
+  <w:num w:numId="12" w16cid:durableId="867530551">
     <w:abstractNumId w:val="8"/>
   </w:num>
-  <w:num w:numId="5" w16cid:durableId="325859572">
+  <w:num w:numId="13" w16cid:durableId="464351712">
+    <w:abstractNumId w:val="18"/>
+  </w:num>
+  <w:num w:numId="14" w16cid:durableId="676274769">
+    <w:abstractNumId w:val="6"/>
+  </w:num>
+  <w:num w:numId="15" w16cid:durableId="1423530884">
+    <w:abstractNumId w:val="5"/>
+  </w:num>
+  <w:num w:numId="16" w16cid:durableId="799149697">
     <w:abstractNumId w:val="3"/>
   </w:num>
-  <w:num w:numId="6" w16cid:durableId="398870548">
+  <w:num w:numId="17" w16cid:durableId="874973434">
+    <w:abstractNumId w:val="2"/>
+  </w:num>
+  <w:num w:numId="18" w16cid:durableId="1624189086">
     <w:abstractNumId w:val="12"/>
   </w:num>
-  <w:num w:numId="7" w16cid:durableId="1317153043">
-    <w:abstractNumId w:val="14"/>
-  </w:num>
-  <w:num w:numId="8" w16cid:durableId="430202784">
-    <w:abstractNumId w:val="6"/>
-  </w:num>
-  <w:num w:numId="9" w16cid:durableId="1169177289">
-    <w:abstractNumId w:val="15"/>
-  </w:num>
-  <w:num w:numId="10" w16cid:durableId="965619825">
+  <w:num w:numId="19" w16cid:durableId="857818583">
     <w:abstractNumId w:val="0"/>
-  </w:num>
-  <w:num w:numId="11" w16cid:durableId="1154027656">
-    <w:abstractNumId w:val="10"/>
-  </w:num>
-  <w:num w:numId="12" w16cid:durableId="867530551">
-    <w:abstractNumId w:val="7"/>
-  </w:num>
-  <w:num w:numId="13" w16cid:durableId="464351712">
-    <w:abstractNumId w:val="16"/>
-  </w:num>
-  <w:num w:numId="14" w16cid:durableId="676274769">
-    <w:abstractNumId w:val="5"/>
-  </w:num>
-  <w:num w:numId="15" w16cid:durableId="1423530884">
-    <w:abstractNumId w:val="4"/>
-  </w:num>
-  <w:num w:numId="16" w16cid:durableId="799149697">
-    <w:abstractNumId w:val="2"/>
-  </w:num>
-  <w:num w:numId="17" w16cid:durableId="874973434">
-    <w:abstractNumId w:val="1"/>
   </w:num>
 </w:numbering>
 </file>

</xml_diff>

<commit_message>
Actualiza Fuentes de Datos con rangos para Viterbo Caldas
</commit_message>
<xml_diff>
--- a/Documentacion/Fuentes de Datos.docx
+++ b/Documentacion/Fuentes de Datos.docx
@@ -100,7 +100,7 @@
           <w:rFonts w:ascii="Arial" w:hAnsi="Arial" w:cs="Arial"/>
           <w:lang w:val="es-CO"/>
         </w:rPr>
-        <w:t>8</w:t>
+        <w:t>9</w:t>
       </w:r>
       <w:r>
         <w:rPr>
@@ -1210,7 +1210,36 @@
                 <w:rFonts w:ascii="Arial" w:hAnsi="Arial" w:cs="Arial"/>
                 <w:lang w:val="es-CO"/>
               </w:rPr>
-              <w:t>B24196-B24252</w:t>
+              <w:t>C:I -</w:t>
+            </w:r>
+          </w:p>
+          <w:p>
+            <w:pPr>
+              <w:rPr>
+                <w:rFonts w:ascii="Arial" w:hAnsi="Arial" w:cs="Arial"/>
+                <w:lang w:val="es-CO"/>
+              </w:rPr>
+            </w:pPr>
+            <w:r>
+              <w:rPr>
+                <w:rFonts w:ascii="Arial" w:hAnsi="Arial" w:cs="Arial"/>
+                <w:lang w:val="es-CO"/>
+              </w:rPr>
+              <w:t>24196</w:t>
+            </w:r>
+            <w:r>
+              <w:rPr>
+                <w:rFonts w:ascii="Arial" w:hAnsi="Arial" w:cs="Arial"/>
+                <w:lang w:val="es-CO"/>
+              </w:rPr>
+              <w:t>:</w:t>
+            </w:r>
+            <w:r>
+              <w:rPr>
+                <w:rFonts w:ascii="Arial" w:hAnsi="Arial" w:cs="Arial"/>
+                <w:lang w:val="es-CO"/>
+              </w:rPr>
+              <w:t>24252</w:t>
             </w:r>
           </w:p>
         </w:tc>
@@ -1300,7 +1329,28 @@
                 <w:rFonts w:ascii="Arial" w:hAnsi="Arial" w:cs="Arial"/>
                 <w:lang w:val="es-CO"/>
               </w:rPr>
-              <w:t>B42485-42607</w:t>
+              <w:t>C:P -</w:t>
+            </w:r>
+            <w:r>
+              <w:rPr>
+                <w:rFonts w:ascii="Arial" w:hAnsi="Arial" w:cs="Arial"/>
+                <w:lang w:val="es-CO"/>
+              </w:rPr>
+              <w:t>42485</w:t>
+            </w:r>
+            <w:r>
+              <w:rPr>
+                <w:rFonts w:ascii="Arial" w:hAnsi="Arial" w:cs="Arial"/>
+                <w:lang w:val="es-CO"/>
+              </w:rPr>
+              <w:t>:</w:t>
+            </w:r>
+            <w:r>
+              <w:rPr>
+                <w:rFonts w:ascii="Arial" w:hAnsi="Arial" w:cs="Arial"/>
+                <w:lang w:val="es-CO"/>
+              </w:rPr>
+              <w:t>42607</w:t>
             </w:r>
           </w:p>
         </w:tc>
@@ -1382,7 +1432,35 @@
                 <w:rFonts w:ascii="Arial" w:hAnsi="Arial" w:cs="Arial"/>
                 <w:lang w:val="es-CO"/>
               </w:rPr>
-              <w:t>B3846-</w:t>
+              <w:t xml:space="preserve">C:U </w:t>
+            </w:r>
+            <w:r>
+              <w:rPr>
+                <w:rFonts w:ascii="Arial" w:hAnsi="Arial" w:cs="Arial"/>
+                <w:lang w:val="es-CO"/>
+              </w:rPr>
+              <w:t>-</w:t>
+            </w:r>
+            <w:r>
+              <w:rPr>
+                <w:rFonts w:ascii="Arial" w:hAnsi="Arial" w:cs="Arial"/>
+                <w:lang w:val="es-CO"/>
+              </w:rPr>
+              <w:t xml:space="preserve"> </w:t>
+            </w:r>
+            <w:r>
+              <w:rPr>
+                <w:rFonts w:ascii="Arial" w:hAnsi="Arial" w:cs="Arial"/>
+                <w:lang w:val="es-CO"/>
+              </w:rPr>
+              <w:t>3846</w:t>
+            </w:r>
+            <w:r>
+              <w:rPr>
+                <w:rFonts w:ascii="Arial" w:hAnsi="Arial" w:cs="Arial"/>
+                <w:lang w:val="es-CO"/>
+              </w:rPr>
+              <w:t>:</w:t>
             </w:r>
           </w:p>
           <w:p>
@@ -1397,7 +1475,7 @@
                 <w:rFonts w:ascii="Arial" w:hAnsi="Arial" w:cs="Arial"/>
                 <w:lang w:val="es-CO"/>
               </w:rPr>
-              <w:t>B3854</w:t>
+              <w:t>3854</w:t>
             </w:r>
           </w:p>
         </w:tc>
@@ -1479,7 +1557,35 @@
                 <w:rFonts w:ascii="Arial" w:hAnsi="Arial" w:cs="Arial"/>
                 <w:lang w:val="es-CO"/>
               </w:rPr>
-              <w:t>B24196-</w:t>
+              <w:t xml:space="preserve">C:U </w:t>
+            </w:r>
+            <w:r>
+              <w:rPr>
+                <w:rFonts w:ascii="Arial" w:hAnsi="Arial" w:cs="Arial"/>
+                <w:lang w:val="es-CO"/>
+              </w:rPr>
+              <w:t>-</w:t>
+            </w:r>
+            <w:r>
+              <w:rPr>
+                <w:rFonts w:ascii="Arial" w:hAnsi="Arial" w:cs="Arial"/>
+                <w:lang w:val="es-CO"/>
+              </w:rPr>
+              <w:t xml:space="preserve"> </w:t>
+            </w:r>
+            <w:r>
+              <w:rPr>
+                <w:rFonts w:ascii="Arial" w:hAnsi="Arial" w:cs="Arial"/>
+                <w:lang w:val="es-CO"/>
+              </w:rPr>
+              <w:t>24196</w:t>
+            </w:r>
+            <w:r>
+              <w:rPr>
+                <w:rFonts w:ascii="Arial" w:hAnsi="Arial" w:cs="Arial"/>
+                <w:lang w:val="es-CO"/>
+              </w:rPr>
+              <w:t>:</w:t>
             </w:r>
           </w:p>
           <w:p>
@@ -1494,7 +1600,7 @@
                 <w:rFonts w:ascii="Arial" w:hAnsi="Arial" w:cs="Arial"/>
                 <w:lang w:val="es-CO"/>
               </w:rPr>
-              <w:t>B24252</w:t>
+              <w:t>24252</w:t>
             </w:r>
           </w:p>
         </w:tc>
@@ -1590,7 +1696,35 @@
                 <w:rFonts w:ascii="Arial" w:hAnsi="Arial" w:cs="Arial"/>
                 <w:lang w:val="es-CO"/>
               </w:rPr>
-              <w:t>B48170-</w:t>
+              <w:t xml:space="preserve">C:V </w:t>
+            </w:r>
+            <w:r>
+              <w:rPr>
+                <w:rFonts w:ascii="Arial" w:hAnsi="Arial" w:cs="Arial"/>
+                <w:lang w:val="es-CO"/>
+              </w:rPr>
+              <w:t>-</w:t>
+            </w:r>
+            <w:r>
+              <w:rPr>
+                <w:rFonts w:ascii="Arial" w:hAnsi="Arial" w:cs="Arial"/>
+                <w:lang w:val="es-CO"/>
+              </w:rPr>
+              <w:t xml:space="preserve"> </w:t>
+            </w:r>
+            <w:r>
+              <w:rPr>
+                <w:rFonts w:ascii="Arial" w:hAnsi="Arial" w:cs="Arial"/>
+                <w:lang w:val="es-CO"/>
+              </w:rPr>
+              <w:t>48170</w:t>
+            </w:r>
+            <w:r>
+              <w:rPr>
+                <w:rFonts w:ascii="Arial" w:hAnsi="Arial" w:cs="Arial"/>
+                <w:lang w:val="es-CO"/>
+              </w:rPr>
+              <w:t>:</w:t>
             </w:r>
           </w:p>
           <w:p>
@@ -1605,7 +1739,7 @@
                 <w:rFonts w:ascii="Arial" w:hAnsi="Arial" w:cs="Arial"/>
                 <w:lang w:val="es-CO"/>
               </w:rPr>
-              <w:t>B48283</w:t>
+              <w:t>48283</w:t>
             </w:r>
           </w:p>
         </w:tc>
@@ -1687,7 +1821,35 @@
                 <w:rFonts w:ascii="Arial" w:hAnsi="Arial" w:cs="Arial"/>
                 <w:lang w:val="es-CO"/>
               </w:rPr>
-              <w:t>B6568-</w:t>
+              <w:t xml:space="preserve">C:AL </w:t>
+            </w:r>
+            <w:r>
+              <w:rPr>
+                <w:rFonts w:ascii="Arial" w:hAnsi="Arial" w:cs="Arial"/>
+                <w:lang w:val="es-CO"/>
+              </w:rPr>
+              <w:t>-</w:t>
+            </w:r>
+            <w:r>
+              <w:rPr>
+                <w:rFonts w:ascii="Arial" w:hAnsi="Arial" w:cs="Arial"/>
+                <w:lang w:val="es-CO"/>
+              </w:rPr>
+              <w:t xml:space="preserve"> </w:t>
+            </w:r>
+            <w:r>
+              <w:rPr>
+                <w:rFonts w:ascii="Arial" w:hAnsi="Arial" w:cs="Arial"/>
+                <w:lang w:val="es-CO"/>
+              </w:rPr>
+              <w:t>6568</w:t>
+            </w:r>
+            <w:r>
+              <w:rPr>
+                <w:rFonts w:ascii="Arial" w:hAnsi="Arial" w:cs="Arial"/>
+                <w:lang w:val="es-CO"/>
+              </w:rPr>
+              <w:t>:</w:t>
             </w:r>
           </w:p>
           <w:p>
@@ -1702,7 +1864,7 @@
                 <w:rFonts w:ascii="Arial" w:hAnsi="Arial" w:cs="Arial"/>
                 <w:lang w:val="es-CO"/>
               </w:rPr>
-              <w:t>B6586</w:t>
+              <w:t>6586</w:t>
             </w:r>
           </w:p>
         </w:tc>
@@ -1784,7 +1946,28 @@
                 <w:rFonts w:ascii="Arial" w:hAnsi="Arial" w:cs="Arial"/>
                 <w:lang w:val="es-CO"/>
               </w:rPr>
-              <w:t>B749-B751</w:t>
+              <w:t xml:space="preserve">C:AL - </w:t>
+            </w:r>
+            <w:r>
+              <w:rPr>
+                <w:rFonts w:ascii="Arial" w:hAnsi="Arial" w:cs="Arial"/>
+                <w:lang w:val="es-CO"/>
+              </w:rPr>
+              <w:t>749</w:t>
+            </w:r>
+            <w:r>
+              <w:rPr>
+                <w:rFonts w:ascii="Arial" w:hAnsi="Arial" w:cs="Arial"/>
+                <w:lang w:val="es-CO"/>
+              </w:rPr>
+              <w:t>:</w:t>
+            </w:r>
+            <w:r>
+              <w:rPr>
+                <w:rFonts w:ascii="Arial" w:hAnsi="Arial" w:cs="Arial"/>
+                <w:lang w:val="es-CO"/>
+              </w:rPr>
+              <w:t>751</w:t>
             </w:r>
           </w:p>
         </w:tc>
@@ -1875,7 +2058,21 @@
                 <w:lang w:val="es-CO"/>
               </w:rPr>
               <w:lastRenderedPageBreak/>
-              <w:t>B19678-</w:t>
+              <w:t xml:space="preserve">C:BS - </w:t>
+            </w:r>
+            <w:r>
+              <w:rPr>
+                <w:rFonts w:ascii="Arial" w:hAnsi="Arial" w:cs="Arial"/>
+                <w:lang w:val="es-CO"/>
+              </w:rPr>
+              <w:t>19678</w:t>
+            </w:r>
+            <w:r>
+              <w:rPr>
+                <w:rFonts w:ascii="Arial" w:hAnsi="Arial" w:cs="Arial"/>
+                <w:lang w:val="es-CO"/>
+              </w:rPr>
+              <w:t>:</w:t>
             </w:r>
           </w:p>
           <w:p>
@@ -1890,7 +2087,7 @@
                 <w:rFonts w:ascii="Arial" w:hAnsi="Arial" w:cs="Arial"/>
                 <w:lang w:val="es-CO"/>
               </w:rPr>
-              <w:t>B19734</w:t>
+              <w:t>19734</w:t>
             </w:r>
           </w:p>
         </w:tc>
@@ -1979,7 +2176,28 @@
                 <w:rFonts w:ascii="Arial" w:hAnsi="Arial" w:cs="Arial"/>
                 <w:lang w:val="es-CO"/>
               </w:rPr>
-              <w:t>B22610-B22663</w:t>
+              <w:t xml:space="preserve">C:N - </w:t>
+            </w:r>
+            <w:r>
+              <w:rPr>
+                <w:rFonts w:ascii="Arial" w:hAnsi="Arial" w:cs="Arial"/>
+                <w:lang w:val="es-CO"/>
+              </w:rPr>
+              <w:t>22610</w:t>
+            </w:r>
+            <w:r>
+              <w:rPr>
+                <w:rFonts w:ascii="Arial" w:hAnsi="Arial" w:cs="Arial"/>
+                <w:lang w:val="es-CO"/>
+              </w:rPr>
+              <w:t>:</w:t>
+            </w:r>
+            <w:r>
+              <w:rPr>
+                <w:rFonts w:ascii="Arial" w:hAnsi="Arial" w:cs="Arial"/>
+                <w:lang w:val="es-CO"/>
+              </w:rPr>
+              <w:t>22663</w:t>
             </w:r>
           </w:p>
         </w:tc>
@@ -2061,7 +2279,28 @@
                 <w:rFonts w:ascii="Arial" w:hAnsi="Arial" w:cs="Arial"/>
                 <w:lang w:val="es-CO"/>
               </w:rPr>
-              <w:t>B3847-B3855</w:t>
+              <w:t xml:space="preserve">C:S - </w:t>
+            </w:r>
+            <w:r>
+              <w:rPr>
+                <w:rFonts w:ascii="Arial" w:hAnsi="Arial" w:cs="Arial"/>
+                <w:lang w:val="es-CO"/>
+              </w:rPr>
+              <w:t>3847</w:t>
+            </w:r>
+            <w:r>
+              <w:rPr>
+                <w:rFonts w:ascii="Arial" w:hAnsi="Arial" w:cs="Arial"/>
+                <w:lang w:val="es-CO"/>
+              </w:rPr>
+              <w:t>:</w:t>
+            </w:r>
+            <w:r>
+              <w:rPr>
+                <w:rFonts w:ascii="Arial" w:hAnsi="Arial" w:cs="Arial"/>
+                <w:lang w:val="es-CO"/>
+              </w:rPr>
+              <w:t>3855</w:t>
             </w:r>
           </w:p>
         </w:tc>
@@ -2143,7 +2382,21 @@
                 <w:rFonts w:ascii="Arial" w:hAnsi="Arial" w:cs="Arial"/>
                 <w:lang w:val="es-CO"/>
               </w:rPr>
-              <w:t>B3846-</w:t>
+              <w:t xml:space="preserve">C:T - </w:t>
+            </w:r>
+            <w:r>
+              <w:rPr>
+                <w:rFonts w:ascii="Arial" w:hAnsi="Arial" w:cs="Arial"/>
+                <w:lang w:val="es-CO"/>
+              </w:rPr>
+              <w:t>3846</w:t>
+            </w:r>
+            <w:r>
+              <w:rPr>
+                <w:rFonts w:ascii="Arial" w:hAnsi="Arial" w:cs="Arial"/>
+                <w:lang w:val="es-CO"/>
+              </w:rPr>
+              <w:t>:</w:t>
             </w:r>
           </w:p>
           <w:p>
@@ -2158,7 +2411,7 @@
                 <w:rFonts w:ascii="Arial" w:hAnsi="Arial" w:cs="Arial"/>
                 <w:lang w:val="es-CO"/>
               </w:rPr>
-              <w:t>B3854</w:t>
+              <w:t>3854</w:t>
             </w:r>
           </w:p>
         </w:tc>
@@ -2240,7 +2493,21 @@
                 <w:rFonts w:ascii="Arial" w:hAnsi="Arial" w:cs="Arial"/>
                 <w:lang w:val="es-CO"/>
               </w:rPr>
-              <w:t>B8959-</w:t>
+              <w:t xml:space="preserve">C:S - </w:t>
+            </w:r>
+            <w:r>
+              <w:rPr>
+                <w:rFonts w:ascii="Arial" w:hAnsi="Arial" w:cs="Arial"/>
+                <w:lang w:val="es-CO"/>
+              </w:rPr>
+              <w:t>8959</w:t>
+            </w:r>
+            <w:r>
+              <w:rPr>
+                <w:rFonts w:ascii="Arial" w:hAnsi="Arial" w:cs="Arial"/>
+                <w:lang w:val="es-CO"/>
+              </w:rPr>
+              <w:t>:</w:t>
             </w:r>
           </w:p>
           <w:p>
@@ -2255,7 +2522,7 @@
                 <w:rFonts w:ascii="Arial" w:hAnsi="Arial" w:cs="Arial"/>
                 <w:lang w:val="es-CO"/>
               </w:rPr>
-              <w:t>B8979</w:t>
+              <w:t>8979</w:t>
             </w:r>
           </w:p>
         </w:tc>
@@ -2337,7 +2604,21 @@
                 <w:rFonts w:ascii="Arial" w:hAnsi="Arial" w:cs="Arial"/>
                 <w:lang w:val="es-CO"/>
               </w:rPr>
-              <w:t>B18211-</w:t>
+              <w:t xml:space="preserve">C:U - </w:t>
+            </w:r>
+            <w:r>
+              <w:rPr>
+                <w:rFonts w:ascii="Arial" w:hAnsi="Arial" w:cs="Arial"/>
+                <w:lang w:val="es-CO"/>
+              </w:rPr>
+              <w:t>18211</w:t>
+            </w:r>
+            <w:r>
+              <w:rPr>
+                <w:rFonts w:ascii="Arial" w:hAnsi="Arial" w:cs="Arial"/>
+                <w:lang w:val="es-CO"/>
+              </w:rPr>
+              <w:t>:</w:t>
             </w:r>
           </w:p>
           <w:p>
@@ -2352,7 +2633,7 @@
                 <w:rFonts w:ascii="Arial" w:hAnsi="Arial" w:cs="Arial"/>
                 <w:lang w:val="es-CO"/>
               </w:rPr>
-              <w:t>B18263</w:t>
+              <w:t>18263</w:t>
             </w:r>
           </w:p>
         </w:tc>
@@ -7234,14 +7515,7 @@
           <w:rFonts w:ascii="Arial" w:hAnsi="Arial" w:cs="Arial"/>
           <w:lang w:val="es-CO"/>
         </w:rPr>
-        <w:t>Contiene 16 columnas y 3 agrupaciones</w:t>
-      </w:r>
-      <w:r>
-        <w:rPr>
-          <w:rFonts w:ascii="Arial" w:hAnsi="Arial" w:cs="Arial"/>
-          <w:lang w:val="es-CO"/>
-        </w:rPr>
-        <w:t>, cada agrupación tiene 3 subgrupos correspondientes al sexo, y 7 subgrupos correspondientes a la pertenencia étnica.</w:t>
+        <w:t>Contiene 16 columnas y 3 agrupaciones, cada agrupación tiene 3 subgrupos correspondientes al sexo, y 7 subgrupos correspondientes a la pertenencia étnica.</w:t>
       </w:r>
     </w:p>
     <w:p>

</xml_diff>

<commit_message>
Corrige columnas faltantes y typos
</commit_message>
<xml_diff>
--- a/Documentacion/Fuentes de Datos.docx
+++ b/Documentacion/Fuentes de Datos.docx
@@ -1,6 +1,6 @@
 
 <file path=word/document.xml><?xml version="1.0" encoding="utf-8"?>
-<w:document xmlns:wpc="http://schemas.microsoft.com/office/word/2010/wordprocessingCanvas" xmlns:cx="http://schemas.microsoft.com/office/drawing/2014/chartex" xmlns:cx1="http://schemas.microsoft.com/office/drawing/2015/9/8/chartex" xmlns:cx2="http://schemas.microsoft.com/office/drawing/2015/10/21/chartex" xmlns:cx3="http://schemas.microsoft.com/office/drawing/2016/5/9/chartex" xmlns:cx4="http://schemas.microsoft.com/office/drawing/2016/5/10/chartex" xmlns:cx5="http://schemas.microsoft.com/office/drawing/2016/5/11/chartex" xmlns:cx6="http://schemas.microsoft.com/office/drawing/2016/5/12/chartex" xmlns:cx7="http://schemas.microsoft.com/office/drawing/2016/5/13/chartex" xmlns:cx8="http://schemas.microsoft.com/office/drawing/2016/5/14/chartex" xmlns:mc="http://schemas.openxmlformats.org/markup-compatibility/2006" xmlns:aink="http://schemas.microsoft.com/office/drawing/2016/ink" xmlns:am3d="http://schemas.microsoft.com/office/drawing/2017/model3d" xmlns:o="urn:schemas-microsoft-com:office:office" xmlns:oel="http://schemas.microsoft.com/office/2019/extlst" xmlns:r="http://schemas.openxmlformats.org/officeDocument/2006/relationships" xmlns:m="http://schemas.openxmlformats.org/officeDocument/2006/math" xmlns:v="urn:schemas-microsoft-com:vml" xmlns:wp14="http://schemas.microsoft.com/office/word/2010/wordprocessingDrawing" xmlns:wp="http://schemas.openxmlformats.org/drawingml/2006/wordprocessingDrawing" xmlns:w10="urn:schemas-microsoft-com:office:word" xmlns:w="http://schemas.openxmlformats.org/wordprocessingml/2006/main" xmlns:w14="http://schemas.microsoft.com/office/word/2010/wordml" xmlns:w15="http://schemas.microsoft.com/office/word/2012/wordml" xmlns:w16cex="http://schemas.microsoft.com/office/word/2018/wordml/cex" xmlns:w16cid="http://schemas.microsoft.com/office/word/2016/wordml/cid" xmlns:w16="http://schemas.microsoft.com/office/word/2018/wordml" xmlns:w16du="http://schemas.microsoft.com/office/word/2023/wordml/word16du" xmlns:w16sdtdh="http://schemas.microsoft.com/office/word/2020/wordml/sdtdatahash" xmlns:w16sdtfl="http://schemas.microsoft.com/office/word/2024/wordml/sdtformatlock" xmlns:w16se="http://schemas.microsoft.com/office/word/2015/wordml/symex" xmlns:wpg="http://schemas.microsoft.com/office/word/2010/wordprocessingGroup" xmlns:wpi="http://schemas.microsoft.com/office/word/2010/wordprocessingInk" xmlns:wne="http://schemas.microsoft.com/office/word/2006/wordml" xmlns:wps="http://schemas.microsoft.com/office/word/2010/wordprocessingShape" mc:Ignorable="w14 w15 w16se w16cid w16 w16cex w16sdtdh w16sdtfl w16du wp14">
+<w:document xmlns:wpc="http://schemas.microsoft.com/office/word/2010/wordprocessingCanvas" xmlns:cx="http://schemas.microsoft.com/office/drawing/2014/chartex" xmlns:cx1="http://schemas.microsoft.com/office/drawing/2015/9/8/chartex" xmlns:cx2="http://schemas.microsoft.com/office/drawing/2015/10/21/chartex" xmlns:cx3="http://schemas.microsoft.com/office/drawing/2016/5/9/chartex" xmlns:cx4="http://schemas.microsoft.com/office/drawing/2016/5/10/chartex" xmlns:cx5="http://schemas.microsoft.com/office/drawing/2016/5/11/chartex" xmlns:cx6="http://schemas.microsoft.com/office/drawing/2016/5/12/chartex" xmlns:cx7="http://schemas.microsoft.com/office/drawing/2016/5/13/chartex" xmlns:cx8="http://schemas.microsoft.com/office/drawing/2016/5/14/chartex" xmlns:mc="http://schemas.openxmlformats.org/markup-compatibility/2006" xmlns:aink="http://schemas.microsoft.com/office/drawing/2016/ink" xmlns:am3d="http://schemas.microsoft.com/office/drawing/2017/model3d" xmlns:o="urn:schemas-microsoft-com:office:office" xmlns:r="http://schemas.openxmlformats.org/officeDocument/2006/relationships" xmlns:m="http://schemas.openxmlformats.org/officeDocument/2006/math" xmlns:v="urn:schemas-microsoft-com:vml" xmlns:wp14="http://schemas.microsoft.com/office/word/2010/wordprocessingDrawing" xmlns:wp="http://schemas.openxmlformats.org/drawingml/2006/wordprocessingDrawing" xmlns:w10="urn:schemas-microsoft-com:office:word" xmlns:w="http://schemas.openxmlformats.org/wordprocessingml/2006/main" xmlns:w14="http://schemas.microsoft.com/office/word/2010/wordml" xmlns:w15="http://schemas.microsoft.com/office/word/2012/wordml" xmlns:w16cex="http://schemas.microsoft.com/office/word/2018/wordml/cex" xmlns:w16cid="http://schemas.microsoft.com/office/word/2016/wordml/cid" xmlns:w16="http://schemas.microsoft.com/office/word/2018/wordml" xmlns:w16sdtdh="http://schemas.microsoft.com/office/word/2020/wordml/sdtdatahash" xmlns:w16se="http://schemas.microsoft.com/office/word/2015/wordml/symex" xmlns:wpg="http://schemas.microsoft.com/office/word/2010/wordprocessingGroup" xmlns:wpi="http://schemas.microsoft.com/office/word/2010/wordprocessingInk" xmlns:wne="http://schemas.microsoft.com/office/word/2006/wordml" xmlns:wps="http://schemas.microsoft.com/office/word/2010/wordprocessingShape" mc:Ignorable="w14 w15 w16se w16cid w16 w16cex w16sdtdh wp14">
   <w:body>
     <w:p>
       <w:pPr>
@@ -100,7 +100,7 @@
           <w:rFonts w:ascii="Arial" w:hAnsi="Arial" w:cs="Arial"/>
           <w:lang w:val="es-CO"/>
         </w:rPr>
-        <w:t>17</w:t>
+        <w:t>21</w:t>
       </w:r>
       <w:r>
         <w:rPr>
@@ -114,7 +114,7 @@
           <w:rFonts w:ascii="Arial" w:hAnsi="Arial" w:cs="Arial"/>
           <w:lang w:val="es-CO"/>
         </w:rPr>
-        <w:t>marzo</w:t>
+        <w:t>octubre</w:t>
       </w:r>
       <w:r>
         <w:rPr>
@@ -187,7 +187,35 @@
           <w:rFonts w:ascii="Arial" w:hAnsi="Arial" w:cs="Arial"/>
           <w:lang w:val="es-CO"/>
         </w:rPr>
-        <w:t>, el ítem ‘Cuadros personas demográfico – CNPV 2018.</w:t>
+        <w:t xml:space="preserve">, </w:t>
+      </w:r>
+      <w:r>
+        <w:rPr>
+          <w:rFonts w:ascii="Arial" w:hAnsi="Arial" w:cs="Arial"/>
+          <w:lang w:val="es-CO"/>
+        </w:rPr>
+        <w:t>d</w:t>
+      </w:r>
+      <w:r>
+        <w:rPr>
+          <w:rFonts w:ascii="Arial" w:hAnsi="Arial" w:cs="Arial"/>
+          <w:lang w:val="es-CO"/>
+        </w:rPr>
+        <w:t>el ítem ‘Cuadros personas demográfico – CNPV 2018</w:t>
+      </w:r>
+      <w:r>
+        <w:rPr>
+          <w:rFonts w:ascii="Arial" w:hAnsi="Arial" w:cs="Arial"/>
+          <w:lang w:val="es-CO"/>
+        </w:rPr>
+        <w:t>’</w:t>
+      </w:r>
+      <w:r>
+        <w:rPr>
+          <w:rFonts w:ascii="Arial" w:hAnsi="Arial" w:cs="Arial"/>
+          <w:lang w:val="es-CO"/>
+        </w:rPr>
+        <w:t>.</w:t>
       </w:r>
     </w:p>
     <w:p>
@@ -733,7 +761,16 @@
           <w:bCs/>
           <w:lang w:val="es-CO"/>
         </w:rPr>
-        <w:t>Datos Preparados</w:t>
+        <w:t>Datos Pr</w:t>
+      </w:r>
+      <w:r>
+        <w:rPr>
+          <w:rFonts w:ascii="Arial" w:hAnsi="Arial" w:cs="Arial"/>
+          <w:b/>
+          <w:bCs/>
+          <w:lang w:val="es-CO"/>
+        </w:rPr>
+        <w:t>ocesados</w:t>
       </w:r>
     </w:p>
     <w:p>
@@ -759,8 +796,9 @@
           <w:iCs/>
           <w:lang w:val="es-CO"/>
         </w:rPr>
-        <w:t>Censo Viterbo Caldas 2018/Data/Datasets/</w:t>
-      </w:r>
+        <w:t>Censo Viterbo Caldas 2018/Data/</w:t>
+      </w:r>
+      <w:proofErr w:type="spellStart"/>
       <w:r>
         <w:rPr>
           <w:rFonts w:ascii="Arial" w:hAnsi="Arial" w:cs="Arial"/>
@@ -768,15 +806,10 @@
           <w:iCs/>
           <w:lang w:val="es-CO"/>
         </w:rPr>
-        <w:t xml:space="preserve"> </w:t>
-      </w:r>
-      <w:r>
-        <w:rPr>
-          <w:rFonts w:ascii="Arial" w:hAnsi="Arial" w:cs="Arial"/>
-          <w:lang w:val="es-CO"/>
-        </w:rPr>
-        <w:t xml:space="preserve"> y tendrán la convención de nombre </w:t>
-      </w:r>
+        <w:t>Datasets</w:t>
+      </w:r>
+      <w:proofErr w:type="spellEnd"/>
+      <w:proofErr w:type="gramStart"/>
       <w:r>
         <w:rPr>
           <w:rFonts w:ascii="Arial" w:hAnsi="Arial" w:cs="Arial"/>
@@ -784,14 +817,7 @@
           <w:iCs/>
           <w:lang w:val="es-CO"/>
         </w:rPr>
-        <w:t xml:space="preserve">departamento_municipio_hoja.csv, </w:t>
-      </w:r>
-      <w:r>
-        <w:rPr>
-          <w:rFonts w:ascii="Arial" w:hAnsi="Arial" w:cs="Arial"/>
-          <w:lang w:val="es-CO"/>
-        </w:rPr>
-        <w:t>ejemplo</w:t>
+        <w:t>/</w:t>
       </w:r>
       <w:r>
         <w:rPr>
@@ -800,7 +826,115 @@
           <w:iCs/>
           <w:lang w:val="es-CO"/>
         </w:rPr>
-        <w:t>, caldas_viterbo_1PM.csv.</w:t>
+        <w:t xml:space="preserve"> </w:t>
+      </w:r>
+      <w:r>
+        <w:rPr>
+          <w:rFonts w:ascii="Arial" w:hAnsi="Arial" w:cs="Arial"/>
+          <w:lang w:val="es-CO"/>
+        </w:rPr>
+        <w:t xml:space="preserve"> y</w:t>
+      </w:r>
+      <w:proofErr w:type="gramEnd"/>
+      <w:r>
+        <w:rPr>
+          <w:rFonts w:ascii="Arial" w:hAnsi="Arial" w:cs="Arial"/>
+          <w:lang w:val="es-CO"/>
+        </w:rPr>
+        <w:t xml:space="preserve"> tendrán la convención de nombre </w:t>
+      </w:r>
+      <w:r>
+        <w:rPr>
+          <w:rFonts w:ascii="Arial" w:hAnsi="Arial" w:cs="Arial"/>
+          <w:i/>
+          <w:iCs/>
+          <w:lang w:val="es-CO"/>
+        </w:rPr>
+        <w:t>departamento_municipio_hoja.csv</w:t>
+      </w:r>
+      <w:r>
+        <w:rPr>
+          <w:rFonts w:ascii="Arial" w:hAnsi="Arial" w:cs="Arial"/>
+          <w:i/>
+          <w:iCs/>
+          <w:lang w:val="es-CO"/>
+        </w:rPr>
+        <w:t xml:space="preserve"> </w:t>
+      </w:r>
+      <w:r>
+        <w:rPr>
+          <w:rFonts w:ascii="Arial" w:hAnsi="Arial" w:cs="Arial"/>
+          <w:lang w:val="es-CO"/>
+        </w:rPr>
+        <w:t xml:space="preserve">y </w:t>
+      </w:r>
+      <w:r>
+        <w:rPr>
+          <w:rFonts w:ascii="Arial" w:hAnsi="Arial" w:cs="Arial"/>
+          <w:i/>
+          <w:iCs/>
+          <w:lang w:val="es-CO"/>
+        </w:rPr>
+        <w:t>departamento_municipio_total_hoja.csv</w:t>
+      </w:r>
+      <w:r>
+        <w:rPr>
+          <w:rFonts w:ascii="Arial" w:hAnsi="Arial" w:cs="Arial"/>
+          <w:i/>
+          <w:iCs/>
+          <w:lang w:val="es-CO"/>
+        </w:rPr>
+        <w:t xml:space="preserve">, </w:t>
+      </w:r>
+      <w:r>
+        <w:rPr>
+          <w:rFonts w:ascii="Arial" w:hAnsi="Arial" w:cs="Arial"/>
+          <w:lang w:val="es-CO"/>
+        </w:rPr>
+        <w:t>ejemplo</w:t>
+      </w:r>
+      <w:r>
+        <w:rPr>
+          <w:rFonts w:ascii="Arial" w:hAnsi="Arial" w:cs="Arial"/>
+          <w:i/>
+          <w:iCs/>
+          <w:lang w:val="es-CO"/>
+        </w:rPr>
+        <w:t>, caldas_viterbo_1PM.csv</w:t>
+      </w:r>
+      <w:r>
+        <w:rPr>
+          <w:rFonts w:ascii="Arial" w:hAnsi="Arial" w:cs="Arial"/>
+          <w:i/>
+          <w:iCs/>
+          <w:lang w:val="es-CO"/>
+        </w:rPr>
+        <w:t xml:space="preserve"> </w:t>
+      </w:r>
+      <w:r>
+        <w:rPr>
+          <w:rFonts w:ascii="Arial" w:hAnsi="Arial" w:cs="Arial"/>
+          <w:lang w:val="es-CO"/>
+        </w:rPr>
+        <w:t xml:space="preserve">o </w:t>
+      </w:r>
+      <w:r>
+        <w:rPr>
+          <w:rFonts w:ascii="Arial" w:hAnsi="Arial" w:cs="Arial"/>
+          <w:i/>
+          <w:iCs/>
+          <w:lang w:val="es-CO"/>
+        </w:rPr>
+        <w:t>caldas_viterbo_total_1PM.csv</w:t>
+      </w:r>
+      <w:r>
+        <w:rPr>
+          <w:rFonts w:ascii="Arial" w:hAnsi="Arial" w:cs="Arial"/>
+          <w:i/>
+          <w:iCs/>
+          <w:lang w:val="es-CO"/>
+        </w:rPr>
+        <w:t>.</w:t>
       </w:r>
     </w:p>
     <w:p>
@@ -1246,12 +1380,21 @@
                 <w:lang w:val="es-CO"/>
               </w:rPr>
             </w:pPr>
+            <w:proofErr w:type="gramStart"/>
             <w:r>
               <w:rPr>
                 <w:rFonts w:ascii="Arial" w:hAnsi="Arial" w:cs="Arial"/>
                 <w:lang w:val="es-CO"/>
               </w:rPr>
-              <w:t>C:I -</w:t>
+              <w:t>C:I</w:t>
+            </w:r>
+            <w:proofErr w:type="gramEnd"/>
+            <w:r>
+              <w:rPr>
+                <w:rFonts w:ascii="Arial" w:hAnsi="Arial" w:cs="Arial"/>
+                <w:lang w:val="es-CO"/>
+              </w:rPr>
+              <w:t xml:space="preserve"> -</w:t>
             </w:r>
           </w:p>
           <w:p>
@@ -1468,12 +1611,21 @@
                 <w:lang w:val="es-CO"/>
               </w:rPr>
             </w:pPr>
+            <w:proofErr w:type="gramStart"/>
             <w:r>
               <w:rPr>
                 <w:rFonts w:ascii="Arial" w:hAnsi="Arial" w:cs="Arial"/>
                 <w:lang w:val="es-CO"/>
               </w:rPr>
-              <w:t xml:space="preserve">C:U </w:t>
+              <w:t>C:U</w:t>
+            </w:r>
+            <w:proofErr w:type="gramEnd"/>
+            <w:r>
+              <w:rPr>
+                <w:rFonts w:ascii="Arial" w:hAnsi="Arial" w:cs="Arial"/>
+                <w:lang w:val="es-CO"/>
+              </w:rPr>
+              <w:t xml:space="preserve"> </w:t>
             </w:r>
             <w:r>
               <w:rPr>
@@ -1503,14 +1655,6 @@
               </w:rPr>
               <w:t>:</w:t>
             </w:r>
-          </w:p>
-          <w:p>
-            <w:pPr>
-              <w:rPr>
-                <w:rFonts w:ascii="Arial" w:hAnsi="Arial" w:cs="Arial"/>
-                <w:lang w:val="es-CO"/>
-              </w:rPr>
-            </w:pPr>
             <w:r>
               <w:rPr>
                 <w:rFonts w:ascii="Arial" w:hAnsi="Arial" w:cs="Arial"/>
@@ -1593,12 +1737,21 @@
                 <w:lang w:val="es-CO"/>
               </w:rPr>
             </w:pPr>
+            <w:proofErr w:type="gramStart"/>
             <w:r>
               <w:rPr>
                 <w:rFonts w:ascii="Arial" w:hAnsi="Arial" w:cs="Arial"/>
                 <w:lang w:val="es-CO"/>
               </w:rPr>
-              <w:t xml:space="preserve">C:U </w:t>
+              <w:t>C:U</w:t>
+            </w:r>
+            <w:proofErr w:type="gramEnd"/>
+            <w:r>
+              <w:rPr>
+                <w:rFonts w:ascii="Arial" w:hAnsi="Arial" w:cs="Arial"/>
+                <w:lang w:val="es-CO"/>
+              </w:rPr>
+              <w:t xml:space="preserve"> </w:t>
             </w:r>
             <w:r>
               <w:rPr>
@@ -1628,14 +1781,6 @@
               </w:rPr>
               <w:t>:</w:t>
             </w:r>
-          </w:p>
-          <w:p>
-            <w:pPr>
-              <w:rPr>
-                <w:rFonts w:ascii="Arial" w:hAnsi="Arial" w:cs="Arial"/>
-                <w:lang w:val="es-CO"/>
-              </w:rPr>
-            </w:pPr>
             <w:r>
               <w:rPr>
                 <w:rFonts w:ascii="Arial" w:hAnsi="Arial" w:cs="Arial"/>
@@ -1732,12 +1877,21 @@
                 <w:lang w:val="es-CO"/>
               </w:rPr>
             </w:pPr>
+            <w:proofErr w:type="gramStart"/>
             <w:r>
               <w:rPr>
                 <w:rFonts w:ascii="Arial" w:hAnsi="Arial" w:cs="Arial"/>
                 <w:lang w:val="es-CO"/>
               </w:rPr>
-              <w:t xml:space="preserve">C:V </w:t>
+              <w:t>C:V</w:t>
+            </w:r>
+            <w:proofErr w:type="gramEnd"/>
+            <w:r>
+              <w:rPr>
+                <w:rFonts w:ascii="Arial" w:hAnsi="Arial" w:cs="Arial"/>
+                <w:lang w:val="es-CO"/>
+              </w:rPr>
+              <w:t xml:space="preserve"> </w:t>
             </w:r>
             <w:r>
               <w:rPr>
@@ -1767,14 +1921,6 @@
               </w:rPr>
               <w:t>:</w:t>
             </w:r>
-          </w:p>
-          <w:p>
-            <w:pPr>
-              <w:rPr>
-                <w:rFonts w:ascii="Arial" w:hAnsi="Arial" w:cs="Arial"/>
-                <w:lang w:val="es-CO"/>
-              </w:rPr>
-            </w:pPr>
             <w:r>
               <w:rPr>
                 <w:rFonts w:ascii="Arial" w:hAnsi="Arial" w:cs="Arial"/>
@@ -1892,14 +2038,6 @@
               </w:rPr>
               <w:t>:</w:t>
             </w:r>
-          </w:p>
-          <w:p>
-            <w:pPr>
-              <w:rPr>
-                <w:rFonts w:ascii="Arial" w:hAnsi="Arial" w:cs="Arial"/>
-                <w:lang w:val="es-CO"/>
-              </w:rPr>
-            </w:pPr>
             <w:r>
               <w:rPr>
                 <w:rFonts w:ascii="Arial" w:hAnsi="Arial" w:cs="Arial"/>
@@ -2071,7 +2209,7 @@
                 <w:rFonts w:ascii="Arial" w:hAnsi="Arial" w:cs="Arial"/>
                 <w:lang w:val="es-CO"/>
               </w:rPr>
-              <w:t>Población censada en hogares que en los últimos treinta días tuvieron alguna enfermedad, accidente, problema odontológico u otro problema de salud, por áreas (Total, Cabecera y Centros poblados y Rural disperso), servicio de salud al que hayan acudido por</w:t>
+              <w:t>Población censada en hogares que en los últimos treinta días tuvieron alguna enfermedad, accidente, problema odontológico u otro problema de salud, por áreas (Total, Cabecera y Centros poblados y Rural disperso), servicio de salud al que hayan acudido</w:t>
             </w:r>
           </w:p>
         </w:tc>
@@ -2107,14 +2245,6 @@
               </w:rPr>
               <w:t>:</w:t>
             </w:r>
-          </w:p>
-          <w:p>
-            <w:pPr>
-              <w:rPr>
-                <w:rFonts w:ascii="Arial" w:hAnsi="Arial" w:cs="Arial"/>
-                <w:lang w:val="es-CO"/>
-              </w:rPr>
-            </w:pPr>
             <w:r>
               <w:rPr>
                 <w:rFonts w:ascii="Arial" w:hAnsi="Arial" w:cs="Arial"/>
@@ -2204,12 +2334,21 @@
                 <w:lang w:val="es-CO"/>
               </w:rPr>
             </w:pPr>
+            <w:proofErr w:type="gramStart"/>
             <w:r>
               <w:rPr>
                 <w:rFonts w:ascii="Arial" w:hAnsi="Arial" w:cs="Arial"/>
                 <w:lang w:val="es-CO"/>
               </w:rPr>
-              <w:t xml:space="preserve">C:N - </w:t>
+              <w:t>C:N</w:t>
+            </w:r>
+            <w:proofErr w:type="gramEnd"/>
+            <w:r>
+              <w:rPr>
+                <w:rFonts w:ascii="Arial" w:hAnsi="Arial" w:cs="Arial"/>
+                <w:lang w:val="es-CO"/>
+              </w:rPr>
+              <w:t xml:space="preserve"> - </w:t>
             </w:r>
             <w:r>
               <w:rPr>
@@ -2410,12 +2549,21 @@
                 <w:lang w:val="es-CO"/>
               </w:rPr>
             </w:pPr>
+            <w:proofErr w:type="gramStart"/>
             <w:r>
               <w:rPr>
                 <w:rFonts w:ascii="Arial" w:hAnsi="Arial" w:cs="Arial"/>
                 <w:lang w:val="es-CO"/>
               </w:rPr>
-              <w:t xml:space="preserve">C:T - </w:t>
+              <w:t>C:T</w:t>
+            </w:r>
+            <w:proofErr w:type="gramEnd"/>
+            <w:r>
+              <w:rPr>
+                <w:rFonts w:ascii="Arial" w:hAnsi="Arial" w:cs="Arial"/>
+                <w:lang w:val="es-CO"/>
+              </w:rPr>
+              <w:t xml:space="preserve"> - </w:t>
             </w:r>
             <w:r>
               <w:rPr>
@@ -2431,14 +2579,6 @@
               </w:rPr>
               <w:t>:</w:t>
             </w:r>
-          </w:p>
-          <w:p>
-            <w:pPr>
-              <w:rPr>
-                <w:rFonts w:ascii="Arial" w:hAnsi="Arial" w:cs="Arial"/>
-                <w:lang w:val="es-CO"/>
-              </w:rPr>
-            </w:pPr>
             <w:r>
               <w:rPr>
                 <w:rFonts w:ascii="Arial" w:hAnsi="Arial" w:cs="Arial"/>
@@ -2542,14 +2682,6 @@
               </w:rPr>
               <w:t>:</w:t>
             </w:r>
-          </w:p>
-          <w:p>
-            <w:pPr>
-              <w:rPr>
-                <w:rFonts w:ascii="Arial" w:hAnsi="Arial" w:cs="Arial"/>
-                <w:lang w:val="es-CO"/>
-              </w:rPr>
-            </w:pPr>
             <w:r>
               <w:rPr>
                 <w:rFonts w:ascii="Arial" w:hAnsi="Arial" w:cs="Arial"/>
@@ -2632,12 +2764,21 @@
                 <w:lang w:val="es-CO"/>
               </w:rPr>
             </w:pPr>
+            <w:proofErr w:type="gramStart"/>
             <w:r>
               <w:rPr>
                 <w:rFonts w:ascii="Arial" w:hAnsi="Arial" w:cs="Arial"/>
                 <w:lang w:val="es-CO"/>
               </w:rPr>
-              <w:t xml:space="preserve">C:U - </w:t>
+              <w:t>C:U</w:t>
+            </w:r>
+            <w:proofErr w:type="gramEnd"/>
+            <w:r>
+              <w:rPr>
+                <w:rFonts w:ascii="Arial" w:hAnsi="Arial" w:cs="Arial"/>
+                <w:lang w:val="es-CO"/>
+              </w:rPr>
+              <w:t xml:space="preserve"> - </w:t>
             </w:r>
             <w:r>
               <w:rPr>
@@ -2653,14 +2794,6 @@
               </w:rPr>
               <w:t>:</w:t>
             </w:r>
-          </w:p>
-          <w:p>
-            <w:pPr>
-              <w:rPr>
-                <w:rFonts w:ascii="Arial" w:hAnsi="Arial" w:cs="Arial"/>
-                <w:lang w:val="es-CO"/>
-              </w:rPr>
-            </w:pPr>
             <w:r>
               <w:rPr>
                 <w:rFonts w:ascii="Arial" w:hAnsi="Arial" w:cs="Arial"/>
@@ -3240,7 +3373,23 @@
           <w:rFonts w:ascii="Arial" w:hAnsi="Arial" w:cs="Arial"/>
           <w:lang w:val="es-CO"/>
         </w:rPr>
-        <w:t>(blank) (texto): Título en blanco, contiene las edades.</w:t>
+        <w:t>(</w:t>
+      </w:r>
+      <w:proofErr w:type="spellStart"/>
+      <w:r>
+        <w:rPr>
+          <w:rFonts w:ascii="Arial" w:hAnsi="Arial" w:cs="Arial"/>
+          <w:lang w:val="es-CO"/>
+        </w:rPr>
+        <w:t>blank</w:t>
+      </w:r>
+      <w:proofErr w:type="spellEnd"/>
+      <w:r>
+        <w:rPr>
+          <w:rFonts w:ascii="Arial" w:hAnsi="Arial" w:cs="Arial"/>
+          <w:lang w:val="es-CO"/>
+        </w:rPr>
+        <w:t>) (texto): Título en blanco, contiene las edades.</w:t>
       </w:r>
     </w:p>
     <w:p>
@@ -5348,7 +5497,23 @@
           <w:lang w:val="es-CO"/>
         </w:rPr>
         <w:lastRenderedPageBreak/>
-        <w:t>Gitano(a) o Rrom (entero): Cantidad de censados que se reconocen como gitanos o romaníes.</w:t>
+        <w:t xml:space="preserve">Gitano(a) o </w:t>
+      </w:r>
+      <w:proofErr w:type="spellStart"/>
+      <w:r>
+        <w:rPr>
+          <w:rFonts w:ascii="Arial" w:hAnsi="Arial" w:cs="Arial"/>
+          <w:lang w:val="es-CO"/>
+        </w:rPr>
+        <w:t>Rrom</w:t>
+      </w:r>
+      <w:proofErr w:type="spellEnd"/>
+      <w:r>
+        <w:rPr>
+          <w:rFonts w:ascii="Arial" w:hAnsi="Arial" w:cs="Arial"/>
+          <w:lang w:val="es-CO"/>
+        </w:rPr>
+        <w:t xml:space="preserve"> (entero): Cantidad de censados que se reconocen como gitanos o romaníes.</w:t>
       </w:r>
     </w:p>
     <w:p>
@@ -5368,7 +5533,23 @@
           <w:rFonts w:ascii="Arial" w:hAnsi="Arial" w:cs="Arial"/>
           <w:lang w:val="es-CO"/>
         </w:rPr>
-        <w:t>Raizal del Archipielago de San Andrés, Providencia y Santa Catalina (entero): Cantidad de censados que se reconocen como raizales del Archipiélago de San Andrés, Providencia y Santa Catalina.</w:t>
+        <w:t xml:space="preserve">Raizal del </w:t>
+      </w:r>
+      <w:proofErr w:type="spellStart"/>
+      <w:r>
+        <w:rPr>
+          <w:rFonts w:ascii="Arial" w:hAnsi="Arial" w:cs="Arial"/>
+          <w:lang w:val="es-CO"/>
+        </w:rPr>
+        <w:t>Archipielago</w:t>
+      </w:r>
+      <w:proofErr w:type="spellEnd"/>
+      <w:r>
+        <w:rPr>
+          <w:rFonts w:ascii="Arial" w:hAnsi="Arial" w:cs="Arial"/>
+          <w:lang w:val="es-CO"/>
+        </w:rPr>
+        <w:t xml:space="preserve"> de San Andrés, Providencia y Santa Catalina (entero): Cantidad de censados que se reconocen como raizales del Archipiélago de San Andrés, Providencia y Santa Catalina.</w:t>
       </w:r>
     </w:p>
     <w:p>
@@ -5643,7 +5824,23 @@
           <w:rFonts w:ascii="Arial" w:hAnsi="Arial" w:cs="Arial"/>
           <w:lang w:val="es-CO"/>
         </w:rPr>
-        <w:t>Gitano(a) o Rrom (entero): Cantidad de censados que se reconocen como gitanos o romaníes.</w:t>
+        <w:t xml:space="preserve">Gitano(a) o </w:t>
+      </w:r>
+      <w:proofErr w:type="spellStart"/>
+      <w:r>
+        <w:rPr>
+          <w:rFonts w:ascii="Arial" w:hAnsi="Arial" w:cs="Arial"/>
+          <w:lang w:val="es-CO"/>
+        </w:rPr>
+        <w:t>Rrom</w:t>
+      </w:r>
+      <w:proofErr w:type="spellEnd"/>
+      <w:r>
+        <w:rPr>
+          <w:rFonts w:ascii="Arial" w:hAnsi="Arial" w:cs="Arial"/>
+          <w:lang w:val="es-CO"/>
+        </w:rPr>
+        <w:t xml:space="preserve"> (entero): Cantidad de censados que se reconocen como gitanos o romaníes.</w:t>
       </w:r>
     </w:p>
     <w:p>
@@ -5663,7 +5860,23 @@
           <w:rFonts w:ascii="Arial" w:hAnsi="Arial" w:cs="Arial"/>
           <w:lang w:val="es-CO"/>
         </w:rPr>
-        <w:t>Raizal del Archipielago de San Andrés, Providencia y Santa Catalina (entero): Cantidad de censados que se reconocen como raizales del Archipiélago de San Andrés, Providencia y Santa Catalina.</w:t>
+        <w:t xml:space="preserve">Raizal del </w:t>
+      </w:r>
+      <w:proofErr w:type="spellStart"/>
+      <w:r>
+        <w:rPr>
+          <w:rFonts w:ascii="Arial" w:hAnsi="Arial" w:cs="Arial"/>
+          <w:lang w:val="es-CO"/>
+        </w:rPr>
+        <w:t>Archipielago</w:t>
+      </w:r>
+      <w:proofErr w:type="spellEnd"/>
+      <w:r>
+        <w:rPr>
+          <w:rFonts w:ascii="Arial" w:hAnsi="Arial" w:cs="Arial"/>
+          <w:lang w:val="es-CO"/>
+        </w:rPr>
+        <w:t xml:space="preserve"> de San Andrés, Providencia y Santa Catalina (entero): Cantidad de censados que se reconocen como raizales del Archipiélago de San Andrés, Providencia y Santa Catalina.</w:t>
       </w:r>
     </w:p>
     <w:p>
@@ -6004,12 +6217,21 @@
           <w:lang w:val="es-CO"/>
         </w:rPr>
       </w:pPr>
-      <w:r>
-        <w:rPr>
-          <w:rFonts w:ascii="Arial" w:hAnsi="Arial" w:cs="Arial"/>
-          <w:lang w:val="es-CO"/>
-        </w:rPr>
-        <w:t>Total personas (entero): Cantidad total de censados del grupo.</w:t>
+      <w:proofErr w:type="gramStart"/>
+      <w:r>
+        <w:rPr>
+          <w:rFonts w:ascii="Arial" w:hAnsi="Arial" w:cs="Arial"/>
+          <w:lang w:val="es-CO"/>
+        </w:rPr>
+        <w:t>Total</w:t>
+      </w:r>
+      <w:proofErr w:type="gramEnd"/>
+      <w:r>
+        <w:rPr>
+          <w:rFonts w:ascii="Arial" w:hAnsi="Arial" w:cs="Arial"/>
+          <w:lang w:val="es-CO"/>
+        </w:rPr>
+        <w:t xml:space="preserve"> personas (entero): Cantidad total de censados del grupo.</w:t>
       </w:r>
     </w:p>
     <w:p>
@@ -6069,7 +6291,7 @@
           <w:rFonts w:ascii="Arial" w:hAnsi="Arial" w:cs="Arial"/>
           <w:lang w:val="es-CO"/>
         </w:rPr>
-        <w:t>Total personas que tuvieron alguna enfermedad (entero): Cantidad total de censados que tuvieron alguna enfermedad los últimos 30 días.</w:t>
+        <w:t>Si información (entero): Cantidad de censados de los cuales no se tiene información acerca de si tuvieron alguna enfermedad los últimos 30 días.</w:t>
       </w:r>
     </w:p>
     <w:p>
@@ -6084,12 +6306,21 @@
           <w:lang w:val="es-CO"/>
         </w:rPr>
       </w:pPr>
-      <w:r>
-        <w:rPr>
-          <w:rFonts w:ascii="Arial" w:hAnsi="Arial" w:cs="Arial"/>
-          <w:lang w:val="es-CO"/>
-        </w:rPr>
-        <w:t>Sin información (entero): Cantidad de censados de los cuales no se tiene información acerca de si tuvieron alguna enfermedad los últimos 30 días.</w:t>
+      <w:proofErr w:type="gramStart"/>
+      <w:r>
+        <w:rPr>
+          <w:rFonts w:ascii="Arial" w:hAnsi="Arial" w:cs="Arial"/>
+          <w:lang w:val="es-CO"/>
+        </w:rPr>
+        <w:t>Total</w:t>
+      </w:r>
+      <w:proofErr w:type="gramEnd"/>
+      <w:r>
+        <w:rPr>
+          <w:rFonts w:ascii="Arial" w:hAnsi="Arial" w:cs="Arial"/>
+          <w:lang w:val="es-CO"/>
+        </w:rPr>
+        <w:t xml:space="preserve"> personas que tuvieron alguna enfermedad (entero): Cantidad total de censados que tuvieron alguna enfermedad los últimos 30 días.</w:t>
       </w:r>
     </w:p>
     <w:p>
@@ -6109,6 +6340,54 @@
           <w:rFonts w:ascii="Arial" w:hAnsi="Arial" w:cs="Arial"/>
           <w:lang w:val="es-CO"/>
         </w:rPr>
+        <w:t>Sin información (entero): Cantidad de censados de los cuales no se tiene información acerca de</w:t>
+      </w:r>
+      <w:r>
+        <w:rPr>
+          <w:rFonts w:ascii="Arial" w:hAnsi="Arial" w:cs="Arial"/>
+          <w:lang w:val="es-CO"/>
+        </w:rPr>
+        <w:t>l servicio de salud</w:t>
+      </w:r>
+      <w:r>
+        <w:rPr>
+          <w:rFonts w:ascii="Arial" w:hAnsi="Arial" w:cs="Arial"/>
+          <w:lang w:val="es-CO"/>
+        </w:rPr>
+        <w:t xml:space="preserve"> </w:t>
+      </w:r>
+      <w:r>
+        <w:rPr>
+          <w:rFonts w:ascii="Arial" w:hAnsi="Arial" w:cs="Arial"/>
+          <w:lang w:val="es-CO"/>
+        </w:rPr>
+        <w:t>al que acudieron</w:t>
+      </w:r>
+      <w:r>
+        <w:rPr>
+          <w:rFonts w:ascii="Arial" w:hAnsi="Arial" w:cs="Arial"/>
+          <w:lang w:val="es-CO"/>
+        </w:rPr>
+        <w:t>.</w:t>
+      </w:r>
+    </w:p>
+    <w:p>
+      <w:pPr>
+        <w:pStyle w:val="Prrafodelista"/>
+        <w:numPr>
+          <w:ilvl w:val="0"/>
+          <w:numId w:val="11"/>
+        </w:numPr>
+        <w:rPr>
+          <w:rFonts w:ascii="Arial" w:hAnsi="Arial" w:cs="Arial"/>
+          <w:lang w:val="es-CO"/>
+        </w:rPr>
+      </w:pPr>
+      <w:r>
+        <w:rPr>
+          <w:rFonts w:ascii="Arial" w:hAnsi="Arial" w:cs="Arial"/>
+          <w:lang w:val="es-CO"/>
+        </w:rPr>
         <w:t xml:space="preserve">A la entidad de seguridad social en salud a la cual está afiliado (entero): Cantidad de censados que </w:t>
       </w:r>
       <w:r>
@@ -6170,6 +6449,7 @@
           <w:rFonts w:ascii="Arial" w:hAnsi="Arial" w:cs="Arial"/>
           <w:lang w:val="es-CO"/>
         </w:rPr>
+        <w:lastRenderedPageBreak/>
         <w:t>A un boticario, farmaceuta, droguista (entero): Cantidad de censados que tuvieron alguna enfermedad los últimos 30 días y acudieron a un boticario, farmaceuta o droguista.</w:t>
       </w:r>
     </w:p>
@@ -6190,7 +6470,6 @@
           <w:rFonts w:ascii="Arial" w:hAnsi="Arial" w:cs="Arial"/>
           <w:lang w:val="es-CO"/>
         </w:rPr>
-        <w:lastRenderedPageBreak/>
         <w:t>A terapias alternativas (entero): Cantidad de censados que tuvieron alguna enfermedad los últimos 30 días y acudieron a terapias alternativas.</w:t>
       </w:r>
     </w:p>
@@ -6271,7 +6550,37 @@
           <w:rFonts w:ascii="Arial" w:hAnsi="Arial" w:cs="Arial"/>
           <w:lang w:val="es-CO"/>
         </w:rPr>
-        <w:t>Se autorrecetó (entero): Cantidad de censados que tuvieron alguna enfermedad los últimos 30 días y se autorrecetaron.</w:t>
+        <w:t xml:space="preserve">Se </w:t>
+      </w:r>
+      <w:proofErr w:type="spellStart"/>
+      <w:r>
+        <w:rPr>
+          <w:rFonts w:ascii="Arial" w:hAnsi="Arial" w:cs="Arial"/>
+          <w:lang w:val="es-CO"/>
+        </w:rPr>
+        <w:t>autorrecetó</w:t>
+      </w:r>
+      <w:proofErr w:type="spellEnd"/>
+      <w:r>
+        <w:rPr>
+          <w:rFonts w:ascii="Arial" w:hAnsi="Arial" w:cs="Arial"/>
+          <w:lang w:val="es-CO"/>
+        </w:rPr>
+        <w:t xml:space="preserve"> (entero): Cantidad de censados que tuvieron alguna enfermedad los últimos 30 días y se auto</w:t>
+      </w:r>
+      <w:r>
+        <w:rPr>
+          <w:rFonts w:ascii="Arial" w:hAnsi="Arial" w:cs="Arial"/>
+          <w:lang w:val="es-CO"/>
+        </w:rPr>
+        <w:t xml:space="preserve"> </w:t>
+      </w:r>
+      <w:r>
+        <w:rPr>
+          <w:rFonts w:ascii="Arial" w:hAnsi="Arial" w:cs="Arial"/>
+          <w:lang w:val="es-CO"/>
+        </w:rPr>
+        <w:t>recetaron.</w:t>
       </w:r>
     </w:p>
     <w:p>
@@ -6363,12 +6672,21 @@
           <w:lang w:val="es-CO"/>
         </w:rPr>
       </w:pPr>
-      <w:r>
-        <w:rPr>
-          <w:rFonts w:ascii="Arial" w:hAnsi="Arial" w:cs="Arial"/>
-          <w:lang w:val="es-CO"/>
-        </w:rPr>
-        <w:t>Total personas menores de 5 años (entero): Cantidad de personas censadas menores de 5 años.</w:t>
+      <w:proofErr w:type="gramStart"/>
+      <w:r>
+        <w:rPr>
+          <w:rFonts w:ascii="Arial" w:hAnsi="Arial" w:cs="Arial"/>
+          <w:lang w:val="es-CO"/>
+        </w:rPr>
+        <w:t>Total</w:t>
+      </w:r>
+      <w:proofErr w:type="gramEnd"/>
+      <w:r>
+        <w:rPr>
+          <w:rFonts w:ascii="Arial" w:hAnsi="Arial" w:cs="Arial"/>
+          <w:lang w:val="es-CO"/>
+        </w:rPr>
+        <w:t xml:space="preserve"> personas menores de 5 años (entero): Cantidad de personas censadas menores de 5 años.</w:t>
       </w:r>
     </w:p>
     <w:p>
@@ -6482,6 +6800,7 @@
           <w:rFonts w:ascii="Arial" w:hAnsi="Arial" w:cs="Arial"/>
           <w:lang w:val="es-CO"/>
         </w:rPr>
+        <w:lastRenderedPageBreak/>
         <w:t>En l</w:t>
       </w:r>
       <w:r>
@@ -6503,15 +6822,7 @@
           <w:rFonts w:ascii="Arial" w:hAnsi="Arial" w:cs="Arial"/>
           <w:lang w:val="es-CO"/>
         </w:rPr>
-        <w:t xml:space="preserve"> al cuidado de un pariente o una persona menor de 18 años (entero): Cantidad de menores de 5 años censados que </w:t>
-      </w:r>
-      <w:r>
-        <w:rPr>
-          <w:rFonts w:ascii="Arial" w:hAnsi="Arial" w:cs="Arial"/>
-          <w:lang w:val="es-CO"/>
-        </w:rPr>
-        <w:lastRenderedPageBreak/>
-        <w:t>permanecen en la vivienda donde viven al cuidado de un pariente o persona menor de 18 años la mayor parte del tiempo entre semana.</w:t>
+        <w:t xml:space="preserve"> al cuidado de un pariente o una persona menor de 18 años (entero): Cantidad de menores de 5 años censados que permanecen en la vivienda donde viven al cuidado de un pariente o persona menor de 18 años la mayor parte del tiempo entre semana.</w:t>
       </w:r>
     </w:p>
     <w:p>
@@ -6904,6 +7215,7 @@
           <w:rFonts w:ascii="Arial" w:hAnsi="Arial" w:cs="Arial"/>
           <w:lang w:val="es-CO"/>
         </w:rPr>
+        <w:lastRenderedPageBreak/>
         <w:t>Contiene 16 columnas y 3 agrupaciones.</w:t>
       </w:r>
     </w:p>
@@ -6919,7 +7231,6 @@
           <w:rFonts w:ascii="Arial" w:hAnsi="Arial" w:cs="Arial"/>
           <w:lang w:val="es-CO"/>
         </w:rPr>
-        <w:lastRenderedPageBreak/>
         <w:t>Columnas:</w:t>
       </w:r>
     </w:p>
@@ -7155,12 +7466,21 @@
           <w:lang w:val="es-CO"/>
         </w:rPr>
       </w:pPr>
-      <w:r>
-        <w:rPr>
-          <w:rFonts w:ascii="Arial" w:hAnsi="Arial" w:cs="Arial"/>
-          <w:lang w:val="es-CO"/>
-        </w:rPr>
-        <w:t>Tecnico (entero): Cantidad de censados cuyo máximo nivel educativo es técnico.</w:t>
+      <w:proofErr w:type="spellStart"/>
+      <w:r>
+        <w:rPr>
+          <w:rFonts w:ascii="Arial" w:hAnsi="Arial" w:cs="Arial"/>
+          <w:lang w:val="es-CO"/>
+        </w:rPr>
+        <w:t>Tecnico</w:t>
+      </w:r>
+      <w:proofErr w:type="spellEnd"/>
+      <w:r>
+        <w:rPr>
+          <w:rFonts w:ascii="Arial" w:hAnsi="Arial" w:cs="Arial"/>
+          <w:lang w:val="es-CO"/>
+        </w:rPr>
+        <w:t xml:space="preserve"> (entero): Cantidad de censados cuyo máximo nivel educativo es técnico.</w:t>
       </w:r>
     </w:p>
     <w:p>
@@ -7330,7 +7650,15 @@
           <w:rFonts w:ascii="Arial" w:hAnsi="Arial" w:cs="Arial"/>
           <w:lang w:val="es-CO"/>
         </w:rPr>
-        <w:t xml:space="preserve">(grupo con datos correspondientes a los censados que asisten a alguna institución educativa), </w:t>
+        <w:t xml:space="preserve">(grupo con datos correspondientes a los censados que asisten a </w:t>
+      </w:r>
+      <w:r>
+        <w:rPr>
+          <w:rFonts w:ascii="Arial" w:hAnsi="Arial" w:cs="Arial"/>
+          <w:lang w:val="es-CO"/>
+        </w:rPr>
+        <w:lastRenderedPageBreak/>
+        <w:t xml:space="preserve">alguna institución educativa), </w:t>
       </w:r>
       <w:r>
         <w:rPr>
@@ -7361,7 +7689,6 @@
           <w:rFonts w:ascii="Arial" w:hAnsi="Arial" w:cs="Arial"/>
           <w:lang w:val="es-CO"/>
         </w:rPr>
-        <w:lastRenderedPageBreak/>
         <w:t>Contiene 3 agrupaciones.</w:t>
       </w:r>
     </w:p>
@@ -7770,6 +8097,7 @@
           <w:rFonts w:ascii="Arial" w:hAnsi="Arial" w:cs="Arial"/>
           <w:lang w:val="es-CO"/>
         </w:rPr>
+        <w:lastRenderedPageBreak/>
         <w:t>Normal completa (entero): Cantidad de censados cuyo máximo nivel educativo es educación normal completa.</w:t>
       </w:r>
     </w:p>
@@ -7790,392 +8118,417 @@
           <w:rFonts w:ascii="Arial" w:hAnsi="Arial" w:cs="Arial"/>
           <w:lang w:val="es-CO"/>
         </w:rPr>
+        <w:t>Normal incompleta (entero): Cantidad de censados cuyo máximo nivel educativo es educación normal incompleta.</w:t>
+      </w:r>
+    </w:p>
+    <w:p>
+      <w:pPr>
+        <w:pStyle w:val="Prrafodelista"/>
+        <w:numPr>
+          <w:ilvl w:val="0"/>
+          <w:numId w:val="16"/>
+        </w:numPr>
+        <w:rPr>
+          <w:rFonts w:ascii="Arial" w:hAnsi="Arial" w:cs="Arial"/>
+          <w:lang w:val="es-CO"/>
+        </w:rPr>
+      </w:pPr>
+      <w:proofErr w:type="spellStart"/>
+      <w:r>
+        <w:rPr>
+          <w:rFonts w:ascii="Arial" w:hAnsi="Arial" w:cs="Arial"/>
+          <w:lang w:val="es-CO"/>
+        </w:rPr>
+        <w:t>Tecnico</w:t>
+      </w:r>
+      <w:proofErr w:type="spellEnd"/>
+      <w:r>
+        <w:rPr>
+          <w:rFonts w:ascii="Arial" w:hAnsi="Arial" w:cs="Arial"/>
+          <w:lang w:val="es-CO"/>
+        </w:rPr>
+        <w:t xml:space="preserve"> (entero): Cantidad de censados cuyo máximo nivel educativo es técnico.</w:t>
+      </w:r>
+    </w:p>
+    <w:p>
+      <w:pPr>
+        <w:pStyle w:val="Prrafodelista"/>
+        <w:numPr>
+          <w:ilvl w:val="0"/>
+          <w:numId w:val="16"/>
+        </w:numPr>
+        <w:rPr>
+          <w:rFonts w:ascii="Arial" w:hAnsi="Arial" w:cs="Arial"/>
+          <w:lang w:val="es-CO"/>
+        </w:rPr>
+      </w:pPr>
+      <w:r>
+        <w:rPr>
+          <w:rFonts w:ascii="Arial" w:hAnsi="Arial" w:cs="Arial"/>
+          <w:lang w:val="es-CO"/>
+        </w:rPr>
+        <w:t>Tecnológico (entero): Cantidad de censados cuyo máximo nivel educativo es tecnológico.</w:t>
+      </w:r>
+    </w:p>
+    <w:p>
+      <w:pPr>
+        <w:pStyle w:val="Prrafodelista"/>
+        <w:numPr>
+          <w:ilvl w:val="0"/>
+          <w:numId w:val="16"/>
+        </w:numPr>
+        <w:rPr>
+          <w:rFonts w:ascii="Arial" w:hAnsi="Arial" w:cs="Arial"/>
+          <w:lang w:val="es-CO"/>
+        </w:rPr>
+      </w:pPr>
+      <w:r>
+        <w:rPr>
+          <w:rFonts w:ascii="Arial" w:hAnsi="Arial" w:cs="Arial"/>
+          <w:lang w:val="es-CO"/>
+        </w:rPr>
+        <w:t>Universitario (entero): Cantidad de censados cuyo máximo nivel educativo es universitario.</w:t>
+      </w:r>
+    </w:p>
+    <w:p>
+      <w:pPr>
+        <w:pStyle w:val="Prrafodelista"/>
+        <w:numPr>
+          <w:ilvl w:val="0"/>
+          <w:numId w:val="16"/>
+        </w:numPr>
+        <w:rPr>
+          <w:rFonts w:ascii="Arial" w:hAnsi="Arial" w:cs="Arial"/>
+          <w:lang w:val="es-CO"/>
+        </w:rPr>
+      </w:pPr>
+      <w:r>
+        <w:rPr>
+          <w:rFonts w:ascii="Arial" w:hAnsi="Arial" w:cs="Arial"/>
+          <w:lang w:val="es-CO"/>
+        </w:rPr>
+        <w:t>Especialización, Maestría, Doctorado (entero): Cantidad de censados cuyo máximo nivel educativo es especialización maestría o doctorado.</w:t>
+      </w:r>
+    </w:p>
+    <w:p>
+      <w:pPr>
+        <w:pStyle w:val="Prrafodelista"/>
+        <w:numPr>
+          <w:ilvl w:val="0"/>
+          <w:numId w:val="16"/>
+        </w:numPr>
+        <w:rPr>
+          <w:rFonts w:ascii="Arial" w:hAnsi="Arial" w:cs="Arial"/>
+          <w:lang w:val="es-CO"/>
+        </w:rPr>
+      </w:pPr>
+      <w:r>
+        <w:rPr>
+          <w:rFonts w:ascii="Arial" w:hAnsi="Arial" w:cs="Arial"/>
+          <w:lang w:val="es-CO"/>
+        </w:rPr>
+        <w:t>Sin información (entero): Cantidad de censados de los cuales no se tiene información acerca de su nivel educativo.</w:t>
+      </w:r>
+    </w:p>
+    <w:p>
+      <w:pPr>
+        <w:rPr>
+          <w:rFonts w:ascii="Arial" w:hAnsi="Arial" w:cs="Arial"/>
+          <w:lang w:val="es-CO"/>
+        </w:rPr>
+      </w:pPr>
+      <w:r>
+        <w:rPr>
+          <w:rFonts w:ascii="Arial" w:hAnsi="Arial" w:cs="Arial"/>
+          <w:lang w:val="es-CO"/>
+        </w:rPr>
+        <w:t>Agrupaciones:</w:t>
+      </w:r>
+    </w:p>
+    <w:p>
+      <w:pPr>
+        <w:pStyle w:val="Prrafodelista"/>
+        <w:numPr>
+          <w:ilvl w:val="0"/>
+          <w:numId w:val="3"/>
+        </w:numPr>
+        <w:rPr>
+          <w:rFonts w:ascii="Arial" w:hAnsi="Arial" w:cs="Arial"/>
+          <w:lang w:val="es-CO"/>
+        </w:rPr>
+      </w:pPr>
+      <w:r>
+        <w:rPr>
+          <w:rFonts w:ascii="Arial" w:hAnsi="Arial" w:cs="Arial"/>
+          <w:lang w:val="es-CO"/>
+        </w:rPr>
+        <w:t>Total: Grupo con resumen de datos totales.</w:t>
+      </w:r>
+    </w:p>
+    <w:p>
+      <w:pPr>
+        <w:pStyle w:val="Prrafodelista"/>
+        <w:numPr>
+          <w:ilvl w:val="0"/>
+          <w:numId w:val="3"/>
+        </w:numPr>
+        <w:rPr>
+          <w:rFonts w:ascii="Arial" w:hAnsi="Arial" w:cs="Arial"/>
+          <w:lang w:val="es-CO"/>
+        </w:rPr>
+      </w:pPr>
+      <w:r>
+        <w:rPr>
+          <w:rFonts w:ascii="Arial" w:hAnsi="Arial" w:cs="Arial"/>
+          <w:lang w:val="es-CO"/>
+        </w:rPr>
+        <w:t>Cabecera: Grupo con resumen de datos correspondientes a las cabeceras municipales</w:t>
+      </w:r>
+    </w:p>
+    <w:p>
+      <w:pPr>
+        <w:pStyle w:val="Prrafodelista"/>
+        <w:numPr>
+          <w:ilvl w:val="0"/>
+          <w:numId w:val="3"/>
+        </w:numPr>
+        <w:rPr>
+          <w:rFonts w:ascii="Arial" w:hAnsi="Arial" w:cs="Arial"/>
+          <w:lang w:val="es-CO"/>
+        </w:rPr>
+      </w:pPr>
+      <w:r>
+        <w:rPr>
+          <w:rFonts w:ascii="Arial" w:hAnsi="Arial" w:cs="Arial"/>
+          <w:lang w:val="es-CO"/>
+        </w:rPr>
+        <w:t>Rural disperso: Grupo con resumen de datos correspondientes a ciudadanos que habitan en las zonas rurales, pero no en centros poblados.</w:t>
+      </w:r>
+    </w:p>
+    <w:p>
+      <w:pPr>
+        <w:rPr>
+          <w:rFonts w:ascii="Arial" w:hAnsi="Arial" w:cs="Arial"/>
+          <w:lang w:val="es-CO"/>
+        </w:rPr>
+      </w:pPr>
+      <w:r>
+        <w:rPr>
+          <w:rFonts w:ascii="Arial" w:hAnsi="Arial" w:cs="Arial"/>
+          <w:lang w:val="es-CO"/>
+        </w:rPr>
+        <w:t>Subgrupos:</w:t>
+      </w:r>
+    </w:p>
+    <w:p>
+      <w:pPr>
+        <w:pStyle w:val="Prrafodelista"/>
+        <w:numPr>
+          <w:ilvl w:val="0"/>
+          <w:numId w:val="6"/>
+        </w:numPr>
+        <w:rPr>
+          <w:rFonts w:ascii="Arial" w:hAnsi="Arial" w:cs="Arial"/>
+          <w:lang w:val="es-CO"/>
+        </w:rPr>
+      </w:pPr>
+      <w:r>
+        <w:rPr>
+          <w:rFonts w:ascii="Arial" w:hAnsi="Arial" w:cs="Arial"/>
+          <w:lang w:val="es-CO"/>
+        </w:rPr>
+        <w:t>Hombre: Grupo con resumen de datos correspondiente a los hombres.</w:t>
+      </w:r>
+    </w:p>
+    <w:p>
+      <w:pPr>
+        <w:pStyle w:val="Prrafodelista"/>
+        <w:numPr>
+          <w:ilvl w:val="0"/>
+          <w:numId w:val="8"/>
+        </w:numPr>
+        <w:rPr>
+          <w:rFonts w:ascii="Arial" w:hAnsi="Arial" w:cs="Arial"/>
+          <w:lang w:val="es-CO"/>
+        </w:rPr>
+      </w:pPr>
+      <w:r>
+        <w:rPr>
+          <w:rFonts w:ascii="Arial" w:hAnsi="Arial" w:cs="Arial"/>
+          <w:lang w:val="es-CO"/>
+        </w:rPr>
+        <w:t>Mujer: Grupo con resumen de datos correspondiente a las mujeres.</w:t>
+      </w:r>
+    </w:p>
+    <w:p>
+      <w:pPr>
+        <w:pStyle w:val="Prrafodelista"/>
+        <w:numPr>
+          <w:ilvl w:val="0"/>
+          <w:numId w:val="8"/>
+        </w:numPr>
+        <w:rPr>
+          <w:rFonts w:ascii="Arial" w:hAnsi="Arial" w:cs="Arial"/>
+          <w:lang w:val="es-CO"/>
+        </w:rPr>
+      </w:pPr>
+      <w:r>
+        <w:rPr>
+          <w:rFonts w:ascii="Arial" w:hAnsi="Arial" w:cs="Arial"/>
+          <w:lang w:val="es-CO"/>
+        </w:rPr>
+        <w:t>Total: Grupo con resumen total de datos.</w:t>
+      </w:r>
+    </w:p>
+    <w:p>
+      <w:pPr>
+        <w:rPr>
+          <w:rFonts w:ascii="Arial" w:hAnsi="Arial" w:cs="Arial"/>
+          <w:lang w:val="es-CO"/>
+        </w:rPr>
+      </w:pPr>
+      <w:r>
+        <w:rPr>
+          <w:rFonts w:ascii="Arial" w:hAnsi="Arial" w:cs="Arial"/>
+          <w:lang w:val="es-CO"/>
+        </w:rPr>
+        <w:t>Subgrupos:</w:t>
+      </w:r>
+    </w:p>
+    <w:p>
+      <w:pPr>
+        <w:pStyle w:val="Prrafodelista"/>
+        <w:numPr>
+          <w:ilvl w:val="0"/>
+          <w:numId w:val="19"/>
+        </w:numPr>
+        <w:rPr>
+          <w:rFonts w:ascii="Arial" w:hAnsi="Arial" w:cs="Arial"/>
+          <w:lang w:val="es-CO"/>
+        </w:rPr>
+      </w:pPr>
+      <w:r>
+        <w:rPr>
+          <w:rFonts w:ascii="Arial" w:hAnsi="Arial" w:cs="Arial"/>
+          <w:lang w:val="es-CO"/>
+        </w:rPr>
+        <w:t>Indígena: Grupo con resumen de datos correspondiente a indígenas.</w:t>
+      </w:r>
+    </w:p>
+    <w:p>
+      <w:pPr>
+        <w:pStyle w:val="Prrafodelista"/>
+        <w:numPr>
+          <w:ilvl w:val="0"/>
+          <w:numId w:val="19"/>
+        </w:numPr>
+        <w:rPr>
+          <w:rFonts w:ascii="Arial" w:hAnsi="Arial" w:cs="Arial"/>
+          <w:lang w:val="es-CO"/>
+        </w:rPr>
+      </w:pPr>
+      <w:r>
+        <w:rPr>
+          <w:rFonts w:ascii="Arial" w:hAnsi="Arial" w:cs="Arial"/>
+          <w:lang w:val="es-CO"/>
+        </w:rPr>
+        <w:t xml:space="preserve">Gitano(a) o </w:t>
+      </w:r>
+      <w:proofErr w:type="spellStart"/>
+      <w:r>
+        <w:rPr>
+          <w:rFonts w:ascii="Arial" w:hAnsi="Arial" w:cs="Arial"/>
+          <w:lang w:val="es-CO"/>
+        </w:rPr>
+        <w:t>Rrom</w:t>
+      </w:r>
+      <w:proofErr w:type="spellEnd"/>
+      <w:r>
+        <w:rPr>
+          <w:rFonts w:ascii="Arial" w:hAnsi="Arial" w:cs="Arial"/>
+          <w:lang w:val="es-CO"/>
+        </w:rPr>
+        <w:t>: Grupo con resumen de datos correspondiente a gitanos o romaníes.</w:t>
+      </w:r>
+    </w:p>
+    <w:p>
+      <w:pPr>
+        <w:pStyle w:val="Prrafodelista"/>
+        <w:numPr>
+          <w:ilvl w:val="0"/>
+          <w:numId w:val="19"/>
+        </w:numPr>
+        <w:rPr>
+          <w:rFonts w:ascii="Arial" w:hAnsi="Arial" w:cs="Arial"/>
+          <w:lang w:val="es-CO"/>
+        </w:rPr>
+      </w:pPr>
+      <w:r>
+        <w:rPr>
+          <w:rFonts w:ascii="Arial" w:hAnsi="Arial" w:cs="Arial"/>
+          <w:lang w:val="es-CO"/>
+        </w:rPr>
+        <w:t>Palenquero(a) de San Basilio: Grupo con resumen de datos correspondiente a palenqueros de San Basilio.</w:t>
+      </w:r>
+    </w:p>
+    <w:p>
+      <w:pPr>
+        <w:pStyle w:val="Prrafodelista"/>
+        <w:numPr>
+          <w:ilvl w:val="0"/>
+          <w:numId w:val="19"/>
+        </w:numPr>
+        <w:rPr>
+          <w:rFonts w:ascii="Arial" w:hAnsi="Arial" w:cs="Arial"/>
+          <w:lang w:val="es-CO"/>
+        </w:rPr>
+      </w:pPr>
+      <w:r>
+        <w:rPr>
+          <w:rFonts w:ascii="Arial" w:hAnsi="Arial" w:cs="Arial"/>
+          <w:lang w:val="es-CO"/>
+        </w:rPr>
+        <w:t>Negro(a), Mulato(a), Afrodescendiente, Afrocolombiano(a): Grupo con resumen datos correspondiente a negros, mulatos, afrodescendientes o afrocolombianos.</w:t>
+      </w:r>
+    </w:p>
+    <w:p>
+      <w:pPr>
+        <w:pStyle w:val="Prrafodelista"/>
+        <w:numPr>
+          <w:ilvl w:val="0"/>
+          <w:numId w:val="19"/>
+        </w:numPr>
+        <w:rPr>
+          <w:rFonts w:ascii="Arial" w:hAnsi="Arial" w:cs="Arial"/>
+          <w:lang w:val="es-CO"/>
+        </w:rPr>
+      </w:pPr>
+      <w:r>
+        <w:rPr>
+          <w:rFonts w:ascii="Arial" w:hAnsi="Arial" w:cs="Arial"/>
+          <w:lang w:val="es-CO"/>
+        </w:rPr>
+        <w:t>Ningún grupo étnico: Grupo con resumen de datos correspondiente a los censados que no pertenecen a ningún grupo étnico.</w:t>
+      </w:r>
+    </w:p>
+    <w:p>
+      <w:pPr>
+        <w:pStyle w:val="Prrafodelista"/>
+        <w:numPr>
+          <w:ilvl w:val="0"/>
+          <w:numId w:val="19"/>
+        </w:numPr>
+        <w:rPr>
+          <w:rFonts w:ascii="Arial" w:hAnsi="Arial" w:cs="Arial"/>
+          <w:lang w:val="es-CO"/>
+        </w:rPr>
+      </w:pPr>
+      <w:r>
+        <w:rPr>
+          <w:rFonts w:ascii="Arial" w:hAnsi="Arial" w:cs="Arial"/>
+          <w:lang w:val="es-CO"/>
+        </w:rPr>
         <w:lastRenderedPageBreak/>
-        <w:t>Normal incompleta (entero): Cantidad de censados cuyo máximo nivel educativo es educación normal incompleta.</w:t>
-      </w:r>
-    </w:p>
-    <w:p>
-      <w:pPr>
-        <w:pStyle w:val="Prrafodelista"/>
-        <w:numPr>
-          <w:ilvl w:val="0"/>
-          <w:numId w:val="16"/>
-        </w:numPr>
-        <w:rPr>
-          <w:rFonts w:ascii="Arial" w:hAnsi="Arial" w:cs="Arial"/>
-          <w:lang w:val="es-CO"/>
-        </w:rPr>
-      </w:pPr>
-      <w:r>
-        <w:rPr>
-          <w:rFonts w:ascii="Arial" w:hAnsi="Arial" w:cs="Arial"/>
-          <w:lang w:val="es-CO"/>
-        </w:rPr>
-        <w:t>Tecnico (entero): Cantidad de censados cuyo máximo nivel educativo es técnico.</w:t>
-      </w:r>
-    </w:p>
-    <w:p>
-      <w:pPr>
-        <w:pStyle w:val="Prrafodelista"/>
-        <w:numPr>
-          <w:ilvl w:val="0"/>
-          <w:numId w:val="16"/>
-        </w:numPr>
-        <w:rPr>
-          <w:rFonts w:ascii="Arial" w:hAnsi="Arial" w:cs="Arial"/>
-          <w:lang w:val="es-CO"/>
-        </w:rPr>
-      </w:pPr>
-      <w:r>
-        <w:rPr>
-          <w:rFonts w:ascii="Arial" w:hAnsi="Arial" w:cs="Arial"/>
-          <w:lang w:val="es-CO"/>
-        </w:rPr>
-        <w:t>Tecnológico (entero): Cantidad de censados cuyo máximo nivel educativo es tecnológico.</w:t>
-      </w:r>
-    </w:p>
-    <w:p>
-      <w:pPr>
-        <w:pStyle w:val="Prrafodelista"/>
-        <w:numPr>
-          <w:ilvl w:val="0"/>
-          <w:numId w:val="16"/>
-        </w:numPr>
-        <w:rPr>
-          <w:rFonts w:ascii="Arial" w:hAnsi="Arial" w:cs="Arial"/>
-          <w:lang w:val="es-CO"/>
-        </w:rPr>
-      </w:pPr>
-      <w:r>
-        <w:rPr>
-          <w:rFonts w:ascii="Arial" w:hAnsi="Arial" w:cs="Arial"/>
-          <w:lang w:val="es-CO"/>
-        </w:rPr>
-        <w:t>Universitario (entero): Cantidad de censados cuyo máximo nivel educativo es universitario.</w:t>
-      </w:r>
-    </w:p>
-    <w:p>
-      <w:pPr>
-        <w:pStyle w:val="Prrafodelista"/>
-        <w:numPr>
-          <w:ilvl w:val="0"/>
-          <w:numId w:val="16"/>
-        </w:numPr>
-        <w:rPr>
-          <w:rFonts w:ascii="Arial" w:hAnsi="Arial" w:cs="Arial"/>
-          <w:lang w:val="es-CO"/>
-        </w:rPr>
-      </w:pPr>
-      <w:r>
-        <w:rPr>
-          <w:rFonts w:ascii="Arial" w:hAnsi="Arial" w:cs="Arial"/>
-          <w:lang w:val="es-CO"/>
-        </w:rPr>
-        <w:t>Especialización, Maestría, Doctorado (entero): Cantidad de censados cuyo máximo nivel educativo es especialización maestría o doctorado.</w:t>
-      </w:r>
-    </w:p>
-    <w:p>
-      <w:pPr>
-        <w:pStyle w:val="Prrafodelista"/>
-        <w:numPr>
-          <w:ilvl w:val="0"/>
-          <w:numId w:val="16"/>
-        </w:numPr>
-        <w:rPr>
-          <w:rFonts w:ascii="Arial" w:hAnsi="Arial" w:cs="Arial"/>
-          <w:lang w:val="es-CO"/>
-        </w:rPr>
-      </w:pPr>
-      <w:r>
-        <w:rPr>
-          <w:rFonts w:ascii="Arial" w:hAnsi="Arial" w:cs="Arial"/>
-          <w:lang w:val="es-CO"/>
-        </w:rPr>
-        <w:t>Sin información (entero): Cantidad de censados de los cuales no se tiene información acerca de su nivel educativo.</w:t>
-      </w:r>
-    </w:p>
-    <w:p>
-      <w:pPr>
-        <w:rPr>
-          <w:rFonts w:ascii="Arial" w:hAnsi="Arial" w:cs="Arial"/>
-          <w:lang w:val="es-CO"/>
-        </w:rPr>
-      </w:pPr>
-      <w:r>
-        <w:rPr>
-          <w:rFonts w:ascii="Arial" w:hAnsi="Arial" w:cs="Arial"/>
-          <w:lang w:val="es-CO"/>
-        </w:rPr>
-        <w:t>Agrupaciones:</w:t>
-      </w:r>
-    </w:p>
-    <w:p>
-      <w:pPr>
-        <w:pStyle w:val="Prrafodelista"/>
-        <w:numPr>
-          <w:ilvl w:val="0"/>
-          <w:numId w:val="3"/>
-        </w:numPr>
-        <w:rPr>
-          <w:rFonts w:ascii="Arial" w:hAnsi="Arial" w:cs="Arial"/>
-          <w:lang w:val="es-CO"/>
-        </w:rPr>
-      </w:pPr>
-      <w:r>
-        <w:rPr>
-          <w:rFonts w:ascii="Arial" w:hAnsi="Arial" w:cs="Arial"/>
-          <w:lang w:val="es-CO"/>
-        </w:rPr>
-        <w:t>Total: Grupo con resumen de datos totales.</w:t>
-      </w:r>
-    </w:p>
-    <w:p>
-      <w:pPr>
-        <w:pStyle w:val="Prrafodelista"/>
-        <w:numPr>
-          <w:ilvl w:val="0"/>
-          <w:numId w:val="3"/>
-        </w:numPr>
-        <w:rPr>
-          <w:rFonts w:ascii="Arial" w:hAnsi="Arial" w:cs="Arial"/>
-          <w:lang w:val="es-CO"/>
-        </w:rPr>
-      </w:pPr>
-      <w:r>
-        <w:rPr>
-          <w:rFonts w:ascii="Arial" w:hAnsi="Arial" w:cs="Arial"/>
-          <w:lang w:val="es-CO"/>
-        </w:rPr>
-        <w:t>Cabecera: Grupo con resumen de datos correspondientes a las cabeceras municipales</w:t>
-      </w:r>
-    </w:p>
-    <w:p>
-      <w:pPr>
-        <w:pStyle w:val="Prrafodelista"/>
-        <w:numPr>
-          <w:ilvl w:val="0"/>
-          <w:numId w:val="3"/>
-        </w:numPr>
-        <w:rPr>
-          <w:rFonts w:ascii="Arial" w:hAnsi="Arial" w:cs="Arial"/>
-          <w:lang w:val="es-CO"/>
-        </w:rPr>
-      </w:pPr>
-      <w:r>
-        <w:rPr>
-          <w:rFonts w:ascii="Arial" w:hAnsi="Arial" w:cs="Arial"/>
-          <w:lang w:val="es-CO"/>
-        </w:rPr>
-        <w:t>Rural disperso: Grupo con resumen de datos correspondientes a ciudadanos que habitan en las zonas rurales, pero no en centros poblados.</w:t>
-      </w:r>
-    </w:p>
-    <w:p>
-      <w:pPr>
-        <w:rPr>
-          <w:rFonts w:ascii="Arial" w:hAnsi="Arial" w:cs="Arial"/>
-          <w:lang w:val="es-CO"/>
-        </w:rPr>
-      </w:pPr>
-      <w:r>
-        <w:rPr>
-          <w:rFonts w:ascii="Arial" w:hAnsi="Arial" w:cs="Arial"/>
-          <w:lang w:val="es-CO"/>
-        </w:rPr>
-        <w:t>Subgrupos:</w:t>
-      </w:r>
-    </w:p>
-    <w:p>
-      <w:pPr>
-        <w:pStyle w:val="Prrafodelista"/>
-        <w:numPr>
-          <w:ilvl w:val="0"/>
-          <w:numId w:val="6"/>
-        </w:numPr>
-        <w:rPr>
-          <w:rFonts w:ascii="Arial" w:hAnsi="Arial" w:cs="Arial"/>
-          <w:lang w:val="es-CO"/>
-        </w:rPr>
-      </w:pPr>
-      <w:r>
-        <w:rPr>
-          <w:rFonts w:ascii="Arial" w:hAnsi="Arial" w:cs="Arial"/>
-          <w:lang w:val="es-CO"/>
-        </w:rPr>
-        <w:t>Hombre: Grupo con resumen de datos correspondiente a los hombres.</w:t>
-      </w:r>
-    </w:p>
-    <w:p>
-      <w:pPr>
-        <w:pStyle w:val="Prrafodelista"/>
-        <w:numPr>
-          <w:ilvl w:val="0"/>
-          <w:numId w:val="8"/>
-        </w:numPr>
-        <w:rPr>
-          <w:rFonts w:ascii="Arial" w:hAnsi="Arial" w:cs="Arial"/>
-          <w:lang w:val="es-CO"/>
-        </w:rPr>
-      </w:pPr>
-      <w:r>
-        <w:rPr>
-          <w:rFonts w:ascii="Arial" w:hAnsi="Arial" w:cs="Arial"/>
-          <w:lang w:val="es-CO"/>
-        </w:rPr>
-        <w:t>Mujer: Grupo con resumen de datos correspondiente a las mujeres.</w:t>
-      </w:r>
-    </w:p>
-    <w:p>
-      <w:pPr>
-        <w:pStyle w:val="Prrafodelista"/>
-        <w:numPr>
-          <w:ilvl w:val="0"/>
-          <w:numId w:val="8"/>
-        </w:numPr>
-        <w:rPr>
-          <w:rFonts w:ascii="Arial" w:hAnsi="Arial" w:cs="Arial"/>
-          <w:lang w:val="es-CO"/>
-        </w:rPr>
-      </w:pPr>
-      <w:r>
-        <w:rPr>
-          <w:rFonts w:ascii="Arial" w:hAnsi="Arial" w:cs="Arial"/>
-          <w:lang w:val="es-CO"/>
-        </w:rPr>
-        <w:t>Total: Grupo con resumen total de datos.</w:t>
-      </w:r>
-    </w:p>
-    <w:p>
-      <w:pPr>
-        <w:rPr>
-          <w:rFonts w:ascii="Arial" w:hAnsi="Arial" w:cs="Arial"/>
-          <w:lang w:val="es-CO"/>
-        </w:rPr>
-      </w:pPr>
-      <w:r>
-        <w:rPr>
-          <w:rFonts w:ascii="Arial" w:hAnsi="Arial" w:cs="Arial"/>
-          <w:lang w:val="es-CO"/>
-        </w:rPr>
-        <w:t>Subgrupos:</w:t>
-      </w:r>
-    </w:p>
-    <w:p>
-      <w:pPr>
-        <w:pStyle w:val="Prrafodelista"/>
-        <w:numPr>
-          <w:ilvl w:val="0"/>
-          <w:numId w:val="19"/>
-        </w:numPr>
-        <w:rPr>
-          <w:rFonts w:ascii="Arial" w:hAnsi="Arial" w:cs="Arial"/>
-          <w:lang w:val="es-CO"/>
-        </w:rPr>
-      </w:pPr>
-      <w:r>
-        <w:rPr>
-          <w:rFonts w:ascii="Arial" w:hAnsi="Arial" w:cs="Arial"/>
-          <w:lang w:val="es-CO"/>
-        </w:rPr>
-        <w:t>Indígena: Grupo con resumen de datos correspondiente a indígenas.</w:t>
-      </w:r>
-    </w:p>
-    <w:p>
-      <w:pPr>
-        <w:pStyle w:val="Prrafodelista"/>
-        <w:numPr>
-          <w:ilvl w:val="0"/>
-          <w:numId w:val="19"/>
-        </w:numPr>
-        <w:rPr>
-          <w:rFonts w:ascii="Arial" w:hAnsi="Arial" w:cs="Arial"/>
-          <w:lang w:val="es-CO"/>
-        </w:rPr>
-      </w:pPr>
-      <w:r>
-        <w:rPr>
-          <w:rFonts w:ascii="Arial" w:hAnsi="Arial" w:cs="Arial"/>
-          <w:lang w:val="es-CO"/>
-        </w:rPr>
-        <w:t>Gitano(a) o Rrom: Grupo con resumen de datos correspondiente a gitanos o romaníes.</w:t>
-      </w:r>
-    </w:p>
-    <w:p>
-      <w:pPr>
-        <w:pStyle w:val="Prrafodelista"/>
-        <w:numPr>
-          <w:ilvl w:val="0"/>
-          <w:numId w:val="19"/>
-        </w:numPr>
-        <w:rPr>
-          <w:rFonts w:ascii="Arial" w:hAnsi="Arial" w:cs="Arial"/>
-          <w:lang w:val="es-CO"/>
-        </w:rPr>
-      </w:pPr>
-      <w:r>
-        <w:rPr>
-          <w:rFonts w:ascii="Arial" w:hAnsi="Arial" w:cs="Arial"/>
-          <w:lang w:val="es-CO"/>
-        </w:rPr>
-        <w:t>Palenquero(a) de San Basilio: Grupo con resumen de datos correspondiente a palenqueros de San Basilio.</w:t>
-      </w:r>
-    </w:p>
-    <w:p>
-      <w:pPr>
-        <w:pStyle w:val="Prrafodelista"/>
-        <w:numPr>
-          <w:ilvl w:val="0"/>
-          <w:numId w:val="19"/>
-        </w:numPr>
-        <w:rPr>
-          <w:rFonts w:ascii="Arial" w:hAnsi="Arial" w:cs="Arial"/>
-          <w:lang w:val="es-CO"/>
-        </w:rPr>
-      </w:pPr>
-      <w:r>
-        <w:rPr>
-          <w:rFonts w:ascii="Arial" w:hAnsi="Arial" w:cs="Arial"/>
-          <w:lang w:val="es-CO"/>
-        </w:rPr>
-        <w:t>Negro(a), Mulato(a), Afrodescendiente, Afrocolombiano(a): Grupo con resumen datos correspondiente a negros, mulatos, afrodescendientes o afrocolombianos.</w:t>
-      </w:r>
-    </w:p>
-    <w:p>
-      <w:pPr>
-        <w:pStyle w:val="Prrafodelista"/>
-        <w:numPr>
-          <w:ilvl w:val="0"/>
-          <w:numId w:val="19"/>
-        </w:numPr>
-        <w:rPr>
-          <w:rFonts w:ascii="Arial" w:hAnsi="Arial" w:cs="Arial"/>
-          <w:lang w:val="es-CO"/>
-        </w:rPr>
-      </w:pPr>
-      <w:r>
-        <w:rPr>
-          <w:rFonts w:ascii="Arial" w:hAnsi="Arial" w:cs="Arial"/>
-          <w:lang w:val="es-CO"/>
-        </w:rPr>
-        <w:t>Ningún grupo étnico: Grupo con resumen de datos correspondiente a los censados que no pertenecen a ningún grupo étnico.</w:t>
-      </w:r>
-    </w:p>
-    <w:p>
-      <w:pPr>
-        <w:pStyle w:val="Prrafodelista"/>
-        <w:numPr>
-          <w:ilvl w:val="0"/>
-          <w:numId w:val="19"/>
-        </w:numPr>
-        <w:rPr>
-          <w:rFonts w:ascii="Arial" w:hAnsi="Arial" w:cs="Arial"/>
-          <w:lang w:val="es-CO"/>
-        </w:rPr>
-      </w:pPr>
-      <w:r>
-        <w:rPr>
-          <w:rFonts w:ascii="Arial" w:hAnsi="Arial" w:cs="Arial"/>
-          <w:lang w:val="es-CO"/>
-        </w:rPr>
         <w:t>Sin información: Grupo con resumen de datos correspondiente a los censados de los cuales no se tiene información de su pertenencia étnica.</w:t>
       </w:r>
     </w:p>
@@ -8218,7 +8571,7 @@
 </file>
 
 <file path=word/numbering.xml><?xml version="1.0" encoding="utf-8"?>
-<w:numbering xmlns:wpc="http://schemas.microsoft.com/office/word/2010/wordprocessingCanvas" xmlns:cx="http://schemas.microsoft.com/office/drawing/2014/chartex" xmlns:cx1="http://schemas.microsoft.com/office/drawing/2015/9/8/chartex" xmlns:cx2="http://schemas.microsoft.com/office/drawing/2015/10/21/chartex" xmlns:cx3="http://schemas.microsoft.com/office/drawing/2016/5/9/chartex" xmlns:cx4="http://schemas.microsoft.com/office/drawing/2016/5/10/chartex" xmlns:cx5="http://schemas.microsoft.com/office/drawing/2016/5/11/chartex" xmlns:cx6="http://schemas.microsoft.com/office/drawing/2016/5/12/chartex" xmlns:cx7="http://schemas.microsoft.com/office/drawing/2016/5/13/chartex" xmlns:cx8="http://schemas.microsoft.com/office/drawing/2016/5/14/chartex" xmlns:mc="http://schemas.openxmlformats.org/markup-compatibility/2006" xmlns:aink="http://schemas.microsoft.com/office/drawing/2016/ink" xmlns:am3d="http://schemas.microsoft.com/office/drawing/2017/model3d" xmlns:o="urn:schemas-microsoft-com:office:office" xmlns:oel="http://schemas.microsoft.com/office/2019/extlst" xmlns:r="http://schemas.openxmlformats.org/officeDocument/2006/relationships" xmlns:m="http://schemas.openxmlformats.org/officeDocument/2006/math" xmlns:v="urn:schemas-microsoft-com:vml" xmlns:wp14="http://schemas.microsoft.com/office/word/2010/wordprocessingDrawing" xmlns:wp="http://schemas.openxmlformats.org/drawingml/2006/wordprocessingDrawing" xmlns:w10="urn:schemas-microsoft-com:office:word" xmlns:w="http://schemas.openxmlformats.org/wordprocessingml/2006/main" xmlns:w14="http://schemas.microsoft.com/office/word/2010/wordml" xmlns:w15="http://schemas.microsoft.com/office/word/2012/wordml" xmlns:w16cex="http://schemas.microsoft.com/office/word/2018/wordml/cex" xmlns:w16cid="http://schemas.microsoft.com/office/word/2016/wordml/cid" xmlns:w16="http://schemas.microsoft.com/office/word/2018/wordml" xmlns:w16du="http://schemas.microsoft.com/office/word/2023/wordml/word16du" xmlns:w16sdtdh="http://schemas.microsoft.com/office/word/2020/wordml/sdtdatahash" xmlns:w16sdtfl="http://schemas.microsoft.com/office/word/2024/wordml/sdtformatlock" xmlns:w16se="http://schemas.microsoft.com/office/word/2015/wordml/symex" xmlns:wpg="http://schemas.microsoft.com/office/word/2010/wordprocessingGroup" xmlns:wpi="http://schemas.microsoft.com/office/word/2010/wordprocessingInk" xmlns:wne="http://schemas.microsoft.com/office/word/2006/wordml" xmlns:wps="http://schemas.microsoft.com/office/word/2010/wordprocessingShape" mc:Ignorable="w14 w15 w16se w16cid w16 w16cex w16sdtdh w16sdtfl w16du wp14">
+<w:numbering xmlns:wpc="http://schemas.microsoft.com/office/word/2010/wordprocessingCanvas" xmlns:cx="http://schemas.microsoft.com/office/drawing/2014/chartex" xmlns:cx1="http://schemas.microsoft.com/office/drawing/2015/9/8/chartex" xmlns:cx2="http://schemas.microsoft.com/office/drawing/2015/10/21/chartex" xmlns:cx3="http://schemas.microsoft.com/office/drawing/2016/5/9/chartex" xmlns:cx4="http://schemas.microsoft.com/office/drawing/2016/5/10/chartex" xmlns:cx5="http://schemas.microsoft.com/office/drawing/2016/5/11/chartex" xmlns:cx6="http://schemas.microsoft.com/office/drawing/2016/5/12/chartex" xmlns:cx7="http://schemas.microsoft.com/office/drawing/2016/5/13/chartex" xmlns:cx8="http://schemas.microsoft.com/office/drawing/2016/5/14/chartex" xmlns:mc="http://schemas.openxmlformats.org/markup-compatibility/2006" xmlns:aink="http://schemas.microsoft.com/office/drawing/2016/ink" xmlns:am3d="http://schemas.microsoft.com/office/drawing/2017/model3d" xmlns:o="urn:schemas-microsoft-com:office:office" xmlns:r="http://schemas.openxmlformats.org/officeDocument/2006/relationships" xmlns:m="http://schemas.openxmlformats.org/officeDocument/2006/math" xmlns:v="urn:schemas-microsoft-com:vml" xmlns:wp14="http://schemas.microsoft.com/office/word/2010/wordprocessingDrawing" xmlns:wp="http://schemas.openxmlformats.org/drawingml/2006/wordprocessingDrawing" xmlns:w10="urn:schemas-microsoft-com:office:word" xmlns:w="http://schemas.openxmlformats.org/wordprocessingml/2006/main" xmlns:w14="http://schemas.microsoft.com/office/word/2010/wordml" xmlns:w15="http://schemas.microsoft.com/office/word/2012/wordml" xmlns:w16cex="http://schemas.microsoft.com/office/word/2018/wordml/cex" xmlns:w16cid="http://schemas.microsoft.com/office/word/2016/wordml/cid" xmlns:w16="http://schemas.microsoft.com/office/word/2018/wordml" xmlns:w16sdtdh="http://schemas.microsoft.com/office/word/2020/wordml/sdtdatahash" xmlns:w16se="http://schemas.microsoft.com/office/word/2015/wordml/symex" xmlns:wpg="http://schemas.microsoft.com/office/word/2010/wordprocessingGroup" xmlns:wpi="http://schemas.microsoft.com/office/word/2010/wordprocessingInk" xmlns:wne="http://schemas.microsoft.com/office/word/2006/wordml" xmlns:wps="http://schemas.microsoft.com/office/word/2010/wordprocessingShape" mc:Ignorable="w14 w15 w16se w16cid w16 w16cex w16sdtdh wp14">
   <w:abstractNum w:abstractNumId="0" w15:restartNumberingAfterBreak="0">
     <w:nsid w:val="082472D9"/>
     <w:multiLevelType w:val="hybridMultilevel"/>
@@ -10366,68 +10719,68 @@
       </w:rPr>
     </w:lvl>
   </w:abstractNum>
-  <w:num w:numId="1" w16cid:durableId="824902107">
+  <w:num w:numId="1">
     <w:abstractNumId w:val="13"/>
   </w:num>
-  <w:num w:numId="2" w16cid:durableId="617299781">
+  <w:num w:numId="2">
     <w:abstractNumId w:val="15"/>
   </w:num>
-  <w:num w:numId="3" w16cid:durableId="1048263498">
+  <w:num w:numId="3">
     <w:abstractNumId w:val="10"/>
   </w:num>
-  <w:num w:numId="4" w16cid:durableId="237983024">
+  <w:num w:numId="4">
     <w:abstractNumId w:val="9"/>
   </w:num>
-  <w:num w:numId="5" w16cid:durableId="325859572">
+  <w:num w:numId="5">
     <w:abstractNumId w:val="4"/>
   </w:num>
-  <w:num w:numId="6" w16cid:durableId="398870548">
+  <w:num w:numId="6">
     <w:abstractNumId w:val="14"/>
   </w:num>
-  <w:num w:numId="7" w16cid:durableId="1317153043">
+  <w:num w:numId="7">
     <w:abstractNumId w:val="16"/>
   </w:num>
-  <w:num w:numId="8" w16cid:durableId="430202784">
+  <w:num w:numId="8">
     <w:abstractNumId w:val="7"/>
   </w:num>
-  <w:num w:numId="9" w16cid:durableId="1169177289">
+  <w:num w:numId="9">
     <w:abstractNumId w:val="17"/>
   </w:num>
-  <w:num w:numId="10" w16cid:durableId="965619825">
+  <w:num w:numId="10">
     <w:abstractNumId w:val="1"/>
   </w:num>
-  <w:num w:numId="11" w16cid:durableId="1154027656">
+  <w:num w:numId="11">
     <w:abstractNumId w:val="11"/>
   </w:num>
-  <w:num w:numId="12" w16cid:durableId="867530551">
+  <w:num w:numId="12">
     <w:abstractNumId w:val="8"/>
   </w:num>
-  <w:num w:numId="13" w16cid:durableId="464351712">
+  <w:num w:numId="13">
     <w:abstractNumId w:val="18"/>
   </w:num>
-  <w:num w:numId="14" w16cid:durableId="676274769">
+  <w:num w:numId="14">
     <w:abstractNumId w:val="6"/>
   </w:num>
-  <w:num w:numId="15" w16cid:durableId="1423530884">
+  <w:num w:numId="15">
     <w:abstractNumId w:val="5"/>
   </w:num>
-  <w:num w:numId="16" w16cid:durableId="799149697">
+  <w:num w:numId="16">
     <w:abstractNumId w:val="3"/>
   </w:num>
-  <w:num w:numId="17" w16cid:durableId="874973434">
+  <w:num w:numId="17">
     <w:abstractNumId w:val="2"/>
   </w:num>
-  <w:num w:numId="18" w16cid:durableId="1624189086">
+  <w:num w:numId="18">
     <w:abstractNumId w:val="12"/>
   </w:num>
-  <w:num w:numId="19" w16cid:durableId="857818583">
+  <w:num w:numId="19">
     <w:abstractNumId w:val="0"/>
   </w:num>
 </w:numbering>
 </file>
 
 <file path=word/styles.xml><?xml version="1.0" encoding="utf-8"?>
-<w:styles xmlns:mc="http://schemas.openxmlformats.org/markup-compatibility/2006" xmlns:r="http://schemas.openxmlformats.org/officeDocument/2006/relationships" xmlns:w="http://schemas.openxmlformats.org/wordprocessingml/2006/main" xmlns:w14="http://schemas.microsoft.com/office/word/2010/wordml" xmlns:w15="http://schemas.microsoft.com/office/word/2012/wordml" xmlns:w16cex="http://schemas.microsoft.com/office/word/2018/wordml/cex" xmlns:w16cid="http://schemas.microsoft.com/office/word/2016/wordml/cid" xmlns:w16="http://schemas.microsoft.com/office/word/2018/wordml" xmlns:w16du="http://schemas.microsoft.com/office/word/2023/wordml/word16du" xmlns:w16sdtdh="http://schemas.microsoft.com/office/word/2020/wordml/sdtdatahash" xmlns:w16sdtfl="http://schemas.microsoft.com/office/word/2024/wordml/sdtformatlock" xmlns:w16se="http://schemas.microsoft.com/office/word/2015/wordml/symex" mc:Ignorable="w14 w15 w16se w16cid w16 w16cex w16sdtdh w16sdtfl w16du">
+<w:styles xmlns:mc="http://schemas.openxmlformats.org/markup-compatibility/2006" xmlns:r="http://schemas.openxmlformats.org/officeDocument/2006/relationships" xmlns:w="http://schemas.openxmlformats.org/wordprocessingml/2006/main" xmlns:w14="http://schemas.microsoft.com/office/word/2010/wordml" xmlns:w15="http://schemas.microsoft.com/office/word/2012/wordml" xmlns:w16cex="http://schemas.microsoft.com/office/word/2018/wordml/cex" xmlns:w16cid="http://schemas.microsoft.com/office/word/2016/wordml/cid" xmlns:w16="http://schemas.microsoft.com/office/word/2018/wordml" xmlns:w16sdtdh="http://schemas.microsoft.com/office/word/2020/wordml/sdtdatahash" xmlns:w16se="http://schemas.microsoft.com/office/word/2015/wordml/symex" mc:Ignorable="w14 w15 w16se w16cid w16 w16cex w16sdtdh">
   <w:docDefaults>
     <w:rPrDefault>
       <w:rPr>

</xml_diff>

<commit_message>
Corrige descripción de fuentes de datos de hojas 17PM y 19PM
</commit_message>
<xml_diff>
--- a/Documentacion/Fuentes de Datos.docx
+++ b/Documentacion/Fuentes de Datos.docx
@@ -100,7 +100,14 @@
           <w:rFonts w:ascii="Arial" w:hAnsi="Arial" w:cs="Arial"/>
           <w:lang w:val="es-CO"/>
         </w:rPr>
-        <w:t>21</w:t>
+        <w:t>2</w:t>
+      </w:r>
+      <w:r>
+        <w:rPr>
+          <w:rFonts w:ascii="Arial" w:hAnsi="Arial" w:cs="Arial"/>
+          <w:lang w:val="es-CO"/>
+        </w:rPr>
+        <w:t>7</w:t>
       </w:r>
       <w:r>
         <w:rPr>
@@ -2534,7 +2541,7 @@
                 <w:rFonts w:ascii="Arial" w:hAnsi="Arial" w:cs="Arial"/>
                 <w:lang w:val="es-CO"/>
               </w:rPr>
-              <w:t>Población censa da en hogares, de 5 años y más de edad, por asistencia escolar y sexo, según municipio y áreas y (Total, Cabecera y Centros poblados y Rural disperso) y grupos de edad escolar</w:t>
+              <w:t>Población censada en hogares particulares, de 5 años y más de edad, por nivel educativo alcanzado, según municipio, áreas (Total, Cabecera y Centros poblados y Rural disperso) y sexo</w:t>
             </w:r>
           </w:p>
         </w:tc>
@@ -2749,7 +2756,7 @@
                 <w:rFonts w:ascii="Arial" w:hAnsi="Arial" w:cs="Arial"/>
                 <w:lang w:val="es-CO"/>
               </w:rPr>
-              <w:t>Población censada en hogares particulares, de 5 años y más de edad, por asistencia escolar y sexo, según municipio, áreas (Total, Cabecera y Centros poblados y Rural disperso) y grupos de edad escolar</w:t>
+              <w:t>Población censada, de 5 años y más de edad, por nivel educativo alcanzado y sexo, según municipio y áreas y (Total, Cabecera y Centros poblados y Rural disperso) y sexo y pertenencia étnica</w:t>
             </w:r>
           </w:p>
         </w:tc>

</xml_diff>